<commit_message>
feat -- TR5: reading about the rectangular method, Jesus  thank you!
</commit_message>
<xml_diff>
--- a/42TR Tehnologiji Rozpodilenyh System/5/TR_KNT-122_Onyshchenko_19_PR5.docx
+++ b/42TR Tehnologiji Rozpodilenyh System/5/TR_KNT-122_Onyshchenko_19_PR5.docx
@@ -426,11 +426,7 @@
       </w:pPr>
       <w:r>
         <w:rPr/>
-        <w:t xml:space="preserve">Метою роботи є </w:t>
-      </w:r>
-      <w:r>
-        <w:rPr/>
-        <w:t>п</w:t>
+        <w:t>Метою роботи є п</w:t>
       </w:r>
       <w:r>
         <w:rPr>
@@ -484,6 +480,110 @@
       <w:r>
         <w:rPr/>
         <w:t>Питання</w:t>
+      </w:r>
+    </w:p>
+    <w:p>
+      <w:pPr>
+        <w:pStyle w:val="p11"/>
+        <w:rPr/>
+      </w:pPr>
+      <w:r>
+        <w:rPr/>
+        <w:t>Проаналізуйте програму 5.1. Нехай інтервал інтегрування складається з 10 підінтервалів (0, 1, 2 і т.д.), а кількість процесорів дорівнює чотирьом. Назвіть номери підінтервалів, в яких обчислює підінтегральну функцію кожний з процесорів.</w:t>
+      </w:r>
+    </w:p>
+    <w:p>
+      <w:pPr>
+        <w:pStyle w:val="p11"/>
+        <w:rPr/>
+      </w:pPr>
+      <w:r>
+        <w:rPr/>
+        <w:t xml:space="preserve">Чи залежить прискорення обчислення числа </w:t>
+      </w:r>
+      <w:r>
+        <w:rPr/>
+        <w:t xml:space="preserve">ПІ </w:t>
+      </w:r>
+      <w:r>
+        <w:rPr/>
+        <w:t>за допомогою програми 1 від кількості підінтервалів?</w:t>
+      </w:r>
+    </w:p>
+    <w:p>
+      <w:pPr>
+        <w:pStyle w:val="p11"/>
+        <w:rPr/>
+      </w:pPr>
+      <w:r>
+        <w:rPr/>
+        <w:t xml:space="preserve">Порівняйте точності обчислень числа </w:t>
+      </w:r>
+      <w:r>
+        <w:rPr/>
+        <w:t xml:space="preserve">ПІ </w:t>
+      </w:r>
+      <w:r>
+        <w:rPr/>
+        <w:t xml:space="preserve">за допомогою програм 5.1 та 5.3. Які </w:t>
+      </w:r>
+      <w:r>
+        <w:rPr/>
+        <w:t>в</w:t>
+      </w:r>
+      <w:r>
+        <w:rPr/>
+        <w:t>аші висновки щодо точності реалізованих в програмах 5.1 та 5.3 методів?</w:t>
+      </w:r>
+    </w:p>
+    <w:p>
+      <w:pPr>
+        <w:pStyle w:val="p11"/>
+        <w:rPr/>
+      </w:pPr>
+      <w:r>
+        <w:rPr/>
+        <w:t>Як в MPI визначити розмір буфера, необхідного для прийому повідомлень?</w:t>
+      </w:r>
+    </w:p>
+    <w:p>
+      <w:pPr>
+        <w:pStyle w:val="p11"/>
+        <w:rPr/>
+      </w:pPr>
+      <w:r>
+        <w:rPr/>
+        <w:t>Що таке групи процесів в MPI? За допомогою яких функцій бібліотеки MPI їх можна створити?</w:t>
+      </w:r>
+    </w:p>
+    <w:p>
+      <w:pPr>
+        <w:pStyle w:val="p11"/>
+        <w:rPr/>
+      </w:pPr>
+      <w:r>
+        <w:rPr/>
+        <w:t>Як здійснити обмін даними між процесами групи?</w:t>
+      </w:r>
+    </w:p>
+    <w:p>
+      <w:pPr>
+        <w:pStyle w:val="p11"/>
+        <w:rPr/>
+      </w:pPr>
+      <w:r>
+        <w:rPr/>
+        <w:t>Поясніть призначення і роботу функції MPI_Comm_split(MPI_Comm comm,int split,int key,MPI_Comm *newcomm);</w:t>
+      </w:r>
+    </w:p>
+    <w:p>
+      <w:pPr>
+        <w:pStyle w:val="p11"/>
+        <w:rPr/>
+      </w:pPr>
+      <w:r>
+        <w:rPr/>
+        <w:t>Чи можуть декілька комунікаторів в одній паралельній програмі мати однакові ідентифікатори?</w:t>
       </w:r>
     </w:p>
     <w:sectPr>
@@ -1284,12 +1384,12 @@
       <w:lang w:val="en-US" w:eastAsia="uk-UA"/>
     </w:rPr>
   </w:style>
-  <w:style w:type="character" w:styleId="user">
-    <w:name w:val="Символ нумерації (user)"/>
+  <w:style w:type="character" w:styleId="Style12">
+    <w:name w:val="Символ нумерації"/>
     <w:qFormat/>
     <w:rPr/>
   </w:style>
-  <w:style w:type="paragraph" w:styleId="Style12">
+  <w:style w:type="paragraph" w:styleId="Style13">
     <w:name w:val="Заголовок"/>
     <w:basedOn w:val="Normal"/>
     <w:next w:val="BodyText"/>
@@ -1299,7 +1399,7 @@
       <w:spacing w:before="240" w:after="120"/>
     </w:pPr>
     <w:rPr>
-      <w:rFonts w:ascii="Liberation Sans" w:hAnsi="Liberation Sans" w:eastAsia="Microsoft YaHei" w:cs="Arial Unicode MS"/>
+      <w:rFonts w:ascii="Liberation Sans" w:hAnsi="Liberation Sans" w:eastAsia="Microsoft YaHei" w:cs="Lucida Sans"/>
       <w:sz w:val="28"/>
       <w:szCs w:val="28"/>
     </w:rPr>
@@ -1336,7 +1436,7 @@
       <w:szCs w:val="24"/>
     </w:rPr>
   </w:style>
-  <w:style w:type="paragraph" w:styleId="Style13">
+  <w:style w:type="paragraph" w:styleId="Style14">
     <w:name w:val="Покажчик"/>
     <w:basedOn w:val="Normal"/>
     <w:qFormat/>
@@ -1344,10 +1444,10 @@
       <w:suppressLineNumbers/>
     </w:pPr>
     <w:rPr>
-      <w:rFonts w:cs="Arial Unicode MS"/>
-    </w:rPr>
-  </w:style>
-  <w:style w:type="paragraph" w:styleId="user1">
+      <w:rFonts w:cs="Lucida Sans"/>
+    </w:rPr>
+  </w:style>
+  <w:style w:type="paragraph" w:styleId="user">
     <w:name w:val="Заголовок (user)"/>
     <w:basedOn w:val="Normal"/>
     <w:next w:val="BodyText"/>
@@ -1357,12 +1457,12 @@
       <w:spacing w:before="240" w:after="120"/>
     </w:pPr>
     <w:rPr>
-      <w:rFonts w:ascii="Liberation Sans" w:hAnsi="Liberation Sans" w:eastAsia="Microsoft YaHei" w:cs="Lucida Sans"/>
+      <w:rFonts w:ascii="Liberation Sans" w:hAnsi="Liberation Sans" w:eastAsia="Microsoft YaHei" w:cs="Arial Unicode MS"/>
       <w:sz w:val="28"/>
       <w:szCs w:val="28"/>
     </w:rPr>
   </w:style>
-  <w:style w:type="paragraph" w:styleId="user2">
+  <w:style w:type="paragraph" w:styleId="user1">
     <w:name w:val="Покажчик (user)"/>
     <w:basedOn w:val="Normal"/>
     <w:qFormat/>
@@ -1370,12 +1470,12 @@
       <w:suppressLineNumbers/>
     </w:pPr>
     <w:rPr>
-      <w:rFonts w:cs="Lucida Sans"/>
+      <w:rFonts w:cs="Arial Unicode MS"/>
     </w:rPr>
   </w:style>
   <w:style w:type="paragraph" w:styleId="IndexHeading">
     <w:name w:val="index heading"/>
-    <w:basedOn w:val="Style12"/>
+    <w:basedOn w:val="user"/>
     <w:pPr/>
     <w:rPr/>
   </w:style>
@@ -1655,7 +1755,17 @@
     </w:pPr>
     <w:rPr/>
   </w:style>
-  <w:style w:type="paragraph" w:styleId="Style14">
+  <w:style w:type="paragraph" w:styleId="user2">
+    <w:name w:val="Вміст таблиці (user)"/>
+    <w:basedOn w:val="Normal"/>
+    <w:qFormat/>
+    <w:pPr>
+      <w:widowControl w:val="false"/>
+      <w:suppressLineNumbers/>
+    </w:pPr>
+    <w:rPr/>
+  </w:style>
+  <w:style w:type="paragraph" w:styleId="Style15">
     <w:name w:val="Вміст таблиці"/>
     <w:basedOn w:val="Normal"/>
     <w:qFormat/>
@@ -1666,18 +1776,8 @@
     <w:rPr/>
   </w:style>
   <w:style w:type="paragraph" w:styleId="user3">
-    <w:name w:val="Вміст таблиці (user)"/>
-    <w:basedOn w:val="Normal"/>
-    <w:qFormat/>
-    <w:pPr>
-      <w:widowControl w:val="false"/>
-      <w:suppressLineNumbers/>
-    </w:pPr>
-    <w:rPr/>
-  </w:style>
-  <w:style w:type="paragraph" w:styleId="Style15">
-    <w:name w:val="Заголовок таблиці"/>
-    <w:basedOn w:val="Style14"/>
+    <w:name w:val="Заголовок таблиці (user)"/>
+    <w:basedOn w:val="user2"/>
     <w:qFormat/>
     <w:pPr>
       <w:suppressLineNumbers/>
@@ -1688,8 +1788,8 @@
       <w:bCs/>
     </w:rPr>
   </w:style>
-  <w:style w:type="paragraph" w:styleId="Style16">
-    <w:name w:val="Верхній і нижній колонтитули"/>
+  <w:style w:type="paragraph" w:styleId="user4">
+    <w:name w:val="Верхній і нижній колонтитули (user)"/>
     <w:basedOn w:val="Normal"/>
     <w:qFormat/>
     <w:pPr>
@@ -1702,8 +1802,8 @@
     </w:pPr>
     <w:rPr/>
   </w:style>
-  <w:style w:type="paragraph" w:styleId="user4">
-    <w:name w:val="Верхній і нижній колонтитули (user)"/>
+  <w:style w:type="paragraph" w:styleId="Style16">
+    <w:name w:val="Верхній і нижній колонтитули"/>
     <w:basedOn w:val="Normal"/>
     <w:qFormat/>
     <w:pPr/>
@@ -1711,7 +1811,7 @@
   </w:style>
   <w:style w:type="paragraph" w:styleId="Footer">
     <w:name w:val="footer"/>
-    <w:basedOn w:val="Style16"/>
+    <w:basedOn w:val="user4"/>
     <w:pPr>
       <w:suppressLineNumbers/>
     </w:pPr>
@@ -1719,7 +1819,7 @@
   </w:style>
   <w:style w:type="paragraph" w:styleId="Header">
     <w:name w:val="header"/>
-    <w:basedOn w:val="user4"/>
+    <w:basedOn w:val="Style16"/>
     <w:pPr>
       <w:suppressLineNumbers/>
       <w:tabs>
@@ -1730,9 +1830,9 @@
     </w:pPr>
     <w:rPr/>
   </w:style>
-  <w:style w:type="paragraph" w:styleId="user5">
-    <w:name w:val="Заголовок таблиці (user)"/>
-    <w:basedOn w:val="user3"/>
+  <w:style w:type="paragraph" w:styleId="Style17">
+    <w:name w:val="Заголовок таблиці"/>
+    <w:basedOn w:val="Style15"/>
     <w:qFormat/>
     <w:pPr>
       <w:suppressLineNumbers/>
@@ -1743,8 +1843,8 @@
       <w:bCs/>
     </w:rPr>
   </w:style>
-  <w:style w:type="numbering" w:styleId="Style17" w:default="1">
-    <w:name w:val="Без маркерів"/>
+  <w:style w:type="numbering" w:styleId="user5" w:default="1">
+    <w:name w:val="Без маркерів (user)"/>
     <w:uiPriority w:val="99"/>
     <w:semiHidden/>
     <w:unhideWhenUsed/>

</xml_diff>

<commit_message>
chore: i dont know
</commit_message>
<xml_diff>
--- a/42TR Tehnologiji Rozpodilenyh System/5/TR_KNT-122_Onyshchenko_19_PR5.docx
+++ b/42TR Tehnologiji Rozpodilenyh System/5/TR_KNT-122_Onyshchenko_19_PR5.docx
@@ -484,7 +484,7 @@
     </w:p>
     <w:p>
       <w:pPr>
-        <w:pStyle w:val="p11"/>
+        <w:pStyle w:val="H2"/>
         <w:rPr/>
       </w:pPr>
       <w:r>
@@ -494,7 +494,7 @@
     </w:p>
     <w:p>
       <w:pPr>
-        <w:pStyle w:val="p11"/>
+        <w:pStyle w:val="H2"/>
         <w:rPr/>
       </w:pPr>
       <w:r>
@@ -512,7 +512,7 @@
     </w:p>
     <w:p>
       <w:pPr>
-        <w:pStyle w:val="p11"/>
+        <w:pStyle w:val="H2"/>
         <w:rPr/>
       </w:pPr>
       <w:r>
@@ -538,7 +538,7 @@
     </w:p>
     <w:p>
       <w:pPr>
-        <w:pStyle w:val="p11"/>
+        <w:pStyle w:val="H2"/>
         <w:rPr/>
       </w:pPr>
       <w:r>
@@ -548,7 +548,7 @@
     </w:p>
     <w:p>
       <w:pPr>
-        <w:pStyle w:val="p11"/>
+        <w:pStyle w:val="H2"/>
         <w:rPr/>
       </w:pPr>
       <w:r>
@@ -558,7 +558,7 @@
     </w:p>
     <w:p>
       <w:pPr>
-        <w:pStyle w:val="p11"/>
+        <w:pStyle w:val="H2"/>
         <w:rPr/>
       </w:pPr>
       <w:r>
@@ -568,17 +568,17 @@
     </w:p>
     <w:p>
       <w:pPr>
-        <w:pStyle w:val="p11"/>
-        <w:rPr/>
-      </w:pPr>
-      <w:r>
-        <w:rPr/>
-        <w:t>Поясніть призначення і роботу функції MPI_Comm_split(MPI_Comm comm,int split,int key,MPI_Comm *newcomm);</w:t>
-      </w:r>
-    </w:p>
-    <w:p>
-      <w:pPr>
-        <w:pStyle w:val="p11"/>
+        <w:pStyle w:val="H2"/>
+        <w:rPr/>
+      </w:pPr>
+      <w:r>
+        <w:rPr/>
+        <w:t>Поясніть призначення і роботу функції MPI_Comm_split(MPI_Comm comm, int split, int key, MPI_Comm *newcomm);</w:t>
+      </w:r>
+    </w:p>
+    <w:p>
+      <w:pPr>
+        <w:pStyle w:val="H2"/>
         <w:rPr/>
       </w:pPr>
       <w:r>

</xml_diff>

<commit_message>
feat -- TR5: make 5.1.2.1
</commit_message>
<xml_diff>
--- a/42TR Tehnologiji Rozpodilenyh System/5/TR_KNT-122_Onyshchenko_19_PR5.docx
+++ b/42TR Tehnologiji Rozpodilenyh System/5/TR_KNT-122_Onyshchenko_19_PR5.docx
@@ -269,6 +269,7 @@
       <w:r>
         <w:rPr/>
         <w:t xml:space="preserve">Студент КНТ-122 </w:t>
+        <w:tab/>
         <w:tab/>
         <w:tab/>
         <w:tab/>
@@ -337,6 +338,7 @@
         <w:tab/>
         <w:tab/>
         <w:tab/>
+        <w:tab/>
         <w:t>Дьячук Т.С.</w:t>
       </w:r>
     </w:p>
@@ -464,6 +466,104 @@
     </w:p>
     <w:p>
       <w:pPr>
+        <w:pStyle w:val="p11"/>
+        <w:rPr/>
+      </w:pPr>
+      <w:r>
+        <w:rPr/>
+      </w:r>
+    </w:p>
+    <w:p>
+      <w:pPr>
+        <w:pStyle w:val="p11"/>
+        <w:rPr/>
+      </w:pPr>
+      <w:r>
+        <w:rPr/>
+        <w:t>5.1.2.1 Розробити послідовні алгоритм та програму обчислення числа π з можливістю вимірювання часу роботи програми для заданого n та визначення помилки апроксимації інтеграла. Для цього використовуйте функцію вимірювання часу бібліотеки MPI, як еталонне значення числа π прийміть 3.141592653589793238462643.</w:t>
+      </w:r>
+    </w:p>
+    <w:p>
+      <w:pPr>
+        <w:pStyle w:val="p11"/>
+        <w:rPr/>
+      </w:pPr>
+      <w:r>
+        <w:rPr/>
+        <w:t>Дослідіть точність та швидкодію програми обчислення π для значень кількості інтервалів 10</w:t>
+      </w:r>
+      <w:r>
+        <w:rPr>
+          <w:vertAlign w:val="superscript"/>
+        </w:rPr>
+        <w:t>3</w:t>
+      </w:r>
+      <w:r>
+        <w:rPr/>
+        <w:t>, 10</w:t>
+      </w:r>
+      <w:r>
+        <w:rPr>
+          <w:vertAlign w:val="superscript"/>
+        </w:rPr>
+        <w:t>4</w:t>
+      </w:r>
+      <w:r>
+        <w:rPr/>
+        <w:t>, 10</w:t>
+      </w:r>
+      <w:r>
+        <w:rPr>
+          <w:vertAlign w:val="superscript"/>
+        </w:rPr>
+        <w:t>5</w:t>
+      </w:r>
+      <w:r>
+        <w:rPr/>
+        <w:t>, 10</w:t>
+      </w:r>
+      <w:r>
+        <w:rPr>
+          <w:vertAlign w:val="superscript"/>
+        </w:rPr>
+        <w:t>6</w:t>
+      </w:r>
+      <w:r>
+        <w:rPr/>
+        <w:t>, 10</w:t>
+      </w:r>
+      <w:r>
+        <w:rPr>
+          <w:vertAlign w:val="superscript"/>
+        </w:rPr>
+        <w:t>7</w:t>
+      </w:r>
+      <w:r>
+        <w:rPr/>
+        <w:t>, 10</w:t>
+      </w:r>
+      <w:r>
+        <w:rPr>
+          <w:vertAlign w:val="superscript"/>
+        </w:rPr>
+        <w:t>9</w:t>
+      </w:r>
+      <w:r>
+        <w:rPr/>
+        <w:t>. Результати подайте у звіті у вигляді таблиці.</w:t>
+      </w:r>
+    </w:p>
+    <w:p>
+      <w:pPr>
+        <w:pStyle w:val="p11"/>
+        <w:rPr/>
+      </w:pPr>
+      <w:r>
+        <w:rPr/>
+      </w:r>
+    </w:p>
+    <w:p>
+      <w:pPr>
         <w:pStyle w:val="h11"/>
         <w:rPr/>
       </w:pPr>
@@ -474,6 +574,1694 @@
     </w:p>
     <w:p>
       <w:pPr>
+        <w:pStyle w:val="H2"/>
+        <w:rPr/>
+      </w:pPr>
+      <w:r>
+        <w:rPr/>
+        <w:t>5.1.2.1</w:t>
+      </w:r>
+    </w:p>
+    <w:p>
+      <w:pPr>
+        <w:pStyle w:val="H3"/>
+        <w:rPr/>
+      </w:pPr>
+      <w:r>
+        <w:rPr/>
+        <w:t>Завдання</w:t>
+      </w:r>
+    </w:p>
+    <w:p>
+      <w:pPr>
+        <w:pStyle w:val="p11"/>
+        <w:rPr/>
+      </w:pPr>
+      <w:r>
+        <w:rPr/>
+      </w:r>
+    </w:p>
+    <w:p>
+      <w:pPr>
+        <w:pStyle w:val="p11"/>
+        <w:rPr/>
+      </w:pPr>
+      <w:r>
+        <w:rPr/>
+        <w:t>5.1.2.1 Розробити послідовні алгоритм та програму обчислення числа π з можливістю вимірювання часу роботи програми для заданого n та визначення помилки апроксимації інтеграла. Для цього використовуйте функцію вимірювання часу бібліотеки MPI, як еталонне значення числа π прийміть 3.141592653589793238462643.</w:t>
+      </w:r>
+    </w:p>
+    <w:p>
+      <w:pPr>
+        <w:pStyle w:val="p11"/>
+        <w:rPr/>
+      </w:pPr>
+      <w:r>
+        <w:rPr/>
+        <w:t>Дослідіть точність та швидкодію програми обчислення π для значень кількості інтервалів 10</w:t>
+      </w:r>
+      <w:r>
+        <w:rPr>
+          <w:vertAlign w:val="superscript"/>
+        </w:rPr>
+        <w:t>3</w:t>
+      </w:r>
+      <w:r>
+        <w:rPr/>
+        <w:t>, 10</w:t>
+      </w:r>
+      <w:r>
+        <w:rPr>
+          <w:vertAlign w:val="superscript"/>
+        </w:rPr>
+        <w:t>4</w:t>
+      </w:r>
+      <w:r>
+        <w:rPr/>
+        <w:t>, 10</w:t>
+      </w:r>
+      <w:r>
+        <w:rPr>
+          <w:vertAlign w:val="superscript"/>
+        </w:rPr>
+        <w:t>5</w:t>
+      </w:r>
+      <w:r>
+        <w:rPr/>
+        <w:t>, 10</w:t>
+      </w:r>
+      <w:r>
+        <w:rPr>
+          <w:vertAlign w:val="superscript"/>
+        </w:rPr>
+        <w:t>6</w:t>
+      </w:r>
+      <w:r>
+        <w:rPr/>
+        <w:t>, 10</w:t>
+      </w:r>
+      <w:r>
+        <w:rPr>
+          <w:vertAlign w:val="superscript"/>
+        </w:rPr>
+        <w:t>7</w:t>
+      </w:r>
+      <w:r>
+        <w:rPr/>
+        <w:t>, 10</w:t>
+      </w:r>
+      <w:r>
+        <w:rPr>
+          <w:vertAlign w:val="superscript"/>
+        </w:rPr>
+        <w:t>9</w:t>
+      </w:r>
+      <w:r>
+        <w:rPr/>
+        <w:t>. Результати подайте у звіті у вигляді таблиці.</w:t>
+      </w:r>
+    </w:p>
+    <w:p>
+      <w:pPr>
+        <w:pStyle w:val="p11"/>
+        <w:rPr/>
+      </w:pPr>
+      <w:r>
+        <w:rPr/>
+      </w:r>
+    </w:p>
+    <w:p>
+      <w:pPr>
+        <w:pStyle w:val="H2"/>
+        <w:rPr/>
+      </w:pPr>
+      <w:r>
+        <w:rPr/>
+        <w:t>Код</w:t>
+      </w:r>
+    </w:p>
+    <w:p>
+      <w:pPr>
+        <w:pStyle w:val="p11"/>
+        <w:rPr/>
+      </w:pPr>
+      <w:r>
+        <w:rPr/>
+      </w:r>
+    </w:p>
+    <w:p>
+      <w:pPr>
+        <w:pStyle w:val="Code"/>
+        <w:rPr>
+          <w:rFonts w:ascii="Cascadia Code" w:hAnsi="Cascadia Code"/>
+        </w:rPr>
+      </w:pPr>
+      <w:r>
+        <w:rPr>
+          <w:rFonts w:ascii="Cascadia Code" w:hAnsi="Cascadia Code"/>
+        </w:rPr>
+        <w:t>from mpi4py import MPI</w:t>
+      </w:r>
+    </w:p>
+    <w:p>
+      <w:pPr>
+        <w:pStyle w:val="Code"/>
+        <w:rPr>
+          <w:rFonts w:ascii="Cascadia Code" w:hAnsi="Cascadia Code"/>
+        </w:rPr>
+      </w:pPr>
+      <w:r>
+        <w:rPr>
+          <w:rFonts w:ascii="Cascadia Code" w:hAnsi="Cascadia Code"/>
+        </w:rPr>
+      </w:r>
+    </w:p>
+    <w:p>
+      <w:pPr>
+        <w:pStyle w:val="Code"/>
+        <w:rPr>
+          <w:rFonts w:ascii="Cascadia Code" w:hAnsi="Cascadia Code"/>
+        </w:rPr>
+      </w:pPr>
+      <w:r>
+        <w:rPr>
+          <w:rFonts w:ascii="Cascadia Code" w:hAnsi="Cascadia Code"/>
+        </w:rPr>
+      </w:r>
+    </w:p>
+    <w:p>
+      <w:pPr>
+        <w:pStyle w:val="Code"/>
+        <w:rPr>
+          <w:rFonts w:ascii="Cascadia Code" w:hAnsi="Cascadia Code"/>
+        </w:rPr>
+      </w:pPr>
+      <w:r>
+        <w:rPr>
+          <w:rFonts w:ascii="Cascadia Code" w:hAnsi="Cascadia Code"/>
+        </w:rPr>
+        <w:t>def calculate_pi(n):</w:t>
+      </w:r>
+    </w:p>
+    <w:p>
+      <w:pPr>
+        <w:pStyle w:val="Code"/>
+        <w:rPr>
+          <w:rFonts w:ascii="Cascadia Code" w:hAnsi="Cascadia Code"/>
+        </w:rPr>
+      </w:pPr>
+      <w:r>
+        <w:rPr>
+          <w:rFonts w:ascii="Cascadia Code" w:hAnsi="Cascadia Code"/>
+        </w:rPr>
+        <w:t xml:space="preserve">    </w:t>
+      </w:r>
+      <w:r>
+        <w:rPr>
+          <w:rFonts w:ascii="Cascadia Code" w:hAnsi="Cascadia Code"/>
+        </w:rPr>
+        <w:t>step = 1.0 / n</w:t>
+      </w:r>
+    </w:p>
+    <w:p>
+      <w:pPr>
+        <w:pStyle w:val="Code"/>
+        <w:rPr>
+          <w:rFonts w:ascii="Cascadia Code" w:hAnsi="Cascadia Code"/>
+        </w:rPr>
+      </w:pPr>
+      <w:r>
+        <w:rPr>
+          <w:rFonts w:ascii="Cascadia Code" w:hAnsi="Cascadia Code"/>
+        </w:rPr>
+        <w:t xml:space="preserve">    </w:t>
+      </w:r>
+      <w:r>
+        <w:rPr>
+          <w:rFonts w:ascii="Cascadia Code" w:hAnsi="Cascadia Code"/>
+        </w:rPr>
+        <w:t>total_sum = 0.0</w:t>
+      </w:r>
+    </w:p>
+    <w:p>
+      <w:pPr>
+        <w:pStyle w:val="Code"/>
+        <w:rPr>
+          <w:rFonts w:ascii="Cascadia Code" w:hAnsi="Cascadia Code"/>
+        </w:rPr>
+      </w:pPr>
+      <w:r>
+        <w:rPr>
+          <w:rFonts w:ascii="Cascadia Code" w:hAnsi="Cascadia Code"/>
+        </w:rPr>
+      </w:r>
+    </w:p>
+    <w:p>
+      <w:pPr>
+        <w:pStyle w:val="Code"/>
+        <w:rPr>
+          <w:rFonts w:ascii="Cascadia Code" w:hAnsi="Cascadia Code"/>
+        </w:rPr>
+      </w:pPr>
+      <w:r>
+        <w:rPr>
+          <w:rFonts w:ascii="Cascadia Code" w:hAnsi="Cascadia Code"/>
+        </w:rPr>
+        <w:t xml:space="preserve">    </w:t>
+      </w:r>
+      <w:r>
+        <w:rPr>
+          <w:rFonts w:ascii="Cascadia Code" w:hAnsi="Cascadia Code"/>
+        </w:rPr>
+        <w:t>start_time = MPI.Wtime()</w:t>
+      </w:r>
+    </w:p>
+    <w:p>
+      <w:pPr>
+        <w:pStyle w:val="Code"/>
+        <w:rPr>
+          <w:rFonts w:ascii="Cascadia Code" w:hAnsi="Cascadia Code"/>
+        </w:rPr>
+      </w:pPr>
+      <w:r>
+        <w:rPr>
+          <w:rFonts w:ascii="Cascadia Code" w:hAnsi="Cascadia Code"/>
+        </w:rPr>
+      </w:r>
+    </w:p>
+    <w:p>
+      <w:pPr>
+        <w:pStyle w:val="Code"/>
+        <w:rPr>
+          <w:rFonts w:ascii="Cascadia Code" w:hAnsi="Cascadia Code"/>
+        </w:rPr>
+      </w:pPr>
+      <w:r>
+        <w:rPr>
+          <w:rFonts w:ascii="Cascadia Code" w:hAnsi="Cascadia Code"/>
+        </w:rPr>
+        <w:t xml:space="preserve">    </w:t>
+      </w:r>
+      <w:r>
+        <w:rPr>
+          <w:rFonts w:ascii="Cascadia Code" w:hAnsi="Cascadia Code"/>
+        </w:rPr>
+        <w:t>for i in range(n):</w:t>
+      </w:r>
+    </w:p>
+    <w:p>
+      <w:pPr>
+        <w:pStyle w:val="Code"/>
+        <w:rPr>
+          <w:rFonts w:ascii="Cascadia Code" w:hAnsi="Cascadia Code"/>
+        </w:rPr>
+      </w:pPr>
+      <w:r>
+        <w:rPr>
+          <w:rFonts w:ascii="Cascadia Code" w:hAnsi="Cascadia Code"/>
+        </w:rPr>
+        <w:t xml:space="preserve">        </w:t>
+      </w:r>
+      <w:r>
+        <w:rPr>
+          <w:rFonts w:ascii="Cascadia Code" w:hAnsi="Cascadia Code"/>
+        </w:rPr>
+        <w:t>x = (i + 0.5) * step</w:t>
+      </w:r>
+    </w:p>
+    <w:p>
+      <w:pPr>
+        <w:pStyle w:val="Code"/>
+        <w:rPr>
+          <w:rFonts w:ascii="Cascadia Code" w:hAnsi="Cascadia Code"/>
+        </w:rPr>
+      </w:pPr>
+      <w:r>
+        <w:rPr>
+          <w:rFonts w:ascii="Cascadia Code" w:hAnsi="Cascadia Code"/>
+        </w:rPr>
+        <w:t xml:space="preserve">        </w:t>
+      </w:r>
+      <w:r>
+        <w:rPr>
+          <w:rFonts w:ascii="Cascadia Code" w:hAnsi="Cascadia Code"/>
+        </w:rPr>
+        <w:t>total_sum += 4.0 / (1.0 + x * x)</w:t>
+      </w:r>
+    </w:p>
+    <w:p>
+      <w:pPr>
+        <w:pStyle w:val="Code"/>
+        <w:rPr>
+          <w:rFonts w:ascii="Cascadia Code" w:hAnsi="Cascadia Code"/>
+        </w:rPr>
+      </w:pPr>
+      <w:r>
+        <w:rPr>
+          <w:rFonts w:ascii="Cascadia Code" w:hAnsi="Cascadia Code"/>
+        </w:rPr>
+        <w:t xml:space="preserve">    </w:t>
+      </w:r>
+      <w:r>
+        <w:rPr>
+          <w:rFonts w:ascii="Cascadia Code" w:hAnsi="Cascadia Code"/>
+        </w:rPr>
+        <w:t>pi_approx = total_sum * step</w:t>
+      </w:r>
+    </w:p>
+    <w:p>
+      <w:pPr>
+        <w:pStyle w:val="Code"/>
+        <w:rPr>
+          <w:rFonts w:ascii="Cascadia Code" w:hAnsi="Cascadia Code"/>
+        </w:rPr>
+      </w:pPr>
+      <w:r>
+        <w:rPr>
+          <w:rFonts w:ascii="Cascadia Code" w:hAnsi="Cascadia Code"/>
+        </w:rPr>
+      </w:r>
+    </w:p>
+    <w:p>
+      <w:pPr>
+        <w:pStyle w:val="Code"/>
+        <w:rPr>
+          <w:rFonts w:ascii="Cascadia Code" w:hAnsi="Cascadia Code"/>
+        </w:rPr>
+      </w:pPr>
+      <w:r>
+        <w:rPr>
+          <w:rFonts w:ascii="Cascadia Code" w:hAnsi="Cascadia Code"/>
+        </w:rPr>
+        <w:t xml:space="preserve">    </w:t>
+      </w:r>
+      <w:r>
+        <w:rPr>
+          <w:rFonts w:ascii="Cascadia Code" w:hAnsi="Cascadia Code"/>
+        </w:rPr>
+        <w:t>end_time = MPI.Wtime()</w:t>
+      </w:r>
+    </w:p>
+    <w:p>
+      <w:pPr>
+        <w:pStyle w:val="Code"/>
+        <w:rPr>
+          <w:rFonts w:ascii="Cascadia Code" w:hAnsi="Cascadia Code"/>
+        </w:rPr>
+      </w:pPr>
+      <w:r>
+        <w:rPr>
+          <w:rFonts w:ascii="Cascadia Code" w:hAnsi="Cascadia Code"/>
+        </w:rPr>
+      </w:r>
+    </w:p>
+    <w:p>
+      <w:pPr>
+        <w:pStyle w:val="Code"/>
+        <w:rPr>
+          <w:rFonts w:ascii="Cascadia Code" w:hAnsi="Cascadia Code"/>
+        </w:rPr>
+      </w:pPr>
+      <w:r>
+        <w:rPr>
+          <w:rFonts w:ascii="Cascadia Code" w:hAnsi="Cascadia Code"/>
+        </w:rPr>
+        <w:t xml:space="preserve">    </w:t>
+      </w:r>
+      <w:r>
+        <w:rPr>
+          <w:rFonts w:ascii="Cascadia Code" w:hAnsi="Cascadia Code"/>
+        </w:rPr>
+        <w:t>return pi_approx, end_time - start_time</w:t>
+      </w:r>
+    </w:p>
+    <w:p>
+      <w:pPr>
+        <w:pStyle w:val="Code"/>
+        <w:rPr>
+          <w:rFonts w:ascii="Cascadia Code" w:hAnsi="Cascadia Code"/>
+        </w:rPr>
+      </w:pPr>
+      <w:r>
+        <w:rPr>
+          <w:rFonts w:ascii="Cascadia Code" w:hAnsi="Cascadia Code"/>
+        </w:rPr>
+      </w:r>
+    </w:p>
+    <w:p>
+      <w:pPr>
+        <w:pStyle w:val="Code"/>
+        <w:rPr>
+          <w:rFonts w:ascii="Cascadia Code" w:hAnsi="Cascadia Code"/>
+        </w:rPr>
+      </w:pPr>
+      <w:r>
+        <w:rPr>
+          <w:rFonts w:ascii="Cascadia Code" w:hAnsi="Cascadia Code"/>
+        </w:rPr>
+      </w:r>
+    </w:p>
+    <w:p>
+      <w:pPr>
+        <w:pStyle w:val="Code"/>
+        <w:rPr>
+          <w:rFonts w:ascii="Cascadia Code" w:hAnsi="Cascadia Code"/>
+        </w:rPr>
+      </w:pPr>
+      <w:r>
+        <w:rPr>
+          <w:rFonts w:ascii="Cascadia Code" w:hAnsi="Cascadia Code"/>
+        </w:rPr>
+        <w:t>def main():</w:t>
+      </w:r>
+    </w:p>
+    <w:p>
+      <w:pPr>
+        <w:pStyle w:val="Code"/>
+        <w:rPr>
+          <w:rFonts w:ascii="Cascadia Code" w:hAnsi="Cascadia Code"/>
+        </w:rPr>
+      </w:pPr>
+      <w:r>
+        <w:rPr>
+          <w:rFonts w:ascii="Cascadia Code" w:hAnsi="Cascadia Code"/>
+        </w:rPr>
+        <w:t xml:space="preserve">    </w:t>
+      </w:r>
+      <w:r>
+        <w:rPr>
+          <w:rFonts w:ascii="Cascadia Code" w:hAnsi="Cascadia Code"/>
+        </w:rPr>
+        <w:t>PI_REF = 3.141592653589793238462643</w:t>
+      </w:r>
+    </w:p>
+    <w:p>
+      <w:pPr>
+        <w:pStyle w:val="Code"/>
+        <w:rPr>
+          <w:rFonts w:ascii="Cascadia Code" w:hAnsi="Cascadia Code"/>
+        </w:rPr>
+      </w:pPr>
+      <w:r>
+        <w:rPr>
+          <w:rFonts w:ascii="Cascadia Code" w:hAnsi="Cascadia Code"/>
+        </w:rPr>
+      </w:r>
+    </w:p>
+    <w:p>
+      <w:pPr>
+        <w:pStyle w:val="Code"/>
+        <w:rPr>
+          <w:rFonts w:ascii="Cascadia Code" w:hAnsi="Cascadia Code"/>
+        </w:rPr>
+      </w:pPr>
+      <w:r>
+        <w:rPr>
+          <w:rFonts w:ascii="Cascadia Code" w:hAnsi="Cascadia Code"/>
+        </w:rPr>
+        <w:t xml:space="preserve">    </w:t>
+      </w:r>
+      <w:r>
+        <w:rPr>
+          <w:rFonts w:ascii="Cascadia Code" w:hAnsi="Cascadia Code"/>
+        </w:rPr>
+        <w:t>n_values = [10**3, 10**4, 10**5, 10**6, 10**7, 10**9]</w:t>
+      </w:r>
+    </w:p>
+    <w:p>
+      <w:pPr>
+        <w:pStyle w:val="Code"/>
+        <w:rPr>
+          <w:rFonts w:ascii="Cascadia Code" w:hAnsi="Cascadia Code"/>
+        </w:rPr>
+      </w:pPr>
+      <w:r>
+        <w:rPr>
+          <w:rFonts w:ascii="Cascadia Code" w:hAnsi="Cascadia Code"/>
+        </w:rPr>
+      </w:r>
+    </w:p>
+    <w:p>
+      <w:pPr>
+        <w:pStyle w:val="Code"/>
+        <w:rPr>
+          <w:rFonts w:ascii="Cascadia Code" w:hAnsi="Cascadia Code"/>
+        </w:rPr>
+      </w:pPr>
+      <w:r>
+        <w:rPr>
+          <w:rFonts w:ascii="Cascadia Code" w:hAnsi="Cascadia Code"/>
+        </w:rPr>
+        <w:t xml:space="preserve">    </w:t>
+      </w:r>
+      <w:r>
+        <w:rPr>
+          <w:rFonts w:ascii="Cascadia Code" w:hAnsi="Cascadia Code"/>
+        </w:rPr>
+        <w:t>print(f"{'n':&lt;12} | {'Calculated PI':&lt;18} | {'Error':&lt;21} | {'Time (sec)':&lt;12}")</w:t>
+      </w:r>
+    </w:p>
+    <w:p>
+      <w:pPr>
+        <w:pStyle w:val="Code"/>
+        <w:rPr>
+          <w:rFonts w:ascii="Cascadia Code" w:hAnsi="Cascadia Code"/>
+        </w:rPr>
+      </w:pPr>
+      <w:r>
+        <w:rPr>
+          <w:rFonts w:ascii="Cascadia Code" w:hAnsi="Cascadia Code"/>
+        </w:rPr>
+        <w:t xml:space="preserve">    </w:t>
+      </w:r>
+      <w:r>
+        <w:rPr>
+          <w:rFonts w:ascii="Cascadia Code" w:hAnsi="Cascadia Code"/>
+        </w:rPr>
+        <w:t>print("-" * 70)</w:t>
+      </w:r>
+    </w:p>
+    <w:p>
+      <w:pPr>
+        <w:pStyle w:val="Code"/>
+        <w:rPr>
+          <w:rFonts w:ascii="Cascadia Code" w:hAnsi="Cascadia Code"/>
+        </w:rPr>
+      </w:pPr>
+      <w:r>
+        <w:rPr>
+          <w:rFonts w:ascii="Cascadia Code" w:hAnsi="Cascadia Code"/>
+        </w:rPr>
+      </w:r>
+    </w:p>
+    <w:p>
+      <w:pPr>
+        <w:pStyle w:val="Code"/>
+        <w:rPr>
+          <w:rFonts w:ascii="Cascadia Code" w:hAnsi="Cascadia Code"/>
+        </w:rPr>
+      </w:pPr>
+      <w:r>
+        <w:rPr>
+          <w:rFonts w:ascii="Cascadia Code" w:hAnsi="Cascadia Code"/>
+        </w:rPr>
+        <w:t xml:space="preserve">    </w:t>
+      </w:r>
+      <w:r>
+        <w:rPr>
+          <w:rFonts w:ascii="Cascadia Code" w:hAnsi="Cascadia Code"/>
+        </w:rPr>
+        <w:t>for n in n_values:</w:t>
+      </w:r>
+    </w:p>
+    <w:p>
+      <w:pPr>
+        <w:pStyle w:val="Code"/>
+        <w:rPr>
+          <w:rFonts w:ascii="Cascadia Code" w:hAnsi="Cascadia Code"/>
+        </w:rPr>
+      </w:pPr>
+      <w:r>
+        <w:rPr>
+          <w:rFonts w:ascii="Cascadia Code" w:hAnsi="Cascadia Code"/>
+        </w:rPr>
+        <w:t xml:space="preserve">        </w:t>
+      </w:r>
+      <w:r>
+        <w:rPr>
+          <w:rFonts w:ascii="Cascadia Code" w:hAnsi="Cascadia Code"/>
+        </w:rPr>
+        <w:t>pi_val, duration = calculate_pi(n)</w:t>
+      </w:r>
+    </w:p>
+    <w:p>
+      <w:pPr>
+        <w:pStyle w:val="Code"/>
+        <w:rPr>
+          <w:rFonts w:ascii="Cascadia Code" w:hAnsi="Cascadia Code"/>
+        </w:rPr>
+      </w:pPr>
+      <w:r>
+        <w:rPr>
+          <w:rFonts w:ascii="Cascadia Code" w:hAnsi="Cascadia Code"/>
+        </w:rPr>
+        <w:t xml:space="preserve">        </w:t>
+      </w:r>
+      <w:r>
+        <w:rPr>
+          <w:rFonts w:ascii="Cascadia Code" w:hAnsi="Cascadia Code"/>
+        </w:rPr>
+        <w:t>error = abs(PI_REF - pi_val)</w:t>
+      </w:r>
+    </w:p>
+    <w:p>
+      <w:pPr>
+        <w:pStyle w:val="Code"/>
+        <w:rPr>
+          <w:rFonts w:ascii="Cascadia Code" w:hAnsi="Cascadia Code"/>
+        </w:rPr>
+      </w:pPr>
+      <w:r>
+        <w:rPr>
+          <w:rFonts w:ascii="Cascadia Code" w:hAnsi="Cascadia Code"/>
+        </w:rPr>
+      </w:r>
+    </w:p>
+    <w:p>
+      <w:pPr>
+        <w:pStyle w:val="Code"/>
+        <w:rPr>
+          <w:rFonts w:ascii="Cascadia Code" w:hAnsi="Cascadia Code"/>
+        </w:rPr>
+      </w:pPr>
+      <w:r>
+        <w:rPr>
+          <w:rFonts w:ascii="Cascadia Code" w:hAnsi="Cascadia Code"/>
+        </w:rPr>
+        <w:t xml:space="preserve">        </w:t>
+      </w:r>
+      <w:r>
+        <w:rPr>
+          <w:rFonts w:ascii="Cascadia Code" w:hAnsi="Cascadia Code"/>
+        </w:rPr>
+        <w:t>print(f"{n:&lt;12e} | {pi_val:&lt;18.15f} | {error:&lt;18.15e} | {duration:&lt;12.6f}")</w:t>
+      </w:r>
+    </w:p>
+    <w:p>
+      <w:pPr>
+        <w:pStyle w:val="Code"/>
+        <w:rPr>
+          <w:rFonts w:ascii="Cascadia Code" w:hAnsi="Cascadia Code"/>
+        </w:rPr>
+      </w:pPr>
+      <w:r>
+        <w:rPr>
+          <w:rFonts w:ascii="Cascadia Code" w:hAnsi="Cascadia Code"/>
+        </w:rPr>
+      </w:r>
+    </w:p>
+    <w:p>
+      <w:pPr>
+        <w:pStyle w:val="Code"/>
+        <w:rPr>
+          <w:rFonts w:ascii="Cascadia Code" w:hAnsi="Cascadia Code"/>
+        </w:rPr>
+      </w:pPr>
+      <w:r>
+        <w:rPr>
+          <w:rFonts w:ascii="Cascadia Code" w:hAnsi="Cascadia Code"/>
+        </w:rPr>
+      </w:r>
+    </w:p>
+    <w:p>
+      <w:pPr>
+        <w:pStyle w:val="Code"/>
+        <w:rPr>
+          <w:rFonts w:ascii="Cascadia Code" w:hAnsi="Cascadia Code"/>
+        </w:rPr>
+      </w:pPr>
+      <w:r>
+        <w:rPr>
+          <w:rFonts w:ascii="Cascadia Code" w:hAnsi="Cascadia Code"/>
+        </w:rPr>
+        <w:t>if __name__ == "__main__":</w:t>
+      </w:r>
+    </w:p>
+    <w:p>
+      <w:pPr>
+        <w:pStyle w:val="Code"/>
+        <w:rPr>
+          <w:rFonts w:ascii="Cascadia Code" w:hAnsi="Cascadia Code"/>
+        </w:rPr>
+      </w:pPr>
+      <w:r>
+        <w:rPr>
+          <w:rFonts w:ascii="Cascadia Code" w:hAnsi="Cascadia Code"/>
+        </w:rPr>
+        <w:t xml:space="preserve">    </w:t>
+      </w:r>
+      <w:r>
+        <w:rPr>
+          <w:rFonts w:ascii="Cascadia Code" w:hAnsi="Cascadia Code"/>
+        </w:rPr>
+        <w:t>main()</w:t>
+      </w:r>
+    </w:p>
+    <w:p>
+      <w:pPr>
+        <w:pStyle w:val="P1"/>
+        <w:rPr>
+          <w:rFonts w:ascii="Cascadia Code" w:hAnsi="Cascadia Code"/>
+        </w:rPr>
+      </w:pPr>
+      <w:r>
+        <w:rPr>
+          <w:rFonts w:ascii="Cascadia Code" w:hAnsi="Cascadia Code"/>
+        </w:rPr>
+      </w:r>
+    </w:p>
+    <w:p>
+      <w:pPr>
+        <w:pStyle w:val="H2"/>
+        <w:rPr/>
+      </w:pPr>
+      <w:r>
+        <w:rPr/>
+        <w:t>Таблиця</w:t>
+      </w:r>
+    </w:p>
+    <w:p>
+      <w:pPr>
+        <w:pStyle w:val="P1"/>
+        <w:rPr/>
+      </w:pPr>
+      <w:r>
+        <w:rPr/>
+      </w:r>
+    </w:p>
+    <w:tbl>
+      <w:tblPr>
+        <w:tblW w:w="7959" w:type="dxa"/>
+        <w:jc w:val="left"/>
+        <w:tblInd w:w="55" w:type="dxa"/>
+        <w:tblLayout w:type="fixed"/>
+        <w:tblCellMar>
+          <w:top w:w="55" w:type="dxa"/>
+          <w:left w:w="55" w:type="dxa"/>
+          <w:bottom w:w="55" w:type="dxa"/>
+          <w:right w:w="55" w:type="dxa"/>
+        </w:tblCellMar>
+      </w:tblPr>
+      <w:tblGrid>
+        <w:gridCol w:w="1397"/>
+        <w:gridCol w:w="2111"/>
+        <w:gridCol w:w="2537"/>
+        <w:gridCol w:w="1914"/>
+      </w:tblGrid>
+      <w:tr>
+        <w:trPr/>
+        <w:tc>
+          <w:tcPr>
+            <w:tcW w:w="1397" w:type="dxa"/>
+            <w:tcBorders>
+              <w:top w:val="single" w:sz="4" w:space="0" w:color="000000"/>
+              <w:left w:val="single" w:sz="4" w:space="0" w:color="000000"/>
+              <w:bottom w:val="single" w:sz="4" w:space="0" w:color="000000"/>
+            </w:tcBorders>
+            <w:vAlign w:val="center"/>
+          </w:tcPr>
+          <w:p>
+            <w:pPr>
+              <w:pStyle w:val="Style14"/>
+              <w:spacing w:lineRule="auto" w:line="240"/>
+              <w:ind w:hanging="0" w:left="0"/>
+              <w:rPr>
+                <w:b/>
+                <w:bCs/>
+                <w:sz w:val="24"/>
+                <w:szCs w:val="24"/>
+                <w:lang w:val="uk-UA"/>
+              </w:rPr>
+            </w:pPr>
+            <w:r>
+              <w:rPr>
+                <w:b/>
+                <w:bCs/>
+                <w:sz w:val="24"/>
+                <w:szCs w:val="24"/>
+                <w:lang w:val="uk-UA"/>
+              </w:rPr>
+              <w:t xml:space="preserve">Значення </w:t>
+            </w:r>
+            <w:r>
+              <w:rPr>
+                <w:b/>
+                <w:bCs/>
+                <w:sz w:val="24"/>
+                <w:szCs w:val="24"/>
+                <w:lang w:val="en-US"/>
+              </w:rPr>
+              <w:t>N</w:t>
+            </w:r>
+          </w:p>
+        </w:tc>
+        <w:tc>
+          <w:tcPr>
+            <w:tcW w:w="2111" w:type="dxa"/>
+            <w:tcBorders>
+              <w:top w:val="single" w:sz="4" w:space="0" w:color="000000"/>
+              <w:left w:val="single" w:sz="4" w:space="0" w:color="000000"/>
+              <w:bottom w:val="single" w:sz="4" w:space="0" w:color="000000"/>
+            </w:tcBorders>
+            <w:vAlign w:val="center"/>
+          </w:tcPr>
+          <w:p>
+            <w:pPr>
+              <w:pStyle w:val="Style14"/>
+              <w:spacing w:lineRule="auto" w:line="240"/>
+              <w:ind w:hanging="0" w:left="0"/>
+              <w:rPr>
+                <w:b/>
+                <w:bCs/>
+                <w:sz w:val="24"/>
+                <w:szCs w:val="24"/>
+              </w:rPr>
+            </w:pPr>
+            <w:r>
+              <w:rPr>
+                <w:b/>
+                <w:bCs/>
+                <w:sz w:val="24"/>
+                <w:szCs w:val="24"/>
+              </w:rPr>
+              <w:t>Обчислений ПІ</w:t>
+            </w:r>
+          </w:p>
+        </w:tc>
+        <w:tc>
+          <w:tcPr>
+            <w:tcW w:w="2537" w:type="dxa"/>
+            <w:tcBorders>
+              <w:top w:val="single" w:sz="4" w:space="0" w:color="000000"/>
+              <w:left w:val="single" w:sz="4" w:space="0" w:color="000000"/>
+              <w:bottom w:val="single" w:sz="4" w:space="0" w:color="000000"/>
+            </w:tcBorders>
+            <w:vAlign w:val="center"/>
+          </w:tcPr>
+          <w:p>
+            <w:pPr>
+              <w:pStyle w:val="Style14"/>
+              <w:spacing w:lineRule="auto" w:line="240"/>
+              <w:ind w:hanging="0" w:left="0"/>
+              <w:rPr>
+                <w:b/>
+                <w:bCs/>
+                <w:sz w:val="24"/>
+                <w:szCs w:val="24"/>
+              </w:rPr>
+            </w:pPr>
+            <w:r>
+              <w:rPr>
+                <w:b/>
+                <w:bCs/>
+                <w:sz w:val="24"/>
+                <w:szCs w:val="24"/>
+              </w:rPr>
+              <w:t>Помилка</w:t>
+            </w:r>
+          </w:p>
+        </w:tc>
+        <w:tc>
+          <w:tcPr>
+            <w:tcW w:w="1914" w:type="dxa"/>
+            <w:tcBorders>
+              <w:top w:val="single" w:sz="4" w:space="0" w:color="000000"/>
+              <w:left w:val="single" w:sz="4" w:space="0" w:color="000000"/>
+              <w:bottom w:val="single" w:sz="4" w:space="0" w:color="000000"/>
+              <w:right w:val="single" w:sz="4" w:space="0" w:color="000000"/>
+            </w:tcBorders>
+            <w:vAlign w:val="center"/>
+          </w:tcPr>
+          <w:p>
+            <w:pPr>
+              <w:pStyle w:val="Style14"/>
+              <w:spacing w:lineRule="auto" w:line="240"/>
+              <w:ind w:hanging="0" w:left="0"/>
+              <w:rPr>
+                <w:b/>
+                <w:bCs/>
+                <w:sz w:val="24"/>
+                <w:szCs w:val="24"/>
+              </w:rPr>
+            </w:pPr>
+            <w:r>
+              <w:rPr>
+                <w:b/>
+                <w:bCs/>
+                <w:sz w:val="24"/>
+                <w:szCs w:val="24"/>
+              </w:rPr>
+              <w:t>Час роботи (сек)</w:t>
+            </w:r>
+          </w:p>
+        </w:tc>
+      </w:tr>
+      <w:tr>
+        <w:trPr/>
+        <w:tc>
+          <w:tcPr>
+            <w:tcW w:w="1397" w:type="dxa"/>
+            <w:tcBorders>
+              <w:left w:val="single" w:sz="4" w:space="0" w:color="000000"/>
+              <w:bottom w:val="single" w:sz="4" w:space="0" w:color="000000"/>
+            </w:tcBorders>
+            <w:vAlign w:val="center"/>
+          </w:tcPr>
+          <w:p>
+            <w:pPr>
+              <w:pStyle w:val="Style14"/>
+              <w:spacing w:lineRule="auto" w:line="240"/>
+              <w:ind w:hanging="0" w:left="0"/>
+              <w:rPr>
+                <w:sz w:val="24"/>
+                <w:szCs w:val="24"/>
+                <w:lang w:val="uk-UA"/>
+              </w:rPr>
+            </w:pPr>
+            <w:r>
+              <w:rPr>
+                <w:sz w:val="24"/>
+                <w:szCs w:val="24"/>
+                <w:lang w:val="uk-UA"/>
+              </w:rPr>
+              <w:t>10</w:t>
+            </w:r>
+            <w:r>
+              <w:rPr>
+                <w:sz w:val="24"/>
+                <w:szCs w:val="24"/>
+                <w:vertAlign w:val="superscript"/>
+                <w:lang w:val="uk-UA"/>
+              </w:rPr>
+              <w:t>3</w:t>
+            </w:r>
+          </w:p>
+        </w:tc>
+        <w:tc>
+          <w:tcPr>
+            <w:tcW w:w="2111" w:type="dxa"/>
+            <w:tcBorders>
+              <w:left w:val="single" w:sz="4" w:space="0" w:color="000000"/>
+              <w:bottom w:val="single" w:sz="4" w:space="0" w:color="000000"/>
+            </w:tcBorders>
+            <w:vAlign w:val="center"/>
+          </w:tcPr>
+          <w:p>
+            <w:pPr>
+              <w:pStyle w:val="Style14"/>
+              <w:spacing w:lineRule="auto" w:line="240"/>
+              <w:ind w:hanging="0" w:left="0"/>
+              <w:rPr>
+                <w:sz w:val="24"/>
+                <w:szCs w:val="24"/>
+              </w:rPr>
+            </w:pPr>
+            <w:r>
+              <w:rPr>
+                <w:sz w:val="24"/>
+                <w:szCs w:val="24"/>
+              </w:rPr>
+              <w:t>3.141592736923123</w:t>
+            </w:r>
+          </w:p>
+        </w:tc>
+        <w:tc>
+          <w:tcPr>
+            <w:tcW w:w="2537" w:type="dxa"/>
+            <w:tcBorders>
+              <w:left w:val="single" w:sz="4" w:space="0" w:color="000000"/>
+              <w:bottom w:val="single" w:sz="4" w:space="0" w:color="000000"/>
+            </w:tcBorders>
+            <w:vAlign w:val="center"/>
+          </w:tcPr>
+          <w:p>
+            <w:pPr>
+              <w:pStyle w:val="Style14"/>
+              <w:spacing w:lineRule="auto" w:line="240"/>
+              <w:ind w:hanging="0" w:left="0"/>
+              <w:rPr>
+                <w:sz w:val="24"/>
+                <w:szCs w:val="24"/>
+              </w:rPr>
+            </w:pPr>
+            <w:r>
+              <w:rPr>
+                <w:sz w:val="24"/>
+                <w:szCs w:val="24"/>
+              </w:rPr>
+              <w:t>8.333332957022321e-08</w:t>
+            </w:r>
+          </w:p>
+        </w:tc>
+        <w:tc>
+          <w:tcPr>
+            <w:tcW w:w="1914" w:type="dxa"/>
+            <w:tcBorders>
+              <w:left w:val="single" w:sz="4" w:space="0" w:color="000000"/>
+              <w:bottom w:val="single" w:sz="4" w:space="0" w:color="000000"/>
+              <w:right w:val="single" w:sz="4" w:space="0" w:color="000000"/>
+            </w:tcBorders>
+            <w:vAlign w:val="center"/>
+          </w:tcPr>
+          <w:p>
+            <w:pPr>
+              <w:pStyle w:val="Style14"/>
+              <w:spacing w:lineRule="auto" w:line="240"/>
+              <w:ind w:hanging="0" w:left="0"/>
+              <w:rPr>
+                <w:sz w:val="24"/>
+                <w:szCs w:val="24"/>
+              </w:rPr>
+            </w:pPr>
+            <w:r>
+              <w:rPr>
+                <w:sz w:val="24"/>
+                <w:szCs w:val="24"/>
+              </w:rPr>
+              <w:t>0.000097</w:t>
+            </w:r>
+          </w:p>
+        </w:tc>
+      </w:tr>
+      <w:tr>
+        <w:trPr/>
+        <w:tc>
+          <w:tcPr>
+            <w:tcW w:w="1397" w:type="dxa"/>
+            <w:tcBorders>
+              <w:left w:val="single" w:sz="4" w:space="0" w:color="000000"/>
+              <w:bottom w:val="single" w:sz="4" w:space="0" w:color="000000"/>
+            </w:tcBorders>
+            <w:vAlign w:val="center"/>
+          </w:tcPr>
+          <w:p>
+            <w:pPr>
+              <w:pStyle w:val="p11"/>
+              <w:spacing w:lineRule="auto" w:line="240"/>
+              <w:ind w:hanging="0" w:left="0"/>
+              <w:rPr>
+                <w:sz w:val="24"/>
+                <w:szCs w:val="24"/>
+              </w:rPr>
+            </w:pPr>
+            <w:r>
+              <w:rPr>
+                <w:sz w:val="24"/>
+                <w:szCs w:val="24"/>
+              </w:rPr>
+              <w:t>10</w:t>
+            </w:r>
+            <w:r>
+              <w:rPr>
+                <w:sz w:val="24"/>
+                <w:szCs w:val="24"/>
+                <w:vertAlign w:val="superscript"/>
+              </w:rPr>
+              <w:t>4</w:t>
+            </w:r>
+          </w:p>
+        </w:tc>
+        <w:tc>
+          <w:tcPr>
+            <w:tcW w:w="2111" w:type="dxa"/>
+            <w:tcBorders>
+              <w:left w:val="single" w:sz="4" w:space="0" w:color="000000"/>
+              <w:bottom w:val="single" w:sz="4" w:space="0" w:color="000000"/>
+            </w:tcBorders>
+            <w:vAlign w:val="center"/>
+          </w:tcPr>
+          <w:p>
+            <w:pPr>
+              <w:pStyle w:val="Style14"/>
+              <w:spacing w:lineRule="auto" w:line="240"/>
+              <w:ind w:hanging="0" w:left="0"/>
+              <w:rPr>
+                <w:sz w:val="24"/>
+                <w:szCs w:val="24"/>
+              </w:rPr>
+            </w:pPr>
+            <w:r>
+              <w:rPr>
+                <w:sz w:val="24"/>
+                <w:szCs w:val="24"/>
+              </w:rPr>
+              <w:t>3.141592654423134</w:t>
+            </w:r>
+          </w:p>
+        </w:tc>
+        <w:tc>
+          <w:tcPr>
+            <w:tcW w:w="2537" w:type="dxa"/>
+            <w:tcBorders>
+              <w:left w:val="single" w:sz="4" w:space="0" w:color="000000"/>
+              <w:bottom w:val="single" w:sz="4" w:space="0" w:color="000000"/>
+            </w:tcBorders>
+            <w:vAlign w:val="center"/>
+          </w:tcPr>
+          <w:p>
+            <w:pPr>
+              <w:pStyle w:val="Style14"/>
+              <w:spacing w:lineRule="auto" w:line="240"/>
+              <w:ind w:hanging="0" w:left="0"/>
+              <w:rPr>
+                <w:sz w:val="24"/>
+                <w:szCs w:val="24"/>
+              </w:rPr>
+            </w:pPr>
+            <w:r>
+              <w:rPr>
+                <w:sz w:val="24"/>
+                <w:szCs w:val="24"/>
+              </w:rPr>
+              <w:t>8.333409518002100e-10</w:t>
+            </w:r>
+          </w:p>
+        </w:tc>
+        <w:tc>
+          <w:tcPr>
+            <w:tcW w:w="1914" w:type="dxa"/>
+            <w:tcBorders>
+              <w:left w:val="single" w:sz="4" w:space="0" w:color="000000"/>
+              <w:bottom w:val="single" w:sz="4" w:space="0" w:color="000000"/>
+              <w:right w:val="single" w:sz="4" w:space="0" w:color="000000"/>
+            </w:tcBorders>
+            <w:vAlign w:val="center"/>
+          </w:tcPr>
+          <w:p>
+            <w:pPr>
+              <w:pStyle w:val="Style14"/>
+              <w:spacing w:lineRule="auto" w:line="240"/>
+              <w:ind w:hanging="0" w:left="0"/>
+              <w:rPr>
+                <w:sz w:val="24"/>
+                <w:szCs w:val="24"/>
+              </w:rPr>
+            </w:pPr>
+            <w:r>
+              <w:rPr>
+                <w:sz w:val="24"/>
+                <w:szCs w:val="24"/>
+              </w:rPr>
+              <w:t>0.000945</w:t>
+            </w:r>
+          </w:p>
+        </w:tc>
+      </w:tr>
+      <w:tr>
+        <w:trPr/>
+        <w:tc>
+          <w:tcPr>
+            <w:tcW w:w="1397" w:type="dxa"/>
+            <w:tcBorders>
+              <w:left w:val="single" w:sz="4" w:space="0" w:color="000000"/>
+              <w:bottom w:val="single" w:sz="4" w:space="0" w:color="000000"/>
+            </w:tcBorders>
+            <w:vAlign w:val="center"/>
+          </w:tcPr>
+          <w:p>
+            <w:pPr>
+              <w:pStyle w:val="p11"/>
+              <w:spacing w:lineRule="auto" w:line="240"/>
+              <w:ind w:hanging="0" w:left="0"/>
+              <w:rPr>
+                <w:vertAlign w:val="superscript"/>
+              </w:rPr>
+            </w:pPr>
+            <w:r>
+              <w:rPr>
+                <w:sz w:val="24"/>
+                <w:szCs w:val="24"/>
+              </w:rPr>
+              <w:t>10</w:t>
+            </w:r>
+            <w:r>
+              <w:rPr>
+                <w:sz w:val="24"/>
+                <w:szCs w:val="24"/>
+                <w:vertAlign w:val="superscript"/>
+              </w:rPr>
+              <w:t>5</w:t>
+            </w:r>
+          </w:p>
+        </w:tc>
+        <w:tc>
+          <w:tcPr>
+            <w:tcW w:w="2111" w:type="dxa"/>
+            <w:tcBorders>
+              <w:left w:val="single" w:sz="4" w:space="0" w:color="000000"/>
+              <w:bottom w:val="single" w:sz="4" w:space="0" w:color="000000"/>
+            </w:tcBorders>
+            <w:vAlign w:val="center"/>
+          </w:tcPr>
+          <w:p>
+            <w:pPr>
+              <w:pStyle w:val="Style14"/>
+              <w:spacing w:lineRule="auto" w:line="240"/>
+              <w:ind w:hanging="0" w:left="0"/>
+              <w:rPr>
+                <w:sz w:val="24"/>
+                <w:szCs w:val="24"/>
+              </w:rPr>
+            </w:pPr>
+            <w:r>
+              <w:rPr>
+                <w:sz w:val="24"/>
+                <w:szCs w:val="24"/>
+              </w:rPr>
+              <w:t>3.141592653598162</w:t>
+            </w:r>
+          </w:p>
+        </w:tc>
+        <w:tc>
+          <w:tcPr>
+            <w:tcW w:w="2537" w:type="dxa"/>
+            <w:tcBorders>
+              <w:left w:val="single" w:sz="4" w:space="0" w:color="000000"/>
+              <w:bottom w:val="single" w:sz="4" w:space="0" w:color="000000"/>
+            </w:tcBorders>
+            <w:vAlign w:val="center"/>
+          </w:tcPr>
+          <w:p>
+            <w:pPr>
+              <w:pStyle w:val="Style14"/>
+              <w:spacing w:lineRule="auto" w:line="240"/>
+              <w:ind w:hanging="0" w:left="0"/>
+              <w:rPr>
+                <w:sz w:val="24"/>
+                <w:szCs w:val="24"/>
+              </w:rPr>
+            </w:pPr>
+            <w:r>
+              <w:rPr>
+                <w:sz w:val="24"/>
+                <w:szCs w:val="24"/>
+              </w:rPr>
+              <w:t>8.368417070414580e-12</w:t>
+            </w:r>
+          </w:p>
+        </w:tc>
+        <w:tc>
+          <w:tcPr>
+            <w:tcW w:w="1914" w:type="dxa"/>
+            <w:tcBorders>
+              <w:left w:val="single" w:sz="4" w:space="0" w:color="000000"/>
+              <w:bottom w:val="single" w:sz="4" w:space="0" w:color="000000"/>
+              <w:right w:val="single" w:sz="4" w:space="0" w:color="000000"/>
+            </w:tcBorders>
+            <w:vAlign w:val="center"/>
+          </w:tcPr>
+          <w:p>
+            <w:pPr>
+              <w:pStyle w:val="Style14"/>
+              <w:spacing w:lineRule="auto" w:line="240"/>
+              <w:ind w:hanging="0" w:left="0"/>
+              <w:rPr>
+                <w:sz w:val="24"/>
+                <w:szCs w:val="24"/>
+              </w:rPr>
+            </w:pPr>
+            <w:r>
+              <w:rPr>
+                <w:sz w:val="24"/>
+                <w:szCs w:val="24"/>
+              </w:rPr>
+              <w:t>0.009637</w:t>
+            </w:r>
+          </w:p>
+        </w:tc>
+      </w:tr>
+      <w:tr>
+        <w:trPr/>
+        <w:tc>
+          <w:tcPr>
+            <w:tcW w:w="1397" w:type="dxa"/>
+            <w:tcBorders>
+              <w:left w:val="single" w:sz="4" w:space="0" w:color="000000"/>
+              <w:bottom w:val="single" w:sz="4" w:space="0" w:color="000000"/>
+            </w:tcBorders>
+            <w:vAlign w:val="center"/>
+          </w:tcPr>
+          <w:p>
+            <w:pPr>
+              <w:pStyle w:val="p11"/>
+              <w:spacing w:lineRule="auto" w:line="240"/>
+              <w:ind w:hanging="0" w:left="0"/>
+              <w:rPr>
+                <w:vertAlign w:val="superscript"/>
+              </w:rPr>
+            </w:pPr>
+            <w:r>
+              <w:rPr>
+                <w:sz w:val="24"/>
+                <w:szCs w:val="24"/>
+              </w:rPr>
+              <w:t>10</w:t>
+            </w:r>
+            <w:r>
+              <w:rPr>
+                <w:sz w:val="24"/>
+                <w:szCs w:val="24"/>
+                <w:vertAlign w:val="superscript"/>
+              </w:rPr>
+              <w:t>6</w:t>
+            </w:r>
+          </w:p>
+        </w:tc>
+        <w:tc>
+          <w:tcPr>
+            <w:tcW w:w="2111" w:type="dxa"/>
+            <w:tcBorders>
+              <w:left w:val="single" w:sz="4" w:space="0" w:color="000000"/>
+              <w:bottom w:val="single" w:sz="4" w:space="0" w:color="000000"/>
+            </w:tcBorders>
+            <w:vAlign w:val="center"/>
+          </w:tcPr>
+          <w:p>
+            <w:pPr>
+              <w:pStyle w:val="Style14"/>
+              <w:spacing w:lineRule="auto" w:line="240"/>
+              <w:ind w:hanging="0" w:left="0"/>
+              <w:rPr>
+                <w:sz w:val="24"/>
+                <w:szCs w:val="24"/>
+              </w:rPr>
+            </w:pPr>
+            <w:r>
+              <w:rPr>
+                <w:sz w:val="24"/>
+                <w:szCs w:val="24"/>
+              </w:rPr>
+              <w:t>3.141592653589764</w:t>
+            </w:r>
+          </w:p>
+        </w:tc>
+        <w:tc>
+          <w:tcPr>
+            <w:tcW w:w="2537" w:type="dxa"/>
+            <w:tcBorders>
+              <w:left w:val="single" w:sz="4" w:space="0" w:color="000000"/>
+              <w:bottom w:val="single" w:sz="4" w:space="0" w:color="000000"/>
+            </w:tcBorders>
+            <w:vAlign w:val="center"/>
+          </w:tcPr>
+          <w:p>
+            <w:pPr>
+              <w:pStyle w:val="Style14"/>
+              <w:spacing w:lineRule="auto" w:line="240"/>
+              <w:ind w:hanging="0" w:left="0"/>
+              <w:rPr>
+                <w:sz w:val="24"/>
+                <w:szCs w:val="24"/>
+              </w:rPr>
+            </w:pPr>
+            <w:r>
+              <w:rPr>
+                <w:sz w:val="24"/>
+                <w:szCs w:val="24"/>
+              </w:rPr>
+              <w:t>2.886579864025407e-14</w:t>
+            </w:r>
+          </w:p>
+        </w:tc>
+        <w:tc>
+          <w:tcPr>
+            <w:tcW w:w="1914" w:type="dxa"/>
+            <w:tcBorders>
+              <w:left w:val="single" w:sz="4" w:space="0" w:color="000000"/>
+              <w:bottom w:val="single" w:sz="4" w:space="0" w:color="000000"/>
+              <w:right w:val="single" w:sz="4" w:space="0" w:color="000000"/>
+            </w:tcBorders>
+            <w:vAlign w:val="center"/>
+          </w:tcPr>
+          <w:p>
+            <w:pPr>
+              <w:pStyle w:val="Style14"/>
+              <w:spacing w:lineRule="auto" w:line="240"/>
+              <w:ind w:hanging="0" w:left="0"/>
+              <w:rPr>
+                <w:sz w:val="24"/>
+                <w:szCs w:val="24"/>
+              </w:rPr>
+            </w:pPr>
+            <w:r>
+              <w:rPr>
+                <w:sz w:val="24"/>
+                <w:szCs w:val="24"/>
+              </w:rPr>
+              <w:t>0.095930</w:t>
+            </w:r>
+          </w:p>
+        </w:tc>
+      </w:tr>
+      <w:tr>
+        <w:trPr/>
+        <w:tc>
+          <w:tcPr>
+            <w:tcW w:w="1397" w:type="dxa"/>
+            <w:tcBorders>
+              <w:left w:val="single" w:sz="4" w:space="0" w:color="000000"/>
+              <w:bottom w:val="single" w:sz="4" w:space="0" w:color="000000"/>
+            </w:tcBorders>
+            <w:vAlign w:val="center"/>
+          </w:tcPr>
+          <w:p>
+            <w:pPr>
+              <w:pStyle w:val="p11"/>
+              <w:spacing w:lineRule="auto" w:line="240"/>
+              <w:ind w:hanging="0" w:left="0"/>
+              <w:rPr>
+                <w:vertAlign w:val="superscript"/>
+              </w:rPr>
+            </w:pPr>
+            <w:r>
+              <w:rPr>
+                <w:sz w:val="24"/>
+                <w:szCs w:val="24"/>
+              </w:rPr>
+              <w:t>10</w:t>
+            </w:r>
+            <w:r>
+              <w:rPr>
+                <w:sz w:val="24"/>
+                <w:szCs w:val="24"/>
+                <w:vertAlign w:val="superscript"/>
+              </w:rPr>
+              <w:t>7</w:t>
+            </w:r>
+          </w:p>
+        </w:tc>
+        <w:tc>
+          <w:tcPr>
+            <w:tcW w:w="2111" w:type="dxa"/>
+            <w:tcBorders>
+              <w:left w:val="single" w:sz="4" w:space="0" w:color="000000"/>
+              <w:bottom w:val="single" w:sz="4" w:space="0" w:color="000000"/>
+            </w:tcBorders>
+            <w:vAlign w:val="center"/>
+          </w:tcPr>
+          <w:p>
+            <w:pPr>
+              <w:pStyle w:val="Style14"/>
+              <w:spacing w:lineRule="auto" w:line="240"/>
+              <w:ind w:hanging="0" w:left="0"/>
+              <w:rPr>
+                <w:sz w:val="24"/>
+                <w:szCs w:val="24"/>
+              </w:rPr>
+            </w:pPr>
+            <w:r>
+              <w:rPr>
+                <w:sz w:val="24"/>
+                <w:szCs w:val="24"/>
+              </w:rPr>
+              <w:t>3.141592653589731</w:t>
+            </w:r>
+          </w:p>
+        </w:tc>
+        <w:tc>
+          <w:tcPr>
+            <w:tcW w:w="2537" w:type="dxa"/>
+            <w:tcBorders>
+              <w:left w:val="single" w:sz="4" w:space="0" w:color="000000"/>
+              <w:bottom w:val="single" w:sz="4" w:space="0" w:color="000000"/>
+            </w:tcBorders>
+            <w:vAlign w:val="center"/>
+          </w:tcPr>
+          <w:p>
+            <w:pPr>
+              <w:pStyle w:val="Style14"/>
+              <w:spacing w:lineRule="auto" w:line="240"/>
+              <w:ind w:hanging="0" w:left="0"/>
+              <w:rPr>
+                <w:sz w:val="24"/>
+                <w:szCs w:val="24"/>
+              </w:rPr>
+            </w:pPr>
+            <w:r>
+              <w:rPr>
+                <w:sz w:val="24"/>
+                <w:szCs w:val="24"/>
+              </w:rPr>
+              <w:t>6.217248937900877e-14</w:t>
+            </w:r>
+          </w:p>
+        </w:tc>
+        <w:tc>
+          <w:tcPr>
+            <w:tcW w:w="1914" w:type="dxa"/>
+            <w:tcBorders>
+              <w:left w:val="single" w:sz="4" w:space="0" w:color="000000"/>
+              <w:bottom w:val="single" w:sz="4" w:space="0" w:color="000000"/>
+              <w:right w:val="single" w:sz="4" w:space="0" w:color="000000"/>
+            </w:tcBorders>
+            <w:vAlign w:val="center"/>
+          </w:tcPr>
+          <w:p>
+            <w:pPr>
+              <w:pStyle w:val="Style14"/>
+              <w:spacing w:lineRule="auto" w:line="240"/>
+              <w:ind w:hanging="0" w:left="0"/>
+              <w:rPr>
+                <w:sz w:val="24"/>
+                <w:szCs w:val="24"/>
+              </w:rPr>
+            </w:pPr>
+            <w:r>
+              <w:rPr>
+                <w:sz w:val="24"/>
+                <w:szCs w:val="24"/>
+              </w:rPr>
+              <w:t>0.959065</w:t>
+            </w:r>
+          </w:p>
+        </w:tc>
+      </w:tr>
+      <w:tr>
+        <w:trPr/>
+        <w:tc>
+          <w:tcPr>
+            <w:tcW w:w="1397" w:type="dxa"/>
+            <w:tcBorders>
+              <w:left w:val="single" w:sz="4" w:space="0" w:color="000000"/>
+              <w:bottom w:val="single" w:sz="4" w:space="0" w:color="000000"/>
+            </w:tcBorders>
+            <w:vAlign w:val="center"/>
+          </w:tcPr>
+          <w:p>
+            <w:pPr>
+              <w:pStyle w:val="p11"/>
+              <w:spacing w:lineRule="auto" w:line="240"/>
+              <w:ind w:hanging="0" w:left="0"/>
+              <w:rPr>
+                <w:sz w:val="24"/>
+                <w:szCs w:val="24"/>
+              </w:rPr>
+            </w:pPr>
+            <w:r>
+              <w:rPr>
+                <w:sz w:val="24"/>
+                <w:szCs w:val="24"/>
+              </w:rPr>
+              <w:t>10</w:t>
+            </w:r>
+            <w:r>
+              <w:rPr>
+                <w:sz w:val="24"/>
+                <w:szCs w:val="24"/>
+                <w:vertAlign w:val="superscript"/>
+              </w:rPr>
+              <w:t>9</w:t>
+            </w:r>
+          </w:p>
+        </w:tc>
+        <w:tc>
+          <w:tcPr>
+            <w:tcW w:w="2111" w:type="dxa"/>
+            <w:tcBorders>
+              <w:left w:val="single" w:sz="4" w:space="0" w:color="000000"/>
+              <w:bottom w:val="single" w:sz="4" w:space="0" w:color="000000"/>
+            </w:tcBorders>
+            <w:vAlign w:val="center"/>
+          </w:tcPr>
+          <w:p>
+            <w:pPr>
+              <w:pStyle w:val="Style14"/>
+              <w:spacing w:lineRule="auto" w:line="240"/>
+              <w:ind w:hanging="0" w:left="0"/>
+              <w:rPr>
+                <w:sz w:val="24"/>
+                <w:szCs w:val="24"/>
+              </w:rPr>
+            </w:pPr>
+            <w:r>
+              <w:rPr>
+                <w:sz w:val="24"/>
+                <w:szCs w:val="24"/>
+              </w:rPr>
+              <w:t>3.141592653589971</w:t>
+            </w:r>
+          </w:p>
+        </w:tc>
+        <w:tc>
+          <w:tcPr>
+            <w:tcW w:w="2537" w:type="dxa"/>
+            <w:tcBorders>
+              <w:left w:val="single" w:sz="4" w:space="0" w:color="000000"/>
+              <w:bottom w:val="single" w:sz="4" w:space="0" w:color="000000"/>
+            </w:tcBorders>
+            <w:vAlign w:val="center"/>
+          </w:tcPr>
+          <w:p>
+            <w:pPr>
+              <w:pStyle w:val="Style14"/>
+              <w:spacing w:lineRule="auto" w:line="240"/>
+              <w:ind w:hanging="0" w:left="0"/>
+              <w:rPr>
+                <w:sz w:val="24"/>
+                <w:szCs w:val="24"/>
+              </w:rPr>
+            </w:pPr>
+            <w:r>
+              <w:rPr>
+                <w:sz w:val="24"/>
+                <w:szCs w:val="24"/>
+              </w:rPr>
+              <w:t>1.776356839400250e-13</w:t>
+            </w:r>
+          </w:p>
+        </w:tc>
+        <w:tc>
+          <w:tcPr>
+            <w:tcW w:w="1914" w:type="dxa"/>
+            <w:tcBorders>
+              <w:left w:val="single" w:sz="4" w:space="0" w:color="000000"/>
+              <w:bottom w:val="single" w:sz="4" w:space="0" w:color="000000"/>
+              <w:right w:val="single" w:sz="4" w:space="0" w:color="000000"/>
+            </w:tcBorders>
+            <w:vAlign w:val="center"/>
+          </w:tcPr>
+          <w:p>
+            <w:pPr>
+              <w:pStyle w:val="Style14"/>
+              <w:spacing w:lineRule="auto" w:line="240"/>
+              <w:ind w:hanging="0" w:left="0"/>
+              <w:rPr>
+                <w:sz w:val="24"/>
+                <w:szCs w:val="24"/>
+              </w:rPr>
+            </w:pPr>
+            <w:r>
+              <w:rPr>
+                <w:sz w:val="24"/>
+                <w:szCs w:val="24"/>
+              </w:rPr>
+              <w:t>94.468141</w:t>
+            </w:r>
+          </w:p>
+        </w:tc>
+      </w:tr>
+    </w:tbl>
+    <w:p>
+      <w:pPr>
+        <w:pStyle w:val="P1"/>
+        <w:rPr/>
+      </w:pPr>
+      <w:r>
+        <w:rPr/>
+      </w:r>
+    </w:p>
+    <w:p>
+      <w:pPr>
         <w:pStyle w:val="h11"/>
         <w:rPr/>
       </w:pPr>
@@ -499,15 +2287,7 @@
       </w:pPr>
       <w:r>
         <w:rPr/>
-        <w:t xml:space="preserve">Чи залежить прискорення обчислення числа </w:t>
-      </w:r>
-      <w:r>
-        <w:rPr/>
-        <w:t xml:space="preserve">ПІ </w:t>
-      </w:r>
-      <w:r>
-        <w:rPr/>
-        <w:t>за допомогою програми 1 від кількості підінтервалів?</w:t>
+        <w:t>Чи залежить прискорення обчислення числа ПІ за допомогою програми 1 від кількості підінтервалів?</w:t>
       </w:r>
     </w:p>
     <w:p>
@@ -517,23 +2297,7 @@
       </w:pPr>
       <w:r>
         <w:rPr/>
-        <w:t xml:space="preserve">Порівняйте точності обчислень числа </w:t>
-      </w:r>
-      <w:r>
-        <w:rPr/>
-        <w:t xml:space="preserve">ПІ </w:t>
-      </w:r>
-      <w:r>
-        <w:rPr/>
-        <w:t xml:space="preserve">за допомогою програм 5.1 та 5.3. Які </w:t>
-      </w:r>
-      <w:r>
-        <w:rPr/>
-        <w:t>в</w:t>
-      </w:r>
-      <w:r>
-        <w:rPr/>
-        <w:t>аші висновки щодо точності реалізованих в програмах 5.1 та 5.3 методів?</w:t>
+        <w:t>Порівняйте точності обчислень числа ПІ за допомогою програм 5.1 та 5.3. Які ваші висновки щодо точності реалізованих в програмах 5.1 та 5.3 методів?</w:t>
       </w:r>
     </w:p>
     <w:p>
@@ -1384,12 +3148,12 @@
       <w:lang w:val="en-US" w:eastAsia="uk-UA"/>
     </w:rPr>
   </w:style>
-  <w:style w:type="character" w:styleId="Style12">
-    <w:name w:val="Символ нумерації"/>
+  <w:style w:type="character" w:styleId="user">
+    <w:name w:val="Символ нумерації (user)"/>
     <w:qFormat/>
     <w:rPr/>
   </w:style>
-  <w:style w:type="paragraph" w:styleId="Style13">
+  <w:style w:type="paragraph" w:styleId="Style12">
     <w:name w:val="Заголовок"/>
     <w:basedOn w:val="Normal"/>
     <w:next w:val="BodyText"/>
@@ -1399,7 +3163,7 @@
       <w:spacing w:before="240" w:after="120"/>
     </w:pPr>
     <w:rPr>
-      <w:rFonts w:ascii="Liberation Sans" w:hAnsi="Liberation Sans" w:eastAsia="Microsoft YaHei" w:cs="Lucida Sans"/>
+      <w:rFonts w:ascii="Liberation Sans" w:hAnsi="Liberation Sans" w:eastAsia="Microsoft YaHei" w:cs="Arial Unicode MS"/>
       <w:sz w:val="28"/>
       <w:szCs w:val="28"/>
     </w:rPr>
@@ -1436,7 +3200,7 @@
       <w:szCs w:val="24"/>
     </w:rPr>
   </w:style>
-  <w:style w:type="paragraph" w:styleId="Style14">
+  <w:style w:type="paragraph" w:styleId="Style13">
     <w:name w:val="Покажчик"/>
     <w:basedOn w:val="Normal"/>
     <w:qFormat/>
@@ -1444,10 +3208,10 @@
       <w:suppressLineNumbers/>
     </w:pPr>
     <w:rPr>
-      <w:rFonts w:cs="Lucida Sans"/>
-    </w:rPr>
-  </w:style>
-  <w:style w:type="paragraph" w:styleId="user">
+      <w:rFonts w:cs="Arial Unicode MS"/>
+    </w:rPr>
+  </w:style>
+  <w:style w:type="paragraph" w:styleId="user1">
     <w:name w:val="Заголовок (user)"/>
     <w:basedOn w:val="Normal"/>
     <w:next w:val="BodyText"/>
@@ -1457,12 +3221,12 @@
       <w:spacing w:before="240" w:after="120"/>
     </w:pPr>
     <w:rPr>
-      <w:rFonts w:ascii="Liberation Sans" w:hAnsi="Liberation Sans" w:eastAsia="Microsoft YaHei" w:cs="Arial Unicode MS"/>
+      <w:rFonts w:ascii="Liberation Sans" w:hAnsi="Liberation Sans" w:eastAsia="Microsoft YaHei" w:cs="Lucida Sans"/>
       <w:sz w:val="28"/>
       <w:szCs w:val="28"/>
     </w:rPr>
   </w:style>
-  <w:style w:type="paragraph" w:styleId="user1">
+  <w:style w:type="paragraph" w:styleId="user2">
     <w:name w:val="Покажчик (user)"/>
     <w:basedOn w:val="Normal"/>
     <w:qFormat/>
@@ -1470,12 +3234,12 @@
       <w:suppressLineNumbers/>
     </w:pPr>
     <w:rPr>
-      <w:rFonts w:cs="Arial Unicode MS"/>
+      <w:rFonts w:cs="Lucida Sans"/>
     </w:rPr>
   </w:style>
   <w:style w:type="paragraph" w:styleId="IndexHeading">
     <w:name w:val="index heading"/>
-    <w:basedOn w:val="user"/>
+    <w:basedOn w:val="Style12"/>
     <w:pPr/>
     <w:rPr/>
   </w:style>
@@ -1755,8 +3519,8 @@
     </w:pPr>
     <w:rPr/>
   </w:style>
-  <w:style w:type="paragraph" w:styleId="user2">
-    <w:name w:val="Вміст таблиці (user)"/>
+  <w:style w:type="paragraph" w:styleId="Style14">
+    <w:name w:val="Вміст таблиці"/>
     <w:basedOn w:val="Normal"/>
     <w:qFormat/>
     <w:pPr>
@@ -1765,8 +3529,8 @@
     </w:pPr>
     <w:rPr/>
   </w:style>
-  <w:style w:type="paragraph" w:styleId="Style15">
-    <w:name w:val="Вміст таблиці"/>
+  <w:style w:type="paragraph" w:styleId="user3">
+    <w:name w:val="Вміст таблиці (user)"/>
     <w:basedOn w:val="Normal"/>
     <w:qFormat/>
     <w:pPr>
@@ -1775,9 +3539,9 @@
     </w:pPr>
     <w:rPr/>
   </w:style>
-  <w:style w:type="paragraph" w:styleId="user3">
-    <w:name w:val="Заголовок таблиці (user)"/>
-    <w:basedOn w:val="user2"/>
+  <w:style w:type="paragraph" w:styleId="Style15">
+    <w:name w:val="Заголовок таблиці"/>
+    <w:basedOn w:val="Style14"/>
     <w:qFormat/>
     <w:pPr>
       <w:suppressLineNumbers/>
@@ -1788,8 +3552,8 @@
       <w:bCs/>
     </w:rPr>
   </w:style>
-  <w:style w:type="paragraph" w:styleId="user4">
-    <w:name w:val="Верхній і нижній колонтитули (user)"/>
+  <w:style w:type="paragraph" w:styleId="Style16">
+    <w:name w:val="Верхній і нижній колонтитули"/>
     <w:basedOn w:val="Normal"/>
     <w:qFormat/>
     <w:pPr>
@@ -1802,8 +3566,8 @@
     </w:pPr>
     <w:rPr/>
   </w:style>
-  <w:style w:type="paragraph" w:styleId="Style16">
-    <w:name w:val="Верхній і нижній колонтитули"/>
+  <w:style w:type="paragraph" w:styleId="user4">
+    <w:name w:val="Верхній і нижній колонтитули (user)"/>
     <w:basedOn w:val="Normal"/>
     <w:qFormat/>
     <w:pPr/>
@@ -1811,7 +3575,7 @@
   </w:style>
   <w:style w:type="paragraph" w:styleId="Footer">
     <w:name w:val="footer"/>
-    <w:basedOn w:val="user4"/>
+    <w:basedOn w:val="Style16"/>
     <w:pPr>
       <w:suppressLineNumbers/>
     </w:pPr>
@@ -1819,7 +3583,7 @@
   </w:style>
   <w:style w:type="paragraph" w:styleId="Header">
     <w:name w:val="header"/>
-    <w:basedOn w:val="Style16"/>
+    <w:basedOn w:val="user4"/>
     <w:pPr>
       <w:suppressLineNumbers/>
       <w:tabs>
@@ -1830,9 +3594,9 @@
     </w:pPr>
     <w:rPr/>
   </w:style>
-  <w:style w:type="paragraph" w:styleId="Style17">
-    <w:name w:val="Заголовок таблиці"/>
-    <w:basedOn w:val="Style15"/>
+  <w:style w:type="paragraph" w:styleId="user5">
+    <w:name w:val="Заголовок таблиці (user)"/>
+    <w:basedOn w:val="user3"/>
     <w:qFormat/>
     <w:pPr>
       <w:suppressLineNumbers/>
@@ -1843,8 +3607,8 @@
       <w:bCs/>
     </w:rPr>
   </w:style>
-  <w:style w:type="numbering" w:styleId="user5" w:default="1">
-    <w:name w:val="Без маркерів (user)"/>
+  <w:style w:type="numbering" w:styleId="Style17" w:default="1">
+    <w:name w:val="Без маркерів"/>
     <w:uiPriority w:val="99"/>
     <w:semiHidden/>
     <w:unhideWhenUsed/>

</xml_diff>

<commit_message>
feat -- TR5: make 5122, Jesus thank you
</commit_message>
<xml_diff>
--- a/42TR Tehnologiji Rozpodilenyh System/5/TR_KNT-122_Onyshchenko_19_PR5.docx
+++ b/42TR Tehnologiji Rozpodilenyh System/5/TR_KNT-122_Onyshchenko_19_PR5.docx
@@ -556,6 +556,20 @@
     <w:p>
       <w:pPr>
         <w:pStyle w:val="p11"/>
+        <w:rPr>
+          <w:lang w:val="en-US"/>
+        </w:rPr>
+      </w:pPr>
+      <w:r>
+        <w:rPr>
+          <w:lang w:val="en-US"/>
+        </w:rPr>
+        <w:t>5.1.2.2 Реалізуйте власну паралельну програму обчислення інтеграла (1) з використанням наведеної програми 1, додайте до неї функцію обчислення часу її виконання. Визначте прискорення паралельної програми для чотирьох процесорів.</w:t>
+      </w:r>
+    </w:p>
+    <w:p>
+      <w:pPr>
+        <w:pStyle w:val="p11"/>
         <w:rPr/>
       </w:pPr>
       <w:r>
@@ -692,7 +706,7 @@
     </w:p>
     <w:p>
       <w:pPr>
-        <w:pStyle w:val="H2"/>
+        <w:pStyle w:val="H3"/>
         <w:rPr/>
       </w:pPr>
       <w:r>
@@ -1322,7 +1336,7 @@
     </w:p>
     <w:p>
       <w:pPr>
-        <w:pStyle w:val="H2"/>
+        <w:pStyle w:val="H3"/>
         <w:rPr/>
       </w:pPr>
       <w:r>
@@ -2258,6 +2272,1241 @@
       </w:pPr>
       <w:r>
         <w:rPr/>
+      </w:r>
+    </w:p>
+    <w:p>
+      <w:pPr>
+        <w:pStyle w:val="H2"/>
+        <w:rPr/>
+      </w:pPr>
+      <w:r>
+        <w:rPr/>
+        <w:t>5.1.2.2</w:t>
+      </w:r>
+    </w:p>
+    <w:p>
+      <w:pPr>
+        <w:pStyle w:val="H3"/>
+        <w:rPr/>
+      </w:pPr>
+      <w:r>
+        <w:rPr/>
+        <w:t>Завдання</w:t>
+      </w:r>
+    </w:p>
+    <w:p>
+      <w:pPr>
+        <w:pStyle w:val="P1"/>
+        <w:rPr/>
+      </w:pPr>
+      <w:r>
+        <w:rPr/>
+      </w:r>
+    </w:p>
+    <w:p>
+      <w:pPr>
+        <w:pStyle w:val="P1"/>
+        <w:rPr/>
+      </w:pPr>
+      <w:r>
+        <w:rPr/>
+        <w:t>Реалізуйте власну паралельну програму обчислення інтеграла (1) з використанням наведеної програми 1, додайте до неї функцію обчислення часу її виконання. Визначте прискорення паралельної програми для чотирьох процесорів.</w:t>
+      </w:r>
+    </w:p>
+    <w:p>
+      <w:pPr>
+        <w:pStyle w:val="P1"/>
+        <w:rPr/>
+      </w:pPr>
+      <w:r>
+        <w:rPr/>
+      </w:r>
+    </w:p>
+    <w:p>
+      <w:pPr>
+        <w:pStyle w:val="H3"/>
+        <w:rPr/>
+      </w:pPr>
+      <w:r>
+        <w:rPr/>
+        <w:t>Код</w:t>
+      </w:r>
+    </w:p>
+    <w:p>
+      <w:pPr>
+        <w:pStyle w:val="P1"/>
+        <w:rPr/>
+      </w:pPr>
+      <w:r>
+        <w:rPr/>
+      </w:r>
+    </w:p>
+    <w:p>
+      <w:pPr>
+        <w:pStyle w:val="Code"/>
+        <w:rPr>
+          <w:rFonts w:ascii="Cascadia Code" w:hAnsi="Cascadia Code"/>
+        </w:rPr>
+      </w:pPr>
+      <w:r>
+        <w:rPr>
+          <w:rFonts w:ascii="Cascadia Code" w:hAnsi="Cascadia Code"/>
+        </w:rPr>
+        <w:t>from mpi4py import MPI</w:t>
+      </w:r>
+    </w:p>
+    <w:p>
+      <w:pPr>
+        <w:pStyle w:val="Code"/>
+        <w:rPr>
+          <w:rFonts w:ascii="Cascadia Code" w:hAnsi="Cascadia Code"/>
+        </w:rPr>
+      </w:pPr>
+      <w:r>
+        <w:rPr>
+          <w:rFonts w:ascii="Cascadia Code" w:hAnsi="Cascadia Code"/>
+        </w:rPr>
+        <w:t>import math</w:t>
+      </w:r>
+    </w:p>
+    <w:p>
+      <w:pPr>
+        <w:pStyle w:val="Code"/>
+        <w:rPr>
+          <w:rFonts w:ascii="Cascadia Code" w:hAnsi="Cascadia Code"/>
+        </w:rPr>
+      </w:pPr>
+      <w:r>
+        <w:rPr>
+          <w:rFonts w:ascii="Cascadia Code" w:hAnsi="Cascadia Code"/>
+        </w:rPr>
+      </w:r>
+    </w:p>
+    <w:p>
+      <w:pPr>
+        <w:pStyle w:val="Code"/>
+        <w:rPr>
+          <w:rFonts w:ascii="Cascadia Code" w:hAnsi="Cascadia Code"/>
+        </w:rPr>
+      </w:pPr>
+      <w:r>
+        <w:rPr>
+          <w:rFonts w:ascii="Cascadia Code" w:hAnsi="Cascadia Code"/>
+        </w:rPr>
+      </w:r>
+    </w:p>
+    <w:p>
+      <w:pPr>
+        <w:pStyle w:val="Code"/>
+        <w:rPr>
+          <w:rFonts w:ascii="Cascadia Code" w:hAnsi="Cascadia Code"/>
+        </w:rPr>
+      </w:pPr>
+      <w:r>
+        <w:rPr>
+          <w:rFonts w:ascii="Cascadia Code" w:hAnsi="Cascadia Code"/>
+        </w:rPr>
+        <w:t>def parallel_pi(N_total):</w:t>
+      </w:r>
+    </w:p>
+    <w:p>
+      <w:pPr>
+        <w:pStyle w:val="Code"/>
+        <w:rPr>
+          <w:rFonts w:ascii="Cascadia Code" w:hAnsi="Cascadia Code"/>
+        </w:rPr>
+      </w:pPr>
+      <w:r>
+        <w:rPr>
+          <w:rFonts w:ascii="Cascadia Code" w:hAnsi="Cascadia Code"/>
+        </w:rPr>
+        <w:t xml:space="preserve">    </w:t>
+      </w:r>
+      <w:r>
+        <w:rPr>
+          <w:rFonts w:ascii="Cascadia Code" w:hAnsi="Cascadia Code"/>
+        </w:rPr>
+        <w:t>comm = MPI.COMM_WORLD</w:t>
+      </w:r>
+    </w:p>
+    <w:p>
+      <w:pPr>
+        <w:pStyle w:val="Code"/>
+        <w:rPr>
+          <w:rFonts w:ascii="Cascadia Code" w:hAnsi="Cascadia Code"/>
+        </w:rPr>
+      </w:pPr>
+      <w:r>
+        <w:rPr>
+          <w:rFonts w:ascii="Cascadia Code" w:hAnsi="Cascadia Code"/>
+        </w:rPr>
+        <w:t xml:space="preserve">    </w:t>
+      </w:r>
+      <w:r>
+        <w:rPr>
+          <w:rFonts w:ascii="Cascadia Code" w:hAnsi="Cascadia Code"/>
+        </w:rPr>
+        <w:t>rank = comm.Get_rank()</w:t>
+      </w:r>
+    </w:p>
+    <w:p>
+      <w:pPr>
+        <w:pStyle w:val="Code"/>
+        <w:rPr>
+          <w:rFonts w:ascii="Cascadia Code" w:hAnsi="Cascadia Code"/>
+        </w:rPr>
+      </w:pPr>
+      <w:r>
+        <w:rPr>
+          <w:rFonts w:ascii="Cascadia Code" w:hAnsi="Cascadia Code"/>
+        </w:rPr>
+        <w:t xml:space="preserve">    </w:t>
+      </w:r>
+      <w:r>
+        <w:rPr>
+          <w:rFonts w:ascii="Cascadia Code" w:hAnsi="Cascadia Code"/>
+        </w:rPr>
+        <w:t>numprocs = comm.Get_size()</w:t>
+      </w:r>
+    </w:p>
+    <w:p>
+      <w:pPr>
+        <w:pStyle w:val="Code"/>
+        <w:rPr>
+          <w:rFonts w:ascii="Cascadia Code" w:hAnsi="Cascadia Code"/>
+        </w:rPr>
+      </w:pPr>
+      <w:r>
+        <w:rPr>
+          <w:rFonts w:ascii="Cascadia Code" w:hAnsi="Cascadia Code"/>
+        </w:rPr>
+      </w:r>
+    </w:p>
+    <w:p>
+      <w:pPr>
+        <w:pStyle w:val="Code"/>
+        <w:rPr>
+          <w:rFonts w:ascii="Cascadia Code" w:hAnsi="Cascadia Code"/>
+        </w:rPr>
+      </w:pPr>
+      <w:r>
+        <w:rPr>
+          <w:rFonts w:ascii="Cascadia Code" w:hAnsi="Cascadia Code"/>
+        </w:rPr>
+        <w:t xml:space="preserve">    </w:t>
+      </w:r>
+      <w:r>
+        <w:rPr>
+          <w:rFonts w:ascii="Cascadia Code" w:hAnsi="Cascadia Code"/>
+        </w:rPr>
+        <w:t>n_local = N_total // numprocs</w:t>
+      </w:r>
+    </w:p>
+    <w:p>
+      <w:pPr>
+        <w:pStyle w:val="Code"/>
+        <w:rPr>
+          <w:rFonts w:ascii="Cascadia Code" w:hAnsi="Cascadia Code"/>
+        </w:rPr>
+      </w:pPr>
+      <w:r>
+        <w:rPr>
+          <w:rFonts w:ascii="Cascadia Code" w:hAnsi="Cascadia Code"/>
+        </w:rPr>
+      </w:r>
+    </w:p>
+    <w:p>
+      <w:pPr>
+        <w:pStyle w:val="Code"/>
+        <w:rPr>
+          <w:rFonts w:ascii="Cascadia Code" w:hAnsi="Cascadia Code"/>
+        </w:rPr>
+      </w:pPr>
+      <w:r>
+        <w:rPr>
+          <w:rFonts w:ascii="Cascadia Code" w:hAnsi="Cascadia Code"/>
+        </w:rPr>
+        <w:t xml:space="preserve">    </w:t>
+      </w:r>
+      <w:r>
+        <w:rPr>
+          <w:rFonts w:ascii="Cascadia Code" w:hAnsi="Cascadia Code"/>
+        </w:rPr>
+        <w:t>comm.Barrier()</w:t>
+      </w:r>
+    </w:p>
+    <w:p>
+      <w:pPr>
+        <w:pStyle w:val="Code"/>
+        <w:rPr>
+          <w:rFonts w:ascii="Cascadia Code" w:hAnsi="Cascadia Code"/>
+        </w:rPr>
+      </w:pPr>
+      <w:r>
+        <w:rPr>
+          <w:rFonts w:ascii="Cascadia Code" w:hAnsi="Cascadia Code"/>
+        </w:rPr>
+        <w:t xml:space="preserve">    </w:t>
+      </w:r>
+      <w:r>
+        <w:rPr>
+          <w:rFonts w:ascii="Cascadia Code" w:hAnsi="Cascadia Code"/>
+        </w:rPr>
+        <w:t>start_time = MPI.Wtime()</w:t>
+      </w:r>
+    </w:p>
+    <w:p>
+      <w:pPr>
+        <w:pStyle w:val="Code"/>
+        <w:rPr>
+          <w:rFonts w:ascii="Cascadia Code" w:hAnsi="Cascadia Code"/>
+        </w:rPr>
+      </w:pPr>
+      <w:r>
+        <w:rPr>
+          <w:rFonts w:ascii="Cascadia Code" w:hAnsi="Cascadia Code"/>
+        </w:rPr>
+      </w:r>
+    </w:p>
+    <w:p>
+      <w:pPr>
+        <w:pStyle w:val="Code"/>
+        <w:rPr>
+          <w:rFonts w:ascii="Cascadia Code" w:hAnsi="Cascadia Code"/>
+        </w:rPr>
+      </w:pPr>
+      <w:r>
+        <w:rPr>
+          <w:rFonts w:ascii="Cascadia Code" w:hAnsi="Cascadia Code"/>
+        </w:rPr>
+        <w:t xml:space="preserve">    </w:t>
+      </w:r>
+      <w:r>
+        <w:rPr>
+          <w:rFonts w:ascii="Cascadia Code" w:hAnsi="Cascadia Code"/>
+        </w:rPr>
+        <w:t>local_sum = 0.0</w:t>
+      </w:r>
+    </w:p>
+    <w:p>
+      <w:pPr>
+        <w:pStyle w:val="Code"/>
+        <w:rPr>
+          <w:rFonts w:ascii="Cascadia Code" w:hAnsi="Cascadia Code"/>
+        </w:rPr>
+      </w:pPr>
+      <w:r>
+        <w:rPr>
+          <w:rFonts w:ascii="Cascadia Code" w:hAnsi="Cascadia Code"/>
+        </w:rPr>
+        <w:t xml:space="preserve">    </w:t>
+      </w:r>
+      <w:r>
+        <w:rPr>
+          <w:rFonts w:ascii="Cascadia Code" w:hAnsi="Cascadia Code"/>
+        </w:rPr>
+        <w:t>start_index = rank * n_local</w:t>
+      </w:r>
+    </w:p>
+    <w:p>
+      <w:pPr>
+        <w:pStyle w:val="Code"/>
+        <w:rPr>
+          <w:rFonts w:ascii="Cascadia Code" w:hAnsi="Cascadia Code"/>
+        </w:rPr>
+      </w:pPr>
+      <w:r>
+        <w:rPr>
+          <w:rFonts w:ascii="Cascadia Code" w:hAnsi="Cascadia Code"/>
+        </w:rPr>
+        <w:t xml:space="preserve">    </w:t>
+      </w:r>
+      <w:r>
+        <w:rPr>
+          <w:rFonts w:ascii="Cascadia Code" w:hAnsi="Cascadia Code"/>
+        </w:rPr>
+        <w:t>end_index = (rank + 1) * n_local</w:t>
+      </w:r>
+    </w:p>
+    <w:p>
+      <w:pPr>
+        <w:pStyle w:val="Code"/>
+        <w:rPr>
+          <w:rFonts w:ascii="Cascadia Code" w:hAnsi="Cascadia Code"/>
+        </w:rPr>
+      </w:pPr>
+      <w:r>
+        <w:rPr>
+          <w:rFonts w:ascii="Cascadia Code" w:hAnsi="Cascadia Code"/>
+        </w:rPr>
+      </w:r>
+    </w:p>
+    <w:p>
+      <w:pPr>
+        <w:pStyle w:val="Code"/>
+        <w:rPr>
+          <w:rFonts w:ascii="Cascadia Code" w:hAnsi="Cascadia Code"/>
+        </w:rPr>
+      </w:pPr>
+      <w:r>
+        <w:rPr>
+          <w:rFonts w:ascii="Cascadia Code" w:hAnsi="Cascadia Code"/>
+        </w:rPr>
+        <w:t xml:space="preserve">    </w:t>
+      </w:r>
+      <w:r>
+        <w:rPr>
+          <w:rFonts w:ascii="Cascadia Code" w:hAnsi="Cascadia Code"/>
+        </w:rPr>
+        <w:t>step = 1.0 / N_total</w:t>
+      </w:r>
+    </w:p>
+    <w:p>
+      <w:pPr>
+        <w:pStyle w:val="Code"/>
+        <w:rPr>
+          <w:rFonts w:ascii="Cascadia Code" w:hAnsi="Cascadia Code"/>
+        </w:rPr>
+      </w:pPr>
+      <w:r>
+        <w:rPr>
+          <w:rFonts w:ascii="Cascadia Code" w:hAnsi="Cascadia Code"/>
+        </w:rPr>
+        <w:t xml:space="preserve">    </w:t>
+      </w:r>
+      <w:r>
+        <w:rPr>
+          <w:rFonts w:ascii="Cascadia Code" w:hAnsi="Cascadia Code"/>
+        </w:rPr>
+        <w:t>for i in range(start_index, end_index):</w:t>
+      </w:r>
+    </w:p>
+    <w:p>
+      <w:pPr>
+        <w:pStyle w:val="Code"/>
+        <w:rPr>
+          <w:rFonts w:ascii="Cascadia Code" w:hAnsi="Cascadia Code"/>
+        </w:rPr>
+      </w:pPr>
+      <w:r>
+        <w:rPr>
+          <w:rFonts w:ascii="Cascadia Code" w:hAnsi="Cascadia Code"/>
+        </w:rPr>
+        <w:t xml:space="preserve">        </w:t>
+      </w:r>
+      <w:r>
+        <w:rPr>
+          <w:rFonts w:ascii="Cascadia Code" w:hAnsi="Cascadia Code"/>
+        </w:rPr>
+        <w:t>x = (i + 0.5) * step</w:t>
+      </w:r>
+    </w:p>
+    <w:p>
+      <w:pPr>
+        <w:pStyle w:val="Code"/>
+        <w:rPr>
+          <w:rFonts w:ascii="Cascadia Code" w:hAnsi="Cascadia Code"/>
+        </w:rPr>
+      </w:pPr>
+      <w:r>
+        <w:rPr>
+          <w:rFonts w:ascii="Cascadia Code" w:hAnsi="Cascadia Code"/>
+        </w:rPr>
+        <w:t xml:space="preserve">        </w:t>
+      </w:r>
+      <w:r>
+        <w:rPr>
+          <w:rFonts w:ascii="Cascadia Code" w:hAnsi="Cascadia Code"/>
+        </w:rPr>
+        <w:t>local_sum += 4.0 / (1.0 + x * x)</w:t>
+      </w:r>
+    </w:p>
+    <w:p>
+      <w:pPr>
+        <w:pStyle w:val="Code"/>
+        <w:rPr>
+          <w:rFonts w:ascii="Cascadia Code" w:hAnsi="Cascadia Code"/>
+        </w:rPr>
+      </w:pPr>
+      <w:r>
+        <w:rPr>
+          <w:rFonts w:ascii="Cascadia Code" w:hAnsi="Cascadia Code"/>
+        </w:rPr>
+      </w:r>
+    </w:p>
+    <w:p>
+      <w:pPr>
+        <w:pStyle w:val="Code"/>
+        <w:rPr>
+          <w:rFonts w:ascii="Cascadia Code" w:hAnsi="Cascadia Code"/>
+        </w:rPr>
+      </w:pPr>
+      <w:r>
+        <w:rPr>
+          <w:rFonts w:ascii="Cascadia Code" w:hAnsi="Cascadia Code"/>
+        </w:rPr>
+        <w:t xml:space="preserve">    </w:t>
+      </w:r>
+      <w:r>
+        <w:rPr>
+          <w:rFonts w:ascii="Cascadia Code" w:hAnsi="Cascadia Code"/>
+        </w:rPr>
+        <w:t>total_sum = comm.reduce(local_sum, op=MPI.SUM, root=0)</w:t>
+      </w:r>
+    </w:p>
+    <w:p>
+      <w:pPr>
+        <w:pStyle w:val="Code"/>
+        <w:rPr>
+          <w:rFonts w:ascii="Cascadia Code" w:hAnsi="Cascadia Code"/>
+        </w:rPr>
+      </w:pPr>
+      <w:r>
+        <w:rPr>
+          <w:rFonts w:ascii="Cascadia Code" w:hAnsi="Cascadia Code"/>
+        </w:rPr>
+      </w:r>
+    </w:p>
+    <w:p>
+      <w:pPr>
+        <w:pStyle w:val="Code"/>
+        <w:rPr>
+          <w:rFonts w:ascii="Cascadia Code" w:hAnsi="Cascadia Code"/>
+        </w:rPr>
+      </w:pPr>
+      <w:r>
+        <w:rPr>
+          <w:rFonts w:ascii="Cascadia Code" w:hAnsi="Cascadia Code"/>
+        </w:rPr>
+        <w:t xml:space="preserve">    </w:t>
+      </w:r>
+      <w:r>
+        <w:rPr>
+          <w:rFonts w:ascii="Cascadia Code" w:hAnsi="Cascadia Code"/>
+        </w:rPr>
+        <w:t>end_time = MPI.Wtime()</w:t>
+      </w:r>
+    </w:p>
+    <w:p>
+      <w:pPr>
+        <w:pStyle w:val="Code"/>
+        <w:rPr>
+          <w:rFonts w:ascii="Cascadia Code" w:hAnsi="Cascadia Code"/>
+        </w:rPr>
+      </w:pPr>
+      <w:r>
+        <w:rPr>
+          <w:rFonts w:ascii="Cascadia Code" w:hAnsi="Cascadia Code"/>
+        </w:rPr>
+        <w:t xml:space="preserve">    </w:t>
+      </w:r>
+      <w:r>
+        <w:rPr>
+          <w:rFonts w:ascii="Cascadia Code" w:hAnsi="Cascadia Code"/>
+        </w:rPr>
+        <w:t>duration = end_time - start_time</w:t>
+      </w:r>
+    </w:p>
+    <w:p>
+      <w:pPr>
+        <w:pStyle w:val="Code"/>
+        <w:rPr>
+          <w:rFonts w:ascii="Cascadia Code" w:hAnsi="Cascadia Code"/>
+        </w:rPr>
+      </w:pPr>
+      <w:r>
+        <w:rPr>
+          <w:rFonts w:ascii="Cascadia Code" w:hAnsi="Cascadia Code"/>
+        </w:rPr>
+      </w:r>
+    </w:p>
+    <w:p>
+      <w:pPr>
+        <w:pStyle w:val="Code"/>
+        <w:rPr>
+          <w:rFonts w:ascii="Cascadia Code" w:hAnsi="Cascadia Code"/>
+        </w:rPr>
+      </w:pPr>
+      <w:r>
+        <w:rPr>
+          <w:rFonts w:ascii="Cascadia Code" w:hAnsi="Cascadia Code"/>
+        </w:rPr>
+        <w:t xml:space="preserve">    </w:t>
+      </w:r>
+      <w:r>
+        <w:rPr>
+          <w:rFonts w:ascii="Cascadia Code" w:hAnsi="Cascadia Code"/>
+        </w:rPr>
+        <w:t>if rank == 0:</w:t>
+      </w:r>
+    </w:p>
+    <w:p>
+      <w:pPr>
+        <w:pStyle w:val="Code"/>
+        <w:rPr>
+          <w:rFonts w:ascii="Cascadia Code" w:hAnsi="Cascadia Code"/>
+        </w:rPr>
+      </w:pPr>
+      <w:r>
+        <w:rPr>
+          <w:rFonts w:ascii="Cascadia Code" w:hAnsi="Cascadia Code"/>
+        </w:rPr>
+        <w:t xml:space="preserve">        </w:t>
+      </w:r>
+      <w:r>
+        <w:rPr>
+          <w:rFonts w:ascii="Cascadia Code" w:hAnsi="Cascadia Code"/>
+        </w:rPr>
+        <w:t>pi_approx = total_sum * step</w:t>
+      </w:r>
+    </w:p>
+    <w:p>
+      <w:pPr>
+        <w:pStyle w:val="Code"/>
+        <w:rPr>
+          <w:rFonts w:ascii="Cascadia Code" w:hAnsi="Cascadia Code"/>
+        </w:rPr>
+      </w:pPr>
+      <w:r>
+        <w:rPr>
+          <w:rFonts w:ascii="Cascadia Code" w:hAnsi="Cascadia Code"/>
+        </w:rPr>
+        <w:t xml:space="preserve">        </w:t>
+      </w:r>
+      <w:r>
+        <w:rPr>
+          <w:rFonts w:ascii="Cascadia Code" w:hAnsi="Cascadia Code"/>
+        </w:rPr>
+        <w:t>return pi_approx, duration</w:t>
+      </w:r>
+    </w:p>
+    <w:p>
+      <w:pPr>
+        <w:pStyle w:val="Code"/>
+        <w:rPr>
+          <w:rFonts w:ascii="Cascadia Code" w:hAnsi="Cascadia Code"/>
+        </w:rPr>
+      </w:pPr>
+      <w:r>
+        <w:rPr>
+          <w:rFonts w:ascii="Cascadia Code" w:hAnsi="Cascadia Code"/>
+        </w:rPr>
+        <w:t xml:space="preserve">    </w:t>
+      </w:r>
+      <w:r>
+        <w:rPr>
+          <w:rFonts w:ascii="Cascadia Code" w:hAnsi="Cascadia Code"/>
+        </w:rPr>
+        <w:t>return None, duration</w:t>
+      </w:r>
+    </w:p>
+    <w:p>
+      <w:pPr>
+        <w:pStyle w:val="Code"/>
+        <w:rPr>
+          <w:rFonts w:ascii="Cascadia Code" w:hAnsi="Cascadia Code"/>
+        </w:rPr>
+      </w:pPr>
+      <w:r>
+        <w:rPr>
+          <w:rFonts w:ascii="Cascadia Code" w:hAnsi="Cascadia Code"/>
+        </w:rPr>
+      </w:r>
+    </w:p>
+    <w:p>
+      <w:pPr>
+        <w:pStyle w:val="Code"/>
+        <w:rPr>
+          <w:rFonts w:ascii="Cascadia Code" w:hAnsi="Cascadia Code"/>
+        </w:rPr>
+      </w:pPr>
+      <w:r>
+        <w:rPr>
+          <w:rFonts w:ascii="Cascadia Code" w:hAnsi="Cascadia Code"/>
+        </w:rPr>
+      </w:r>
+    </w:p>
+    <w:p>
+      <w:pPr>
+        <w:pStyle w:val="Code"/>
+        <w:rPr>
+          <w:rFonts w:ascii="Cascadia Code" w:hAnsi="Cascadia Code"/>
+        </w:rPr>
+      </w:pPr>
+      <w:r>
+        <w:rPr>
+          <w:rFonts w:ascii="Cascadia Code" w:hAnsi="Cascadia Code"/>
+        </w:rPr>
+        <w:t>if __name__ == "__main__":</w:t>
+      </w:r>
+    </w:p>
+    <w:p>
+      <w:pPr>
+        <w:pStyle w:val="Code"/>
+        <w:rPr>
+          <w:rFonts w:ascii="Cascadia Code" w:hAnsi="Cascadia Code"/>
+        </w:rPr>
+      </w:pPr>
+      <w:r>
+        <w:rPr>
+          <w:rFonts w:ascii="Cascadia Code" w:hAnsi="Cascadia Code"/>
+        </w:rPr>
+        <w:t xml:space="preserve">    </w:t>
+      </w:r>
+      <w:r>
+        <w:rPr>
+          <w:rFonts w:ascii="Cascadia Code" w:hAnsi="Cascadia Code"/>
+        </w:rPr>
+        <w:t>N = 10**8</w:t>
+      </w:r>
+    </w:p>
+    <w:p>
+      <w:pPr>
+        <w:pStyle w:val="Code"/>
+        <w:rPr>
+          <w:rFonts w:ascii="Cascadia Code" w:hAnsi="Cascadia Code"/>
+        </w:rPr>
+      </w:pPr>
+      <w:r>
+        <w:rPr>
+          <w:rFonts w:ascii="Cascadia Code" w:hAnsi="Cascadia Code"/>
+        </w:rPr>
+      </w:r>
+    </w:p>
+    <w:p>
+      <w:pPr>
+        <w:pStyle w:val="Code"/>
+        <w:rPr>
+          <w:rFonts w:ascii="Cascadia Code" w:hAnsi="Cascadia Code"/>
+        </w:rPr>
+      </w:pPr>
+      <w:r>
+        <w:rPr>
+          <w:rFonts w:ascii="Cascadia Code" w:hAnsi="Cascadia Code"/>
+        </w:rPr>
+        <w:t xml:space="preserve">    </w:t>
+      </w:r>
+      <w:r>
+        <w:rPr>
+          <w:rFonts w:ascii="Cascadia Code" w:hAnsi="Cascadia Code"/>
+        </w:rPr>
+        <w:t>pi_value, time_spent = parallel_pi(N)</w:t>
+      </w:r>
+    </w:p>
+    <w:p>
+      <w:pPr>
+        <w:pStyle w:val="Code"/>
+        <w:rPr>
+          <w:rFonts w:ascii="Cascadia Code" w:hAnsi="Cascadia Code"/>
+        </w:rPr>
+      </w:pPr>
+      <w:r>
+        <w:rPr>
+          <w:rFonts w:ascii="Cascadia Code" w:hAnsi="Cascadia Code"/>
+        </w:rPr>
+      </w:r>
+    </w:p>
+    <w:p>
+      <w:pPr>
+        <w:pStyle w:val="Code"/>
+        <w:rPr>
+          <w:rFonts w:ascii="Cascadia Code" w:hAnsi="Cascadia Code"/>
+        </w:rPr>
+      </w:pPr>
+      <w:r>
+        <w:rPr>
+          <w:rFonts w:ascii="Cascadia Code" w:hAnsi="Cascadia Code"/>
+        </w:rPr>
+        <w:t xml:space="preserve">    </w:t>
+      </w:r>
+      <w:r>
+        <w:rPr>
+          <w:rFonts w:ascii="Cascadia Code" w:hAnsi="Cascadia Code"/>
+        </w:rPr>
+        <w:t>rank = MPI.COMM_WORLD.Get_rank()</w:t>
+      </w:r>
+    </w:p>
+    <w:p>
+      <w:pPr>
+        <w:pStyle w:val="Code"/>
+        <w:rPr>
+          <w:rFonts w:ascii="Cascadia Code" w:hAnsi="Cascadia Code"/>
+        </w:rPr>
+      </w:pPr>
+      <w:r>
+        <w:rPr>
+          <w:rFonts w:ascii="Cascadia Code" w:hAnsi="Cascadia Code"/>
+        </w:rPr>
+        <w:t xml:space="preserve">    </w:t>
+      </w:r>
+      <w:r>
+        <w:rPr>
+          <w:rFonts w:ascii="Cascadia Code" w:hAnsi="Cascadia Code"/>
+        </w:rPr>
+        <w:t>if rank == 0:</w:t>
+      </w:r>
+    </w:p>
+    <w:p>
+      <w:pPr>
+        <w:pStyle w:val="Code"/>
+        <w:rPr>
+          <w:rFonts w:ascii="Cascadia Code" w:hAnsi="Cascadia Code"/>
+        </w:rPr>
+      </w:pPr>
+      <w:r>
+        <w:rPr>
+          <w:rFonts w:ascii="Cascadia Code" w:hAnsi="Cascadia Code"/>
+        </w:rPr>
+        <w:t xml:space="preserve">        </w:t>
+      </w:r>
+      <w:r>
+        <w:rPr>
+          <w:rFonts w:ascii="Cascadia Code" w:hAnsi="Cascadia Code"/>
+        </w:rPr>
+        <w:t>pi_ref = math.pi</w:t>
+      </w:r>
+    </w:p>
+    <w:p>
+      <w:pPr>
+        <w:pStyle w:val="Code"/>
+        <w:rPr>
+          <w:rFonts w:ascii="Cascadia Code" w:hAnsi="Cascadia Code"/>
+        </w:rPr>
+      </w:pPr>
+      <w:r>
+        <w:rPr>
+          <w:rFonts w:ascii="Cascadia Code" w:hAnsi="Cascadia Code"/>
+        </w:rPr>
+        <w:t xml:space="preserve">        </w:t>
+      </w:r>
+      <w:r>
+        <w:rPr>
+          <w:rFonts w:ascii="Cascadia Code" w:hAnsi="Cascadia Code"/>
+        </w:rPr>
+        <w:t>print(f"Processes amount: {MPI.COMM_WORLD.Get_size()}")</w:t>
+      </w:r>
+    </w:p>
+    <w:p>
+      <w:pPr>
+        <w:pStyle w:val="Code"/>
+        <w:rPr>
+          <w:rFonts w:ascii="Cascadia Code" w:hAnsi="Cascadia Code"/>
+        </w:rPr>
+      </w:pPr>
+      <w:r>
+        <w:rPr>
+          <w:rFonts w:ascii="Cascadia Code" w:hAnsi="Cascadia Code"/>
+        </w:rPr>
+        <w:t xml:space="preserve">        </w:t>
+      </w:r>
+      <w:r>
+        <w:rPr>
+          <w:rFonts w:ascii="Cascadia Code" w:hAnsi="Cascadia Code"/>
+        </w:rPr>
+        <w:t>print(f"Calculated PI: {pi_value:.16f}")</w:t>
+      </w:r>
+    </w:p>
+    <w:p>
+      <w:pPr>
+        <w:pStyle w:val="Code"/>
+        <w:rPr>
+          <w:rFonts w:ascii="Cascadia Code" w:hAnsi="Cascadia Code"/>
+        </w:rPr>
+      </w:pPr>
+      <w:r>
+        <w:rPr>
+          <w:rFonts w:ascii="Cascadia Code" w:hAnsi="Cascadia Code"/>
+        </w:rPr>
+        <w:t xml:space="preserve">        </w:t>
+      </w:r>
+      <w:r>
+        <w:rPr>
+          <w:rFonts w:ascii="Cascadia Code" w:hAnsi="Cascadia Code"/>
+        </w:rPr>
+        <w:t>print(f"Error: {abs(pi_ref - pi_value):.16e}")</w:t>
+      </w:r>
+    </w:p>
+    <w:p>
+      <w:pPr>
+        <w:pStyle w:val="Code"/>
+        <w:rPr>
+          <w:rFonts w:ascii="Cascadia Code" w:hAnsi="Cascadia Code"/>
+        </w:rPr>
+      </w:pPr>
+      <w:r>
+        <w:rPr>
+          <w:rFonts w:ascii="Cascadia Code" w:hAnsi="Cascadia Code"/>
+        </w:rPr>
+        <w:t xml:space="preserve">        </w:t>
+      </w:r>
+      <w:r>
+        <w:rPr>
+          <w:rFonts w:ascii="Cascadia Code" w:hAnsi="Cascadia Code"/>
+        </w:rPr>
+        <w:t>print(f"Execution time: {time_spent:.6f} sec")</w:t>
+      </w:r>
+    </w:p>
+    <w:p>
+      <w:pPr>
+        <w:pStyle w:val="P1"/>
+        <w:rPr>
+          <w:rFonts w:ascii="Cascadia Code" w:hAnsi="Cascadia Code"/>
+        </w:rPr>
+      </w:pPr>
+      <w:r>
+        <w:rPr>
+          <w:rFonts w:ascii="Cascadia Code" w:hAnsi="Cascadia Code"/>
+        </w:rPr>
+      </w:r>
+    </w:p>
+    <w:p>
+      <w:pPr>
+        <w:pStyle w:val="H3"/>
+        <w:rPr/>
+      </w:pPr>
+      <w:r>
+        <w:rPr/>
+        <w:t>Результат</w:t>
+      </w:r>
+    </w:p>
+    <w:p>
+      <w:pPr>
+        <w:pStyle w:val="P1"/>
+        <w:rPr/>
+      </w:pPr>
+      <w:r>
+        <w:rPr/>
+      </w:r>
+    </w:p>
+    <w:p>
+      <w:pPr>
+        <w:pStyle w:val="P1"/>
+        <w:rPr/>
+      </w:pPr>
+      <w:r>
+        <w:rPr/>
+        <w:t>Вивід у консоль:</w:t>
+      </w:r>
+    </w:p>
+    <w:p>
+      <w:pPr>
+        <w:pStyle w:val="P1"/>
+        <w:rPr/>
+      </w:pPr>
+      <w:r>
+        <w:rPr/>
+      </w:r>
+    </w:p>
+    <w:p>
+      <w:pPr>
+        <w:pStyle w:val="Code"/>
+        <w:rPr/>
+      </w:pPr>
+      <w:r>
+        <w:rPr/>
+        <w:t>Processes amount: 4</w:t>
+      </w:r>
+    </w:p>
+    <w:p>
+      <w:pPr>
+        <w:pStyle w:val="Code"/>
+        <w:rPr/>
+      </w:pPr>
+      <w:r>
+        <w:rPr/>
+        <w:t>Calculated PI: 3.1415926535896825</w:t>
+      </w:r>
+    </w:p>
+    <w:p>
+      <w:pPr>
+        <w:pStyle w:val="Code"/>
+        <w:rPr/>
+      </w:pPr>
+      <w:r>
+        <w:rPr/>
+        <w:t>Error: 1.1057821325266559e-13</w:t>
+      </w:r>
+    </w:p>
+    <w:p>
+      <w:pPr>
+        <w:pStyle w:val="Code"/>
+        <w:rPr/>
+      </w:pPr>
+      <w:r>
+        <w:rPr/>
+        <w:t>Execution time: 2.499878 sec</w:t>
+      </w:r>
+    </w:p>
+    <w:p>
+      <w:pPr>
+        <w:pStyle w:val="P1"/>
+        <w:rPr/>
+      </w:pPr>
+      <w:r>
+        <w:rPr/>
+      </w:r>
+    </w:p>
+    <w:p>
+      <w:pPr>
+        <w:pStyle w:val="P1"/>
+        <w:rPr/>
+      </w:pPr>
+      <w:r>
+        <w:rPr/>
+        <w:t>Для отримання прискорення потрібно:</w:t>
+      </w:r>
+    </w:p>
+    <w:p>
+      <w:pPr>
+        <w:pStyle w:val="P1"/>
+        <w:rPr/>
+      </w:pPr>
+      <w:r>
+        <w:rPr/>
+        <w:t xml:space="preserve">1. запустити програму на одному потоці, отримати значення </w:t>
+      </w:r>
+      <w:r>
+        <w:rPr>
+          <w:lang w:val="en-US"/>
+        </w:rPr>
+        <w:t>T</w:t>
+      </w:r>
+      <w:r>
+        <w:rPr>
+          <w:vertAlign w:val="subscript"/>
+          <w:lang w:val="en-US"/>
+        </w:rPr>
+        <w:t>1</w:t>
+      </w:r>
+      <w:r>
+        <w:rPr>
+          <w:position w:val="0"/>
+          <w:sz w:val="28"/>
+          <w:vertAlign w:val="baseline"/>
+          <w:lang w:val="en-US"/>
+        </w:rPr>
+        <w:t>;</w:t>
+      </w:r>
+    </w:p>
+    <w:p>
+      <w:pPr>
+        <w:pStyle w:val="P1"/>
+        <w:rPr>
+          <w:lang w:val="uk-UA"/>
+        </w:rPr>
+      </w:pPr>
+      <w:r>
+        <w:rPr>
+          <w:lang w:val="uk-UA"/>
+        </w:rPr>
+        <w:t xml:space="preserve">2. запустити прогрму на чотирьох потоках, отримати значення </w:t>
+      </w:r>
+      <w:r>
+        <w:rPr>
+          <w:lang w:val="en-US"/>
+        </w:rPr>
+        <w:t>T</w:t>
+      </w:r>
+      <w:r>
+        <w:rPr>
+          <w:vertAlign w:val="subscript"/>
+          <w:lang w:val="en-US"/>
+        </w:rPr>
+        <w:t>4</w:t>
+      </w:r>
+      <w:r>
+        <w:rPr>
+          <w:position w:val="0"/>
+          <w:sz w:val="28"/>
+          <w:vertAlign w:val="baseline"/>
+          <w:lang w:val="en-US"/>
+        </w:rPr>
+        <w:t>;</w:t>
+      </w:r>
+    </w:p>
+    <w:p>
+      <w:pPr>
+        <w:pStyle w:val="P1"/>
+        <w:rPr>
+          <w:lang w:val="en-US"/>
+        </w:rPr>
+      </w:pPr>
+      <w:r>
+        <w:rPr>
+          <w:lang w:val="en-US"/>
+        </w:rPr>
+        <w:t xml:space="preserve">3. </w:t>
+      </w:r>
+      <w:r>
+        <w:rPr>
+          <w:lang w:val="uk-UA"/>
+        </w:rPr>
+        <w:t xml:space="preserve">розрахувати прискорення, поділивши </w:t>
+      </w:r>
+      <w:r>
+        <w:rPr>
+          <w:lang w:val="en-US"/>
+        </w:rPr>
+        <w:t>T</w:t>
+      </w:r>
+      <w:r>
+        <w:rPr>
+          <w:vertAlign w:val="subscript"/>
+          <w:lang w:val="en-US"/>
+        </w:rPr>
+        <w:t xml:space="preserve">1 </w:t>
+      </w:r>
+      <w:r>
+        <w:rPr>
+          <w:position w:val="0"/>
+          <w:sz w:val="28"/>
+          <w:vertAlign w:val="baseline"/>
+          <w:lang w:val="uk-UA"/>
+        </w:rPr>
+        <w:t xml:space="preserve">на  </w:t>
+      </w:r>
+      <w:r>
+        <w:rPr>
+          <w:position w:val="0"/>
+          <w:sz w:val="28"/>
+          <w:vertAlign w:val="baseline"/>
+          <w:lang w:val="en-US"/>
+        </w:rPr>
+        <w:t>T</w:t>
+      </w:r>
+      <w:r>
+        <w:rPr>
+          <w:vertAlign w:val="subscript"/>
+          <w:lang w:val="en-US"/>
+        </w:rPr>
+        <w:t>4</w:t>
+      </w:r>
+      <w:r>
+        <w:rPr>
+          <w:position w:val="0"/>
+          <w:sz w:val="28"/>
+          <w:vertAlign w:val="baseline"/>
+          <w:lang w:val="uk-UA"/>
+        </w:rPr>
+        <w:t>.</w:t>
+      </w:r>
+    </w:p>
+    <w:p>
+      <w:pPr>
+        <w:pStyle w:val="P1"/>
+        <w:rPr>
+          <w:lang w:val="uk-UA"/>
+        </w:rPr>
+      </w:pPr>
+      <w:r>
+        <w:rPr>
+          <w:lang w:val="uk-UA"/>
+        </w:rPr>
+        <w:t>Процес:</w:t>
+      </w:r>
+    </w:p>
+    <w:p>
+      <w:pPr>
+        <w:pStyle w:val="P1"/>
+        <w:rPr>
+          <w:lang w:val="uk-UA"/>
+        </w:rPr>
+      </w:pPr>
+      <w:r>
+        <w:rPr>
+          <w:lang w:val="uk-UA"/>
+        </w:rPr>
+        <w:t>1. Значення Т</w:t>
+      </w:r>
+      <w:r>
+        <w:rPr>
+          <w:vertAlign w:val="subscript"/>
+          <w:lang w:val="uk-UA"/>
+        </w:rPr>
+        <w:t>1</w:t>
+      </w:r>
+      <w:r>
+        <w:rPr>
+          <w:position w:val="0"/>
+          <w:sz w:val="28"/>
+          <w:vertAlign w:val="baseline"/>
+          <w:lang w:val="uk-UA"/>
+        </w:rPr>
+        <w:t xml:space="preserve"> = 9.594051;</w:t>
+      </w:r>
+    </w:p>
+    <w:p>
+      <w:pPr>
+        <w:pStyle w:val="P1"/>
+        <w:rPr>
+          <w:lang w:val="uk-UA"/>
+        </w:rPr>
+      </w:pPr>
+      <w:r>
+        <w:rPr>
+          <w:lang w:val="uk-UA"/>
+        </w:rPr>
+        <w:t xml:space="preserve">2. Значення </w:t>
+      </w:r>
+      <w:r>
+        <w:rPr>
+          <w:position w:val="0"/>
+          <w:sz w:val="28"/>
+          <w:vertAlign w:val="baseline"/>
+          <w:lang w:val="en-US"/>
+        </w:rPr>
+        <w:t>T</w:t>
+      </w:r>
+      <w:r>
+        <w:rPr>
+          <w:vertAlign w:val="subscript"/>
+          <w:lang w:val="en-US"/>
+        </w:rPr>
+        <w:t>4</w:t>
+      </w:r>
+      <w:r>
+        <w:rPr>
+          <w:position w:val="0"/>
+          <w:sz w:val="28"/>
+          <w:vertAlign w:val="baseline"/>
+          <w:lang w:val="en-US"/>
+        </w:rPr>
+        <w:t xml:space="preserve"> </w:t>
+      </w:r>
+      <w:r>
+        <w:rPr>
+          <w:position w:val="0"/>
+          <w:sz w:val="28"/>
+          <w:vertAlign w:val="baseline"/>
+          <w:lang w:val="uk-UA"/>
+        </w:rPr>
+        <w:t>= 2.499878;</w:t>
+      </w:r>
+    </w:p>
+    <w:p>
+      <w:pPr>
+        <w:pStyle w:val="P1"/>
+        <w:rPr>
+          <w:lang w:val="uk-UA"/>
+        </w:rPr>
+      </w:pPr>
+      <w:r>
+        <w:rPr>
+          <w:lang w:val="uk-UA"/>
+        </w:rPr>
+        <w:t xml:space="preserve">3. Значення </w:t>
+      </w:r>
+      <w:r>
+        <w:rPr>
+          <w:lang w:val="en-US"/>
+        </w:rPr>
+        <w:t>S (</w:t>
+      </w:r>
+      <w:r>
+        <w:rPr>
+          <w:lang w:val="uk-UA"/>
+        </w:rPr>
+        <w:t>прискорення) = 3.83780768502.</w:t>
       </w:r>
     </w:p>
     <w:p>

</xml_diff>

<commit_message>
feat -- TR5: 5123 done Jesus please help
</commit_message>
<xml_diff>
--- a/42TR Tehnologiji Rozpodilenyh System/5/TR_KNT-122_Onyshchenko_19_PR5.docx
+++ b/42TR Tehnologiji Rozpodilenyh System/5/TR_KNT-122_Onyshchenko_19_PR5.docx
@@ -570,10 +570,151 @@
     <w:p>
       <w:pPr>
         <w:pStyle w:val="p11"/>
-        <w:rPr/>
-      </w:pPr>
-      <w:r>
-        <w:rPr/>
+        <w:rPr>
+          <w:lang w:val="en-US"/>
+        </w:rPr>
+      </w:pPr>
+      <w:r>
+        <w:rPr>
+          <w:lang w:val="en-US"/>
+        </w:rPr>
+        <w:t>5.1.2.3 Використовуючи опановану техніку інтегрування, розробіть послідовні алгоритм та програму обчислення інтеграла у відповідності до наведених нижче варіантів. В програмі реалізуйте введення кількості інтервалів з клавіатури. Дослідіть точність та швидкодію програми для значень кількості інтервалів 10</w:t>
+      </w:r>
+      <w:r>
+        <w:rPr>
+          <w:vertAlign w:val="superscript"/>
+          <w:lang w:val="en-US"/>
+        </w:rPr>
+        <w:t>3</w:t>
+      </w:r>
+      <w:r>
+        <w:rPr>
+          <w:lang w:val="en-US"/>
+        </w:rPr>
+        <w:t>, 10</w:t>
+      </w:r>
+      <w:r>
+        <w:rPr>
+          <w:vertAlign w:val="superscript"/>
+          <w:lang w:val="en-US"/>
+        </w:rPr>
+        <w:t>4</w:t>
+      </w:r>
+      <w:r>
+        <w:rPr>
+          <w:lang w:val="en-US"/>
+        </w:rPr>
+        <w:t>, 10</w:t>
+      </w:r>
+      <w:r>
+        <w:rPr>
+          <w:vertAlign w:val="superscript"/>
+          <w:lang w:val="en-US"/>
+        </w:rPr>
+        <w:t>5</w:t>
+      </w:r>
+      <w:r>
+        <w:rPr>
+          <w:lang w:val="en-US"/>
+        </w:rPr>
+        <w:t>, 10</w:t>
+      </w:r>
+      <w:r>
+        <w:rPr>
+          <w:vertAlign w:val="superscript"/>
+          <w:lang w:val="en-US"/>
+        </w:rPr>
+        <w:t>6</w:t>
+      </w:r>
+      <w:r>
+        <w:rPr>
+          <w:lang w:val="en-US"/>
+        </w:rPr>
+        <w:t>, 10</w:t>
+      </w:r>
+      <w:r>
+        <w:rPr>
+          <w:vertAlign w:val="superscript"/>
+          <w:lang w:val="en-US"/>
+        </w:rPr>
+        <w:t>7</w:t>
+      </w:r>
+      <w:r>
+        <w:rPr>
+          <w:lang w:val="en-US"/>
+        </w:rPr>
+        <w:t>, 10</w:t>
+      </w:r>
+      <w:r>
+        <w:rPr>
+          <w:vertAlign w:val="superscript"/>
+          <w:lang w:val="en-US"/>
+        </w:rPr>
+        <w:t>9</w:t>
+      </w:r>
+      <w:r>
+        <w:drawing>
+          <wp:anchor behindDoc="0" distT="0" distB="0" distL="0" distR="0" simplePos="0" locked="0" layoutInCell="0" allowOverlap="1" relativeHeight="2">
+            <wp:simplePos x="0" y="0"/>
+            <wp:positionH relativeFrom="column">
+              <wp:posOffset>2188845</wp:posOffset>
+            </wp:positionH>
+            <wp:positionV relativeFrom="paragraph">
+              <wp:posOffset>1558925</wp:posOffset>
+            </wp:positionV>
+            <wp:extent cx="1438275" cy="466725"/>
+            <wp:effectExtent l="0" t="0" r="0" b="0"/>
+            <wp:wrapSquare wrapText="largest"/>
+            <wp:docPr id="1" name="Зображення1"/>
+            <wp:cNvGraphicFramePr>
+              <a:graphicFrameLocks xmlns:a="http://schemas.openxmlformats.org/drawingml/2006/main" noChangeAspect="1"/>
+            </wp:cNvGraphicFramePr>
+            <a:graphic xmlns:a="http://schemas.openxmlformats.org/drawingml/2006/main">
+              <a:graphicData uri="http://schemas.openxmlformats.org/drawingml/2006/picture">
+                <pic:pic xmlns:pic="http://schemas.openxmlformats.org/drawingml/2006/picture">
+                  <pic:nvPicPr>
+                    <pic:cNvPr id="1" name="Зображення1"/>
+                    <pic:cNvPicPr>
+                      <a:picLocks noChangeAspect="1" noChangeArrowheads="1"/>
+                    </pic:cNvPicPr>
+                  </pic:nvPicPr>
+                  <pic:blipFill>
+                    <a:blip r:embed="rId2"/>
+                    <a:stretch>
+                      <a:fillRect/>
+                    </a:stretch>
+                  </pic:blipFill>
+                  <pic:spPr bwMode="auto">
+                    <a:xfrm>
+                      <a:off x="0" y="0"/>
+                      <a:ext cx="1438275" cy="466725"/>
+                    </a:xfrm>
+                    <a:prstGeom prst="rect">
+                      <a:avLst/>
+                    </a:prstGeom>
+                    <a:noFill/>
+                  </pic:spPr>
+                </pic:pic>
+              </a:graphicData>
+            </a:graphic>
+          </wp:anchor>
+        </w:drawing>
+      </w:r>
+      <w:r>
+        <w:rPr>
+          <w:lang w:val="en-US"/>
+        </w:rPr>
+        <w:t>. Результати подайте у звіті у вигляді таблиці.</w:t>
+      </w:r>
+    </w:p>
+    <w:p>
+      <w:pPr>
+        <w:pStyle w:val="p11"/>
+        <w:rPr/>
+      </w:pPr>
+      <w:r>
+        <w:rPr/>
+        <w:t xml:space="preserve">Обчислити інтеграл </w:t>
       </w:r>
     </w:p>
     <w:p>
@@ -1367,16 +1508,16 @@
         </w:tblCellMar>
       </w:tblPr>
       <w:tblGrid>
-        <w:gridCol w:w="1397"/>
-        <w:gridCol w:w="2111"/>
-        <w:gridCol w:w="2537"/>
-        <w:gridCol w:w="1914"/>
+        <w:gridCol w:w="1396"/>
+        <w:gridCol w:w="2112"/>
+        <w:gridCol w:w="2536"/>
+        <w:gridCol w:w="1915"/>
       </w:tblGrid>
       <w:tr>
         <w:trPr/>
         <w:tc>
           <w:tcPr>
-            <w:tcW w:w="1397" w:type="dxa"/>
+            <w:tcW w:w="1396" w:type="dxa"/>
             <w:tcBorders>
               <w:top w:val="single" w:sz="4" w:space="0" w:color="000000"/>
               <w:left w:val="single" w:sz="4" w:space="0" w:color="000000"/>
@@ -1386,7 +1527,7 @@
           </w:tcPr>
           <w:p>
             <w:pPr>
-              <w:pStyle w:val="Style14"/>
+              <w:pStyle w:val="user2"/>
               <w:spacing w:lineRule="auto" w:line="240"/>
               <w:ind w:hanging="0" w:left="0"/>
               <w:rPr>
@@ -1421,7 +1562,7 @@
         </w:tc>
         <w:tc>
           <w:tcPr>
-            <w:tcW w:w="2111" w:type="dxa"/>
+            <w:tcW w:w="2112" w:type="dxa"/>
             <w:tcBorders>
               <w:top w:val="single" w:sz="4" w:space="0" w:color="000000"/>
               <w:left w:val="single" w:sz="4" w:space="0" w:color="000000"/>
@@ -1431,7 +1572,7 @@
           </w:tcPr>
           <w:p>
             <w:pPr>
-              <w:pStyle w:val="Style14"/>
+              <w:pStyle w:val="user2"/>
               <w:spacing w:lineRule="auto" w:line="240"/>
               <w:ind w:hanging="0" w:left="0"/>
               <w:rPr>
@@ -1454,7 +1595,7 @@
         </w:tc>
         <w:tc>
           <w:tcPr>
-            <w:tcW w:w="2537" w:type="dxa"/>
+            <w:tcW w:w="2536" w:type="dxa"/>
             <w:tcBorders>
               <w:top w:val="single" w:sz="4" w:space="0" w:color="000000"/>
               <w:left w:val="single" w:sz="4" w:space="0" w:color="000000"/>
@@ -1464,7 +1605,7 @@
           </w:tcPr>
           <w:p>
             <w:pPr>
-              <w:pStyle w:val="Style14"/>
+              <w:pStyle w:val="user2"/>
               <w:spacing w:lineRule="auto" w:line="240"/>
               <w:ind w:hanging="0" w:left="0"/>
               <w:rPr>
@@ -1487,7 +1628,7 @@
         </w:tc>
         <w:tc>
           <w:tcPr>
-            <w:tcW w:w="1914" w:type="dxa"/>
+            <w:tcW w:w="1915" w:type="dxa"/>
             <w:tcBorders>
               <w:top w:val="single" w:sz="4" w:space="0" w:color="000000"/>
               <w:left w:val="single" w:sz="4" w:space="0" w:color="000000"/>
@@ -1498,7 +1639,7 @@
           </w:tcPr>
           <w:p>
             <w:pPr>
-              <w:pStyle w:val="Style14"/>
+              <w:pStyle w:val="user2"/>
               <w:spacing w:lineRule="auto" w:line="240"/>
               <w:ind w:hanging="0" w:left="0"/>
               <w:rPr>
@@ -1524,7 +1665,7 @@
         <w:trPr/>
         <w:tc>
           <w:tcPr>
-            <w:tcW w:w="1397" w:type="dxa"/>
+            <w:tcW w:w="1396" w:type="dxa"/>
             <w:tcBorders>
               <w:left w:val="single" w:sz="4" w:space="0" w:color="000000"/>
               <w:bottom w:val="single" w:sz="4" w:space="0" w:color="000000"/>
@@ -1533,7 +1674,7 @@
           </w:tcPr>
           <w:p>
             <w:pPr>
-              <w:pStyle w:val="Style14"/>
+              <w:pStyle w:val="user2"/>
               <w:spacing w:lineRule="auto" w:line="240"/>
               <w:ind w:hanging="0" w:left="0"/>
               <w:rPr>
@@ -1563,7 +1704,7 @@
         </w:tc>
         <w:tc>
           <w:tcPr>
-            <w:tcW w:w="2111" w:type="dxa"/>
+            <w:tcW w:w="2112" w:type="dxa"/>
             <w:tcBorders>
               <w:left w:val="single" w:sz="4" w:space="0" w:color="000000"/>
               <w:bottom w:val="single" w:sz="4" w:space="0" w:color="000000"/>
@@ -1572,7 +1713,7 @@
           </w:tcPr>
           <w:p>
             <w:pPr>
-              <w:pStyle w:val="Style14"/>
+              <w:pStyle w:val="user2"/>
               <w:spacing w:lineRule="auto" w:line="240"/>
               <w:ind w:hanging="0" w:left="0"/>
               <w:rPr>
@@ -1591,7 +1732,7 @@
         </w:tc>
         <w:tc>
           <w:tcPr>
-            <w:tcW w:w="2537" w:type="dxa"/>
+            <w:tcW w:w="2536" w:type="dxa"/>
             <w:tcBorders>
               <w:left w:val="single" w:sz="4" w:space="0" w:color="000000"/>
               <w:bottom w:val="single" w:sz="4" w:space="0" w:color="000000"/>
@@ -1600,7 +1741,7 @@
           </w:tcPr>
           <w:p>
             <w:pPr>
-              <w:pStyle w:val="Style14"/>
+              <w:pStyle w:val="user2"/>
               <w:spacing w:lineRule="auto" w:line="240"/>
               <w:ind w:hanging="0" w:left="0"/>
               <w:rPr>
@@ -1619,7 +1760,7 @@
         </w:tc>
         <w:tc>
           <w:tcPr>
-            <w:tcW w:w="1914" w:type="dxa"/>
+            <w:tcW w:w="1915" w:type="dxa"/>
             <w:tcBorders>
               <w:left w:val="single" w:sz="4" w:space="0" w:color="000000"/>
               <w:bottom w:val="single" w:sz="4" w:space="0" w:color="000000"/>
@@ -1629,7 +1770,7 @@
           </w:tcPr>
           <w:p>
             <w:pPr>
-              <w:pStyle w:val="Style14"/>
+              <w:pStyle w:val="user2"/>
               <w:spacing w:lineRule="auto" w:line="240"/>
               <w:ind w:hanging="0" w:left="0"/>
               <w:rPr>
@@ -1651,7 +1792,7 @@
         <w:trPr/>
         <w:tc>
           <w:tcPr>
-            <w:tcW w:w="1397" w:type="dxa"/>
+            <w:tcW w:w="1396" w:type="dxa"/>
             <w:tcBorders>
               <w:left w:val="single" w:sz="4" w:space="0" w:color="000000"/>
               <w:bottom w:val="single" w:sz="4" w:space="0" w:color="000000"/>
@@ -1687,7 +1828,7 @@
         </w:tc>
         <w:tc>
           <w:tcPr>
-            <w:tcW w:w="2111" w:type="dxa"/>
+            <w:tcW w:w="2112" w:type="dxa"/>
             <w:tcBorders>
               <w:left w:val="single" w:sz="4" w:space="0" w:color="000000"/>
               <w:bottom w:val="single" w:sz="4" w:space="0" w:color="000000"/>
@@ -1696,7 +1837,7 @@
           </w:tcPr>
           <w:p>
             <w:pPr>
-              <w:pStyle w:val="Style14"/>
+              <w:pStyle w:val="user2"/>
               <w:spacing w:lineRule="auto" w:line="240"/>
               <w:ind w:hanging="0" w:left="0"/>
               <w:rPr>
@@ -1715,7 +1856,7 @@
         </w:tc>
         <w:tc>
           <w:tcPr>
-            <w:tcW w:w="2537" w:type="dxa"/>
+            <w:tcW w:w="2536" w:type="dxa"/>
             <w:tcBorders>
               <w:left w:val="single" w:sz="4" w:space="0" w:color="000000"/>
               <w:bottom w:val="single" w:sz="4" w:space="0" w:color="000000"/>
@@ -1724,7 +1865,7 @@
           </w:tcPr>
           <w:p>
             <w:pPr>
-              <w:pStyle w:val="Style14"/>
+              <w:pStyle w:val="user2"/>
               <w:spacing w:lineRule="auto" w:line="240"/>
               <w:ind w:hanging="0" w:left="0"/>
               <w:rPr>
@@ -1743,7 +1884,7 @@
         </w:tc>
         <w:tc>
           <w:tcPr>
-            <w:tcW w:w="1914" w:type="dxa"/>
+            <w:tcW w:w="1915" w:type="dxa"/>
             <w:tcBorders>
               <w:left w:val="single" w:sz="4" w:space="0" w:color="000000"/>
               <w:bottom w:val="single" w:sz="4" w:space="0" w:color="000000"/>
@@ -1753,7 +1894,7 @@
           </w:tcPr>
           <w:p>
             <w:pPr>
-              <w:pStyle w:val="Style14"/>
+              <w:pStyle w:val="user2"/>
               <w:spacing w:lineRule="auto" w:line="240"/>
               <w:ind w:hanging="0" w:left="0"/>
               <w:rPr>
@@ -1775,7 +1916,7 @@
         <w:trPr/>
         <w:tc>
           <w:tcPr>
-            <w:tcW w:w="1397" w:type="dxa"/>
+            <w:tcW w:w="1396" w:type="dxa"/>
             <w:tcBorders>
               <w:left w:val="single" w:sz="4" w:space="0" w:color="000000"/>
               <w:bottom w:val="single" w:sz="4" w:space="0" w:color="000000"/>
@@ -1810,7 +1951,7 @@
         </w:tc>
         <w:tc>
           <w:tcPr>
-            <w:tcW w:w="2111" w:type="dxa"/>
+            <w:tcW w:w="2112" w:type="dxa"/>
             <w:tcBorders>
               <w:left w:val="single" w:sz="4" w:space="0" w:color="000000"/>
               <w:bottom w:val="single" w:sz="4" w:space="0" w:color="000000"/>
@@ -1819,7 +1960,7 @@
           </w:tcPr>
           <w:p>
             <w:pPr>
-              <w:pStyle w:val="Style14"/>
+              <w:pStyle w:val="user2"/>
               <w:spacing w:lineRule="auto" w:line="240"/>
               <w:ind w:hanging="0" w:left="0"/>
               <w:rPr>
@@ -1838,7 +1979,7 @@
         </w:tc>
         <w:tc>
           <w:tcPr>
-            <w:tcW w:w="2537" w:type="dxa"/>
+            <w:tcW w:w="2536" w:type="dxa"/>
             <w:tcBorders>
               <w:left w:val="single" w:sz="4" w:space="0" w:color="000000"/>
               <w:bottom w:val="single" w:sz="4" w:space="0" w:color="000000"/>
@@ -1847,7 +1988,7 @@
           </w:tcPr>
           <w:p>
             <w:pPr>
-              <w:pStyle w:val="Style14"/>
+              <w:pStyle w:val="user2"/>
               <w:spacing w:lineRule="auto" w:line="240"/>
               <w:ind w:hanging="0" w:left="0"/>
               <w:rPr>
@@ -1866,7 +2007,7 @@
         </w:tc>
         <w:tc>
           <w:tcPr>
-            <w:tcW w:w="1914" w:type="dxa"/>
+            <w:tcW w:w="1915" w:type="dxa"/>
             <w:tcBorders>
               <w:left w:val="single" w:sz="4" w:space="0" w:color="000000"/>
               <w:bottom w:val="single" w:sz="4" w:space="0" w:color="000000"/>
@@ -1876,7 +2017,7 @@
           </w:tcPr>
           <w:p>
             <w:pPr>
-              <w:pStyle w:val="Style14"/>
+              <w:pStyle w:val="user2"/>
               <w:spacing w:lineRule="auto" w:line="240"/>
               <w:ind w:hanging="0" w:left="0"/>
               <w:rPr>
@@ -1898,7 +2039,7 @@
         <w:trPr/>
         <w:tc>
           <w:tcPr>
-            <w:tcW w:w="1397" w:type="dxa"/>
+            <w:tcW w:w="1396" w:type="dxa"/>
             <w:tcBorders>
               <w:left w:val="single" w:sz="4" w:space="0" w:color="000000"/>
               <w:bottom w:val="single" w:sz="4" w:space="0" w:color="000000"/>
@@ -1933,7 +2074,7 @@
         </w:tc>
         <w:tc>
           <w:tcPr>
-            <w:tcW w:w="2111" w:type="dxa"/>
+            <w:tcW w:w="2112" w:type="dxa"/>
             <w:tcBorders>
               <w:left w:val="single" w:sz="4" w:space="0" w:color="000000"/>
               <w:bottom w:val="single" w:sz="4" w:space="0" w:color="000000"/>
@@ -1942,7 +2083,7 @@
           </w:tcPr>
           <w:p>
             <w:pPr>
-              <w:pStyle w:val="Style14"/>
+              <w:pStyle w:val="user2"/>
               <w:spacing w:lineRule="auto" w:line="240"/>
               <w:ind w:hanging="0" w:left="0"/>
               <w:rPr>
@@ -1961,7 +2102,7 @@
         </w:tc>
         <w:tc>
           <w:tcPr>
-            <w:tcW w:w="2537" w:type="dxa"/>
+            <w:tcW w:w="2536" w:type="dxa"/>
             <w:tcBorders>
               <w:left w:val="single" w:sz="4" w:space="0" w:color="000000"/>
               <w:bottom w:val="single" w:sz="4" w:space="0" w:color="000000"/>
@@ -1970,7 +2111,7 @@
           </w:tcPr>
           <w:p>
             <w:pPr>
-              <w:pStyle w:val="Style14"/>
+              <w:pStyle w:val="user2"/>
               <w:spacing w:lineRule="auto" w:line="240"/>
               <w:ind w:hanging="0" w:left="0"/>
               <w:rPr>
@@ -1989,7 +2130,7 @@
         </w:tc>
         <w:tc>
           <w:tcPr>
-            <w:tcW w:w="1914" w:type="dxa"/>
+            <w:tcW w:w="1915" w:type="dxa"/>
             <w:tcBorders>
               <w:left w:val="single" w:sz="4" w:space="0" w:color="000000"/>
               <w:bottom w:val="single" w:sz="4" w:space="0" w:color="000000"/>
@@ -1999,7 +2140,7 @@
           </w:tcPr>
           <w:p>
             <w:pPr>
-              <w:pStyle w:val="Style14"/>
+              <w:pStyle w:val="user2"/>
               <w:spacing w:lineRule="auto" w:line="240"/>
               <w:ind w:hanging="0" w:left="0"/>
               <w:rPr>
@@ -2021,7 +2162,7 @@
         <w:trPr/>
         <w:tc>
           <w:tcPr>
-            <w:tcW w:w="1397" w:type="dxa"/>
+            <w:tcW w:w="1396" w:type="dxa"/>
             <w:tcBorders>
               <w:left w:val="single" w:sz="4" w:space="0" w:color="000000"/>
               <w:bottom w:val="single" w:sz="4" w:space="0" w:color="000000"/>
@@ -2056,7 +2197,7 @@
         </w:tc>
         <w:tc>
           <w:tcPr>
-            <w:tcW w:w="2111" w:type="dxa"/>
+            <w:tcW w:w="2112" w:type="dxa"/>
             <w:tcBorders>
               <w:left w:val="single" w:sz="4" w:space="0" w:color="000000"/>
               <w:bottom w:val="single" w:sz="4" w:space="0" w:color="000000"/>
@@ -2065,7 +2206,7 @@
           </w:tcPr>
           <w:p>
             <w:pPr>
-              <w:pStyle w:val="Style14"/>
+              <w:pStyle w:val="user2"/>
               <w:spacing w:lineRule="auto" w:line="240"/>
               <w:ind w:hanging="0" w:left="0"/>
               <w:rPr>
@@ -2084,7 +2225,7 @@
         </w:tc>
         <w:tc>
           <w:tcPr>
-            <w:tcW w:w="2537" w:type="dxa"/>
+            <w:tcW w:w="2536" w:type="dxa"/>
             <w:tcBorders>
               <w:left w:val="single" w:sz="4" w:space="0" w:color="000000"/>
               <w:bottom w:val="single" w:sz="4" w:space="0" w:color="000000"/>
@@ -2093,7 +2234,7 @@
           </w:tcPr>
           <w:p>
             <w:pPr>
-              <w:pStyle w:val="Style14"/>
+              <w:pStyle w:val="user2"/>
               <w:spacing w:lineRule="auto" w:line="240"/>
               <w:ind w:hanging="0" w:left="0"/>
               <w:rPr>
@@ -2112,7 +2253,7 @@
         </w:tc>
         <w:tc>
           <w:tcPr>
-            <w:tcW w:w="1914" w:type="dxa"/>
+            <w:tcW w:w="1915" w:type="dxa"/>
             <w:tcBorders>
               <w:left w:val="single" w:sz="4" w:space="0" w:color="000000"/>
               <w:bottom w:val="single" w:sz="4" w:space="0" w:color="000000"/>
@@ -2122,7 +2263,7 @@
           </w:tcPr>
           <w:p>
             <w:pPr>
-              <w:pStyle w:val="Style14"/>
+              <w:pStyle w:val="user2"/>
               <w:spacing w:lineRule="auto" w:line="240"/>
               <w:ind w:hanging="0" w:left="0"/>
               <w:rPr>
@@ -2144,7 +2285,7 @@
         <w:trPr/>
         <w:tc>
           <w:tcPr>
-            <w:tcW w:w="1397" w:type="dxa"/>
+            <w:tcW w:w="1396" w:type="dxa"/>
             <w:tcBorders>
               <w:left w:val="single" w:sz="4" w:space="0" w:color="000000"/>
               <w:bottom w:val="single" w:sz="4" w:space="0" w:color="000000"/>
@@ -2180,7 +2321,7 @@
         </w:tc>
         <w:tc>
           <w:tcPr>
-            <w:tcW w:w="2111" w:type="dxa"/>
+            <w:tcW w:w="2112" w:type="dxa"/>
             <w:tcBorders>
               <w:left w:val="single" w:sz="4" w:space="0" w:color="000000"/>
               <w:bottom w:val="single" w:sz="4" w:space="0" w:color="000000"/>
@@ -2189,7 +2330,7 @@
           </w:tcPr>
           <w:p>
             <w:pPr>
-              <w:pStyle w:val="Style14"/>
+              <w:pStyle w:val="user2"/>
               <w:spacing w:lineRule="auto" w:line="240"/>
               <w:ind w:hanging="0" w:left="0"/>
               <w:rPr>
@@ -2208,7 +2349,7 @@
         </w:tc>
         <w:tc>
           <w:tcPr>
-            <w:tcW w:w="2537" w:type="dxa"/>
+            <w:tcW w:w="2536" w:type="dxa"/>
             <w:tcBorders>
               <w:left w:val="single" w:sz="4" w:space="0" w:color="000000"/>
               <w:bottom w:val="single" w:sz="4" w:space="0" w:color="000000"/>
@@ -2217,7 +2358,7 @@
           </w:tcPr>
           <w:p>
             <w:pPr>
-              <w:pStyle w:val="Style14"/>
+              <w:pStyle w:val="user2"/>
               <w:spacing w:lineRule="auto" w:line="240"/>
               <w:ind w:hanging="0" w:left="0"/>
               <w:rPr>
@@ -2236,7 +2377,7 @@
         </w:tc>
         <w:tc>
           <w:tcPr>
-            <w:tcW w:w="1914" w:type="dxa"/>
+            <w:tcW w:w="1915" w:type="dxa"/>
             <w:tcBorders>
               <w:left w:val="single" w:sz="4" w:space="0" w:color="000000"/>
               <w:bottom w:val="single" w:sz="4" w:space="0" w:color="000000"/>
@@ -2246,7 +2387,7 @@
           </w:tcPr>
           <w:p>
             <w:pPr>
-              <w:pStyle w:val="Style14"/>
+              <w:pStyle w:val="user2"/>
               <w:spacing w:lineRule="auto" w:line="240"/>
               <w:ind w:hanging="0" w:left="0"/>
               <w:rPr>
@@ -3200,40 +3341,56 @@
     <w:p>
       <w:pPr>
         <w:pStyle w:val="Code"/>
-        <w:rPr/>
-      </w:pPr>
-      <w:r>
-        <w:rPr/>
+        <w:rPr>
+          <w:rFonts w:ascii="Cascadia Code" w:hAnsi="Cascadia Code"/>
+        </w:rPr>
+      </w:pPr>
+      <w:r>
+        <w:rPr>
+          <w:rFonts w:ascii="Cascadia Code" w:hAnsi="Cascadia Code"/>
+        </w:rPr>
         <w:t>Processes amount: 4</w:t>
       </w:r>
     </w:p>
     <w:p>
       <w:pPr>
         <w:pStyle w:val="Code"/>
-        <w:rPr/>
-      </w:pPr>
-      <w:r>
-        <w:rPr/>
+        <w:rPr>
+          <w:rFonts w:ascii="Cascadia Code" w:hAnsi="Cascadia Code"/>
+        </w:rPr>
+      </w:pPr>
+      <w:r>
+        <w:rPr>
+          <w:rFonts w:ascii="Cascadia Code" w:hAnsi="Cascadia Code"/>
+        </w:rPr>
         <w:t>Calculated PI: 3.1415926535896825</w:t>
       </w:r>
     </w:p>
     <w:p>
       <w:pPr>
         <w:pStyle w:val="Code"/>
-        <w:rPr/>
-      </w:pPr>
-      <w:r>
-        <w:rPr/>
+        <w:rPr>
+          <w:rFonts w:ascii="Cascadia Code" w:hAnsi="Cascadia Code"/>
+        </w:rPr>
+      </w:pPr>
+      <w:r>
+        <w:rPr>
+          <w:rFonts w:ascii="Cascadia Code" w:hAnsi="Cascadia Code"/>
+        </w:rPr>
         <w:t>Error: 1.1057821325266559e-13</w:t>
       </w:r>
     </w:p>
     <w:p>
       <w:pPr>
         <w:pStyle w:val="Code"/>
-        <w:rPr/>
-      </w:pPr>
-      <w:r>
-        <w:rPr/>
+        <w:rPr>
+          <w:rFonts w:ascii="Cascadia Code" w:hAnsi="Cascadia Code"/>
+        </w:rPr>
+      </w:pPr>
+      <w:r>
+        <w:rPr>
+          <w:rFonts w:ascii="Cascadia Code" w:hAnsi="Cascadia Code"/>
+        </w:rPr>
         <w:t>Execution time: 2.499878 sec</w:t>
       </w:r>
     </w:p>
@@ -3281,6 +3438,7 @@
       <w:r>
         <w:rPr>
           <w:position w:val="0"/>
+          <w:sz w:val="28"/>
           <w:sz w:val="28"/>
           <w:vertAlign w:val="baseline"/>
           <w:lang w:val="en-US"/>
@@ -3318,6 +3476,7 @@
         <w:rPr>
           <w:position w:val="0"/>
           <w:sz w:val="28"/>
+          <w:sz w:val="28"/>
           <w:vertAlign w:val="baseline"/>
           <w:lang w:val="en-US"/>
         </w:rPr>
@@ -3359,6 +3518,7 @@
       <w:r>
         <w:rPr>
           <w:position w:val="0"/>
+          <w:sz w:val="28"/>
           <w:sz w:val="28"/>
           <w:vertAlign w:val="baseline"/>
           <w:lang w:val="uk-UA"/>
@@ -3369,6 +3529,7 @@
         <w:rPr>
           <w:position w:val="0"/>
           <w:sz w:val="28"/>
+          <w:sz w:val="28"/>
           <w:vertAlign w:val="baseline"/>
           <w:lang w:val="en-US"/>
         </w:rPr>
@@ -3384,6 +3545,7 @@
       <w:r>
         <w:rPr>
           <w:position w:val="0"/>
+          <w:sz w:val="28"/>
           <w:sz w:val="28"/>
           <w:vertAlign w:val="baseline"/>
           <w:lang w:val="uk-UA"/>
@@ -3429,6 +3591,7 @@
         <w:rPr>
           <w:position w:val="0"/>
           <w:sz w:val="28"/>
+          <w:sz w:val="28"/>
           <w:vertAlign w:val="baseline"/>
           <w:lang w:val="uk-UA"/>
         </w:rPr>
@@ -3451,6 +3614,7 @@
       <w:r>
         <w:rPr>
           <w:position w:val="0"/>
+          <w:sz w:val="28"/>
           <w:sz w:val="28"/>
           <w:vertAlign w:val="baseline"/>
           <w:lang w:val="en-US"/>
@@ -3468,6 +3632,7 @@
         <w:rPr>
           <w:position w:val="0"/>
           <w:sz w:val="28"/>
+          <w:sz w:val="28"/>
           <w:vertAlign w:val="baseline"/>
           <w:lang w:val="en-US"/>
         </w:rPr>
@@ -3476,6 +3641,7 @@
       <w:r>
         <w:rPr>
           <w:position w:val="0"/>
+          <w:sz w:val="28"/>
           <w:sz w:val="28"/>
           <w:vertAlign w:val="baseline"/>
           <w:lang w:val="uk-UA"/>
@@ -3507,6 +3673,1098 @@
           <w:lang w:val="uk-UA"/>
         </w:rPr>
         <w:t>прискорення) = 3.83780768502.</w:t>
+      </w:r>
+    </w:p>
+    <w:p>
+      <w:pPr>
+        <w:pStyle w:val="P1"/>
+        <w:rPr>
+          <w:lang w:val="uk-UA"/>
+        </w:rPr>
+      </w:pPr>
+      <w:r>
+        <w:rPr>
+          <w:lang w:val="uk-UA"/>
+        </w:rPr>
+      </w:r>
+    </w:p>
+    <w:p>
+      <w:pPr>
+        <w:pStyle w:val="H2"/>
+        <w:rPr/>
+      </w:pPr>
+      <w:r>
+        <w:rPr/>
+        <w:t>5.1.2.3</w:t>
+      </w:r>
+    </w:p>
+    <w:p>
+      <w:pPr>
+        <w:pStyle w:val="H3"/>
+        <w:rPr/>
+      </w:pPr>
+      <w:r>
+        <w:rPr/>
+        <w:t>Завдання</w:t>
+      </w:r>
+    </w:p>
+    <w:p>
+      <w:pPr>
+        <w:pStyle w:val="P1"/>
+        <w:rPr>
+          <w:lang w:val="uk-UA"/>
+        </w:rPr>
+      </w:pPr>
+      <w:r>
+        <w:rPr>
+          <w:lang w:val="uk-UA"/>
+        </w:rPr>
+      </w:r>
+    </w:p>
+    <w:p>
+      <w:pPr>
+        <w:pStyle w:val="Normal"/>
+        <w:rPr>
+          <w:lang w:val="en-US"/>
+        </w:rPr>
+      </w:pPr>
+      <w:r>
+        <w:rPr>
+          <w:lang w:val="en-US"/>
+        </w:rPr>
+        <w:t>Використовуючи опановану техніку інтегрування, розробіть послідовні алгоритм та програму обчислення інтеграла у відповідності до наведених нижче варіантів. В програмі реалізуйте введення кількості інтервалів з клавіатури. Дослідіть точність та швидкодію програми для значень кількості інтервалів 10</w:t>
+      </w:r>
+      <w:r>
+        <w:rPr>
+          <w:vertAlign w:val="superscript"/>
+          <w:lang w:val="en-US"/>
+        </w:rPr>
+        <w:t>3</w:t>
+      </w:r>
+      <w:r>
+        <w:rPr>
+          <w:lang w:val="en-US"/>
+        </w:rPr>
+        <w:t>, 10</w:t>
+      </w:r>
+      <w:r>
+        <w:rPr>
+          <w:vertAlign w:val="superscript"/>
+          <w:lang w:val="en-US"/>
+        </w:rPr>
+        <w:t>4</w:t>
+      </w:r>
+      <w:r>
+        <w:rPr>
+          <w:lang w:val="en-US"/>
+        </w:rPr>
+        <w:t>, 10</w:t>
+      </w:r>
+      <w:r>
+        <w:rPr>
+          <w:vertAlign w:val="superscript"/>
+          <w:lang w:val="en-US"/>
+        </w:rPr>
+        <w:t>5</w:t>
+      </w:r>
+      <w:r>
+        <w:rPr>
+          <w:lang w:val="en-US"/>
+        </w:rPr>
+        <w:t>, 10</w:t>
+      </w:r>
+      <w:r>
+        <w:rPr>
+          <w:vertAlign w:val="superscript"/>
+          <w:lang w:val="en-US"/>
+        </w:rPr>
+        <w:t>6</w:t>
+      </w:r>
+      <w:r>
+        <w:rPr>
+          <w:lang w:val="en-US"/>
+        </w:rPr>
+        <w:t>, 10</w:t>
+      </w:r>
+      <w:r>
+        <w:rPr>
+          <w:vertAlign w:val="superscript"/>
+          <w:lang w:val="en-US"/>
+        </w:rPr>
+        <w:t>7</w:t>
+      </w:r>
+      <w:r>
+        <w:rPr>
+          <w:lang w:val="en-US"/>
+        </w:rPr>
+        <w:t>, 10</w:t>
+      </w:r>
+      <w:r>
+        <w:rPr>
+          <w:vertAlign w:val="superscript"/>
+          <w:lang w:val="en-US"/>
+        </w:rPr>
+        <w:t>9</w:t>
+      </w:r>
+      <w:r>
+        <w:drawing>
+          <wp:anchor behindDoc="0" distT="0" distB="0" distL="0" distR="0" simplePos="0" locked="0" layoutInCell="0" allowOverlap="1" relativeHeight="3">
+            <wp:simplePos x="0" y="0"/>
+            <wp:positionH relativeFrom="column">
+              <wp:posOffset>2188845</wp:posOffset>
+            </wp:positionH>
+            <wp:positionV relativeFrom="paragraph">
+              <wp:posOffset>1558925</wp:posOffset>
+            </wp:positionV>
+            <wp:extent cx="1438275" cy="466725"/>
+            <wp:effectExtent l="0" t="0" r="0" b="0"/>
+            <wp:wrapSquare wrapText="largest"/>
+            <wp:docPr id="2" name="Зображення1 копія 1"/>
+            <wp:cNvGraphicFramePr>
+              <a:graphicFrameLocks xmlns:a="http://schemas.openxmlformats.org/drawingml/2006/main" noChangeAspect="1"/>
+            </wp:cNvGraphicFramePr>
+            <a:graphic xmlns:a="http://schemas.openxmlformats.org/drawingml/2006/main">
+              <a:graphicData uri="http://schemas.openxmlformats.org/drawingml/2006/picture">
+                <pic:pic xmlns:pic="http://schemas.openxmlformats.org/drawingml/2006/picture">
+                  <pic:nvPicPr>
+                    <pic:cNvPr id="2" name="Зображення1 копія 1"/>
+                    <pic:cNvPicPr>
+                      <a:picLocks noChangeAspect="1" noChangeArrowheads="1"/>
+                    </pic:cNvPicPr>
+                  </pic:nvPicPr>
+                  <pic:blipFill>
+                    <a:blip r:embed="rId3"/>
+                    <a:stretch>
+                      <a:fillRect/>
+                    </a:stretch>
+                  </pic:blipFill>
+                  <pic:spPr bwMode="auto">
+                    <a:xfrm>
+                      <a:off x="0" y="0"/>
+                      <a:ext cx="1438275" cy="466725"/>
+                    </a:xfrm>
+                    <a:prstGeom prst="rect">
+                      <a:avLst/>
+                    </a:prstGeom>
+                    <a:noFill/>
+                  </pic:spPr>
+                </pic:pic>
+              </a:graphicData>
+            </a:graphic>
+          </wp:anchor>
+        </w:drawing>
+      </w:r>
+      <w:r>
+        <w:rPr>
+          <w:lang w:val="en-US"/>
+        </w:rPr>
+        <w:t>. Результати подайте у звіті у вигляді таблиці.</w:t>
+      </w:r>
+    </w:p>
+    <w:p>
+      <w:pPr>
+        <w:pStyle w:val="p11"/>
+        <w:rPr>
+          <w:lang w:val="uk-UA"/>
+        </w:rPr>
+      </w:pPr>
+      <w:r>
+        <w:rPr>
+          <w:lang w:val="uk-UA"/>
+        </w:rPr>
+        <w:t>Обчислити інтеграл</w:t>
+      </w:r>
+    </w:p>
+    <w:p>
+      <w:pPr>
+        <w:pStyle w:val="P1"/>
+        <w:rPr>
+          <w:lang w:val="uk-UA"/>
+        </w:rPr>
+      </w:pPr>
+      <w:r>
+        <w:rPr>
+          <w:lang w:val="uk-UA"/>
+        </w:rPr>
+      </w:r>
+    </w:p>
+    <w:p>
+      <w:pPr>
+        <w:pStyle w:val="H3"/>
+        <w:rPr/>
+      </w:pPr>
+      <w:r>
+        <w:rPr/>
+        <w:t>Код</w:t>
+      </w:r>
+    </w:p>
+    <w:p>
+      <w:pPr>
+        <w:pStyle w:val="P1"/>
+        <w:rPr/>
+      </w:pPr>
+      <w:r>
+        <w:rPr/>
+      </w:r>
+    </w:p>
+    <w:p>
+      <w:pPr>
+        <w:pStyle w:val="Code"/>
+        <w:rPr>
+          <w:rFonts w:ascii="Cascadia Code" w:hAnsi="Cascadia Code"/>
+        </w:rPr>
+      </w:pPr>
+      <w:r>
+        <w:rPr>
+          <w:rFonts w:ascii="Cascadia Code" w:hAnsi="Cascadia Code"/>
+        </w:rPr>
+        <w:t>from mpi4py import MPI</w:t>
+      </w:r>
+    </w:p>
+    <w:p>
+      <w:pPr>
+        <w:pStyle w:val="Code"/>
+        <w:rPr>
+          <w:rFonts w:ascii="Cascadia Code" w:hAnsi="Cascadia Code"/>
+        </w:rPr>
+      </w:pPr>
+      <w:r>
+        <w:rPr>
+          <w:rFonts w:ascii="Cascadia Code" w:hAnsi="Cascadia Code"/>
+        </w:rPr>
+        <w:t>import numpy as np</w:t>
+      </w:r>
+    </w:p>
+    <w:p>
+      <w:pPr>
+        <w:pStyle w:val="Code"/>
+        <w:rPr>
+          <w:rFonts w:ascii="Cascadia Code" w:hAnsi="Cascadia Code"/>
+        </w:rPr>
+      </w:pPr>
+      <w:r>
+        <w:rPr>
+          <w:rFonts w:ascii="Cascadia Code" w:hAnsi="Cascadia Code"/>
+        </w:rPr>
+      </w:r>
+    </w:p>
+    <w:p>
+      <w:pPr>
+        <w:pStyle w:val="Code"/>
+        <w:rPr>
+          <w:rFonts w:ascii="Cascadia Code" w:hAnsi="Cascadia Code"/>
+        </w:rPr>
+      </w:pPr>
+      <w:r>
+        <w:rPr>
+          <w:rFonts w:ascii="Cascadia Code" w:hAnsi="Cascadia Code"/>
+        </w:rPr>
+        <w:t>def f(x):</w:t>
+      </w:r>
+    </w:p>
+    <w:p>
+      <w:pPr>
+        <w:pStyle w:val="Code"/>
+        <w:rPr>
+          <w:rFonts w:ascii="Cascadia Code" w:hAnsi="Cascadia Code"/>
+        </w:rPr>
+      </w:pPr>
+      <w:r>
+        <w:rPr>
+          <w:rFonts w:ascii="Cascadia Code" w:hAnsi="Cascadia Code"/>
+        </w:rPr>
+        <w:t xml:space="preserve">    </w:t>
+      </w:r>
+      <w:r>
+        <w:rPr>
+          <w:rFonts w:ascii="Cascadia Code" w:hAnsi="Cascadia Code"/>
+        </w:rPr>
+        <w:t>return np.sin(x) ** 2</w:t>
+      </w:r>
+    </w:p>
+    <w:p>
+      <w:pPr>
+        <w:pStyle w:val="Code"/>
+        <w:rPr>
+          <w:rFonts w:ascii="Cascadia Code" w:hAnsi="Cascadia Code"/>
+        </w:rPr>
+      </w:pPr>
+      <w:r>
+        <w:rPr>
+          <w:rFonts w:ascii="Cascadia Code" w:hAnsi="Cascadia Code"/>
+        </w:rPr>
+      </w:r>
+    </w:p>
+    <w:p>
+      <w:pPr>
+        <w:pStyle w:val="Code"/>
+        <w:rPr>
+          <w:rFonts w:ascii="Cascadia Code" w:hAnsi="Cascadia Code"/>
+        </w:rPr>
+      </w:pPr>
+      <w:r>
+        <w:rPr>
+          <w:rFonts w:ascii="Cascadia Code" w:hAnsi="Cascadia Code"/>
+        </w:rPr>
+        <w:t>def main():</w:t>
+      </w:r>
+    </w:p>
+    <w:p>
+      <w:pPr>
+        <w:pStyle w:val="Code"/>
+        <w:rPr>
+          <w:rFonts w:ascii="Cascadia Code" w:hAnsi="Cascadia Code"/>
+        </w:rPr>
+      </w:pPr>
+      <w:r>
+        <w:rPr>
+          <w:rFonts w:ascii="Cascadia Code" w:hAnsi="Cascadia Code"/>
+        </w:rPr>
+        <w:t xml:space="preserve">    </w:t>
+      </w:r>
+      <w:r>
+        <w:rPr>
+          <w:rFonts w:ascii="Cascadia Code" w:hAnsi="Cascadia Code"/>
+        </w:rPr>
+        <w:t>comm = MPI.COMM_WORLD</w:t>
+      </w:r>
+    </w:p>
+    <w:p>
+      <w:pPr>
+        <w:pStyle w:val="Code"/>
+        <w:rPr>
+          <w:rFonts w:ascii="Cascadia Code" w:hAnsi="Cascadia Code"/>
+        </w:rPr>
+      </w:pPr>
+      <w:r>
+        <w:rPr>
+          <w:rFonts w:ascii="Cascadia Code" w:hAnsi="Cascadia Code"/>
+        </w:rPr>
+        <w:t xml:space="preserve">    </w:t>
+      </w:r>
+      <w:r>
+        <w:rPr>
+          <w:rFonts w:ascii="Cascadia Code" w:hAnsi="Cascadia Code"/>
+        </w:rPr>
+        <w:t>rank = comm.Get_rank()</w:t>
+      </w:r>
+    </w:p>
+    <w:p>
+      <w:pPr>
+        <w:pStyle w:val="Code"/>
+        <w:rPr>
+          <w:rFonts w:ascii="Cascadia Code" w:hAnsi="Cascadia Code"/>
+        </w:rPr>
+      </w:pPr>
+      <w:r>
+        <w:rPr>
+          <w:rFonts w:ascii="Cascadia Code" w:hAnsi="Cascadia Code"/>
+        </w:rPr>
+        <w:t xml:space="preserve">    </w:t>
+      </w:r>
+      <w:r>
+        <w:rPr>
+          <w:rFonts w:ascii="Cascadia Code" w:hAnsi="Cascadia Code"/>
+        </w:rPr>
+        <w:t>size = comm.Get_size()</w:t>
+      </w:r>
+    </w:p>
+    <w:p>
+      <w:pPr>
+        <w:pStyle w:val="Code"/>
+        <w:rPr>
+          <w:rFonts w:ascii="Cascadia Code" w:hAnsi="Cascadia Code"/>
+        </w:rPr>
+      </w:pPr>
+      <w:r>
+        <w:rPr>
+          <w:rFonts w:ascii="Cascadia Code" w:hAnsi="Cascadia Code"/>
+        </w:rPr>
+      </w:r>
+    </w:p>
+    <w:p>
+      <w:pPr>
+        <w:pStyle w:val="Code"/>
+        <w:rPr>
+          <w:rFonts w:ascii="Cascadia Code" w:hAnsi="Cascadia Code"/>
+        </w:rPr>
+      </w:pPr>
+      <w:r>
+        <w:rPr>
+          <w:rFonts w:ascii="Cascadia Code" w:hAnsi="Cascadia Code"/>
+        </w:rPr>
+        <w:t xml:space="preserve">    </w:t>
+      </w:r>
+      <w:r>
+        <w:rPr>
+          <w:rFonts w:ascii="Cascadia Code" w:hAnsi="Cascadia Code"/>
+        </w:rPr>
+        <w:t>a = 0.0</w:t>
+      </w:r>
+    </w:p>
+    <w:p>
+      <w:pPr>
+        <w:pStyle w:val="Code"/>
+        <w:rPr>
+          <w:rFonts w:ascii="Cascadia Code" w:hAnsi="Cascadia Code"/>
+        </w:rPr>
+      </w:pPr>
+      <w:r>
+        <w:rPr>
+          <w:rFonts w:ascii="Cascadia Code" w:hAnsi="Cascadia Code"/>
+        </w:rPr>
+        <w:t xml:space="preserve">    </w:t>
+      </w:r>
+      <w:r>
+        <w:rPr>
+          <w:rFonts w:ascii="Cascadia Code" w:hAnsi="Cascadia Code"/>
+        </w:rPr>
+        <w:t>b = np.pi / 2</w:t>
+      </w:r>
+    </w:p>
+    <w:p>
+      <w:pPr>
+        <w:pStyle w:val="Code"/>
+        <w:rPr>
+          <w:rFonts w:ascii="Cascadia Code" w:hAnsi="Cascadia Code"/>
+        </w:rPr>
+      </w:pPr>
+      <w:r>
+        <w:rPr>
+          <w:rFonts w:ascii="Cascadia Code" w:hAnsi="Cascadia Code"/>
+        </w:rPr>
+      </w:r>
+    </w:p>
+    <w:p>
+      <w:pPr>
+        <w:pStyle w:val="Code"/>
+        <w:rPr>
+          <w:rFonts w:ascii="Cascadia Code" w:hAnsi="Cascadia Code"/>
+        </w:rPr>
+      </w:pPr>
+      <w:r>
+        <w:rPr>
+          <w:rFonts w:ascii="Cascadia Code" w:hAnsi="Cascadia Code"/>
+        </w:rPr>
+        <w:t xml:space="preserve">    </w:t>
+      </w:r>
+      <w:r>
+        <w:rPr>
+          <w:rFonts w:ascii="Cascadia Code" w:hAnsi="Cascadia Code"/>
+        </w:rPr>
+        <w:t>if rank == 0:</w:t>
+      </w:r>
+    </w:p>
+    <w:p>
+      <w:pPr>
+        <w:pStyle w:val="Code"/>
+        <w:rPr>
+          <w:rFonts w:ascii="Cascadia Code" w:hAnsi="Cascadia Code"/>
+        </w:rPr>
+      </w:pPr>
+      <w:r>
+        <w:rPr>
+          <w:rFonts w:ascii="Cascadia Code" w:hAnsi="Cascadia Code"/>
+        </w:rPr>
+        <w:t xml:space="preserve">        </w:t>
+      </w:r>
+      <w:r>
+        <w:rPr>
+          <w:rFonts w:ascii="Cascadia Code" w:hAnsi="Cascadia Code"/>
+        </w:rPr>
+        <w:t>n = int(input("Please enter the number of intervals (n): "))</w:t>
+      </w:r>
+    </w:p>
+    <w:p>
+      <w:pPr>
+        <w:pStyle w:val="Code"/>
+        <w:rPr>
+          <w:rFonts w:ascii="Cascadia Code" w:hAnsi="Cascadia Code"/>
+        </w:rPr>
+      </w:pPr>
+      <w:r>
+        <w:rPr>
+          <w:rFonts w:ascii="Cascadia Code" w:hAnsi="Cascadia Code"/>
+        </w:rPr>
+        <w:t xml:space="preserve">    </w:t>
+      </w:r>
+      <w:r>
+        <w:rPr>
+          <w:rFonts w:ascii="Cascadia Code" w:hAnsi="Cascadia Code"/>
+        </w:rPr>
+        <w:t>else:</w:t>
+      </w:r>
+    </w:p>
+    <w:p>
+      <w:pPr>
+        <w:pStyle w:val="Code"/>
+        <w:rPr>
+          <w:rFonts w:ascii="Cascadia Code" w:hAnsi="Cascadia Code"/>
+        </w:rPr>
+      </w:pPr>
+      <w:r>
+        <w:rPr>
+          <w:rFonts w:ascii="Cascadia Code" w:hAnsi="Cascadia Code"/>
+        </w:rPr>
+        <w:t xml:space="preserve">        </w:t>
+      </w:r>
+      <w:r>
+        <w:rPr>
+          <w:rFonts w:ascii="Cascadia Code" w:hAnsi="Cascadia Code"/>
+        </w:rPr>
+        <w:t>n = None</w:t>
+      </w:r>
+    </w:p>
+    <w:p>
+      <w:pPr>
+        <w:pStyle w:val="Code"/>
+        <w:rPr>
+          <w:rFonts w:ascii="Cascadia Code" w:hAnsi="Cascadia Code"/>
+        </w:rPr>
+      </w:pPr>
+      <w:r>
+        <w:rPr>
+          <w:rFonts w:ascii="Cascadia Code" w:hAnsi="Cascadia Code"/>
+        </w:rPr>
+      </w:r>
+    </w:p>
+    <w:p>
+      <w:pPr>
+        <w:pStyle w:val="Code"/>
+        <w:rPr>
+          <w:rFonts w:ascii="Cascadia Code" w:hAnsi="Cascadia Code"/>
+        </w:rPr>
+      </w:pPr>
+      <w:r>
+        <w:rPr>
+          <w:rFonts w:ascii="Cascadia Code" w:hAnsi="Cascadia Code"/>
+        </w:rPr>
+        <w:t xml:space="preserve">    </w:t>
+      </w:r>
+      <w:r>
+        <w:rPr>
+          <w:rFonts w:ascii="Cascadia Code" w:hAnsi="Cascadia Code"/>
+        </w:rPr>
+        <w:t>n = comm.bcast(n, root=0)</w:t>
+      </w:r>
+    </w:p>
+    <w:p>
+      <w:pPr>
+        <w:pStyle w:val="Code"/>
+        <w:rPr>
+          <w:rFonts w:ascii="Cascadia Code" w:hAnsi="Cascadia Code"/>
+        </w:rPr>
+      </w:pPr>
+      <w:r>
+        <w:rPr>
+          <w:rFonts w:ascii="Cascadia Code" w:hAnsi="Cascadia Code"/>
+        </w:rPr>
+      </w:r>
+    </w:p>
+    <w:p>
+      <w:pPr>
+        <w:pStyle w:val="Code"/>
+        <w:rPr>
+          <w:rFonts w:ascii="Cascadia Code" w:hAnsi="Cascadia Code"/>
+        </w:rPr>
+      </w:pPr>
+      <w:r>
+        <w:rPr>
+          <w:rFonts w:ascii="Cascadia Code" w:hAnsi="Cascadia Code"/>
+        </w:rPr>
+        <w:t xml:space="preserve">    </w:t>
+      </w:r>
+      <w:r>
+        <w:rPr>
+          <w:rFonts w:ascii="Cascadia Code" w:hAnsi="Cascadia Code"/>
+        </w:rPr>
+        <w:t>start_time = MPI.Wtime()</w:t>
+      </w:r>
+    </w:p>
+    <w:p>
+      <w:pPr>
+        <w:pStyle w:val="Code"/>
+        <w:rPr>
+          <w:rFonts w:ascii="Cascadia Code" w:hAnsi="Cascadia Code"/>
+        </w:rPr>
+      </w:pPr>
+      <w:r>
+        <w:rPr>
+          <w:rFonts w:ascii="Cascadia Code" w:hAnsi="Cascadia Code"/>
+        </w:rPr>
+      </w:r>
+    </w:p>
+    <w:p>
+      <w:pPr>
+        <w:pStyle w:val="Code"/>
+        <w:rPr>
+          <w:rFonts w:ascii="Cascadia Code" w:hAnsi="Cascadia Code"/>
+        </w:rPr>
+      </w:pPr>
+      <w:r>
+        <w:rPr>
+          <w:rFonts w:ascii="Cascadia Code" w:hAnsi="Cascadia Code"/>
+        </w:rPr>
+        <w:t xml:space="preserve">    </w:t>
+      </w:r>
+      <w:r>
+        <w:rPr>
+          <w:rFonts w:ascii="Cascadia Code" w:hAnsi="Cascadia Code"/>
+        </w:rPr>
+        <w:t>h = (b - a) / n</w:t>
+      </w:r>
+    </w:p>
+    <w:p>
+      <w:pPr>
+        <w:pStyle w:val="Code"/>
+        <w:rPr>
+          <w:rFonts w:ascii="Cascadia Code" w:hAnsi="Cascadia Code"/>
+        </w:rPr>
+      </w:pPr>
+      <w:r>
+        <w:rPr>
+          <w:rFonts w:ascii="Cascadia Code" w:hAnsi="Cascadia Code"/>
+        </w:rPr>
+        <w:t xml:space="preserve">    </w:t>
+      </w:r>
+      <w:r>
+        <w:rPr>
+          <w:rFonts w:ascii="Cascadia Code" w:hAnsi="Cascadia Code"/>
+        </w:rPr>
+        <w:t>local_n = n // size</w:t>
+      </w:r>
+    </w:p>
+    <w:p>
+      <w:pPr>
+        <w:pStyle w:val="Code"/>
+        <w:rPr>
+          <w:rFonts w:ascii="Cascadia Code" w:hAnsi="Cascadia Code"/>
+        </w:rPr>
+      </w:pPr>
+      <w:r>
+        <w:rPr>
+          <w:rFonts w:ascii="Cascadia Code" w:hAnsi="Cascadia Code"/>
+        </w:rPr>
+        <w:t xml:space="preserve">    </w:t>
+      </w:r>
+      <w:r>
+        <w:rPr>
+          <w:rFonts w:ascii="Cascadia Code" w:hAnsi="Cascadia Code"/>
+        </w:rPr>
+        <w:t>local_a = a + rank * local_n * h</w:t>
+      </w:r>
+    </w:p>
+    <w:p>
+      <w:pPr>
+        <w:pStyle w:val="Code"/>
+        <w:rPr>
+          <w:rFonts w:ascii="Cascadia Code" w:hAnsi="Cascadia Code"/>
+        </w:rPr>
+      </w:pPr>
+      <w:r>
+        <w:rPr>
+          <w:rFonts w:ascii="Cascadia Code" w:hAnsi="Cascadia Code"/>
+        </w:rPr>
+        <w:t xml:space="preserve">    </w:t>
+      </w:r>
+      <w:r>
+        <w:rPr>
+          <w:rFonts w:ascii="Cascadia Code" w:hAnsi="Cascadia Code"/>
+        </w:rPr>
+        <w:t>local_b = local_a + local_n * h</w:t>
+      </w:r>
+    </w:p>
+    <w:p>
+      <w:pPr>
+        <w:pStyle w:val="Code"/>
+        <w:rPr>
+          <w:rFonts w:ascii="Cascadia Code" w:hAnsi="Cascadia Code"/>
+        </w:rPr>
+      </w:pPr>
+      <w:r>
+        <w:rPr>
+          <w:rFonts w:ascii="Cascadia Code" w:hAnsi="Cascadia Code"/>
+        </w:rPr>
+      </w:r>
+    </w:p>
+    <w:p>
+      <w:pPr>
+        <w:pStyle w:val="Code"/>
+        <w:rPr>
+          <w:rFonts w:ascii="Cascadia Code" w:hAnsi="Cascadia Code"/>
+        </w:rPr>
+      </w:pPr>
+      <w:r>
+        <w:rPr>
+          <w:rFonts w:ascii="Cascadia Code" w:hAnsi="Cascadia Code"/>
+        </w:rPr>
+        <w:t xml:space="preserve">    </w:t>
+      </w:r>
+      <w:r>
+        <w:rPr>
+          <w:rFonts w:ascii="Cascadia Code" w:hAnsi="Cascadia Code"/>
+        </w:rPr>
+        <w:t>integral = (f(local_a) + f(local_b)) / 2.0</w:t>
+      </w:r>
+    </w:p>
+    <w:p>
+      <w:pPr>
+        <w:pStyle w:val="Code"/>
+        <w:rPr>
+          <w:rFonts w:ascii="Cascadia Code" w:hAnsi="Cascadia Code"/>
+        </w:rPr>
+      </w:pPr>
+      <w:r>
+        <w:rPr>
+          <w:rFonts w:ascii="Cascadia Code" w:hAnsi="Cascadia Code"/>
+        </w:rPr>
+        <w:t xml:space="preserve">    </w:t>
+      </w:r>
+      <w:r>
+        <w:rPr>
+          <w:rFonts w:ascii="Cascadia Code" w:hAnsi="Cascadia Code"/>
+        </w:rPr>
+        <w:t>for i in range(1, local_n):</w:t>
+      </w:r>
+    </w:p>
+    <w:p>
+      <w:pPr>
+        <w:pStyle w:val="Code"/>
+        <w:rPr>
+          <w:rFonts w:ascii="Cascadia Code" w:hAnsi="Cascadia Code"/>
+        </w:rPr>
+      </w:pPr>
+      <w:r>
+        <w:rPr>
+          <w:rFonts w:ascii="Cascadia Code" w:hAnsi="Cascadia Code"/>
+        </w:rPr>
+        <w:t xml:space="preserve">        </w:t>
+      </w:r>
+      <w:r>
+        <w:rPr>
+          <w:rFonts w:ascii="Cascadia Code" w:hAnsi="Cascadia Code"/>
+        </w:rPr>
+        <w:t>x = local_a + i * h</w:t>
+      </w:r>
+    </w:p>
+    <w:p>
+      <w:pPr>
+        <w:pStyle w:val="Code"/>
+        <w:rPr>
+          <w:rFonts w:ascii="Cascadia Code" w:hAnsi="Cascadia Code"/>
+        </w:rPr>
+      </w:pPr>
+      <w:r>
+        <w:rPr>
+          <w:rFonts w:ascii="Cascadia Code" w:hAnsi="Cascadia Code"/>
+        </w:rPr>
+        <w:t xml:space="preserve">        </w:t>
+      </w:r>
+      <w:r>
+        <w:rPr>
+          <w:rFonts w:ascii="Cascadia Code" w:hAnsi="Cascadia Code"/>
+        </w:rPr>
+        <w:t>integral += f(x)</w:t>
+      </w:r>
+    </w:p>
+    <w:p>
+      <w:pPr>
+        <w:pStyle w:val="Code"/>
+        <w:rPr>
+          <w:rFonts w:ascii="Cascadia Code" w:hAnsi="Cascadia Code"/>
+        </w:rPr>
+      </w:pPr>
+      <w:r>
+        <w:rPr>
+          <w:rFonts w:ascii="Cascadia Code" w:hAnsi="Cascadia Code"/>
+        </w:rPr>
+        <w:t xml:space="preserve">    </w:t>
+      </w:r>
+      <w:r>
+        <w:rPr>
+          <w:rFonts w:ascii="Cascadia Code" w:hAnsi="Cascadia Code"/>
+        </w:rPr>
+        <w:t>integral *= h</w:t>
+      </w:r>
+    </w:p>
+    <w:p>
+      <w:pPr>
+        <w:pStyle w:val="Code"/>
+        <w:rPr>
+          <w:rFonts w:ascii="Cascadia Code" w:hAnsi="Cascadia Code"/>
+        </w:rPr>
+      </w:pPr>
+      <w:r>
+        <w:rPr>
+          <w:rFonts w:ascii="Cascadia Code" w:hAnsi="Cascadia Code"/>
+        </w:rPr>
+      </w:r>
+    </w:p>
+    <w:p>
+      <w:pPr>
+        <w:pStyle w:val="Code"/>
+        <w:rPr>
+          <w:rFonts w:ascii="Cascadia Code" w:hAnsi="Cascadia Code"/>
+        </w:rPr>
+      </w:pPr>
+      <w:r>
+        <w:rPr>
+          <w:rFonts w:ascii="Cascadia Code" w:hAnsi="Cascadia Code"/>
+        </w:rPr>
+        <w:t xml:space="preserve">    </w:t>
+      </w:r>
+      <w:r>
+        <w:rPr>
+          <w:rFonts w:ascii="Cascadia Code" w:hAnsi="Cascadia Code"/>
+        </w:rPr>
+        <w:t>total_integral = comm.reduce(integral, op=MPI.SUM, root=0)</w:t>
+      </w:r>
+    </w:p>
+    <w:p>
+      <w:pPr>
+        <w:pStyle w:val="Code"/>
+        <w:rPr>
+          <w:rFonts w:ascii="Cascadia Code" w:hAnsi="Cascadia Code"/>
+        </w:rPr>
+      </w:pPr>
+      <w:r>
+        <w:rPr>
+          <w:rFonts w:ascii="Cascadia Code" w:hAnsi="Cascadia Code"/>
+        </w:rPr>
+        <w:t xml:space="preserve">    </w:t>
+      </w:r>
+      <w:r>
+        <w:rPr>
+          <w:rFonts w:ascii="Cascadia Code" w:hAnsi="Cascadia Code"/>
+        </w:rPr>
+        <w:t>end_time = MPI.Wtime()</w:t>
+      </w:r>
+    </w:p>
+    <w:p>
+      <w:pPr>
+        <w:pStyle w:val="Code"/>
+        <w:rPr>
+          <w:rFonts w:ascii="Cascadia Code" w:hAnsi="Cascadia Code"/>
+        </w:rPr>
+      </w:pPr>
+      <w:r>
+        <w:rPr>
+          <w:rFonts w:ascii="Cascadia Code" w:hAnsi="Cascadia Code"/>
+        </w:rPr>
+      </w:r>
+    </w:p>
+    <w:p>
+      <w:pPr>
+        <w:pStyle w:val="Code"/>
+        <w:rPr>
+          <w:rFonts w:ascii="Cascadia Code" w:hAnsi="Cascadia Code"/>
+        </w:rPr>
+      </w:pPr>
+      <w:r>
+        <w:rPr>
+          <w:rFonts w:ascii="Cascadia Code" w:hAnsi="Cascadia Code"/>
+        </w:rPr>
+        <w:t xml:space="preserve">    </w:t>
+      </w:r>
+      <w:r>
+        <w:rPr>
+          <w:rFonts w:ascii="Cascadia Code" w:hAnsi="Cascadia Code"/>
+        </w:rPr>
+        <w:t>if rank == 0:</w:t>
+      </w:r>
+    </w:p>
+    <w:p>
+      <w:pPr>
+        <w:pStyle w:val="Code"/>
+        <w:rPr>
+          <w:rFonts w:ascii="Cascadia Code" w:hAnsi="Cascadia Code"/>
+        </w:rPr>
+      </w:pPr>
+      <w:r>
+        <w:rPr>
+          <w:rFonts w:ascii="Cascadia Code" w:hAnsi="Cascadia Code"/>
+        </w:rPr>
+        <w:t xml:space="preserve">        </w:t>
+      </w:r>
+      <w:r>
+        <w:rPr>
+          <w:rFonts w:ascii="Cascadia Code" w:hAnsi="Cascadia Code"/>
+        </w:rPr>
+        <w:t>execution_time = end_time - start_time</w:t>
+      </w:r>
+    </w:p>
+    <w:p>
+      <w:pPr>
+        <w:pStyle w:val="Code"/>
+        <w:rPr>
+          <w:rFonts w:ascii="Cascadia Code" w:hAnsi="Cascadia Code"/>
+        </w:rPr>
+      </w:pPr>
+      <w:r>
+        <w:rPr>
+          <w:rFonts w:ascii="Cascadia Code" w:hAnsi="Cascadia Code"/>
+        </w:rPr>
+        <w:t xml:space="preserve">        </w:t>
+      </w:r>
+      <w:r>
+        <w:rPr>
+          <w:rFonts w:ascii="Cascadia Code" w:hAnsi="Cascadia Code"/>
+        </w:rPr>
+        <w:t>print(f"Result: {total_integral:.12f}")</w:t>
+      </w:r>
+    </w:p>
+    <w:p>
+      <w:pPr>
+        <w:pStyle w:val="Code"/>
+        <w:rPr>
+          <w:rFonts w:ascii="Cascadia Code" w:hAnsi="Cascadia Code"/>
+        </w:rPr>
+      </w:pPr>
+      <w:r>
+        <w:rPr>
+          <w:rFonts w:ascii="Cascadia Code" w:hAnsi="Cascadia Code"/>
+        </w:rPr>
+        <w:t xml:space="preserve">        </w:t>
+      </w:r>
+      <w:r>
+        <w:rPr>
+          <w:rFonts w:ascii="Cascadia Code" w:hAnsi="Cascadia Code"/>
+        </w:rPr>
+        <w:t>print(f"Execution time: {execution_time:.6f} sec")</w:t>
+      </w:r>
+    </w:p>
+    <w:p>
+      <w:pPr>
+        <w:pStyle w:val="Code"/>
+        <w:rPr>
+          <w:rFonts w:ascii="Cascadia Code" w:hAnsi="Cascadia Code"/>
+        </w:rPr>
+      </w:pPr>
+      <w:r>
+        <w:rPr>
+          <w:rFonts w:ascii="Cascadia Code" w:hAnsi="Cascadia Code"/>
+        </w:rPr>
+      </w:r>
+    </w:p>
+    <w:p>
+      <w:pPr>
+        <w:pStyle w:val="Code"/>
+        <w:rPr>
+          <w:rFonts w:ascii="Cascadia Code" w:hAnsi="Cascadia Code"/>
+        </w:rPr>
+      </w:pPr>
+      <w:r>
+        <w:rPr>
+          <w:rFonts w:ascii="Cascadia Code" w:hAnsi="Cascadia Code"/>
+        </w:rPr>
+        <w:t>if __name__ == "__main__":</w:t>
+      </w:r>
+    </w:p>
+    <w:p>
+      <w:pPr>
+        <w:pStyle w:val="Code"/>
+        <w:rPr>
+          <w:rFonts w:ascii="Cascadia Code" w:hAnsi="Cascadia Code"/>
+        </w:rPr>
+      </w:pPr>
+      <w:r>
+        <w:rPr>
+          <w:rFonts w:ascii="Cascadia Code" w:hAnsi="Cascadia Code"/>
+        </w:rPr>
+        <w:t xml:space="preserve">    </w:t>
+      </w:r>
+      <w:r>
+        <w:rPr>
+          <w:rFonts w:ascii="Cascadia Code" w:hAnsi="Cascadia Code"/>
+        </w:rPr>
+        <w:t>main()</w:t>
+      </w:r>
+    </w:p>
+    <w:p>
+      <w:pPr>
+        <w:pStyle w:val="P1"/>
+        <w:rPr/>
+      </w:pPr>
+      <w:r>
+        <w:rPr/>
+      </w:r>
+    </w:p>
+    <w:p>
+      <w:pPr>
+        <w:pStyle w:val="H3"/>
+        <w:rPr/>
+      </w:pPr>
+      <w:r>
+        <w:rPr/>
+        <w:t>Результати</w:t>
+      </w:r>
+    </w:p>
+    <w:p>
+      <w:pPr>
+        <w:pStyle w:val="P1"/>
+        <w:rPr>
+          <w:lang w:val="uk-UA"/>
+        </w:rPr>
+      </w:pPr>
+      <w:r>
+        <w:rPr>
+          <w:lang w:val="uk-UA"/>
+        </w:rPr>
+      </w:r>
+    </w:p>
+    <w:p>
+      <w:pPr>
+        <w:pStyle w:val="Code"/>
+        <w:rPr>
+          <w:rFonts w:ascii="Cascadia Code" w:hAnsi="Cascadia Code"/>
+        </w:rPr>
+      </w:pPr>
+      <w:r>
+        <w:rPr>
+          <w:rFonts w:ascii="Cascadia Code" w:hAnsi="Cascadia Code"/>
+        </w:rPr>
+        <w:t>Please enter the number of intervals (n): 3</w:t>
+      </w:r>
+    </w:p>
+    <w:p>
+      <w:pPr>
+        <w:pStyle w:val="Code"/>
+        <w:rPr>
+          <w:rFonts w:ascii="Cascadia Code" w:hAnsi="Cascadia Code"/>
+        </w:rPr>
+      </w:pPr>
+      <w:r>
+        <w:rPr>
+          <w:rFonts w:ascii="Cascadia Code" w:hAnsi="Cascadia Code"/>
+        </w:rPr>
+        <w:t>Result: 0.785398163397</w:t>
+      </w:r>
+    </w:p>
+    <w:p>
+      <w:pPr>
+        <w:pStyle w:val="Code"/>
+        <w:rPr>
+          <w:rFonts w:ascii="Cascadia Code" w:hAnsi="Cascadia Code"/>
+        </w:rPr>
+      </w:pPr>
+      <w:r>
+        <w:rPr>
+          <w:rFonts w:ascii="Cascadia Code" w:hAnsi="Cascadia Code"/>
+        </w:rPr>
+        <w:t>Execution time: 0.000630 sec</w:t>
+      </w:r>
+    </w:p>
+    <w:p>
+      <w:pPr>
+        <w:pStyle w:val="P1"/>
+        <w:rPr>
+          <w:rFonts w:ascii="Cascadia Code" w:hAnsi="Cascadia Code"/>
+        </w:rPr>
+      </w:pPr>
+      <w:r>
+        <w:rPr>
+          <w:rFonts w:ascii="Cascadia Code" w:hAnsi="Cascadia Code"/>
+        </w:rPr>
       </w:r>
     </w:p>
     <w:p>
@@ -4397,12 +5655,12 @@
       <w:lang w:val="en-US" w:eastAsia="uk-UA"/>
     </w:rPr>
   </w:style>
-  <w:style w:type="character" w:styleId="user">
-    <w:name w:val="Символ нумерації (user)"/>
+  <w:style w:type="character" w:styleId="Style12">
+    <w:name w:val="Символ нумерації"/>
     <w:qFormat/>
     <w:rPr/>
   </w:style>
-  <w:style w:type="paragraph" w:styleId="Style12">
+  <w:style w:type="paragraph" w:styleId="Style13">
     <w:name w:val="Заголовок"/>
     <w:basedOn w:val="Normal"/>
     <w:next w:val="BodyText"/>
@@ -4412,7 +5670,7 @@
       <w:spacing w:before="240" w:after="120"/>
     </w:pPr>
     <w:rPr>
-      <w:rFonts w:ascii="Liberation Sans" w:hAnsi="Liberation Sans" w:eastAsia="Microsoft YaHei" w:cs="Arial Unicode MS"/>
+      <w:rFonts w:ascii="Liberation Sans" w:hAnsi="Liberation Sans" w:eastAsia="Microsoft YaHei" w:cs="Lucida Sans"/>
       <w:sz w:val="28"/>
       <w:szCs w:val="28"/>
     </w:rPr>
@@ -4449,8 +5707,34 @@
       <w:szCs w:val="24"/>
     </w:rPr>
   </w:style>
-  <w:style w:type="paragraph" w:styleId="Style13">
+  <w:style w:type="paragraph" w:styleId="Style14">
     <w:name w:val="Покажчик"/>
+    <w:basedOn w:val="Normal"/>
+    <w:qFormat/>
+    <w:pPr>
+      <w:suppressLineNumbers/>
+    </w:pPr>
+    <w:rPr>
+      <w:rFonts w:cs="Lucida Sans"/>
+    </w:rPr>
+  </w:style>
+  <w:style w:type="paragraph" w:styleId="user">
+    <w:name w:val="Заголовок (user)"/>
+    <w:basedOn w:val="Normal"/>
+    <w:next w:val="BodyText"/>
+    <w:qFormat/>
+    <w:pPr>
+      <w:keepNext w:val="true"/>
+      <w:spacing w:before="240" w:after="120"/>
+    </w:pPr>
+    <w:rPr>
+      <w:rFonts w:ascii="Liberation Sans" w:hAnsi="Liberation Sans" w:eastAsia="Microsoft YaHei" w:cs="Arial Unicode MS"/>
+      <w:sz w:val="28"/>
+      <w:szCs w:val="28"/>
+    </w:rPr>
+  </w:style>
+  <w:style w:type="paragraph" w:styleId="user1">
+    <w:name w:val="Покажчик (user)"/>
     <w:basedOn w:val="Normal"/>
     <w:qFormat/>
     <w:pPr>
@@ -4460,35 +5744,9 @@
       <w:rFonts w:cs="Arial Unicode MS"/>
     </w:rPr>
   </w:style>
-  <w:style w:type="paragraph" w:styleId="user1">
-    <w:name w:val="Заголовок (user)"/>
-    <w:basedOn w:val="Normal"/>
-    <w:next w:val="BodyText"/>
-    <w:qFormat/>
-    <w:pPr>
-      <w:keepNext w:val="true"/>
-      <w:spacing w:before="240" w:after="120"/>
-    </w:pPr>
-    <w:rPr>
-      <w:rFonts w:ascii="Liberation Sans" w:hAnsi="Liberation Sans" w:eastAsia="Microsoft YaHei" w:cs="Lucida Sans"/>
-      <w:sz w:val="28"/>
-      <w:szCs w:val="28"/>
-    </w:rPr>
-  </w:style>
-  <w:style w:type="paragraph" w:styleId="user2">
-    <w:name w:val="Покажчик (user)"/>
-    <w:basedOn w:val="Normal"/>
-    <w:qFormat/>
-    <w:pPr>
-      <w:suppressLineNumbers/>
-    </w:pPr>
-    <w:rPr>
-      <w:rFonts w:cs="Lucida Sans"/>
-    </w:rPr>
-  </w:style>
   <w:style w:type="paragraph" w:styleId="IndexHeading">
     <w:name w:val="index heading"/>
-    <w:basedOn w:val="Style12"/>
+    <w:basedOn w:val="user"/>
     <w:pPr/>
     <w:rPr/>
   </w:style>
@@ -4768,7 +6026,17 @@
     </w:pPr>
     <w:rPr/>
   </w:style>
-  <w:style w:type="paragraph" w:styleId="Style14">
+  <w:style w:type="paragraph" w:styleId="user2">
+    <w:name w:val="Вміст таблиці (user)"/>
+    <w:basedOn w:val="Normal"/>
+    <w:qFormat/>
+    <w:pPr>
+      <w:widowControl w:val="false"/>
+      <w:suppressLineNumbers/>
+    </w:pPr>
+    <w:rPr/>
+  </w:style>
+  <w:style w:type="paragraph" w:styleId="Style15">
     <w:name w:val="Вміст таблиці"/>
     <w:basedOn w:val="Normal"/>
     <w:qFormat/>
@@ -4779,18 +6047,8 @@
     <w:rPr/>
   </w:style>
   <w:style w:type="paragraph" w:styleId="user3">
-    <w:name w:val="Вміст таблиці (user)"/>
-    <w:basedOn w:val="Normal"/>
-    <w:qFormat/>
-    <w:pPr>
-      <w:widowControl w:val="false"/>
-      <w:suppressLineNumbers/>
-    </w:pPr>
-    <w:rPr/>
-  </w:style>
-  <w:style w:type="paragraph" w:styleId="Style15">
-    <w:name w:val="Заголовок таблиці"/>
-    <w:basedOn w:val="Style14"/>
+    <w:name w:val="Заголовок таблиці (user)"/>
+    <w:basedOn w:val="user2"/>
     <w:qFormat/>
     <w:pPr>
       <w:suppressLineNumbers/>
@@ -4801,8 +6059,8 @@
       <w:bCs/>
     </w:rPr>
   </w:style>
-  <w:style w:type="paragraph" w:styleId="Style16">
-    <w:name w:val="Верхній і нижній колонтитули"/>
+  <w:style w:type="paragraph" w:styleId="user4">
+    <w:name w:val="Верхній і нижній колонтитули (user)"/>
     <w:basedOn w:val="Normal"/>
     <w:qFormat/>
     <w:pPr>
@@ -4815,8 +6073,8 @@
     </w:pPr>
     <w:rPr/>
   </w:style>
-  <w:style w:type="paragraph" w:styleId="user4">
-    <w:name w:val="Верхній і нижній колонтитули (user)"/>
+  <w:style w:type="paragraph" w:styleId="Style16">
+    <w:name w:val="Верхній і нижній колонтитули"/>
     <w:basedOn w:val="Normal"/>
     <w:qFormat/>
     <w:pPr/>
@@ -4824,7 +6082,7 @@
   </w:style>
   <w:style w:type="paragraph" w:styleId="Footer">
     <w:name w:val="footer"/>
-    <w:basedOn w:val="Style16"/>
+    <w:basedOn w:val="user4"/>
     <w:pPr>
       <w:suppressLineNumbers/>
     </w:pPr>
@@ -4832,7 +6090,7 @@
   </w:style>
   <w:style w:type="paragraph" w:styleId="Header">
     <w:name w:val="header"/>
-    <w:basedOn w:val="user4"/>
+    <w:basedOn w:val="Style16"/>
     <w:pPr>
       <w:suppressLineNumbers/>
       <w:tabs>
@@ -4843,9 +6101,9 @@
     </w:pPr>
     <w:rPr/>
   </w:style>
-  <w:style w:type="paragraph" w:styleId="user5">
-    <w:name w:val="Заголовок таблиці (user)"/>
-    <w:basedOn w:val="user3"/>
+  <w:style w:type="paragraph" w:styleId="Style17">
+    <w:name w:val="Заголовок таблиці"/>
+    <w:basedOn w:val="Style15"/>
     <w:qFormat/>
     <w:pPr>
       <w:suppressLineNumbers/>
@@ -4856,8 +6114,8 @@
       <w:bCs/>
     </w:rPr>
   </w:style>
-  <w:style w:type="numbering" w:styleId="Style17" w:default="1">
-    <w:name w:val="Без маркерів"/>
+  <w:style w:type="numbering" w:styleId="user5" w:default="1">
+    <w:name w:val="Без маркерів (user)"/>
     <w:uiPriority w:val="99"/>
     <w:semiHidden/>
     <w:unhideWhenUsed/>

</xml_diff>

<commit_message>
feat -- TR5: 5221 and 5222 done Jesus thank you
</commit_message>
<xml_diff>
--- a/42TR Tehnologiji Rozpodilenyh System/5/TR_KNT-122_Onyshchenko_19_PR5.docx
+++ b/42TR Tehnologiji Rozpodilenyh System/5/TR_KNT-122_Onyshchenko_19_PR5.docx
@@ -719,6 +719,268 @@
     </w:p>
     <w:p>
       <w:pPr>
+        <w:pStyle w:val="p11"/>
+        <w:rPr/>
+      </w:pPr>
+      <w:r>
+        <w:rPr/>
+        <w:t>5.2.2.1 Програму 5.2 доповніть функцією обчислення часу її виконання та функцією обчислення дисперсії σ</w:t>
+      </w:r>
+      <w:r>
+        <w:rPr>
+          <w:vertAlign w:val="superscript"/>
+        </w:rPr>
+        <w:t>2</w:t>
+      </w:r>
+      <w:r>
+        <w:rPr/>
+        <w:t xml:space="preserve"> випадкової величини значення π.</w:t>
+      </w:r>
+    </w:p>
+    <w:p>
+      <w:pPr>
+        <w:pStyle w:val="p11"/>
+        <w:rPr/>
+      </w:pPr>
+      <w:r>
+        <w:rPr/>
+        <w:drawing>
+          <wp:inline distT="0" distB="0" distL="0" distR="0">
+            <wp:extent cx="3057525" cy="857250"/>
+            <wp:effectExtent l="0" t="0" r="0" b="0"/>
+            <wp:docPr id="2" name="Зображення2"/>
+            <wp:cNvGraphicFramePr>
+              <a:graphicFrameLocks xmlns:a="http://schemas.openxmlformats.org/drawingml/2006/main" noChangeAspect="1"/>
+            </wp:cNvGraphicFramePr>
+            <a:graphic xmlns:a="http://schemas.openxmlformats.org/drawingml/2006/main">
+              <a:graphicData uri="http://schemas.openxmlformats.org/drawingml/2006/picture">
+                <pic:pic xmlns:pic="http://schemas.openxmlformats.org/drawingml/2006/picture">
+                  <pic:nvPicPr>
+                    <pic:cNvPr id="2" name="Зображення2"/>
+                    <pic:cNvPicPr>
+                      <a:picLocks noChangeAspect="1" noChangeArrowheads="1"/>
+                    </pic:cNvPicPr>
+                  </pic:nvPicPr>
+                  <pic:blipFill>
+                    <a:blip r:embed="rId3"/>
+                    <a:stretch>
+                      <a:fillRect/>
+                    </a:stretch>
+                  </pic:blipFill>
+                  <pic:spPr bwMode="auto">
+                    <a:xfrm>
+                      <a:off x="0" y="0"/>
+                      <a:ext cx="3057525" cy="857250"/>
+                    </a:xfrm>
+                    <a:prstGeom prst="rect">
+                      <a:avLst/>
+                    </a:prstGeom>
+                    <a:noFill/>
+                  </pic:spPr>
+                </pic:pic>
+              </a:graphicData>
+            </a:graphic>
+          </wp:inline>
+        </w:drawing>
+      </w:r>
+    </w:p>
+    <w:p>
+      <w:pPr>
+        <w:pStyle w:val="p11"/>
+        <w:rPr/>
+      </w:pPr>
+      <w:r>
+        <w:rPr/>
+        <w:t xml:space="preserve">причому, оскільки середнє значення </w:t>
+      </w:r>
+      <w:r>
+        <w:drawing>
+          <wp:anchor behindDoc="0" distT="0" distB="0" distL="0" distR="0" simplePos="0" locked="0" layoutInCell="0" allowOverlap="1" relativeHeight="5">
+            <wp:simplePos x="0" y="0"/>
+            <wp:positionH relativeFrom="column">
+              <wp:posOffset>3315335</wp:posOffset>
+            </wp:positionH>
+            <wp:positionV relativeFrom="paragraph">
+              <wp:posOffset>-70485</wp:posOffset>
+            </wp:positionV>
+            <wp:extent cx="342900" cy="381000"/>
+            <wp:effectExtent l="0" t="0" r="0" b="0"/>
+            <wp:wrapSquare wrapText="largest"/>
+            <wp:docPr id="3" name="Зображення3"/>
+            <wp:cNvGraphicFramePr>
+              <a:graphicFrameLocks xmlns:a="http://schemas.openxmlformats.org/drawingml/2006/main" noChangeAspect="1"/>
+            </wp:cNvGraphicFramePr>
+            <a:graphic xmlns:a="http://schemas.openxmlformats.org/drawingml/2006/main">
+              <a:graphicData uri="http://schemas.openxmlformats.org/drawingml/2006/picture">
+                <pic:pic xmlns:pic="http://schemas.openxmlformats.org/drawingml/2006/picture">
+                  <pic:nvPicPr>
+                    <pic:cNvPr id="3" name="Зображення3"/>
+                    <pic:cNvPicPr>
+                      <a:picLocks noChangeAspect="1" noChangeArrowheads="1"/>
+                    </pic:cNvPicPr>
+                  </pic:nvPicPr>
+                  <pic:blipFill>
+                    <a:blip r:embed="rId4"/>
+                    <a:stretch>
+                      <a:fillRect/>
+                    </a:stretch>
+                  </pic:blipFill>
+                  <pic:spPr bwMode="auto">
+                    <a:xfrm>
+                      <a:off x="0" y="0"/>
+                      <a:ext cx="342900" cy="381000"/>
+                    </a:xfrm>
+                    <a:prstGeom prst="rect">
+                      <a:avLst/>
+                    </a:prstGeom>
+                    <a:noFill/>
+                  </pic:spPr>
+                </pic:pic>
+              </a:graphicData>
+            </a:graphic>
+          </wp:anchor>
+        </w:drawing>
+      </w:r>
+      <w:r>
+        <w:rPr/>
+        <w:t xml:space="preserve"> заздалегідь не відомо, зручніше використати формулу</w:t>
+      </w:r>
+      <w:r>
+        <w:rPr>
+          <w:lang w:val="en-US"/>
+        </w:rPr>
+        <w:t>:</w:t>
+      </w:r>
+    </w:p>
+    <w:p>
+      <w:pPr>
+        <w:pStyle w:val="p11"/>
+        <w:rPr>
+          <w:lang w:val="en-US"/>
+        </w:rPr>
+      </w:pPr>
+      <w:r>
+        <w:rPr>
+          <w:lang w:val="en-US"/>
+        </w:rPr>
+        <w:drawing>
+          <wp:inline distT="0" distB="0" distL="0" distR="0">
+            <wp:extent cx="3886835" cy="1000125"/>
+            <wp:effectExtent l="0" t="0" r="0" b="0"/>
+            <wp:docPr id="4" name="Зображення4"/>
+            <wp:cNvGraphicFramePr>
+              <a:graphicFrameLocks xmlns:a="http://schemas.openxmlformats.org/drawingml/2006/main" noChangeAspect="1"/>
+            </wp:cNvGraphicFramePr>
+            <a:graphic xmlns:a="http://schemas.openxmlformats.org/drawingml/2006/main">
+              <a:graphicData uri="http://schemas.openxmlformats.org/drawingml/2006/picture">
+                <pic:pic xmlns:pic="http://schemas.openxmlformats.org/drawingml/2006/picture">
+                  <pic:nvPicPr>
+                    <pic:cNvPr id="4" name="Зображення4"/>
+                    <pic:cNvPicPr>
+                      <a:picLocks noChangeAspect="1" noChangeArrowheads="1"/>
+                    </pic:cNvPicPr>
+                  </pic:nvPicPr>
+                  <pic:blipFill>
+                    <a:blip r:embed="rId5"/>
+                    <a:stretch>
+                      <a:fillRect/>
+                    </a:stretch>
+                  </pic:blipFill>
+                  <pic:spPr bwMode="auto">
+                    <a:xfrm>
+                      <a:off x="0" y="0"/>
+                      <a:ext cx="3886835" cy="1000125"/>
+                    </a:xfrm>
+                    <a:prstGeom prst="rect">
+                      <a:avLst/>
+                    </a:prstGeom>
+                    <a:noFill/>
+                  </pic:spPr>
+                </pic:pic>
+              </a:graphicData>
+            </a:graphic>
+          </wp:inline>
+        </w:drawing>
+      </w:r>
+    </w:p>
+    <w:p>
+      <w:pPr>
+        <w:pStyle w:val="p11"/>
+        <w:rPr/>
+      </w:pPr>
+      <w:r>
+        <w:rPr/>
+        <w:t>5.2.2.2 Використовуючи формули (5.9) визначити N таке, щоб похибка ε обчислення числа π наближено дорівнювала 10</w:t>
+      </w:r>
+      <w:r>
+        <w:rPr>
+          <w:vertAlign w:val="superscript"/>
+        </w:rPr>
+        <w:t>-4</w:t>
+      </w:r>
+      <w:r>
+        <w:rPr/>
+        <w:t>.</w:t>
+      </w:r>
+    </w:p>
+    <w:p>
+      <w:pPr>
+        <w:pStyle w:val="img1"/>
+        <w:rPr/>
+      </w:pPr>
+      <w:r>
+        <w:rPr/>
+        <w:drawing>
+          <wp:inline distT="0" distB="0" distL="0" distR="0">
+            <wp:extent cx="2105025" cy="409575"/>
+            <wp:effectExtent l="0" t="0" r="0" b="0"/>
+            <wp:docPr id="5" name="Зображення5"/>
+            <wp:cNvGraphicFramePr>
+              <a:graphicFrameLocks xmlns:a="http://schemas.openxmlformats.org/drawingml/2006/main" noChangeAspect="1"/>
+            </wp:cNvGraphicFramePr>
+            <a:graphic xmlns:a="http://schemas.openxmlformats.org/drawingml/2006/main">
+              <a:graphicData uri="http://schemas.openxmlformats.org/drawingml/2006/picture">
+                <pic:pic xmlns:pic="http://schemas.openxmlformats.org/drawingml/2006/picture">
+                  <pic:nvPicPr>
+                    <pic:cNvPr id="5" name="Зображення5"/>
+                    <pic:cNvPicPr>
+                      <a:picLocks noChangeAspect="1" noChangeArrowheads="1"/>
+                    </pic:cNvPicPr>
+                  </pic:nvPicPr>
+                  <pic:blipFill>
+                    <a:blip r:embed="rId6"/>
+                    <a:stretch>
+                      <a:fillRect/>
+                    </a:stretch>
+                  </pic:blipFill>
+                  <pic:spPr bwMode="auto">
+                    <a:xfrm>
+                      <a:off x="0" y="0"/>
+                      <a:ext cx="2105025" cy="409575"/>
+                    </a:xfrm>
+                    <a:prstGeom prst="rect">
+                      <a:avLst/>
+                    </a:prstGeom>
+                    <a:noFill/>
+                  </pic:spPr>
+                </pic:pic>
+              </a:graphicData>
+            </a:graphic>
+          </wp:inline>
+        </w:drawing>
+      </w:r>
+    </w:p>
+    <w:p>
+      <w:pPr>
+        <w:pStyle w:val="p11"/>
+        <w:rPr/>
+      </w:pPr>
+      <w:r>
+        <w:rPr/>
+      </w:r>
+    </w:p>
+    <w:p>
+      <w:pPr>
         <w:pStyle w:val="h11"/>
         <w:rPr/>
       </w:pPr>
@@ -763,7 +1025,7 @@
       </w:pPr>
       <w:r>
         <w:rPr/>
-        <w:t>5.1.2.1 Розробити послідовні алгоритм та програму обчислення числа π з можливістю вимірювання часу роботи програми для заданого n та визначення помилки апроксимації інтеграла. Для цього використовуйте функцію вимірювання часу бібліотеки MPI, як еталонне значення числа π прийміть 3.141592653589793238462643.</w:t>
+        <w:t>Розробити послідовні алгоритм та програму обчислення числа π з можливістю вимірювання часу роботи програми для заданого n та визначення помилки апроксимації інтеграла. Для цього використовуйте функцію вимірювання часу бібліотеки MPI, як еталонне значення числа π прийміть 3.141592653589793238462643.</w:t>
       </w:r>
     </w:p>
     <w:p>
@@ -3819,7 +4081,7 @@
             <wp:extent cx="1438275" cy="466725"/>
             <wp:effectExtent l="0" t="0" r="0" b="0"/>
             <wp:wrapSquare wrapText="largest"/>
-            <wp:docPr id="2" name="Зображення1 копія 1"/>
+            <wp:docPr id="6" name="Зображення1 копія 1"/>
             <wp:cNvGraphicFramePr>
               <a:graphicFrameLocks xmlns:a="http://schemas.openxmlformats.org/drawingml/2006/main" noChangeAspect="1"/>
             </wp:cNvGraphicFramePr>
@@ -3827,13 +4089,13 @@
               <a:graphicData uri="http://schemas.openxmlformats.org/drawingml/2006/picture">
                 <pic:pic xmlns:pic="http://schemas.openxmlformats.org/drawingml/2006/picture">
                   <pic:nvPicPr>
-                    <pic:cNvPr id="2" name="Зображення1 копія 1"/>
+                    <pic:cNvPr id="6" name="Зображення1 копія 1"/>
                     <pic:cNvPicPr>
                       <a:picLocks noChangeAspect="1" noChangeArrowheads="1"/>
                     </pic:cNvPicPr>
                   </pic:nvPicPr>
                   <pic:blipFill>
-                    <a:blip r:embed="rId3"/>
+                    <a:blip r:embed="rId7"/>
                     <a:stretch>
                       <a:fillRect/>
                     </a:stretch>
@@ -4765,6 +5027,2777 @@
         <w:rPr>
           <w:rFonts w:ascii="Cascadia Code" w:hAnsi="Cascadia Code"/>
         </w:rPr>
+      </w:r>
+    </w:p>
+    <w:p>
+      <w:pPr>
+        <w:pStyle w:val="H2"/>
+        <w:rPr/>
+      </w:pPr>
+      <w:r>
+        <w:rPr/>
+        <w:t>5.2.2.1</w:t>
+      </w:r>
+    </w:p>
+    <w:p>
+      <w:pPr>
+        <w:pStyle w:val="H3"/>
+        <w:rPr/>
+      </w:pPr>
+      <w:r>
+        <w:rPr/>
+        <w:t>Завдання</w:t>
+      </w:r>
+    </w:p>
+    <w:p>
+      <w:pPr>
+        <w:pStyle w:val="P1"/>
+        <w:rPr>
+          <w:lang w:val="uk-UA"/>
+        </w:rPr>
+      </w:pPr>
+      <w:r>
+        <w:rPr>
+          <w:lang w:val="uk-UA"/>
+        </w:rPr>
+      </w:r>
+    </w:p>
+    <w:p>
+      <w:pPr>
+        <w:pStyle w:val="p11"/>
+        <w:rPr/>
+      </w:pPr>
+      <w:r>
+        <w:rPr/>
+        <w:t>5.2.2.1 Програму 5.2 доповніть функцією обчислення часу її виконання та функцією обчислення дисперсії σ</w:t>
+      </w:r>
+      <w:r>
+        <w:rPr>
+          <w:vertAlign w:val="superscript"/>
+        </w:rPr>
+        <w:t>2</w:t>
+      </w:r>
+      <w:r>
+        <w:rPr/>
+        <w:t xml:space="preserve"> випадкової величини значення π.</w:t>
+      </w:r>
+    </w:p>
+    <w:p>
+      <w:pPr>
+        <w:pStyle w:val="img1"/>
+        <w:rPr/>
+      </w:pPr>
+      <w:r>
+        <w:rPr/>
+        <w:drawing>
+          <wp:inline distT="0" distB="0" distL="0" distR="0">
+            <wp:extent cx="3057525" cy="857250"/>
+            <wp:effectExtent l="0" t="0" r="0" b="0"/>
+            <wp:docPr id="7" name="Зображення2 копія 1"/>
+            <wp:cNvGraphicFramePr>
+              <a:graphicFrameLocks xmlns:a="http://schemas.openxmlformats.org/drawingml/2006/main" noChangeAspect="1"/>
+            </wp:cNvGraphicFramePr>
+            <a:graphic xmlns:a="http://schemas.openxmlformats.org/drawingml/2006/main">
+              <a:graphicData uri="http://schemas.openxmlformats.org/drawingml/2006/picture">
+                <pic:pic xmlns:pic="http://schemas.openxmlformats.org/drawingml/2006/picture">
+                  <pic:nvPicPr>
+                    <pic:cNvPr id="7" name="Зображення2 копія 1"/>
+                    <pic:cNvPicPr>
+                      <a:picLocks noChangeAspect="1" noChangeArrowheads="1"/>
+                    </pic:cNvPicPr>
+                  </pic:nvPicPr>
+                  <pic:blipFill>
+                    <a:blip r:embed="rId8"/>
+                    <a:stretch>
+                      <a:fillRect/>
+                    </a:stretch>
+                  </pic:blipFill>
+                  <pic:spPr bwMode="auto">
+                    <a:xfrm>
+                      <a:off x="0" y="0"/>
+                      <a:ext cx="3057525" cy="857250"/>
+                    </a:xfrm>
+                    <a:prstGeom prst="rect">
+                      <a:avLst/>
+                    </a:prstGeom>
+                    <a:noFill/>
+                  </pic:spPr>
+                </pic:pic>
+              </a:graphicData>
+            </a:graphic>
+          </wp:inline>
+        </w:drawing>
+      </w:r>
+    </w:p>
+    <w:p>
+      <w:pPr>
+        <w:pStyle w:val="p11"/>
+        <w:rPr/>
+      </w:pPr>
+      <w:r>
+        <w:rPr/>
+        <w:t xml:space="preserve">причому, оскільки середнє значення </w:t>
+      </w:r>
+      <w:r>
+        <w:drawing>
+          <wp:anchor behindDoc="0" distT="0" distB="0" distL="0" distR="0" simplePos="0" locked="0" layoutInCell="0" allowOverlap="1" relativeHeight="9">
+            <wp:simplePos x="0" y="0"/>
+            <wp:positionH relativeFrom="column">
+              <wp:posOffset>3315335</wp:posOffset>
+            </wp:positionH>
+            <wp:positionV relativeFrom="paragraph">
+              <wp:posOffset>-70485</wp:posOffset>
+            </wp:positionV>
+            <wp:extent cx="342900" cy="381000"/>
+            <wp:effectExtent l="0" t="0" r="0" b="0"/>
+            <wp:wrapSquare wrapText="largest"/>
+            <wp:docPr id="8" name="Зображення3 копія 1"/>
+            <wp:cNvGraphicFramePr>
+              <a:graphicFrameLocks xmlns:a="http://schemas.openxmlformats.org/drawingml/2006/main" noChangeAspect="1"/>
+            </wp:cNvGraphicFramePr>
+            <a:graphic xmlns:a="http://schemas.openxmlformats.org/drawingml/2006/main">
+              <a:graphicData uri="http://schemas.openxmlformats.org/drawingml/2006/picture">
+                <pic:pic xmlns:pic="http://schemas.openxmlformats.org/drawingml/2006/picture">
+                  <pic:nvPicPr>
+                    <pic:cNvPr id="8" name="Зображення3 копія 1"/>
+                    <pic:cNvPicPr>
+                      <a:picLocks noChangeAspect="1" noChangeArrowheads="1"/>
+                    </pic:cNvPicPr>
+                  </pic:nvPicPr>
+                  <pic:blipFill>
+                    <a:blip r:embed="rId9"/>
+                    <a:stretch>
+                      <a:fillRect/>
+                    </a:stretch>
+                  </pic:blipFill>
+                  <pic:spPr bwMode="auto">
+                    <a:xfrm>
+                      <a:off x="0" y="0"/>
+                      <a:ext cx="342900" cy="381000"/>
+                    </a:xfrm>
+                    <a:prstGeom prst="rect">
+                      <a:avLst/>
+                    </a:prstGeom>
+                    <a:noFill/>
+                  </pic:spPr>
+                </pic:pic>
+              </a:graphicData>
+            </a:graphic>
+          </wp:anchor>
+        </w:drawing>
+      </w:r>
+      <w:r>
+        <w:rPr/>
+        <w:t xml:space="preserve"> заздалегідь не відомо, зручніше використати формулу</w:t>
+      </w:r>
+      <w:r>
+        <w:rPr>
+          <w:lang w:val="en-US"/>
+        </w:rPr>
+        <w:t>:</w:t>
+      </w:r>
+    </w:p>
+    <w:p>
+      <w:pPr>
+        <w:pStyle w:val="img1"/>
+        <w:rPr/>
+      </w:pPr>
+      <w:r>
+        <w:rPr/>
+        <w:drawing>
+          <wp:inline distT="0" distB="0" distL="0" distR="0">
+            <wp:extent cx="3886835" cy="1000125"/>
+            <wp:effectExtent l="0" t="0" r="0" b="0"/>
+            <wp:docPr id="9" name="Зображення4 копія 1"/>
+            <wp:cNvGraphicFramePr>
+              <a:graphicFrameLocks xmlns:a="http://schemas.openxmlformats.org/drawingml/2006/main" noChangeAspect="1"/>
+            </wp:cNvGraphicFramePr>
+            <a:graphic xmlns:a="http://schemas.openxmlformats.org/drawingml/2006/main">
+              <a:graphicData uri="http://schemas.openxmlformats.org/drawingml/2006/picture">
+                <pic:pic xmlns:pic="http://schemas.openxmlformats.org/drawingml/2006/picture">
+                  <pic:nvPicPr>
+                    <pic:cNvPr id="9" name="Зображення4 копія 1"/>
+                    <pic:cNvPicPr>
+                      <a:picLocks noChangeAspect="1" noChangeArrowheads="1"/>
+                    </pic:cNvPicPr>
+                  </pic:nvPicPr>
+                  <pic:blipFill>
+                    <a:blip r:embed="rId10"/>
+                    <a:stretch>
+                      <a:fillRect/>
+                    </a:stretch>
+                  </pic:blipFill>
+                  <pic:spPr bwMode="auto">
+                    <a:xfrm>
+                      <a:off x="0" y="0"/>
+                      <a:ext cx="3886835" cy="1000125"/>
+                    </a:xfrm>
+                    <a:prstGeom prst="rect">
+                      <a:avLst/>
+                    </a:prstGeom>
+                    <a:noFill/>
+                  </pic:spPr>
+                </pic:pic>
+              </a:graphicData>
+            </a:graphic>
+          </wp:inline>
+        </w:drawing>
+      </w:r>
+    </w:p>
+    <w:p>
+      <w:pPr>
+        <w:pStyle w:val="p11"/>
+        <w:rPr>
+          <w:lang w:val="en-US"/>
+        </w:rPr>
+      </w:pPr>
+      <w:r>
+        <w:rPr>
+          <w:lang w:val="en-US"/>
+        </w:rPr>
+      </w:r>
+    </w:p>
+    <w:p>
+      <w:pPr>
+        <w:pStyle w:val="H3"/>
+        <w:rPr/>
+      </w:pPr>
+      <w:r>
+        <w:rPr/>
+        <w:t>Код</w:t>
+      </w:r>
+    </w:p>
+    <w:p>
+      <w:pPr>
+        <w:pStyle w:val="P1"/>
+        <w:rPr/>
+      </w:pPr>
+      <w:r>
+        <w:rPr/>
+      </w:r>
+    </w:p>
+    <w:p>
+      <w:pPr>
+        <w:pStyle w:val="Code"/>
+        <w:rPr>
+          <w:rFonts w:ascii="Cascadia Code" w:hAnsi="Cascadia Code"/>
+        </w:rPr>
+      </w:pPr>
+      <w:r>
+        <w:rPr>
+          <w:rFonts w:ascii="Cascadia Code" w:hAnsi="Cascadia Code"/>
+        </w:rPr>
+        <w:t>import math</w:t>
+      </w:r>
+    </w:p>
+    <w:p>
+      <w:pPr>
+        <w:pStyle w:val="Code"/>
+        <w:rPr>
+          <w:rFonts w:ascii="Cascadia Code" w:hAnsi="Cascadia Code"/>
+        </w:rPr>
+      </w:pPr>
+      <w:r>
+        <w:rPr>
+          <w:rFonts w:ascii="Cascadia Code" w:hAnsi="Cascadia Code"/>
+        </w:rPr>
+        <w:t>import random</w:t>
+      </w:r>
+    </w:p>
+    <w:p>
+      <w:pPr>
+        <w:pStyle w:val="Code"/>
+        <w:rPr>
+          <w:rFonts w:ascii="Cascadia Code" w:hAnsi="Cascadia Code"/>
+        </w:rPr>
+      </w:pPr>
+      <w:r>
+        <w:rPr>
+          <w:rFonts w:ascii="Cascadia Code" w:hAnsi="Cascadia Code"/>
+        </w:rPr>
+        <w:t>import sys</w:t>
+      </w:r>
+    </w:p>
+    <w:p>
+      <w:pPr>
+        <w:pStyle w:val="Code"/>
+        <w:rPr>
+          <w:rFonts w:ascii="Cascadia Code" w:hAnsi="Cascadia Code"/>
+        </w:rPr>
+      </w:pPr>
+      <w:r>
+        <w:rPr>
+          <w:rFonts w:ascii="Cascadia Code" w:hAnsi="Cascadia Code"/>
+        </w:rPr>
+        <w:t>import time</w:t>
+      </w:r>
+    </w:p>
+    <w:p>
+      <w:pPr>
+        <w:pStyle w:val="Code"/>
+        <w:rPr>
+          <w:rFonts w:ascii="Cascadia Code" w:hAnsi="Cascadia Code"/>
+        </w:rPr>
+      </w:pPr>
+      <w:r>
+        <w:rPr>
+          <w:rFonts w:ascii="Cascadia Code" w:hAnsi="Cascadia Code"/>
+        </w:rPr>
+        <w:t>from mpi4py import MPI</w:t>
+      </w:r>
+    </w:p>
+    <w:p>
+      <w:pPr>
+        <w:pStyle w:val="Code"/>
+        <w:rPr>
+          <w:rFonts w:ascii="Cascadia Code" w:hAnsi="Cascadia Code"/>
+        </w:rPr>
+      </w:pPr>
+      <w:r>
+        <w:rPr>
+          <w:rFonts w:ascii="Cascadia Code" w:hAnsi="Cascadia Code"/>
+        </w:rPr>
+      </w:r>
+    </w:p>
+    <w:p>
+      <w:pPr>
+        <w:pStyle w:val="Code"/>
+        <w:rPr>
+          <w:rFonts w:ascii="Cascadia Code" w:hAnsi="Cascadia Code"/>
+        </w:rPr>
+      </w:pPr>
+      <w:r>
+        <w:rPr>
+          <w:rFonts w:ascii="Cascadia Code" w:hAnsi="Cascadia Code"/>
+        </w:rPr>
+        <w:t>def main():</w:t>
+      </w:r>
+    </w:p>
+    <w:p>
+      <w:pPr>
+        <w:pStyle w:val="Code"/>
+        <w:rPr>
+          <w:rFonts w:ascii="Cascadia Code" w:hAnsi="Cascadia Code"/>
+        </w:rPr>
+      </w:pPr>
+      <w:r>
+        <w:rPr>
+          <w:rFonts w:ascii="Cascadia Code" w:hAnsi="Cascadia Code"/>
+        </w:rPr>
+        <w:t xml:space="preserve">    </w:t>
+      </w:r>
+      <w:r>
+        <w:rPr>
+          <w:rFonts w:ascii="Cascadia Code" w:hAnsi="Cascadia Code"/>
+        </w:rPr>
+        <w:t>comm = MPI.COMM_WORLD</w:t>
+      </w:r>
+    </w:p>
+    <w:p>
+      <w:pPr>
+        <w:pStyle w:val="Code"/>
+        <w:rPr>
+          <w:rFonts w:ascii="Cascadia Code" w:hAnsi="Cascadia Code"/>
+        </w:rPr>
+      </w:pPr>
+      <w:r>
+        <w:rPr>
+          <w:rFonts w:ascii="Cascadia Code" w:hAnsi="Cascadia Code"/>
+        </w:rPr>
+        <w:t xml:space="preserve">    </w:t>
+      </w:r>
+      <w:r>
+        <w:rPr>
+          <w:rFonts w:ascii="Cascadia Code" w:hAnsi="Cascadia Code"/>
+        </w:rPr>
+        <w:t>rank = comm.Get_rank()</w:t>
+      </w:r>
+    </w:p>
+    <w:p>
+      <w:pPr>
+        <w:pStyle w:val="Code"/>
+        <w:rPr>
+          <w:rFonts w:ascii="Cascadia Code" w:hAnsi="Cascadia Code"/>
+        </w:rPr>
+      </w:pPr>
+      <w:r>
+        <w:rPr>
+          <w:rFonts w:ascii="Cascadia Code" w:hAnsi="Cascadia Code"/>
+        </w:rPr>
+        <w:t xml:space="preserve">    </w:t>
+      </w:r>
+      <w:r>
+        <w:rPr>
+          <w:rFonts w:ascii="Cascadia Code" w:hAnsi="Cascadia Code"/>
+        </w:rPr>
+        <w:t>numprocs = comm.Get_size()</w:t>
+      </w:r>
+    </w:p>
+    <w:p>
+      <w:pPr>
+        <w:pStyle w:val="Code"/>
+        <w:rPr>
+          <w:rFonts w:ascii="Cascadia Code" w:hAnsi="Cascadia Code"/>
+        </w:rPr>
+      </w:pPr>
+      <w:r>
+        <w:rPr>
+          <w:rFonts w:ascii="Cascadia Code" w:hAnsi="Cascadia Code"/>
+        </w:rPr>
+      </w:r>
+    </w:p>
+    <w:p>
+      <w:pPr>
+        <w:pStyle w:val="Code"/>
+        <w:rPr>
+          <w:rFonts w:ascii="Cascadia Code" w:hAnsi="Cascadia Code"/>
+        </w:rPr>
+      </w:pPr>
+      <w:r>
+        <w:rPr>
+          <w:rFonts w:ascii="Cascadia Code" w:hAnsi="Cascadia Code"/>
+        </w:rPr>
+        <w:t xml:space="preserve">    </w:t>
+      </w:r>
+      <w:r>
+        <w:rPr>
+          <w:rFonts w:ascii="Cascadia Code" w:hAnsi="Cascadia Code"/>
+        </w:rPr>
+        <w:t>n_in_proc = 1_000_000</w:t>
+      </w:r>
+    </w:p>
+    <w:p>
+      <w:pPr>
+        <w:pStyle w:val="Code"/>
+        <w:rPr>
+          <w:rFonts w:ascii="Cascadia Code" w:hAnsi="Cascadia Code"/>
+        </w:rPr>
+      </w:pPr>
+      <w:r>
+        <w:rPr>
+          <w:rFonts w:ascii="Cascadia Code" w:hAnsi="Cascadia Code"/>
+        </w:rPr>
+        <w:t xml:space="preserve">    </w:t>
+      </w:r>
+      <w:r>
+        <w:rPr>
+          <w:rFonts w:ascii="Cascadia Code" w:hAnsi="Cascadia Code"/>
+        </w:rPr>
+        <w:t>R = 0.5</w:t>
+      </w:r>
+    </w:p>
+    <w:p>
+      <w:pPr>
+        <w:pStyle w:val="Code"/>
+        <w:rPr>
+          <w:rFonts w:ascii="Cascadia Code" w:hAnsi="Cascadia Code"/>
+        </w:rPr>
+      </w:pPr>
+      <w:r>
+        <w:rPr>
+          <w:rFonts w:ascii="Cascadia Code" w:hAnsi="Cascadia Code"/>
+        </w:rPr>
+        <w:t xml:space="preserve">    </w:t>
+      </w:r>
+      <w:r>
+        <w:rPr>
+          <w:rFonts w:ascii="Cascadia Code" w:hAnsi="Cascadia Code"/>
+        </w:rPr>
+        <w:t>pi_reference = math.pi</w:t>
+      </w:r>
+    </w:p>
+    <w:p>
+      <w:pPr>
+        <w:pStyle w:val="Code"/>
+        <w:rPr>
+          <w:rFonts w:ascii="Cascadia Code" w:hAnsi="Cascadia Code"/>
+        </w:rPr>
+      </w:pPr>
+      <w:r>
+        <w:rPr>
+          <w:rFonts w:ascii="Cascadia Code" w:hAnsi="Cascadia Code"/>
+        </w:rPr>
+      </w:r>
+    </w:p>
+    <w:p>
+      <w:pPr>
+        <w:pStyle w:val="Code"/>
+        <w:rPr>
+          <w:rFonts w:ascii="Cascadia Code" w:hAnsi="Cascadia Code"/>
+        </w:rPr>
+      </w:pPr>
+      <w:r>
+        <w:rPr>
+          <w:rFonts w:ascii="Cascadia Code" w:hAnsi="Cascadia Code"/>
+        </w:rPr>
+        <w:t xml:space="preserve">    </w:t>
+      </w:r>
+      <w:r>
+        <w:rPr>
+          <w:rFonts w:ascii="Cascadia Code" w:hAnsi="Cascadia Code"/>
+        </w:rPr>
+        <w:t>n_iterations = 0</w:t>
+      </w:r>
+    </w:p>
+    <w:p>
+      <w:pPr>
+        <w:pStyle w:val="Code"/>
+        <w:rPr>
+          <w:rFonts w:ascii="Cascadia Code" w:hAnsi="Cascadia Code"/>
+        </w:rPr>
+      </w:pPr>
+      <w:r>
+        <w:rPr>
+          <w:rFonts w:ascii="Cascadia Code" w:hAnsi="Cascadia Code"/>
+        </w:rPr>
+        <w:t xml:space="preserve">    </w:t>
+      </w:r>
+      <w:r>
+        <w:rPr>
+          <w:rFonts w:ascii="Cascadia Code" w:hAnsi="Cascadia Code"/>
+        </w:rPr>
+        <w:t>if rank == 0:</w:t>
+      </w:r>
+    </w:p>
+    <w:p>
+      <w:pPr>
+        <w:pStyle w:val="Code"/>
+        <w:rPr>
+          <w:rFonts w:ascii="Cascadia Code" w:hAnsi="Cascadia Code"/>
+        </w:rPr>
+      </w:pPr>
+      <w:r>
+        <w:rPr>
+          <w:rFonts w:ascii="Cascadia Code" w:hAnsi="Cascadia Code"/>
+        </w:rPr>
+        <w:t xml:space="preserve">        </w:t>
+      </w:r>
+      <w:r>
+        <w:rPr>
+          <w:rFonts w:ascii="Cascadia Code" w:hAnsi="Cascadia Code"/>
+        </w:rPr>
+        <w:t>if len(sys.argv) &gt; 1:</w:t>
+      </w:r>
+    </w:p>
+    <w:p>
+      <w:pPr>
+        <w:pStyle w:val="Code"/>
+        <w:rPr>
+          <w:rFonts w:ascii="Cascadia Code" w:hAnsi="Cascadia Code"/>
+        </w:rPr>
+      </w:pPr>
+      <w:r>
+        <w:rPr>
+          <w:rFonts w:ascii="Cascadia Code" w:hAnsi="Cascadia Code"/>
+        </w:rPr>
+        <w:t xml:space="preserve">            </w:t>
+      </w:r>
+      <w:r>
+        <w:rPr>
+          <w:rFonts w:ascii="Cascadia Code" w:hAnsi="Cascadia Code"/>
+        </w:rPr>
+        <w:t>n_iterations = int(sys.argv[1])</w:t>
+      </w:r>
+    </w:p>
+    <w:p>
+      <w:pPr>
+        <w:pStyle w:val="Code"/>
+        <w:rPr>
+          <w:rFonts w:ascii="Cascadia Code" w:hAnsi="Cascadia Code"/>
+        </w:rPr>
+      </w:pPr>
+      <w:r>
+        <w:rPr>
+          <w:rFonts w:ascii="Cascadia Code" w:hAnsi="Cascadia Code"/>
+        </w:rPr>
+        <w:t xml:space="preserve">        </w:t>
+      </w:r>
+      <w:r>
+        <w:rPr>
+          <w:rFonts w:ascii="Cascadia Code" w:hAnsi="Cascadia Code"/>
+        </w:rPr>
+        <w:t>else:</w:t>
+      </w:r>
+    </w:p>
+    <w:p>
+      <w:pPr>
+        <w:pStyle w:val="Code"/>
+        <w:rPr>
+          <w:rFonts w:ascii="Cascadia Code" w:hAnsi="Cascadia Code"/>
+        </w:rPr>
+      </w:pPr>
+      <w:r>
+        <w:rPr>
+          <w:rFonts w:ascii="Cascadia Code" w:hAnsi="Cascadia Code"/>
+        </w:rPr>
+        <w:t xml:space="preserve">            </w:t>
+      </w:r>
+      <w:r>
+        <w:rPr>
+          <w:rFonts w:ascii="Cascadia Code" w:hAnsi="Cascadia Code"/>
+        </w:rPr>
+        <w:t>n_iterations = 10</w:t>
+      </w:r>
+    </w:p>
+    <w:p>
+      <w:pPr>
+        <w:pStyle w:val="Code"/>
+        <w:rPr>
+          <w:rFonts w:ascii="Cascadia Code" w:hAnsi="Cascadia Code"/>
+        </w:rPr>
+      </w:pPr>
+      <w:r>
+        <w:rPr>
+          <w:rFonts w:ascii="Cascadia Code" w:hAnsi="Cascadia Code"/>
+        </w:rPr>
+      </w:r>
+    </w:p>
+    <w:p>
+      <w:pPr>
+        <w:pStyle w:val="Code"/>
+        <w:rPr>
+          <w:rFonts w:ascii="Cascadia Code" w:hAnsi="Cascadia Code"/>
+        </w:rPr>
+      </w:pPr>
+      <w:r>
+        <w:rPr>
+          <w:rFonts w:ascii="Cascadia Code" w:hAnsi="Cascadia Code"/>
+        </w:rPr>
+        <w:t xml:space="preserve">    </w:t>
+      </w:r>
+      <w:r>
+        <w:rPr>
+          <w:rFonts w:ascii="Cascadia Code" w:hAnsi="Cascadia Code"/>
+        </w:rPr>
+        <w:t>n_iterations = comm.bcast(n_iterations, root=0)</w:t>
+      </w:r>
+    </w:p>
+    <w:p>
+      <w:pPr>
+        <w:pStyle w:val="Code"/>
+        <w:rPr>
+          <w:rFonts w:ascii="Cascadia Code" w:hAnsi="Cascadia Code"/>
+        </w:rPr>
+      </w:pPr>
+      <w:r>
+        <w:rPr>
+          <w:rFonts w:ascii="Cascadia Code" w:hAnsi="Cascadia Code"/>
+        </w:rPr>
+      </w:r>
+    </w:p>
+    <w:p>
+      <w:pPr>
+        <w:pStyle w:val="Code"/>
+        <w:rPr>
+          <w:rFonts w:ascii="Cascadia Code" w:hAnsi="Cascadia Code"/>
+        </w:rPr>
+      </w:pPr>
+      <w:r>
+        <w:rPr>
+          <w:rFonts w:ascii="Cascadia Code" w:hAnsi="Cascadia Code"/>
+        </w:rPr>
+        <w:t xml:space="preserve">    </w:t>
+      </w:r>
+      <w:r>
+        <w:rPr>
+          <w:rFonts w:ascii="Cascadia Code" w:hAnsi="Cascadia Code"/>
+        </w:rPr>
+        <w:t>pi_values = []</w:t>
+      </w:r>
+    </w:p>
+    <w:p>
+      <w:pPr>
+        <w:pStyle w:val="Code"/>
+        <w:rPr>
+          <w:rFonts w:ascii="Cascadia Code" w:hAnsi="Cascadia Code"/>
+        </w:rPr>
+      </w:pPr>
+      <w:r>
+        <w:rPr>
+          <w:rFonts w:ascii="Cascadia Code" w:hAnsi="Cascadia Code"/>
+        </w:rPr>
+      </w:r>
+    </w:p>
+    <w:p>
+      <w:pPr>
+        <w:pStyle w:val="Code"/>
+        <w:rPr>
+          <w:rFonts w:ascii="Cascadia Code" w:hAnsi="Cascadia Code"/>
+        </w:rPr>
+      </w:pPr>
+      <w:r>
+        <w:rPr>
+          <w:rFonts w:ascii="Cascadia Code" w:hAnsi="Cascadia Code"/>
+        </w:rPr>
+        <w:t xml:space="preserve">    </w:t>
+      </w:r>
+      <w:r>
+        <w:rPr>
+          <w:rFonts w:ascii="Cascadia Code" w:hAnsi="Cascadia Code"/>
+        </w:rPr>
+        <w:t>start_time = MPI.Wtime()</w:t>
+      </w:r>
+    </w:p>
+    <w:p>
+      <w:pPr>
+        <w:pStyle w:val="Code"/>
+        <w:rPr>
+          <w:rFonts w:ascii="Cascadia Code" w:hAnsi="Cascadia Code"/>
+        </w:rPr>
+      </w:pPr>
+      <w:r>
+        <w:rPr>
+          <w:rFonts w:ascii="Cascadia Code" w:hAnsi="Cascadia Code"/>
+        </w:rPr>
+      </w:r>
+    </w:p>
+    <w:p>
+      <w:pPr>
+        <w:pStyle w:val="Code"/>
+        <w:rPr>
+          <w:rFonts w:ascii="Cascadia Code" w:hAnsi="Cascadia Code"/>
+        </w:rPr>
+      </w:pPr>
+      <w:r>
+        <w:rPr>
+          <w:rFonts w:ascii="Cascadia Code" w:hAnsi="Cascadia Code"/>
+        </w:rPr>
+        <w:t xml:space="preserve">    </w:t>
+      </w:r>
+      <w:r>
+        <w:rPr>
+          <w:rFonts w:ascii="Cascadia Code" w:hAnsi="Cascadia Code"/>
+        </w:rPr>
+        <w:t>for i in range(n_iterations):</w:t>
+      </w:r>
+    </w:p>
+    <w:p>
+      <w:pPr>
+        <w:pStyle w:val="Code"/>
+        <w:rPr>
+          <w:rFonts w:ascii="Cascadia Code" w:hAnsi="Cascadia Code"/>
+        </w:rPr>
+      </w:pPr>
+      <w:r>
+        <w:rPr>
+          <w:rFonts w:ascii="Cascadia Code" w:hAnsi="Cascadia Code"/>
+        </w:rPr>
+        <w:t xml:space="preserve">        </w:t>
+      </w:r>
+      <w:r>
+        <w:rPr>
+          <w:rFonts w:ascii="Cascadia Code" w:hAnsi="Cascadia Code"/>
+        </w:rPr>
+        <w:t>random.seed(time.time() + rank + i)</w:t>
+      </w:r>
+    </w:p>
+    <w:p>
+      <w:pPr>
+        <w:pStyle w:val="Code"/>
+        <w:rPr>
+          <w:rFonts w:ascii="Cascadia Code" w:hAnsi="Cascadia Code"/>
+        </w:rPr>
+      </w:pPr>
+      <w:r>
+        <w:rPr>
+          <w:rFonts w:ascii="Cascadia Code" w:hAnsi="Cascadia Code"/>
+        </w:rPr>
+      </w:r>
+    </w:p>
+    <w:p>
+      <w:pPr>
+        <w:pStyle w:val="Code"/>
+        <w:rPr>
+          <w:rFonts w:ascii="Cascadia Code" w:hAnsi="Cascadia Code"/>
+        </w:rPr>
+      </w:pPr>
+      <w:r>
+        <w:rPr>
+          <w:rFonts w:ascii="Cascadia Code" w:hAnsi="Cascadia Code"/>
+        </w:rPr>
+        <w:t xml:space="preserve">        </w:t>
+      </w:r>
+      <w:r>
+        <w:rPr>
+          <w:rFonts w:ascii="Cascadia Code" w:hAnsi="Cascadia Code"/>
+        </w:rPr>
+        <w:t>in_circle_local = 0</w:t>
+      </w:r>
+    </w:p>
+    <w:p>
+      <w:pPr>
+        <w:pStyle w:val="Code"/>
+        <w:rPr>
+          <w:rFonts w:ascii="Cascadia Code" w:hAnsi="Cascadia Code"/>
+        </w:rPr>
+      </w:pPr>
+      <w:r>
+        <w:rPr>
+          <w:rFonts w:ascii="Cascadia Code" w:hAnsi="Cascadia Code"/>
+        </w:rPr>
+        <w:t xml:space="preserve">        </w:t>
+      </w:r>
+      <w:r>
+        <w:rPr>
+          <w:rFonts w:ascii="Cascadia Code" w:hAnsi="Cascadia Code"/>
+        </w:rPr>
+        <w:t>for _ in range(n_in_proc):</w:t>
+      </w:r>
+    </w:p>
+    <w:p>
+      <w:pPr>
+        <w:pStyle w:val="Code"/>
+        <w:rPr>
+          <w:rFonts w:ascii="Cascadia Code" w:hAnsi="Cascadia Code"/>
+        </w:rPr>
+      </w:pPr>
+      <w:r>
+        <w:rPr>
+          <w:rFonts w:ascii="Cascadia Code" w:hAnsi="Cascadia Code"/>
+        </w:rPr>
+        <w:t xml:space="preserve">            </w:t>
+      </w:r>
+      <w:r>
+        <w:rPr>
+          <w:rFonts w:ascii="Cascadia Code" w:hAnsi="Cascadia Code"/>
+        </w:rPr>
+        <w:t>x = random.uniform(-0.5, 0.5)</w:t>
+      </w:r>
+    </w:p>
+    <w:p>
+      <w:pPr>
+        <w:pStyle w:val="Code"/>
+        <w:rPr>
+          <w:rFonts w:ascii="Cascadia Code" w:hAnsi="Cascadia Code"/>
+        </w:rPr>
+      </w:pPr>
+      <w:r>
+        <w:rPr>
+          <w:rFonts w:ascii="Cascadia Code" w:hAnsi="Cascadia Code"/>
+        </w:rPr>
+        <w:t xml:space="preserve">            </w:t>
+      </w:r>
+      <w:r>
+        <w:rPr>
+          <w:rFonts w:ascii="Cascadia Code" w:hAnsi="Cascadia Code"/>
+        </w:rPr>
+        <w:t>y = random.uniform(-0.5, 0.5)</w:t>
+      </w:r>
+    </w:p>
+    <w:p>
+      <w:pPr>
+        <w:pStyle w:val="Code"/>
+        <w:rPr>
+          <w:rFonts w:ascii="Cascadia Code" w:hAnsi="Cascadia Code"/>
+        </w:rPr>
+      </w:pPr>
+      <w:r>
+        <w:rPr>
+          <w:rFonts w:ascii="Cascadia Code" w:hAnsi="Cascadia Code"/>
+        </w:rPr>
+        <w:t xml:space="preserve">            </w:t>
+      </w:r>
+      <w:r>
+        <w:rPr>
+          <w:rFonts w:ascii="Cascadia Code" w:hAnsi="Cascadia Code"/>
+        </w:rPr>
+        <w:t>if x * x + y * y &lt; R * R:</w:t>
+      </w:r>
+    </w:p>
+    <w:p>
+      <w:pPr>
+        <w:pStyle w:val="Code"/>
+        <w:rPr>
+          <w:rFonts w:ascii="Cascadia Code" w:hAnsi="Cascadia Code"/>
+        </w:rPr>
+      </w:pPr>
+      <w:r>
+        <w:rPr>
+          <w:rFonts w:ascii="Cascadia Code" w:hAnsi="Cascadia Code"/>
+        </w:rPr>
+        <w:t xml:space="preserve">                </w:t>
+      </w:r>
+      <w:r>
+        <w:rPr>
+          <w:rFonts w:ascii="Cascadia Code" w:hAnsi="Cascadia Code"/>
+        </w:rPr>
+        <w:t>in_circle_local += 1</w:t>
+      </w:r>
+    </w:p>
+    <w:p>
+      <w:pPr>
+        <w:pStyle w:val="Code"/>
+        <w:rPr>
+          <w:rFonts w:ascii="Cascadia Code" w:hAnsi="Cascadia Code"/>
+        </w:rPr>
+      </w:pPr>
+      <w:r>
+        <w:rPr>
+          <w:rFonts w:ascii="Cascadia Code" w:hAnsi="Cascadia Code"/>
+        </w:rPr>
+      </w:r>
+    </w:p>
+    <w:p>
+      <w:pPr>
+        <w:pStyle w:val="Code"/>
+        <w:rPr>
+          <w:rFonts w:ascii="Cascadia Code" w:hAnsi="Cascadia Code"/>
+        </w:rPr>
+      </w:pPr>
+      <w:r>
+        <w:rPr>
+          <w:rFonts w:ascii="Cascadia Code" w:hAnsi="Cascadia Code"/>
+        </w:rPr>
+        <w:t xml:space="preserve">        </w:t>
+      </w:r>
+      <w:r>
+        <w:rPr>
+          <w:rFonts w:ascii="Cascadia Code" w:hAnsi="Cascadia Code"/>
+        </w:rPr>
+        <w:t>total_in_circle = comm.reduce(in_circle_local, op=MPI.SUM, root=0)</w:t>
+      </w:r>
+    </w:p>
+    <w:p>
+      <w:pPr>
+        <w:pStyle w:val="Code"/>
+        <w:rPr>
+          <w:rFonts w:ascii="Cascadia Code" w:hAnsi="Cascadia Code"/>
+        </w:rPr>
+      </w:pPr>
+      <w:r>
+        <w:rPr>
+          <w:rFonts w:ascii="Cascadia Code" w:hAnsi="Cascadia Code"/>
+        </w:rPr>
+      </w:r>
+    </w:p>
+    <w:p>
+      <w:pPr>
+        <w:pStyle w:val="Code"/>
+        <w:rPr>
+          <w:rFonts w:ascii="Cascadia Code" w:hAnsi="Cascadia Code"/>
+        </w:rPr>
+      </w:pPr>
+      <w:r>
+        <w:rPr>
+          <w:rFonts w:ascii="Cascadia Code" w:hAnsi="Cascadia Code"/>
+        </w:rPr>
+        <w:t xml:space="preserve">        </w:t>
+      </w:r>
+      <w:r>
+        <w:rPr>
+          <w:rFonts w:ascii="Cascadia Code" w:hAnsi="Cascadia Code"/>
+        </w:rPr>
+        <w:t>if rank == 0:</w:t>
+      </w:r>
+    </w:p>
+    <w:p>
+      <w:pPr>
+        <w:pStyle w:val="Code"/>
+        <w:rPr>
+          <w:rFonts w:ascii="Cascadia Code" w:hAnsi="Cascadia Code"/>
+        </w:rPr>
+      </w:pPr>
+      <w:r>
+        <w:rPr>
+          <w:rFonts w:ascii="Cascadia Code" w:hAnsi="Cascadia Code"/>
+        </w:rPr>
+        <w:t xml:space="preserve">            </w:t>
+      </w:r>
+      <w:r>
+        <w:rPr>
+          <w:rFonts w:ascii="Cascadia Code" w:hAnsi="Cascadia Code"/>
+        </w:rPr>
+        <w:t>total_points_iter = n_in_proc * numprocs</w:t>
+      </w:r>
+    </w:p>
+    <w:p>
+      <w:pPr>
+        <w:pStyle w:val="Code"/>
+        <w:rPr>
+          <w:rFonts w:ascii="Cascadia Code" w:hAnsi="Cascadia Code"/>
+        </w:rPr>
+      </w:pPr>
+      <w:r>
+        <w:rPr>
+          <w:rFonts w:ascii="Cascadia Code" w:hAnsi="Cascadia Code"/>
+        </w:rPr>
+        <w:t xml:space="preserve">            </w:t>
+      </w:r>
+      <w:r>
+        <w:rPr>
+          <w:rFonts w:ascii="Cascadia Code" w:hAnsi="Cascadia Code"/>
+        </w:rPr>
+        <w:t>xi = 4.0 * (total_in_circle / total_points_iter)</w:t>
+      </w:r>
+    </w:p>
+    <w:p>
+      <w:pPr>
+        <w:pStyle w:val="Code"/>
+        <w:rPr>
+          <w:rFonts w:ascii="Cascadia Code" w:hAnsi="Cascadia Code"/>
+        </w:rPr>
+      </w:pPr>
+      <w:r>
+        <w:rPr>
+          <w:rFonts w:ascii="Cascadia Code" w:hAnsi="Cascadia Code"/>
+        </w:rPr>
+        <w:t xml:space="preserve">            </w:t>
+      </w:r>
+      <w:r>
+        <w:rPr>
+          <w:rFonts w:ascii="Cascadia Code" w:hAnsi="Cascadia Code"/>
+        </w:rPr>
+        <w:t>pi_values.append(xi)</w:t>
+      </w:r>
+    </w:p>
+    <w:p>
+      <w:pPr>
+        <w:pStyle w:val="Code"/>
+        <w:rPr>
+          <w:rFonts w:ascii="Cascadia Code" w:hAnsi="Cascadia Code"/>
+        </w:rPr>
+      </w:pPr>
+      <w:r>
+        <w:rPr>
+          <w:rFonts w:ascii="Cascadia Code" w:hAnsi="Cascadia Code"/>
+        </w:rPr>
+        <w:t xml:space="preserve">            </w:t>
+      </w:r>
+      <w:r>
+        <w:rPr>
+          <w:rFonts w:ascii="Cascadia Code" w:hAnsi="Cascadia Code"/>
+        </w:rPr>
+        <w:t>print(f"Iteration {i + 1}: pi = {xi:.10f}")</w:t>
+      </w:r>
+    </w:p>
+    <w:p>
+      <w:pPr>
+        <w:pStyle w:val="Code"/>
+        <w:rPr>
+          <w:rFonts w:ascii="Cascadia Code" w:hAnsi="Cascadia Code"/>
+        </w:rPr>
+      </w:pPr>
+      <w:r>
+        <w:rPr>
+          <w:rFonts w:ascii="Cascadia Code" w:hAnsi="Cascadia Code"/>
+        </w:rPr>
+      </w:r>
+    </w:p>
+    <w:p>
+      <w:pPr>
+        <w:pStyle w:val="Code"/>
+        <w:rPr>
+          <w:rFonts w:ascii="Cascadia Code" w:hAnsi="Cascadia Code"/>
+        </w:rPr>
+      </w:pPr>
+      <w:r>
+        <w:rPr>
+          <w:rFonts w:ascii="Cascadia Code" w:hAnsi="Cascadia Code"/>
+        </w:rPr>
+        <w:t xml:space="preserve">    </w:t>
+      </w:r>
+      <w:r>
+        <w:rPr>
+          <w:rFonts w:ascii="Cascadia Code" w:hAnsi="Cascadia Code"/>
+        </w:rPr>
+        <w:t>end_time = MPI.Wtime()</w:t>
+      </w:r>
+    </w:p>
+    <w:p>
+      <w:pPr>
+        <w:pStyle w:val="Code"/>
+        <w:rPr>
+          <w:rFonts w:ascii="Cascadia Code" w:hAnsi="Cascadia Code"/>
+        </w:rPr>
+      </w:pPr>
+      <w:r>
+        <w:rPr>
+          <w:rFonts w:ascii="Cascadia Code" w:hAnsi="Cascadia Code"/>
+        </w:rPr>
+      </w:r>
+    </w:p>
+    <w:p>
+      <w:pPr>
+        <w:pStyle w:val="Code"/>
+        <w:rPr>
+          <w:rFonts w:ascii="Cascadia Code" w:hAnsi="Cascadia Code"/>
+        </w:rPr>
+      </w:pPr>
+      <w:r>
+        <w:rPr>
+          <w:rFonts w:ascii="Cascadia Code" w:hAnsi="Cascadia Code"/>
+        </w:rPr>
+        <w:t xml:space="preserve">    </w:t>
+      </w:r>
+      <w:r>
+        <w:rPr>
+          <w:rFonts w:ascii="Cascadia Code" w:hAnsi="Cascadia Code"/>
+        </w:rPr>
+        <w:t>if rank == 0:</w:t>
+      </w:r>
+    </w:p>
+    <w:p>
+      <w:pPr>
+        <w:pStyle w:val="Code"/>
+        <w:rPr>
+          <w:rFonts w:ascii="Cascadia Code" w:hAnsi="Cascadia Code"/>
+        </w:rPr>
+      </w:pPr>
+      <w:r>
+        <w:rPr>
+          <w:rFonts w:ascii="Cascadia Code" w:hAnsi="Cascadia Code"/>
+        </w:rPr>
+        <w:t xml:space="preserve">        </w:t>
+      </w:r>
+      <w:r>
+        <w:rPr>
+          <w:rFonts w:ascii="Cascadia Code" w:hAnsi="Cascadia Code"/>
+        </w:rPr>
+        <w:t>n = len(pi_values)</w:t>
+      </w:r>
+    </w:p>
+    <w:p>
+      <w:pPr>
+        <w:pStyle w:val="Code"/>
+        <w:rPr>
+          <w:rFonts w:ascii="Cascadia Code" w:hAnsi="Cascadia Code"/>
+        </w:rPr>
+      </w:pPr>
+      <w:r>
+        <w:rPr>
+          <w:rFonts w:ascii="Cascadia Code" w:hAnsi="Cascadia Code"/>
+        </w:rPr>
+        <w:t xml:space="preserve">        </w:t>
+      </w:r>
+      <w:r>
+        <w:rPr>
+          <w:rFonts w:ascii="Cascadia Code" w:hAnsi="Cascadia Code"/>
+        </w:rPr>
+        <w:t>sum_xi = sum(pi_values)</w:t>
+      </w:r>
+    </w:p>
+    <w:p>
+      <w:pPr>
+        <w:pStyle w:val="Code"/>
+        <w:rPr>
+          <w:rFonts w:ascii="Cascadia Code" w:hAnsi="Cascadia Code"/>
+        </w:rPr>
+      </w:pPr>
+      <w:r>
+        <w:rPr>
+          <w:rFonts w:ascii="Cascadia Code" w:hAnsi="Cascadia Code"/>
+        </w:rPr>
+        <w:t xml:space="preserve">        </w:t>
+      </w:r>
+      <w:r>
+        <w:rPr>
+          <w:rFonts w:ascii="Cascadia Code" w:hAnsi="Cascadia Code"/>
+        </w:rPr>
+        <w:t>sum_xi_sq = sum(x**2 for x in pi_values)</w:t>
+      </w:r>
+    </w:p>
+    <w:p>
+      <w:pPr>
+        <w:pStyle w:val="Code"/>
+        <w:rPr>
+          <w:rFonts w:ascii="Cascadia Code" w:hAnsi="Cascadia Code"/>
+        </w:rPr>
+      </w:pPr>
+      <w:r>
+        <w:rPr>
+          <w:rFonts w:ascii="Cascadia Code" w:hAnsi="Cascadia Code"/>
+        </w:rPr>
+      </w:r>
+    </w:p>
+    <w:p>
+      <w:pPr>
+        <w:pStyle w:val="Code"/>
+        <w:rPr>
+          <w:rFonts w:ascii="Cascadia Code" w:hAnsi="Cascadia Code"/>
+        </w:rPr>
+      </w:pPr>
+      <w:r>
+        <w:rPr>
+          <w:rFonts w:ascii="Cascadia Code" w:hAnsi="Cascadia Code"/>
+        </w:rPr>
+        <w:t xml:space="preserve">        </w:t>
+      </w:r>
+      <w:r>
+        <w:rPr>
+          <w:rFonts w:ascii="Cascadia Code" w:hAnsi="Cascadia Code"/>
+        </w:rPr>
+        <w:t>pi_final = sum_xi / n</w:t>
+      </w:r>
+    </w:p>
+    <w:p>
+      <w:pPr>
+        <w:pStyle w:val="Code"/>
+        <w:rPr>
+          <w:rFonts w:ascii="Cascadia Code" w:hAnsi="Cascadia Code"/>
+        </w:rPr>
+      </w:pPr>
+      <w:r>
+        <w:rPr>
+          <w:rFonts w:ascii="Cascadia Code" w:hAnsi="Cascadia Code"/>
+        </w:rPr>
+      </w:r>
+    </w:p>
+    <w:p>
+      <w:pPr>
+        <w:pStyle w:val="Code"/>
+        <w:rPr>
+          <w:rFonts w:ascii="Cascadia Code" w:hAnsi="Cascadia Code"/>
+        </w:rPr>
+      </w:pPr>
+      <w:r>
+        <w:rPr>
+          <w:rFonts w:ascii="Cascadia Code" w:hAnsi="Cascadia Code"/>
+        </w:rPr>
+        <w:t xml:space="preserve">        </w:t>
+      </w:r>
+      <w:r>
+        <w:rPr>
+          <w:rFonts w:ascii="Cascadia Code" w:hAnsi="Cascadia Code"/>
+        </w:rPr>
+        <w:t>variance = (1.0 / (n + 1)) * (sum_xi_sq - (1.0 / n) * (sum_xi**2))</w:t>
+      </w:r>
+    </w:p>
+    <w:p>
+      <w:pPr>
+        <w:pStyle w:val="Code"/>
+        <w:rPr>
+          <w:rFonts w:ascii="Cascadia Code" w:hAnsi="Cascadia Code"/>
+        </w:rPr>
+      </w:pPr>
+      <w:r>
+        <w:rPr>
+          <w:rFonts w:ascii="Cascadia Code" w:hAnsi="Cascadia Code"/>
+        </w:rPr>
+      </w:r>
+    </w:p>
+    <w:p>
+      <w:pPr>
+        <w:pStyle w:val="Code"/>
+        <w:rPr>
+          <w:rFonts w:ascii="Cascadia Code" w:hAnsi="Cascadia Code"/>
+        </w:rPr>
+      </w:pPr>
+      <w:r>
+        <w:rPr>
+          <w:rFonts w:ascii="Cascadia Code" w:hAnsi="Cascadia Code"/>
+        </w:rPr>
+        <w:t xml:space="preserve">        </w:t>
+      </w:r>
+      <w:r>
+        <w:rPr>
+          <w:rFonts w:ascii="Cascadia Code" w:hAnsi="Cascadia Code"/>
+        </w:rPr>
+        <w:t>execution_time = end_time - start_time</w:t>
+      </w:r>
+    </w:p>
+    <w:p>
+      <w:pPr>
+        <w:pStyle w:val="Code"/>
+        <w:rPr>
+          <w:rFonts w:ascii="Cascadia Code" w:hAnsi="Cascadia Code"/>
+        </w:rPr>
+      </w:pPr>
+      <w:r>
+        <w:rPr>
+          <w:rFonts w:ascii="Cascadia Code" w:hAnsi="Cascadia Code"/>
+        </w:rPr>
+      </w:r>
+    </w:p>
+    <w:p>
+      <w:pPr>
+        <w:pStyle w:val="Code"/>
+        <w:rPr>
+          <w:rFonts w:ascii="Cascadia Code" w:hAnsi="Cascadia Code"/>
+        </w:rPr>
+      </w:pPr>
+      <w:r>
+        <w:rPr>
+          <w:rFonts w:ascii="Cascadia Code" w:hAnsi="Cascadia Code"/>
+        </w:rPr>
+        <w:t xml:space="preserve">        </w:t>
+      </w:r>
+      <w:r>
+        <w:rPr>
+          <w:rFonts w:ascii="Cascadia Code" w:hAnsi="Cascadia Code"/>
+        </w:rPr>
+        <w:t>print("--- Results ---")</w:t>
+      </w:r>
+    </w:p>
+    <w:p>
+      <w:pPr>
+        <w:pStyle w:val="Code"/>
+        <w:rPr>
+          <w:rFonts w:ascii="Cascadia Code" w:hAnsi="Cascadia Code"/>
+        </w:rPr>
+      </w:pPr>
+      <w:r>
+        <w:rPr>
+          <w:rFonts w:ascii="Cascadia Code" w:hAnsi="Cascadia Code"/>
+        </w:rPr>
+        <w:t xml:space="preserve">        </w:t>
+      </w:r>
+      <w:r>
+        <w:rPr>
+          <w:rFonts w:ascii="Cascadia Code" w:hAnsi="Cascadia Code"/>
+        </w:rPr>
+        <w:t>print(f"Amount of iterations (N): {n}")</w:t>
+      </w:r>
+    </w:p>
+    <w:p>
+      <w:pPr>
+        <w:pStyle w:val="Code"/>
+        <w:rPr>
+          <w:rFonts w:ascii="Cascadia Code" w:hAnsi="Cascadia Code"/>
+        </w:rPr>
+      </w:pPr>
+      <w:r>
+        <w:rPr>
+          <w:rFonts w:ascii="Cascadia Code" w:hAnsi="Cascadia Code"/>
+        </w:rPr>
+        <w:t xml:space="preserve">        </w:t>
+      </w:r>
+      <w:r>
+        <w:rPr>
+          <w:rFonts w:ascii="Cascadia Code" w:hAnsi="Cascadia Code"/>
+        </w:rPr>
+        <w:t>print(f"Dots per iteration:       {n_in_proc * numprocs}")</w:t>
+      </w:r>
+    </w:p>
+    <w:p>
+      <w:pPr>
+        <w:pStyle w:val="Code"/>
+        <w:rPr>
+          <w:rFonts w:ascii="Cascadia Code" w:hAnsi="Cascadia Code"/>
+        </w:rPr>
+      </w:pPr>
+      <w:r>
+        <w:rPr>
+          <w:rFonts w:ascii="Cascadia Code" w:hAnsi="Cascadia Code"/>
+        </w:rPr>
+        <w:t xml:space="preserve">        </w:t>
+      </w:r>
+      <w:r>
+        <w:rPr>
+          <w:rFonts w:ascii="Cascadia Code" w:hAnsi="Cascadia Code"/>
+        </w:rPr>
+        <w:t>print(f"Final PI (mean):          {pi_final:.16f}")</w:t>
+      </w:r>
+    </w:p>
+    <w:p>
+      <w:pPr>
+        <w:pStyle w:val="Code"/>
+        <w:rPr>
+          <w:rFonts w:ascii="Cascadia Code" w:hAnsi="Cascadia Code"/>
+        </w:rPr>
+      </w:pPr>
+      <w:r>
+        <w:rPr>
+          <w:rFonts w:ascii="Cascadia Code" w:hAnsi="Cascadia Code"/>
+        </w:rPr>
+        <w:t xml:space="preserve">        </w:t>
+      </w:r>
+      <w:r>
+        <w:rPr>
+          <w:rFonts w:ascii="Cascadia Code" w:hAnsi="Cascadia Code"/>
+        </w:rPr>
+        <w:t>print(f"Error:                    {abs(pi_reference - pi_final):.16f}")</w:t>
+      </w:r>
+    </w:p>
+    <w:p>
+      <w:pPr>
+        <w:pStyle w:val="Code"/>
+        <w:rPr>
+          <w:rFonts w:ascii="Cascadia Code" w:hAnsi="Cascadia Code"/>
+        </w:rPr>
+      </w:pPr>
+      <w:r>
+        <w:rPr>
+          <w:rFonts w:ascii="Cascadia Code" w:hAnsi="Cascadia Code"/>
+        </w:rPr>
+        <w:t xml:space="preserve">        </w:t>
+      </w:r>
+      <w:r>
+        <w:rPr>
+          <w:rFonts w:ascii="Cascadia Code" w:hAnsi="Cascadia Code"/>
+        </w:rPr>
+        <w:t>print(f"Variance (sigma^2):       {variance:.16e}")</w:t>
+      </w:r>
+    </w:p>
+    <w:p>
+      <w:pPr>
+        <w:pStyle w:val="Code"/>
+        <w:rPr>
+          <w:rFonts w:ascii="Cascadia Code" w:hAnsi="Cascadia Code"/>
+        </w:rPr>
+      </w:pPr>
+      <w:r>
+        <w:rPr>
+          <w:rFonts w:ascii="Cascadia Code" w:hAnsi="Cascadia Code"/>
+        </w:rPr>
+        <w:t xml:space="preserve">        </w:t>
+      </w:r>
+      <w:r>
+        <w:rPr>
+          <w:rFonts w:ascii="Cascadia Code" w:hAnsi="Cascadia Code"/>
+        </w:rPr>
+        <w:t>print(f"Execution time:           {execution_time:.6f} sec")</w:t>
+      </w:r>
+    </w:p>
+    <w:p>
+      <w:pPr>
+        <w:pStyle w:val="Code"/>
+        <w:rPr>
+          <w:rFonts w:ascii="Cascadia Code" w:hAnsi="Cascadia Code"/>
+        </w:rPr>
+      </w:pPr>
+      <w:r>
+        <w:rPr>
+          <w:rFonts w:ascii="Cascadia Code" w:hAnsi="Cascadia Code"/>
+        </w:rPr>
+      </w:r>
+    </w:p>
+    <w:p>
+      <w:pPr>
+        <w:pStyle w:val="Code"/>
+        <w:rPr>
+          <w:rFonts w:ascii="Cascadia Code" w:hAnsi="Cascadia Code"/>
+        </w:rPr>
+      </w:pPr>
+      <w:r>
+        <w:rPr>
+          <w:rFonts w:ascii="Cascadia Code" w:hAnsi="Cascadia Code"/>
+        </w:rPr>
+        <w:t>if __name__ == "__main__":</w:t>
+      </w:r>
+    </w:p>
+    <w:p>
+      <w:pPr>
+        <w:pStyle w:val="Code"/>
+        <w:rPr>
+          <w:rFonts w:ascii="Cascadia Code" w:hAnsi="Cascadia Code"/>
+        </w:rPr>
+      </w:pPr>
+      <w:r>
+        <w:rPr>
+          <w:rFonts w:ascii="Cascadia Code" w:hAnsi="Cascadia Code"/>
+        </w:rPr>
+        <w:t xml:space="preserve">    </w:t>
+      </w:r>
+      <w:r>
+        <w:rPr>
+          <w:rFonts w:ascii="Cascadia Code" w:hAnsi="Cascadia Code"/>
+        </w:rPr>
+        <w:t>main()</w:t>
+      </w:r>
+    </w:p>
+    <w:p>
+      <w:pPr>
+        <w:pStyle w:val="P1"/>
+        <w:rPr/>
+      </w:pPr>
+      <w:r>
+        <w:rPr/>
+      </w:r>
+    </w:p>
+    <w:p>
+      <w:pPr>
+        <w:pStyle w:val="H3"/>
+        <w:rPr/>
+      </w:pPr>
+      <w:r>
+        <w:rPr/>
+        <w:t>Результати</w:t>
+      </w:r>
+    </w:p>
+    <w:p>
+      <w:pPr>
+        <w:pStyle w:val="P1"/>
+        <w:rPr/>
+      </w:pPr>
+      <w:r>
+        <w:rPr/>
+      </w:r>
+    </w:p>
+    <w:p>
+      <w:pPr>
+        <w:pStyle w:val="Code"/>
+        <w:rPr>
+          <w:rFonts w:ascii="Cascadia Code" w:hAnsi="Cascadia Code"/>
+        </w:rPr>
+      </w:pPr>
+      <w:r>
+        <w:rPr>
+          <w:rFonts w:ascii="Cascadia Code" w:hAnsi="Cascadia Code"/>
+        </w:rPr>
+        <w:t>Iteration 1: pi = 3.1404240000</w:t>
+      </w:r>
+    </w:p>
+    <w:p>
+      <w:pPr>
+        <w:pStyle w:val="Code"/>
+        <w:rPr>
+          <w:rFonts w:ascii="Cascadia Code" w:hAnsi="Cascadia Code"/>
+        </w:rPr>
+      </w:pPr>
+      <w:r>
+        <w:rPr>
+          <w:rFonts w:ascii="Cascadia Code" w:hAnsi="Cascadia Code"/>
+        </w:rPr>
+        <w:t>Iteration 2: pi = 3.1390520000</w:t>
+      </w:r>
+    </w:p>
+    <w:p>
+      <w:pPr>
+        <w:pStyle w:val="Code"/>
+        <w:rPr>
+          <w:rFonts w:ascii="Cascadia Code" w:hAnsi="Cascadia Code"/>
+        </w:rPr>
+      </w:pPr>
+      <w:r>
+        <w:rPr>
+          <w:rFonts w:ascii="Cascadia Code" w:hAnsi="Cascadia Code"/>
+        </w:rPr>
+        <w:t>Iteration 3: pi = 3.1390280000</w:t>
+      </w:r>
+    </w:p>
+    <w:p>
+      <w:pPr>
+        <w:pStyle w:val="Code"/>
+        <w:rPr>
+          <w:rFonts w:ascii="Cascadia Code" w:hAnsi="Cascadia Code"/>
+        </w:rPr>
+      </w:pPr>
+      <w:r>
+        <w:rPr>
+          <w:rFonts w:ascii="Cascadia Code" w:hAnsi="Cascadia Code"/>
+        </w:rPr>
+        <w:t>Iteration 4: pi = 3.1419760000</w:t>
+      </w:r>
+    </w:p>
+    <w:p>
+      <w:pPr>
+        <w:pStyle w:val="Code"/>
+        <w:rPr>
+          <w:rFonts w:ascii="Cascadia Code" w:hAnsi="Cascadia Code"/>
+        </w:rPr>
+      </w:pPr>
+      <w:r>
+        <w:rPr>
+          <w:rFonts w:ascii="Cascadia Code" w:hAnsi="Cascadia Code"/>
+        </w:rPr>
+        <w:t>Iteration 5: pi = 3.1400280000</w:t>
+      </w:r>
+    </w:p>
+    <w:p>
+      <w:pPr>
+        <w:pStyle w:val="Code"/>
+        <w:rPr>
+          <w:rFonts w:ascii="Cascadia Code" w:hAnsi="Cascadia Code"/>
+        </w:rPr>
+      </w:pPr>
+      <w:r>
+        <w:rPr>
+          <w:rFonts w:ascii="Cascadia Code" w:hAnsi="Cascadia Code"/>
+        </w:rPr>
+        <w:t>Iteration 6: pi = 3.1403280000</w:t>
+      </w:r>
+    </w:p>
+    <w:p>
+      <w:pPr>
+        <w:pStyle w:val="Code"/>
+        <w:rPr>
+          <w:rFonts w:ascii="Cascadia Code" w:hAnsi="Cascadia Code"/>
+        </w:rPr>
+      </w:pPr>
+      <w:r>
+        <w:rPr>
+          <w:rFonts w:ascii="Cascadia Code" w:hAnsi="Cascadia Code"/>
+        </w:rPr>
+        <w:t>Iteration 7: pi = 3.1401840000</w:t>
+      </w:r>
+    </w:p>
+    <w:p>
+      <w:pPr>
+        <w:pStyle w:val="Code"/>
+        <w:rPr>
+          <w:rFonts w:ascii="Cascadia Code" w:hAnsi="Cascadia Code"/>
+        </w:rPr>
+      </w:pPr>
+      <w:r>
+        <w:rPr>
+          <w:rFonts w:ascii="Cascadia Code" w:hAnsi="Cascadia Code"/>
+        </w:rPr>
+        <w:t>Iteration 8: pi = 3.1450040000</w:t>
+      </w:r>
+    </w:p>
+    <w:p>
+      <w:pPr>
+        <w:pStyle w:val="Code"/>
+        <w:rPr>
+          <w:rFonts w:ascii="Cascadia Code" w:hAnsi="Cascadia Code"/>
+        </w:rPr>
+      </w:pPr>
+      <w:r>
+        <w:rPr>
+          <w:rFonts w:ascii="Cascadia Code" w:hAnsi="Cascadia Code"/>
+        </w:rPr>
+        <w:t>Iteration 9: pi = 3.1402640000</w:t>
+      </w:r>
+    </w:p>
+    <w:p>
+      <w:pPr>
+        <w:pStyle w:val="Code"/>
+        <w:rPr>
+          <w:rFonts w:ascii="Cascadia Code" w:hAnsi="Cascadia Code"/>
+        </w:rPr>
+      </w:pPr>
+      <w:r>
+        <w:rPr>
+          <w:rFonts w:ascii="Cascadia Code" w:hAnsi="Cascadia Code"/>
+        </w:rPr>
+        <w:t>Iteration 10: pi = 3.1404440000</w:t>
+      </w:r>
+    </w:p>
+    <w:p>
+      <w:pPr>
+        <w:pStyle w:val="Code"/>
+        <w:rPr>
+          <w:rFonts w:ascii="Cascadia Code" w:hAnsi="Cascadia Code"/>
+        </w:rPr>
+      </w:pPr>
+      <w:r>
+        <w:rPr>
+          <w:rFonts w:ascii="Cascadia Code" w:hAnsi="Cascadia Code"/>
+        </w:rPr>
+        <w:t>--- Results ---</w:t>
+      </w:r>
+    </w:p>
+    <w:p>
+      <w:pPr>
+        <w:pStyle w:val="Code"/>
+        <w:rPr>
+          <w:rFonts w:ascii="Cascadia Code" w:hAnsi="Cascadia Code"/>
+        </w:rPr>
+      </w:pPr>
+      <w:r>
+        <w:rPr>
+          <w:rFonts w:ascii="Cascadia Code" w:hAnsi="Cascadia Code"/>
+        </w:rPr>
+        <w:t>Amount of iterations (N): 10</w:t>
+      </w:r>
+    </w:p>
+    <w:p>
+      <w:pPr>
+        <w:pStyle w:val="Code"/>
+        <w:rPr>
+          <w:rFonts w:ascii="Cascadia Code" w:hAnsi="Cascadia Code"/>
+        </w:rPr>
+      </w:pPr>
+      <w:r>
+        <w:rPr>
+          <w:rFonts w:ascii="Cascadia Code" w:hAnsi="Cascadia Code"/>
+        </w:rPr>
+        <w:t>Dots per iteration:       1000000</w:t>
+      </w:r>
+    </w:p>
+    <w:p>
+      <w:pPr>
+        <w:pStyle w:val="Code"/>
+        <w:rPr>
+          <w:rFonts w:ascii="Cascadia Code" w:hAnsi="Cascadia Code"/>
+        </w:rPr>
+      </w:pPr>
+      <w:r>
+        <w:rPr>
+          <w:rFonts w:ascii="Cascadia Code" w:hAnsi="Cascadia Code"/>
+        </w:rPr>
+        <w:t>Final PI (mean):          3.1406732000000002</w:t>
+      </w:r>
+    </w:p>
+    <w:p>
+      <w:pPr>
+        <w:pStyle w:val="Code"/>
+        <w:rPr>
+          <w:rFonts w:ascii="Cascadia Code" w:hAnsi="Cascadia Code"/>
+        </w:rPr>
+      </w:pPr>
+      <w:r>
+        <w:rPr>
+          <w:rFonts w:ascii="Cascadia Code" w:hAnsi="Cascadia Code"/>
+        </w:rPr>
+        <w:t>Error:                    0.0009194535897930</w:t>
+      </w:r>
+    </w:p>
+    <w:p>
+      <w:pPr>
+        <w:pStyle w:val="Code"/>
+        <w:rPr>
+          <w:rFonts w:ascii="Cascadia Code" w:hAnsi="Cascadia Code"/>
+        </w:rPr>
+      </w:pPr>
+      <w:r>
+        <w:rPr>
+          <w:rFonts w:ascii="Cascadia Code" w:hAnsi="Cascadia Code"/>
+        </w:rPr>
+        <w:t>Variance (sigma^2):       2.4404481448217750e-06</w:t>
+      </w:r>
+    </w:p>
+    <w:p>
+      <w:pPr>
+        <w:pStyle w:val="Code"/>
+        <w:rPr>
+          <w:rFonts w:ascii="Cascadia Code" w:hAnsi="Cascadia Code"/>
+        </w:rPr>
+      </w:pPr>
+      <w:r>
+        <w:rPr>
+          <w:rFonts w:ascii="Cascadia Code" w:hAnsi="Cascadia Code"/>
+        </w:rPr>
+        <w:t>Execution time:           3.435761 sec</w:t>
+      </w:r>
+    </w:p>
+    <w:p>
+      <w:pPr>
+        <w:pStyle w:val="P1"/>
+        <w:rPr>
+          <w:rFonts w:ascii="Cascadia Code" w:hAnsi="Cascadia Code"/>
+        </w:rPr>
+      </w:pPr>
+      <w:r>
+        <w:rPr>
+          <w:rFonts w:ascii="Cascadia Code" w:hAnsi="Cascadia Code"/>
+        </w:rPr>
+      </w:r>
+    </w:p>
+    <w:p>
+      <w:pPr>
+        <w:pStyle w:val="H2"/>
+        <w:rPr/>
+      </w:pPr>
+      <w:r>
+        <w:rPr/>
+        <w:t>5.2.2.2</w:t>
+      </w:r>
+    </w:p>
+    <w:p>
+      <w:pPr>
+        <w:pStyle w:val="H3"/>
+        <w:rPr/>
+      </w:pPr>
+      <w:r>
+        <w:rPr/>
+        <w:t>Завдання</w:t>
+      </w:r>
+    </w:p>
+    <w:p>
+      <w:pPr>
+        <w:pStyle w:val="P1"/>
+        <w:rPr>
+          <w:lang w:val="uk-UA"/>
+        </w:rPr>
+      </w:pPr>
+      <w:r>
+        <w:rPr>
+          <w:lang w:val="uk-UA"/>
+        </w:rPr>
+      </w:r>
+    </w:p>
+    <w:p>
+      <w:pPr>
+        <w:pStyle w:val="Normal"/>
+        <w:rPr/>
+      </w:pPr>
+      <w:r>
+        <w:rPr/>
+        <w:t>Використовуючи формули (5.9) визначити N таке, щоб похибка ε обчислення числа π наближено дорівнювала 10</w:t>
+      </w:r>
+      <w:r>
+        <w:rPr>
+          <w:vertAlign w:val="superscript"/>
+        </w:rPr>
+        <w:t>-4</w:t>
+      </w:r>
+      <w:r>
+        <w:rPr/>
+        <w:t>.</w:t>
+      </w:r>
+    </w:p>
+    <w:p>
+      <w:pPr>
+        <w:pStyle w:val="img1"/>
+        <w:rPr/>
+      </w:pPr>
+      <w:r>
+        <w:rPr/>
+        <w:drawing>
+          <wp:inline distT="0" distB="0" distL="0" distR="0">
+            <wp:extent cx="2105025" cy="409575"/>
+            <wp:effectExtent l="0" t="0" r="0" b="0"/>
+            <wp:docPr id="10" name="Зображення5 копія 1"/>
+            <wp:cNvGraphicFramePr>
+              <a:graphicFrameLocks xmlns:a="http://schemas.openxmlformats.org/drawingml/2006/main" noChangeAspect="1"/>
+            </wp:cNvGraphicFramePr>
+            <a:graphic xmlns:a="http://schemas.openxmlformats.org/drawingml/2006/main">
+              <a:graphicData uri="http://schemas.openxmlformats.org/drawingml/2006/picture">
+                <pic:pic xmlns:pic="http://schemas.openxmlformats.org/drawingml/2006/picture">
+                  <pic:nvPicPr>
+                    <pic:cNvPr id="10" name="Зображення5 копія 1"/>
+                    <pic:cNvPicPr>
+                      <a:picLocks noChangeAspect="1" noChangeArrowheads="1"/>
+                    </pic:cNvPicPr>
+                  </pic:nvPicPr>
+                  <pic:blipFill>
+                    <a:blip r:embed="rId11"/>
+                    <a:stretch>
+                      <a:fillRect/>
+                    </a:stretch>
+                  </pic:blipFill>
+                  <pic:spPr bwMode="auto">
+                    <a:xfrm>
+                      <a:off x="0" y="0"/>
+                      <a:ext cx="2105025" cy="409575"/>
+                    </a:xfrm>
+                    <a:prstGeom prst="rect">
+                      <a:avLst/>
+                    </a:prstGeom>
+                    <a:noFill/>
+                  </pic:spPr>
+                </pic:pic>
+              </a:graphicData>
+            </a:graphic>
+          </wp:inline>
+        </w:drawing>
+      </w:r>
+    </w:p>
+    <w:p>
+      <w:pPr>
+        <w:pStyle w:val="p11"/>
+        <w:rPr/>
+      </w:pPr>
+      <w:r>
+        <w:rPr/>
+      </w:r>
+    </w:p>
+    <w:p>
+      <w:pPr>
+        <w:pStyle w:val="H3"/>
+        <w:rPr/>
+      </w:pPr>
+      <w:r>
+        <w:rPr/>
+        <w:t>Код</w:t>
+      </w:r>
+    </w:p>
+    <w:p>
+      <w:pPr>
+        <w:pStyle w:val="P1"/>
+        <w:rPr/>
+      </w:pPr>
+      <w:r>
+        <w:rPr/>
+      </w:r>
+    </w:p>
+    <w:p>
+      <w:pPr>
+        <w:pStyle w:val="Code"/>
+        <w:rPr>
+          <w:rFonts w:ascii="Cascadia Code" w:hAnsi="Cascadia Code"/>
+        </w:rPr>
+      </w:pPr>
+      <w:r>
+        <w:rPr>
+          <w:rFonts w:ascii="Cascadia Code" w:hAnsi="Cascadia Code"/>
+        </w:rPr>
+        <w:t>import math</w:t>
+      </w:r>
+    </w:p>
+    <w:p>
+      <w:pPr>
+        <w:pStyle w:val="Code"/>
+        <w:rPr>
+          <w:rFonts w:ascii="Cascadia Code" w:hAnsi="Cascadia Code"/>
+        </w:rPr>
+      </w:pPr>
+      <w:r>
+        <w:rPr>
+          <w:rFonts w:ascii="Cascadia Code" w:hAnsi="Cascadia Code"/>
+        </w:rPr>
+        <w:t>import random</w:t>
+      </w:r>
+    </w:p>
+    <w:p>
+      <w:pPr>
+        <w:pStyle w:val="Code"/>
+        <w:rPr>
+          <w:rFonts w:ascii="Cascadia Code" w:hAnsi="Cascadia Code"/>
+        </w:rPr>
+      </w:pPr>
+      <w:r>
+        <w:rPr>
+          <w:rFonts w:ascii="Cascadia Code" w:hAnsi="Cascadia Code"/>
+        </w:rPr>
+        <w:t>import time</w:t>
+      </w:r>
+    </w:p>
+    <w:p>
+      <w:pPr>
+        <w:pStyle w:val="Code"/>
+        <w:rPr>
+          <w:rFonts w:ascii="Cascadia Code" w:hAnsi="Cascadia Code"/>
+        </w:rPr>
+      </w:pPr>
+      <w:r>
+        <w:rPr>
+          <w:rFonts w:ascii="Cascadia Code" w:hAnsi="Cascadia Code"/>
+        </w:rPr>
+        <w:t>from mpi4py import MPI</w:t>
+      </w:r>
+    </w:p>
+    <w:p>
+      <w:pPr>
+        <w:pStyle w:val="Code"/>
+        <w:rPr>
+          <w:rFonts w:ascii="Cascadia Code" w:hAnsi="Cascadia Code"/>
+        </w:rPr>
+      </w:pPr>
+      <w:r>
+        <w:rPr>
+          <w:rFonts w:ascii="Cascadia Code" w:hAnsi="Cascadia Code"/>
+        </w:rPr>
+      </w:r>
+    </w:p>
+    <w:p>
+      <w:pPr>
+        <w:pStyle w:val="Code"/>
+        <w:rPr>
+          <w:rFonts w:ascii="Cascadia Code" w:hAnsi="Cascadia Code"/>
+        </w:rPr>
+      </w:pPr>
+      <w:r>
+        <w:rPr>
+          <w:rFonts w:ascii="Cascadia Code" w:hAnsi="Cascadia Code"/>
+        </w:rPr>
+      </w:r>
+    </w:p>
+    <w:p>
+      <w:pPr>
+        <w:pStyle w:val="Code"/>
+        <w:rPr>
+          <w:rFonts w:ascii="Cascadia Code" w:hAnsi="Cascadia Code"/>
+        </w:rPr>
+      </w:pPr>
+      <w:r>
+        <w:rPr>
+          <w:rFonts w:ascii="Cascadia Code" w:hAnsi="Cascadia Code"/>
+        </w:rPr>
+        <w:t>def main():</w:t>
+      </w:r>
+    </w:p>
+    <w:p>
+      <w:pPr>
+        <w:pStyle w:val="Code"/>
+        <w:rPr>
+          <w:rFonts w:ascii="Cascadia Code" w:hAnsi="Cascadia Code"/>
+        </w:rPr>
+      </w:pPr>
+      <w:r>
+        <w:rPr>
+          <w:rFonts w:ascii="Cascadia Code" w:hAnsi="Cascadia Code"/>
+        </w:rPr>
+        <w:t xml:space="preserve">    </w:t>
+      </w:r>
+      <w:r>
+        <w:rPr>
+          <w:rFonts w:ascii="Cascadia Code" w:hAnsi="Cascadia Code"/>
+        </w:rPr>
+        <w:t>comm = MPI.COMM_WORLD</w:t>
+      </w:r>
+    </w:p>
+    <w:p>
+      <w:pPr>
+        <w:pStyle w:val="Code"/>
+        <w:rPr>
+          <w:rFonts w:ascii="Cascadia Code" w:hAnsi="Cascadia Code"/>
+        </w:rPr>
+      </w:pPr>
+      <w:r>
+        <w:rPr>
+          <w:rFonts w:ascii="Cascadia Code" w:hAnsi="Cascadia Code"/>
+        </w:rPr>
+        <w:t xml:space="preserve">    </w:t>
+      </w:r>
+      <w:r>
+        <w:rPr>
+          <w:rFonts w:ascii="Cascadia Code" w:hAnsi="Cascadia Code"/>
+        </w:rPr>
+        <w:t>rank = comm.Get_rank()</w:t>
+      </w:r>
+    </w:p>
+    <w:p>
+      <w:pPr>
+        <w:pStyle w:val="Code"/>
+        <w:rPr>
+          <w:rFonts w:ascii="Cascadia Code" w:hAnsi="Cascadia Code"/>
+        </w:rPr>
+      </w:pPr>
+      <w:r>
+        <w:rPr>
+          <w:rFonts w:ascii="Cascadia Code" w:hAnsi="Cascadia Code"/>
+        </w:rPr>
+        <w:t xml:space="preserve">    </w:t>
+      </w:r>
+      <w:r>
+        <w:rPr>
+          <w:rFonts w:ascii="Cascadia Code" w:hAnsi="Cascadia Code"/>
+        </w:rPr>
+        <w:t>size = comm.Get_size()</w:t>
+      </w:r>
+    </w:p>
+    <w:p>
+      <w:pPr>
+        <w:pStyle w:val="Code"/>
+        <w:rPr>
+          <w:rFonts w:ascii="Cascadia Code" w:hAnsi="Cascadia Code"/>
+        </w:rPr>
+      </w:pPr>
+      <w:r>
+        <w:rPr>
+          <w:rFonts w:ascii="Cascadia Code" w:hAnsi="Cascadia Code"/>
+        </w:rPr>
+      </w:r>
+    </w:p>
+    <w:p>
+      <w:pPr>
+        <w:pStyle w:val="Code"/>
+        <w:rPr>
+          <w:rFonts w:ascii="Cascadia Code" w:hAnsi="Cascadia Code"/>
+        </w:rPr>
+      </w:pPr>
+      <w:r>
+        <w:rPr>
+          <w:rFonts w:ascii="Cascadia Code" w:hAnsi="Cascadia Code"/>
+        </w:rPr>
+        <w:t xml:space="preserve">    </w:t>
+      </w:r>
+      <w:r>
+        <w:rPr>
+          <w:rFonts w:ascii="Cascadia Code" w:hAnsi="Cascadia Code"/>
+        </w:rPr>
+        <w:t>epsilon = 1e-4</w:t>
+      </w:r>
+    </w:p>
+    <w:p>
+      <w:pPr>
+        <w:pStyle w:val="Code"/>
+        <w:rPr>
+          <w:rFonts w:ascii="Cascadia Code" w:hAnsi="Cascadia Code"/>
+        </w:rPr>
+      </w:pPr>
+      <w:r>
+        <w:rPr>
+          <w:rFonts w:ascii="Cascadia Code" w:hAnsi="Cascadia Code"/>
+        </w:rPr>
+        <w:t xml:space="preserve">    </w:t>
+      </w:r>
+      <w:r>
+        <w:rPr>
+          <w:rFonts w:ascii="Cascadia Code" w:hAnsi="Cascadia Code"/>
+        </w:rPr>
+        <w:t># N = pi*(4-pi) / epsilon^2</w:t>
+      </w:r>
+    </w:p>
+    <w:p>
+      <w:pPr>
+        <w:pStyle w:val="Code"/>
+        <w:rPr>
+          <w:rFonts w:ascii="Cascadia Code" w:hAnsi="Cascadia Code"/>
+        </w:rPr>
+      </w:pPr>
+      <w:r>
+        <w:rPr>
+          <w:rFonts w:ascii="Cascadia Code" w:hAnsi="Cascadia Code"/>
+        </w:rPr>
+        <w:t xml:space="preserve">    </w:t>
+      </w:r>
+      <w:r>
+        <w:rPr>
+          <w:rFonts w:ascii="Cascadia Code" w:hAnsi="Cascadia Code"/>
+        </w:rPr>
+        <w:t>total_n = int(2.697 * (epsilon**-2))</w:t>
+      </w:r>
+    </w:p>
+    <w:p>
+      <w:pPr>
+        <w:pStyle w:val="Code"/>
+        <w:rPr>
+          <w:rFonts w:ascii="Cascadia Code" w:hAnsi="Cascadia Code"/>
+        </w:rPr>
+      </w:pPr>
+      <w:r>
+        <w:rPr>
+          <w:rFonts w:ascii="Cascadia Code" w:hAnsi="Cascadia Code"/>
+        </w:rPr>
+      </w:r>
+    </w:p>
+    <w:p>
+      <w:pPr>
+        <w:pStyle w:val="Code"/>
+        <w:rPr>
+          <w:rFonts w:ascii="Cascadia Code" w:hAnsi="Cascadia Code"/>
+        </w:rPr>
+      </w:pPr>
+      <w:r>
+        <w:rPr>
+          <w:rFonts w:ascii="Cascadia Code" w:hAnsi="Cascadia Code"/>
+        </w:rPr>
+        <w:t xml:space="preserve">    </w:t>
+      </w:r>
+      <w:r>
+        <w:rPr>
+          <w:rFonts w:ascii="Cascadia Code" w:hAnsi="Cascadia Code"/>
+        </w:rPr>
+        <w:t>local_n = total_n // size</w:t>
+      </w:r>
+    </w:p>
+    <w:p>
+      <w:pPr>
+        <w:pStyle w:val="Code"/>
+        <w:rPr>
+          <w:rFonts w:ascii="Cascadia Code" w:hAnsi="Cascadia Code"/>
+        </w:rPr>
+      </w:pPr>
+      <w:r>
+        <w:rPr>
+          <w:rFonts w:ascii="Cascadia Code" w:hAnsi="Cascadia Code"/>
+        </w:rPr>
+        <w:t xml:space="preserve">    </w:t>
+      </w:r>
+      <w:r>
+        <w:rPr>
+          <w:rFonts w:ascii="Cascadia Code" w:hAnsi="Cascadia Code"/>
+        </w:rPr>
+        <w:t>if rank == size - 1:</w:t>
+      </w:r>
+    </w:p>
+    <w:p>
+      <w:pPr>
+        <w:pStyle w:val="Code"/>
+        <w:rPr>
+          <w:rFonts w:ascii="Cascadia Code" w:hAnsi="Cascadia Code"/>
+        </w:rPr>
+      </w:pPr>
+      <w:r>
+        <w:rPr>
+          <w:rFonts w:ascii="Cascadia Code" w:hAnsi="Cascadia Code"/>
+        </w:rPr>
+        <w:t xml:space="preserve">        </w:t>
+      </w:r>
+      <w:r>
+        <w:rPr>
+          <w:rFonts w:ascii="Cascadia Code" w:hAnsi="Cascadia Code"/>
+        </w:rPr>
+        <w:t>local_n += total_n % size</w:t>
+      </w:r>
+    </w:p>
+    <w:p>
+      <w:pPr>
+        <w:pStyle w:val="Code"/>
+        <w:rPr>
+          <w:rFonts w:ascii="Cascadia Code" w:hAnsi="Cascadia Code"/>
+        </w:rPr>
+      </w:pPr>
+      <w:r>
+        <w:rPr>
+          <w:rFonts w:ascii="Cascadia Code" w:hAnsi="Cascadia Code"/>
+        </w:rPr>
+      </w:r>
+    </w:p>
+    <w:p>
+      <w:pPr>
+        <w:pStyle w:val="Code"/>
+        <w:rPr>
+          <w:rFonts w:ascii="Cascadia Code" w:hAnsi="Cascadia Code"/>
+        </w:rPr>
+      </w:pPr>
+      <w:r>
+        <w:rPr>
+          <w:rFonts w:ascii="Cascadia Code" w:hAnsi="Cascadia Code"/>
+        </w:rPr>
+        <w:t xml:space="preserve">    </w:t>
+      </w:r>
+      <w:r>
+        <w:rPr>
+          <w:rFonts w:ascii="Cascadia Code" w:hAnsi="Cascadia Code"/>
+        </w:rPr>
+        <w:t>random.seed(time.time() + rank)</w:t>
+      </w:r>
+    </w:p>
+    <w:p>
+      <w:pPr>
+        <w:pStyle w:val="Code"/>
+        <w:rPr>
+          <w:rFonts w:ascii="Cascadia Code" w:hAnsi="Cascadia Code"/>
+        </w:rPr>
+      </w:pPr>
+      <w:r>
+        <w:rPr>
+          <w:rFonts w:ascii="Cascadia Code" w:hAnsi="Cascadia Code"/>
+        </w:rPr>
+        <w:t xml:space="preserve">    </w:t>
+      </w:r>
+      <w:r>
+        <w:rPr>
+          <w:rFonts w:ascii="Cascadia Code" w:hAnsi="Cascadia Code"/>
+        </w:rPr>
+        <w:t>count = 0</w:t>
+      </w:r>
+    </w:p>
+    <w:p>
+      <w:pPr>
+        <w:pStyle w:val="Code"/>
+        <w:rPr>
+          <w:rFonts w:ascii="Cascadia Code" w:hAnsi="Cascadia Code"/>
+        </w:rPr>
+      </w:pPr>
+      <w:r>
+        <w:rPr>
+          <w:rFonts w:ascii="Cascadia Code" w:hAnsi="Cascadia Code"/>
+        </w:rPr>
+      </w:r>
+    </w:p>
+    <w:p>
+      <w:pPr>
+        <w:pStyle w:val="Code"/>
+        <w:rPr>
+          <w:rFonts w:ascii="Cascadia Code" w:hAnsi="Cascadia Code"/>
+        </w:rPr>
+      </w:pPr>
+      <w:r>
+        <w:rPr>
+          <w:rFonts w:ascii="Cascadia Code" w:hAnsi="Cascadia Code"/>
+        </w:rPr>
+        <w:t xml:space="preserve">    </w:t>
+      </w:r>
+      <w:r>
+        <w:rPr>
+          <w:rFonts w:ascii="Cascadia Code" w:hAnsi="Cascadia Code"/>
+        </w:rPr>
+        <w:t>start_time = MPI.Wtime()</w:t>
+      </w:r>
+    </w:p>
+    <w:p>
+      <w:pPr>
+        <w:pStyle w:val="Code"/>
+        <w:rPr>
+          <w:rFonts w:ascii="Cascadia Code" w:hAnsi="Cascadia Code"/>
+        </w:rPr>
+      </w:pPr>
+      <w:r>
+        <w:rPr>
+          <w:rFonts w:ascii="Cascadia Code" w:hAnsi="Cascadia Code"/>
+        </w:rPr>
+      </w:r>
+    </w:p>
+    <w:p>
+      <w:pPr>
+        <w:pStyle w:val="Code"/>
+        <w:rPr>
+          <w:rFonts w:ascii="Cascadia Code" w:hAnsi="Cascadia Code"/>
+        </w:rPr>
+      </w:pPr>
+      <w:r>
+        <w:rPr>
+          <w:rFonts w:ascii="Cascadia Code" w:hAnsi="Cascadia Code"/>
+        </w:rPr>
+        <w:t xml:space="preserve">    </w:t>
+      </w:r>
+      <w:r>
+        <w:rPr>
+          <w:rFonts w:ascii="Cascadia Code" w:hAnsi="Cascadia Code"/>
+        </w:rPr>
+        <w:t>for _ in range(local_n):</w:t>
+      </w:r>
+    </w:p>
+    <w:p>
+      <w:pPr>
+        <w:pStyle w:val="Code"/>
+        <w:rPr>
+          <w:rFonts w:ascii="Cascadia Code" w:hAnsi="Cascadia Code"/>
+        </w:rPr>
+      </w:pPr>
+      <w:r>
+        <w:rPr>
+          <w:rFonts w:ascii="Cascadia Code" w:hAnsi="Cascadia Code"/>
+        </w:rPr>
+        <w:t xml:space="preserve">        </w:t>
+      </w:r>
+      <w:r>
+        <w:rPr>
+          <w:rFonts w:ascii="Cascadia Code" w:hAnsi="Cascadia Code"/>
+        </w:rPr>
+        <w:t>x = random.random()</w:t>
+      </w:r>
+    </w:p>
+    <w:p>
+      <w:pPr>
+        <w:pStyle w:val="Code"/>
+        <w:rPr>
+          <w:rFonts w:ascii="Cascadia Code" w:hAnsi="Cascadia Code"/>
+        </w:rPr>
+      </w:pPr>
+      <w:r>
+        <w:rPr>
+          <w:rFonts w:ascii="Cascadia Code" w:hAnsi="Cascadia Code"/>
+        </w:rPr>
+        <w:t xml:space="preserve">        </w:t>
+      </w:r>
+      <w:r>
+        <w:rPr>
+          <w:rFonts w:ascii="Cascadia Code" w:hAnsi="Cascadia Code"/>
+        </w:rPr>
+        <w:t>y = random.random()</w:t>
+      </w:r>
+    </w:p>
+    <w:p>
+      <w:pPr>
+        <w:pStyle w:val="Code"/>
+        <w:rPr>
+          <w:rFonts w:ascii="Cascadia Code" w:hAnsi="Cascadia Code"/>
+        </w:rPr>
+      </w:pPr>
+      <w:r>
+        <w:rPr>
+          <w:rFonts w:ascii="Cascadia Code" w:hAnsi="Cascadia Code"/>
+        </w:rPr>
+        <w:t xml:space="preserve">        </w:t>
+      </w:r>
+      <w:r>
+        <w:rPr>
+          <w:rFonts w:ascii="Cascadia Code" w:hAnsi="Cascadia Code"/>
+        </w:rPr>
+        <w:t>if x * x + y * y &lt;= 1.0:</w:t>
+      </w:r>
+    </w:p>
+    <w:p>
+      <w:pPr>
+        <w:pStyle w:val="Code"/>
+        <w:rPr>
+          <w:rFonts w:ascii="Cascadia Code" w:hAnsi="Cascadia Code"/>
+        </w:rPr>
+      </w:pPr>
+      <w:r>
+        <w:rPr>
+          <w:rFonts w:ascii="Cascadia Code" w:hAnsi="Cascadia Code"/>
+        </w:rPr>
+        <w:t xml:space="preserve">            </w:t>
+      </w:r>
+      <w:r>
+        <w:rPr>
+          <w:rFonts w:ascii="Cascadia Code" w:hAnsi="Cascadia Code"/>
+        </w:rPr>
+        <w:t>count += 1</w:t>
+      </w:r>
+    </w:p>
+    <w:p>
+      <w:pPr>
+        <w:pStyle w:val="Code"/>
+        <w:rPr>
+          <w:rFonts w:ascii="Cascadia Code" w:hAnsi="Cascadia Code"/>
+        </w:rPr>
+      </w:pPr>
+      <w:r>
+        <w:rPr>
+          <w:rFonts w:ascii="Cascadia Code" w:hAnsi="Cascadia Code"/>
+        </w:rPr>
+      </w:r>
+    </w:p>
+    <w:p>
+      <w:pPr>
+        <w:pStyle w:val="Code"/>
+        <w:rPr>
+          <w:rFonts w:ascii="Cascadia Code" w:hAnsi="Cascadia Code"/>
+        </w:rPr>
+      </w:pPr>
+      <w:r>
+        <w:rPr>
+          <w:rFonts w:ascii="Cascadia Code" w:hAnsi="Cascadia Code"/>
+        </w:rPr>
+        <w:t xml:space="preserve">    </w:t>
+      </w:r>
+      <w:r>
+        <w:rPr>
+          <w:rFonts w:ascii="Cascadia Code" w:hAnsi="Cascadia Code"/>
+        </w:rPr>
+        <w:t>total_count = comm.reduce(count, op=MPI.SUM, root=0)</w:t>
+      </w:r>
+    </w:p>
+    <w:p>
+      <w:pPr>
+        <w:pStyle w:val="Code"/>
+        <w:rPr>
+          <w:rFonts w:ascii="Cascadia Code" w:hAnsi="Cascadia Code"/>
+        </w:rPr>
+      </w:pPr>
+      <w:r>
+        <w:rPr>
+          <w:rFonts w:ascii="Cascadia Code" w:hAnsi="Cascadia Code"/>
+        </w:rPr>
+        <w:t xml:space="preserve">    </w:t>
+      </w:r>
+      <w:r>
+        <w:rPr>
+          <w:rFonts w:ascii="Cascadia Code" w:hAnsi="Cascadia Code"/>
+        </w:rPr>
+        <w:t>end_time = MPI.Wtime()</w:t>
+      </w:r>
+    </w:p>
+    <w:p>
+      <w:pPr>
+        <w:pStyle w:val="Code"/>
+        <w:rPr>
+          <w:rFonts w:ascii="Cascadia Code" w:hAnsi="Cascadia Code"/>
+        </w:rPr>
+      </w:pPr>
+      <w:r>
+        <w:rPr>
+          <w:rFonts w:ascii="Cascadia Code" w:hAnsi="Cascadia Code"/>
+        </w:rPr>
+      </w:r>
+    </w:p>
+    <w:p>
+      <w:pPr>
+        <w:pStyle w:val="Code"/>
+        <w:rPr>
+          <w:rFonts w:ascii="Cascadia Code" w:hAnsi="Cascadia Code"/>
+        </w:rPr>
+      </w:pPr>
+      <w:r>
+        <w:rPr>
+          <w:rFonts w:ascii="Cascadia Code" w:hAnsi="Cascadia Code"/>
+        </w:rPr>
+        <w:t xml:space="preserve">    </w:t>
+      </w:r>
+      <w:r>
+        <w:rPr>
+          <w:rFonts w:ascii="Cascadia Code" w:hAnsi="Cascadia Code"/>
+        </w:rPr>
+        <w:t>if rank == 0:</w:t>
+      </w:r>
+    </w:p>
+    <w:p>
+      <w:pPr>
+        <w:pStyle w:val="Code"/>
+        <w:rPr>
+          <w:rFonts w:ascii="Cascadia Code" w:hAnsi="Cascadia Code"/>
+        </w:rPr>
+      </w:pPr>
+      <w:r>
+        <w:rPr>
+          <w:rFonts w:ascii="Cascadia Code" w:hAnsi="Cascadia Code"/>
+        </w:rPr>
+        <w:t xml:space="preserve">        </w:t>
+      </w:r>
+      <w:r>
+        <w:rPr>
+          <w:rFonts w:ascii="Cascadia Code" w:hAnsi="Cascadia Code"/>
+        </w:rPr>
+        <w:t>pi_approx = 4.0 * total_count / total_n</w:t>
+      </w:r>
+    </w:p>
+    <w:p>
+      <w:pPr>
+        <w:pStyle w:val="Code"/>
+        <w:rPr>
+          <w:rFonts w:ascii="Cascadia Code" w:hAnsi="Cascadia Code"/>
+        </w:rPr>
+      </w:pPr>
+      <w:r>
+        <w:rPr>
+          <w:rFonts w:ascii="Cascadia Code" w:hAnsi="Cascadia Code"/>
+        </w:rPr>
+        <w:t xml:space="preserve">        </w:t>
+      </w:r>
+      <w:r>
+        <w:rPr>
+          <w:rFonts w:ascii="Cascadia Code" w:hAnsi="Cascadia Code"/>
+        </w:rPr>
+        <w:t>actual_error = abs(math.pi - pi_approx)</w:t>
+      </w:r>
+    </w:p>
+    <w:p>
+      <w:pPr>
+        <w:pStyle w:val="Code"/>
+        <w:rPr>
+          <w:rFonts w:ascii="Cascadia Code" w:hAnsi="Cascadia Code"/>
+        </w:rPr>
+      </w:pPr>
+      <w:r>
+        <w:rPr>
+          <w:rFonts w:ascii="Cascadia Code" w:hAnsi="Cascadia Code"/>
+        </w:rPr>
+      </w:r>
+    </w:p>
+    <w:p>
+      <w:pPr>
+        <w:pStyle w:val="Code"/>
+        <w:rPr>
+          <w:rFonts w:ascii="Cascadia Code" w:hAnsi="Cascadia Code"/>
+        </w:rPr>
+      </w:pPr>
+      <w:r>
+        <w:rPr>
+          <w:rFonts w:ascii="Cascadia Code" w:hAnsi="Cascadia Code"/>
+        </w:rPr>
+        <w:t xml:space="preserve">        </w:t>
+      </w:r>
+      <w:r>
+        <w:rPr>
+          <w:rFonts w:ascii="Cascadia Code" w:hAnsi="Cascadia Code"/>
+        </w:rPr>
+        <w:t>print(f"--- Results for epsilon = {epsilon} ---")</w:t>
+      </w:r>
+    </w:p>
+    <w:p>
+      <w:pPr>
+        <w:pStyle w:val="Code"/>
+        <w:rPr>
+          <w:rFonts w:ascii="Cascadia Code" w:hAnsi="Cascadia Code"/>
+        </w:rPr>
+      </w:pPr>
+      <w:r>
+        <w:rPr>
+          <w:rFonts w:ascii="Cascadia Code" w:hAnsi="Cascadia Code"/>
+        </w:rPr>
+        <w:t xml:space="preserve">        </w:t>
+      </w:r>
+      <w:r>
+        <w:rPr>
+          <w:rFonts w:ascii="Cascadia Code" w:hAnsi="Cascadia Code"/>
+        </w:rPr>
+        <w:t>print(f"Total number of dots (N): {total_n}")</w:t>
+      </w:r>
+    </w:p>
+    <w:p>
+      <w:pPr>
+        <w:pStyle w:val="Code"/>
+        <w:rPr>
+          <w:rFonts w:ascii="Cascadia Code" w:hAnsi="Cascadia Code"/>
+        </w:rPr>
+      </w:pPr>
+      <w:r>
+        <w:rPr>
+          <w:rFonts w:ascii="Cascadia Code" w:hAnsi="Cascadia Code"/>
+        </w:rPr>
+        <w:t xml:space="preserve">        </w:t>
+      </w:r>
+      <w:r>
+        <w:rPr>
+          <w:rFonts w:ascii="Cascadia Code" w:hAnsi="Cascadia Code"/>
+        </w:rPr>
+        <w:t>print(f"Calculated PI: {pi_approx:.10f}")</w:t>
+      </w:r>
+    </w:p>
+    <w:p>
+      <w:pPr>
+        <w:pStyle w:val="Code"/>
+        <w:rPr>
+          <w:rFonts w:ascii="Cascadia Code" w:hAnsi="Cascadia Code"/>
+        </w:rPr>
+      </w:pPr>
+      <w:r>
+        <w:rPr>
+          <w:rFonts w:ascii="Cascadia Code" w:hAnsi="Cascadia Code"/>
+        </w:rPr>
+        <w:t xml:space="preserve">        </w:t>
+      </w:r>
+      <w:r>
+        <w:rPr>
+          <w:rFonts w:ascii="Cascadia Code" w:hAnsi="Cascadia Code"/>
+        </w:rPr>
+        <w:t>print(f"Actual error: {actual_error:.10e}")</w:t>
+      </w:r>
+    </w:p>
+    <w:p>
+      <w:pPr>
+        <w:pStyle w:val="Code"/>
+        <w:rPr>
+          <w:rFonts w:ascii="Cascadia Code" w:hAnsi="Cascadia Code"/>
+        </w:rPr>
+      </w:pPr>
+      <w:r>
+        <w:rPr>
+          <w:rFonts w:ascii="Cascadia Code" w:hAnsi="Cascadia Code"/>
+        </w:rPr>
+        <w:t xml:space="preserve">        </w:t>
+      </w:r>
+      <w:r>
+        <w:rPr>
+          <w:rFonts w:ascii="Cascadia Code" w:hAnsi="Cascadia Code"/>
+        </w:rPr>
+        <w:t>print(f"Execution time for {size} processors: {end_time - start_time:.4f} sec")</w:t>
+      </w:r>
+    </w:p>
+    <w:p>
+      <w:pPr>
+        <w:pStyle w:val="Code"/>
+        <w:rPr>
+          <w:rFonts w:ascii="Cascadia Code" w:hAnsi="Cascadia Code"/>
+        </w:rPr>
+      </w:pPr>
+      <w:r>
+        <w:rPr>
+          <w:rFonts w:ascii="Cascadia Code" w:hAnsi="Cascadia Code"/>
+        </w:rPr>
+      </w:r>
+    </w:p>
+    <w:p>
+      <w:pPr>
+        <w:pStyle w:val="Code"/>
+        <w:rPr>
+          <w:rFonts w:ascii="Cascadia Code" w:hAnsi="Cascadia Code"/>
+        </w:rPr>
+      </w:pPr>
+      <w:r>
+        <w:rPr>
+          <w:rFonts w:ascii="Cascadia Code" w:hAnsi="Cascadia Code"/>
+        </w:rPr>
+      </w:r>
+    </w:p>
+    <w:p>
+      <w:pPr>
+        <w:pStyle w:val="Code"/>
+        <w:rPr>
+          <w:rFonts w:ascii="Cascadia Code" w:hAnsi="Cascadia Code"/>
+        </w:rPr>
+      </w:pPr>
+      <w:r>
+        <w:rPr>
+          <w:rFonts w:ascii="Cascadia Code" w:hAnsi="Cascadia Code"/>
+        </w:rPr>
+        <w:t>if __name__ == "__main__":</w:t>
+      </w:r>
+    </w:p>
+    <w:p>
+      <w:pPr>
+        <w:pStyle w:val="Code"/>
+        <w:rPr>
+          <w:rFonts w:ascii="Cascadia Code" w:hAnsi="Cascadia Code"/>
+        </w:rPr>
+      </w:pPr>
+      <w:r>
+        <w:rPr>
+          <w:rFonts w:ascii="Cascadia Code" w:hAnsi="Cascadia Code"/>
+        </w:rPr>
+        <w:t xml:space="preserve">    </w:t>
+      </w:r>
+      <w:r>
+        <w:rPr>
+          <w:rFonts w:ascii="Cascadia Code" w:hAnsi="Cascadia Code"/>
+        </w:rPr>
+        <w:t>main()</w:t>
+      </w:r>
+    </w:p>
+    <w:p>
+      <w:pPr>
+        <w:pStyle w:val="P1"/>
+        <w:rPr/>
+      </w:pPr>
+      <w:r>
+        <w:rPr/>
+      </w:r>
+    </w:p>
+    <w:p>
+      <w:pPr>
+        <w:pStyle w:val="H3"/>
+        <w:rPr/>
+      </w:pPr>
+      <w:r>
+        <w:rPr/>
+        <w:t>Результати</w:t>
+      </w:r>
+    </w:p>
+    <w:p>
+      <w:pPr>
+        <w:pStyle w:val="p11"/>
+        <w:rPr/>
+      </w:pPr>
+      <w:r>
+        <w:rPr/>
+      </w:r>
+    </w:p>
+    <w:p>
+      <w:pPr>
+        <w:pStyle w:val="Code"/>
+        <w:rPr>
+          <w:rFonts w:ascii="Cascadia Code" w:hAnsi="Cascadia Code"/>
+        </w:rPr>
+      </w:pPr>
+      <w:r>
+        <w:rPr>
+          <w:rFonts w:ascii="Cascadia Code" w:hAnsi="Cascadia Code"/>
+        </w:rPr>
+        <w:t>--- Results for epsilon = 0.0001 ---</w:t>
+      </w:r>
+    </w:p>
+    <w:p>
+      <w:pPr>
+        <w:pStyle w:val="Code"/>
+        <w:rPr>
+          <w:rFonts w:ascii="Cascadia Code" w:hAnsi="Cascadia Code"/>
+        </w:rPr>
+      </w:pPr>
+      <w:r>
+        <w:rPr>
+          <w:rFonts w:ascii="Cascadia Code" w:hAnsi="Cascadia Code"/>
+        </w:rPr>
+        <w:t>Total number of dots (N): 269699999</w:t>
+      </w:r>
+    </w:p>
+    <w:p>
+      <w:pPr>
+        <w:pStyle w:val="Code"/>
+        <w:rPr>
+          <w:rFonts w:ascii="Cascadia Code" w:hAnsi="Cascadia Code"/>
+        </w:rPr>
+      </w:pPr>
+      <w:r>
+        <w:rPr>
+          <w:rFonts w:ascii="Cascadia Code" w:hAnsi="Cascadia Code"/>
+        </w:rPr>
+        <w:t>Calculated PI: 3.1414958811</w:t>
+      </w:r>
+    </w:p>
+    <w:p>
+      <w:pPr>
+        <w:pStyle w:val="Code"/>
+        <w:rPr>
+          <w:rFonts w:ascii="Cascadia Code" w:hAnsi="Cascadia Code"/>
+        </w:rPr>
+      </w:pPr>
+      <w:r>
+        <w:rPr>
+          <w:rFonts w:ascii="Cascadia Code" w:hAnsi="Cascadia Code"/>
+        </w:rPr>
+        <w:t>Actual error: 9.6772457068e-05</w:t>
+      </w:r>
+    </w:p>
+    <w:p>
+      <w:pPr>
+        <w:pStyle w:val="Code"/>
+        <w:rPr>
+          <w:rFonts w:ascii="Cascadia Code" w:hAnsi="Cascadia Code"/>
+        </w:rPr>
+      </w:pPr>
+      <w:r>
+        <w:rPr>
+          <w:rFonts w:ascii="Cascadia Code" w:hAnsi="Cascadia Code"/>
+        </w:rPr>
+        <w:t>Execution time for 12 processors: 5.9276 sec</w:t>
       </w:r>
     </w:p>
     <w:p>

</xml_diff>

<commit_message>
feat -- TR5: 5223 done, Jesus thank you
</commit_message>
<xml_diff>
--- a/42TR Tehnologiji Rozpodilenyh System/5/TR_KNT-122_Onyshchenko_19_PR5.docx
+++ b/42TR Tehnologiji Rozpodilenyh System/5/TR_KNT-122_Onyshchenko_19_PR5.docx
@@ -957,6 +957,67 @@
                     <a:xfrm>
                       <a:off x="0" y="0"/>
                       <a:ext cx="2105025" cy="409575"/>
+                    </a:xfrm>
+                    <a:prstGeom prst="rect">
+                      <a:avLst/>
+                    </a:prstGeom>
+                    <a:noFill/>
+                  </pic:spPr>
+                </pic:pic>
+              </a:graphicData>
+            </a:graphic>
+          </wp:inline>
+        </w:drawing>
+      </w:r>
+    </w:p>
+    <w:p>
+      <w:pPr>
+        <w:pStyle w:val="p11"/>
+        <w:rPr>
+          <w:lang w:val="en-US"/>
+        </w:rPr>
+      </w:pPr>
+      <w:r>
+        <w:rPr>
+          <w:lang w:val="en-US"/>
+        </w:rPr>
+        <w:t>5.2.2.3 Підібрати для знайденого N параметри N_in_proc та n_in_proc для випадку використання двох та чотирьох процесів і за допомогою доповненої програми обчислити число π, показати, що виконується відношення (5.8).</w:t>
+      </w:r>
+    </w:p>
+    <w:p>
+      <w:pPr>
+        <w:pStyle w:val="img1"/>
+        <w:rPr/>
+      </w:pPr>
+      <w:r>
+        <w:rPr/>
+        <w:drawing>
+          <wp:inline distT="0" distB="0" distL="0" distR="0">
+            <wp:extent cx="1143000" cy="590550"/>
+            <wp:effectExtent l="0" t="0" r="0" b="0"/>
+            <wp:docPr id="6" name="Зображення6"/>
+            <wp:cNvGraphicFramePr>
+              <a:graphicFrameLocks xmlns:a="http://schemas.openxmlformats.org/drawingml/2006/main" noChangeAspect="1"/>
+            </wp:cNvGraphicFramePr>
+            <a:graphic xmlns:a="http://schemas.openxmlformats.org/drawingml/2006/main">
+              <a:graphicData uri="http://schemas.openxmlformats.org/drawingml/2006/picture">
+                <pic:pic xmlns:pic="http://schemas.openxmlformats.org/drawingml/2006/picture">
+                  <pic:nvPicPr>
+                    <pic:cNvPr id="6" name="Зображення6"/>
+                    <pic:cNvPicPr>
+                      <a:picLocks noChangeAspect="1" noChangeArrowheads="1"/>
+                    </pic:cNvPicPr>
+                  </pic:nvPicPr>
+                  <pic:blipFill>
+                    <a:blip r:embed="rId7"/>
+                    <a:stretch>
+                      <a:fillRect/>
+                    </a:stretch>
+                  </pic:blipFill>
+                  <pic:spPr bwMode="auto">
+                    <a:xfrm>
+                      <a:off x="0" y="0"/>
+                      <a:ext cx="1143000" cy="590550"/>
                     </a:xfrm>
                     <a:prstGeom prst="rect">
                       <a:avLst/>
@@ -4081,7 +4142,7 @@
             <wp:extent cx="1438275" cy="466725"/>
             <wp:effectExtent l="0" t="0" r="0" b="0"/>
             <wp:wrapSquare wrapText="largest"/>
-            <wp:docPr id="6" name="Зображення1 копія 1"/>
+            <wp:docPr id="7" name="Зображення1 копія 1"/>
             <wp:cNvGraphicFramePr>
               <a:graphicFrameLocks xmlns:a="http://schemas.openxmlformats.org/drawingml/2006/main" noChangeAspect="1"/>
             </wp:cNvGraphicFramePr>
@@ -4089,13 +4150,13 @@
               <a:graphicData uri="http://schemas.openxmlformats.org/drawingml/2006/picture">
                 <pic:pic xmlns:pic="http://schemas.openxmlformats.org/drawingml/2006/picture">
                   <pic:nvPicPr>
-                    <pic:cNvPr id="6" name="Зображення1 копія 1"/>
+                    <pic:cNvPr id="7" name="Зображення1 копія 1"/>
                     <pic:cNvPicPr>
                       <a:picLocks noChangeAspect="1" noChangeArrowheads="1"/>
                     </pic:cNvPicPr>
                   </pic:nvPicPr>
                   <pic:blipFill>
-                    <a:blip r:embed="rId7"/>
+                    <a:blip r:embed="rId8"/>
                     <a:stretch>
                       <a:fillRect/>
                     </a:stretch>
@@ -5093,7 +5154,7 @@
           <wp:inline distT="0" distB="0" distL="0" distR="0">
             <wp:extent cx="3057525" cy="857250"/>
             <wp:effectExtent l="0" t="0" r="0" b="0"/>
-            <wp:docPr id="7" name="Зображення2 копія 1"/>
+            <wp:docPr id="8" name="Зображення2 копія 1"/>
             <wp:cNvGraphicFramePr>
               <a:graphicFrameLocks xmlns:a="http://schemas.openxmlformats.org/drawingml/2006/main" noChangeAspect="1"/>
             </wp:cNvGraphicFramePr>
@@ -5101,13 +5162,13 @@
               <a:graphicData uri="http://schemas.openxmlformats.org/drawingml/2006/picture">
                 <pic:pic xmlns:pic="http://schemas.openxmlformats.org/drawingml/2006/picture">
                   <pic:nvPicPr>
-                    <pic:cNvPr id="7" name="Зображення2 копія 1"/>
+                    <pic:cNvPr id="8" name="Зображення2 копія 1"/>
                     <pic:cNvPicPr>
                       <a:picLocks noChangeAspect="1" noChangeArrowheads="1"/>
                     </pic:cNvPicPr>
                   </pic:nvPicPr>
                   <pic:blipFill>
-                    <a:blip r:embed="rId8"/>
+                    <a:blip r:embed="rId9"/>
                     <a:stretch>
                       <a:fillRect/>
                     </a:stretch>
@@ -5151,7 +5212,7 @@
             <wp:extent cx="342900" cy="381000"/>
             <wp:effectExtent l="0" t="0" r="0" b="0"/>
             <wp:wrapSquare wrapText="largest"/>
-            <wp:docPr id="8" name="Зображення3 копія 1"/>
+            <wp:docPr id="9" name="Зображення3 копія 1"/>
             <wp:cNvGraphicFramePr>
               <a:graphicFrameLocks xmlns:a="http://schemas.openxmlformats.org/drawingml/2006/main" noChangeAspect="1"/>
             </wp:cNvGraphicFramePr>
@@ -5159,13 +5220,13 @@
               <a:graphicData uri="http://schemas.openxmlformats.org/drawingml/2006/picture">
                 <pic:pic xmlns:pic="http://schemas.openxmlformats.org/drawingml/2006/picture">
                   <pic:nvPicPr>
-                    <pic:cNvPr id="8" name="Зображення3 копія 1"/>
+                    <pic:cNvPr id="9" name="Зображення3 копія 1"/>
                     <pic:cNvPicPr>
                       <a:picLocks noChangeAspect="1" noChangeArrowheads="1"/>
                     </pic:cNvPicPr>
                   </pic:nvPicPr>
                   <pic:blipFill>
-                    <a:blip r:embed="rId9"/>
+                    <a:blip r:embed="rId10"/>
                     <a:stretch>
                       <a:fillRect/>
                     </a:stretch>
@@ -5208,7 +5269,7 @@
           <wp:inline distT="0" distB="0" distL="0" distR="0">
             <wp:extent cx="3886835" cy="1000125"/>
             <wp:effectExtent l="0" t="0" r="0" b="0"/>
-            <wp:docPr id="9" name="Зображення4 копія 1"/>
+            <wp:docPr id="10" name="Зображення4 копія 1"/>
             <wp:cNvGraphicFramePr>
               <a:graphicFrameLocks xmlns:a="http://schemas.openxmlformats.org/drawingml/2006/main" noChangeAspect="1"/>
             </wp:cNvGraphicFramePr>
@@ -5216,13 +5277,13 @@
               <a:graphicData uri="http://schemas.openxmlformats.org/drawingml/2006/picture">
                 <pic:pic xmlns:pic="http://schemas.openxmlformats.org/drawingml/2006/picture">
                   <pic:nvPicPr>
-                    <pic:cNvPr id="9" name="Зображення4 копія 1"/>
+                    <pic:cNvPr id="10" name="Зображення4 копія 1"/>
                     <pic:cNvPicPr>
                       <a:picLocks noChangeAspect="1" noChangeArrowheads="1"/>
                     </pic:cNvPicPr>
                   </pic:nvPicPr>
                   <pic:blipFill>
-                    <a:blip r:embed="rId10"/>
+                    <a:blip r:embed="rId11"/>
                     <a:stretch>
                       <a:fillRect/>
                     </a:stretch>
@@ -6838,7 +6899,7 @@
           <wp:inline distT="0" distB="0" distL="0" distR="0">
             <wp:extent cx="2105025" cy="409575"/>
             <wp:effectExtent l="0" t="0" r="0" b="0"/>
-            <wp:docPr id="10" name="Зображення5 копія 1"/>
+            <wp:docPr id="11" name="Зображення5 копія 1"/>
             <wp:cNvGraphicFramePr>
               <a:graphicFrameLocks xmlns:a="http://schemas.openxmlformats.org/drawingml/2006/main" noChangeAspect="1"/>
             </wp:cNvGraphicFramePr>
@@ -6846,13 +6907,13 @@
               <a:graphicData uri="http://schemas.openxmlformats.org/drawingml/2006/picture">
                 <pic:pic xmlns:pic="http://schemas.openxmlformats.org/drawingml/2006/picture">
                   <pic:nvPicPr>
-                    <pic:cNvPr id="10" name="Зображення5 копія 1"/>
+                    <pic:cNvPr id="11" name="Зображення5 копія 1"/>
                     <pic:cNvPicPr>
                       <a:picLocks noChangeAspect="1" noChangeArrowheads="1"/>
                     </pic:cNvPicPr>
                   </pic:nvPicPr>
                   <pic:blipFill>
-                    <a:blip r:embed="rId11"/>
+                    <a:blip r:embed="rId12"/>
                     <a:stretch>
                       <a:fillRect/>
                     </a:stretch>
@@ -7798,6 +7859,1445 @@
           <w:rFonts w:ascii="Cascadia Code" w:hAnsi="Cascadia Code"/>
         </w:rPr>
         <w:t>Execution time for 12 processors: 5.9276 sec</w:t>
+      </w:r>
+    </w:p>
+    <w:p>
+      <w:pPr>
+        <w:pStyle w:val="P1"/>
+        <w:rPr>
+          <w:rFonts w:ascii="Cascadia Code" w:hAnsi="Cascadia Code"/>
+        </w:rPr>
+      </w:pPr>
+      <w:r>
+        <w:rPr>
+          <w:rFonts w:ascii="Cascadia Code" w:hAnsi="Cascadia Code"/>
+        </w:rPr>
+      </w:r>
+    </w:p>
+    <w:p>
+      <w:pPr>
+        <w:pStyle w:val="H2"/>
+        <w:rPr/>
+      </w:pPr>
+      <w:r>
+        <w:rPr/>
+        <w:t>5.2.2.3</w:t>
+      </w:r>
+    </w:p>
+    <w:p>
+      <w:pPr>
+        <w:pStyle w:val="H3"/>
+        <w:rPr/>
+      </w:pPr>
+      <w:r>
+        <w:rPr/>
+        <w:t>Завдання</w:t>
+      </w:r>
+    </w:p>
+    <w:p>
+      <w:pPr>
+        <w:pStyle w:val="P1"/>
+        <w:rPr/>
+      </w:pPr>
+      <w:r>
+        <w:rPr/>
+      </w:r>
+    </w:p>
+    <w:p>
+      <w:pPr>
+        <w:pStyle w:val="Normal"/>
+        <w:rPr>
+          <w:lang w:val="en-US"/>
+        </w:rPr>
+      </w:pPr>
+      <w:r>
+        <w:rPr>
+          <w:lang w:val="en-US"/>
+        </w:rPr>
+        <w:t>Підібрати для знайденого N параметри N_in_proc та n_in_proc для випадку використання двох та чотирьох процесів і за допомогою доповненої програми обчислити число π, показати, що виконується відношення (5.8).</w:t>
+      </w:r>
+    </w:p>
+    <w:p>
+      <w:pPr>
+        <w:pStyle w:val="img1"/>
+        <w:rPr/>
+      </w:pPr>
+      <w:r>
+        <w:rPr/>
+        <w:drawing>
+          <wp:inline distT="0" distB="0" distL="0" distR="0">
+            <wp:extent cx="1143000" cy="590550"/>
+            <wp:effectExtent l="0" t="0" r="0" b="0"/>
+            <wp:docPr id="12" name="Зображення6 копія 1"/>
+            <wp:cNvGraphicFramePr>
+              <a:graphicFrameLocks xmlns:a="http://schemas.openxmlformats.org/drawingml/2006/main" noChangeAspect="1"/>
+            </wp:cNvGraphicFramePr>
+            <a:graphic xmlns:a="http://schemas.openxmlformats.org/drawingml/2006/main">
+              <a:graphicData uri="http://schemas.openxmlformats.org/drawingml/2006/picture">
+                <pic:pic xmlns:pic="http://schemas.openxmlformats.org/drawingml/2006/picture">
+                  <pic:nvPicPr>
+                    <pic:cNvPr id="12" name="Зображення6 копія 1"/>
+                    <pic:cNvPicPr>
+                      <a:picLocks noChangeAspect="1" noChangeArrowheads="1"/>
+                    </pic:cNvPicPr>
+                  </pic:nvPicPr>
+                  <pic:blipFill>
+                    <a:blip r:embed="rId13"/>
+                    <a:stretch>
+                      <a:fillRect/>
+                    </a:stretch>
+                  </pic:blipFill>
+                  <pic:spPr bwMode="auto">
+                    <a:xfrm>
+                      <a:off x="0" y="0"/>
+                      <a:ext cx="1143000" cy="590550"/>
+                    </a:xfrm>
+                    <a:prstGeom prst="rect">
+                      <a:avLst/>
+                    </a:prstGeom>
+                    <a:noFill/>
+                  </pic:spPr>
+                </pic:pic>
+              </a:graphicData>
+            </a:graphic>
+          </wp:inline>
+        </w:drawing>
+      </w:r>
+    </w:p>
+    <w:p>
+      <w:pPr>
+        <w:pStyle w:val="p11"/>
+        <w:rPr/>
+      </w:pPr>
+      <w:r>
+        <w:rPr/>
+      </w:r>
+    </w:p>
+    <w:p>
+      <w:pPr>
+        <w:pStyle w:val="H3"/>
+        <w:rPr/>
+      </w:pPr>
+      <w:r>
+        <w:rPr/>
+        <w:t>Код</w:t>
+      </w:r>
+    </w:p>
+    <w:p>
+      <w:pPr>
+        <w:pStyle w:val="p11"/>
+        <w:rPr/>
+      </w:pPr>
+      <w:r>
+        <w:rPr/>
+      </w:r>
+    </w:p>
+    <w:p>
+      <w:pPr>
+        <w:pStyle w:val="Code"/>
+        <w:rPr>
+          <w:rFonts w:ascii="Cascadia Code" w:hAnsi="Cascadia Code"/>
+        </w:rPr>
+      </w:pPr>
+      <w:r>
+        <w:rPr>
+          <w:rFonts w:ascii="Cascadia Code" w:hAnsi="Cascadia Code"/>
+        </w:rPr>
+        <w:t>import math</w:t>
+      </w:r>
+    </w:p>
+    <w:p>
+      <w:pPr>
+        <w:pStyle w:val="Code"/>
+        <w:rPr>
+          <w:rFonts w:ascii="Cascadia Code" w:hAnsi="Cascadia Code"/>
+        </w:rPr>
+      </w:pPr>
+      <w:r>
+        <w:rPr>
+          <w:rFonts w:ascii="Cascadia Code" w:hAnsi="Cascadia Code"/>
+        </w:rPr>
+        <w:t>import random</w:t>
+      </w:r>
+    </w:p>
+    <w:p>
+      <w:pPr>
+        <w:pStyle w:val="Code"/>
+        <w:rPr>
+          <w:rFonts w:ascii="Cascadia Code" w:hAnsi="Cascadia Code"/>
+        </w:rPr>
+      </w:pPr>
+      <w:r>
+        <w:rPr>
+          <w:rFonts w:ascii="Cascadia Code" w:hAnsi="Cascadia Code"/>
+        </w:rPr>
+        <w:t>import time</w:t>
+      </w:r>
+    </w:p>
+    <w:p>
+      <w:pPr>
+        <w:pStyle w:val="Code"/>
+        <w:rPr>
+          <w:rFonts w:ascii="Cascadia Code" w:hAnsi="Cascadia Code"/>
+        </w:rPr>
+      </w:pPr>
+      <w:r>
+        <w:rPr>
+          <w:rFonts w:ascii="Cascadia Code" w:hAnsi="Cascadia Code"/>
+        </w:rPr>
+        <w:t>from mpi4py import MPI</w:t>
+      </w:r>
+    </w:p>
+    <w:p>
+      <w:pPr>
+        <w:pStyle w:val="Code"/>
+        <w:rPr>
+          <w:rFonts w:ascii="Cascadia Code" w:hAnsi="Cascadia Code"/>
+        </w:rPr>
+      </w:pPr>
+      <w:r>
+        <w:rPr>
+          <w:rFonts w:ascii="Cascadia Code" w:hAnsi="Cascadia Code"/>
+        </w:rPr>
+      </w:r>
+    </w:p>
+    <w:p>
+      <w:pPr>
+        <w:pStyle w:val="Code"/>
+        <w:rPr>
+          <w:rFonts w:ascii="Cascadia Code" w:hAnsi="Cascadia Code"/>
+        </w:rPr>
+      </w:pPr>
+      <w:r>
+        <w:rPr>
+          <w:rFonts w:ascii="Cascadia Code" w:hAnsi="Cascadia Code"/>
+        </w:rPr>
+        <w:t>def main():</w:t>
+      </w:r>
+    </w:p>
+    <w:p>
+      <w:pPr>
+        <w:pStyle w:val="Code"/>
+        <w:rPr>
+          <w:rFonts w:ascii="Cascadia Code" w:hAnsi="Cascadia Code"/>
+        </w:rPr>
+      </w:pPr>
+      <w:r>
+        <w:rPr>
+          <w:rFonts w:ascii="Cascadia Code" w:hAnsi="Cascadia Code"/>
+        </w:rPr>
+        <w:t xml:space="preserve">    </w:t>
+      </w:r>
+      <w:r>
+        <w:rPr>
+          <w:rFonts w:ascii="Cascadia Code" w:hAnsi="Cascadia Code"/>
+        </w:rPr>
+        <w:t>comm = MPI.COMM_WORLD</w:t>
+      </w:r>
+    </w:p>
+    <w:p>
+      <w:pPr>
+        <w:pStyle w:val="Code"/>
+        <w:rPr>
+          <w:rFonts w:ascii="Cascadia Code" w:hAnsi="Cascadia Code"/>
+        </w:rPr>
+      </w:pPr>
+      <w:r>
+        <w:rPr>
+          <w:rFonts w:ascii="Cascadia Code" w:hAnsi="Cascadia Code"/>
+        </w:rPr>
+        <w:t xml:space="preserve">    </w:t>
+      </w:r>
+      <w:r>
+        <w:rPr>
+          <w:rFonts w:ascii="Cascadia Code" w:hAnsi="Cascadia Code"/>
+        </w:rPr>
+        <w:t>rank = comm.Get_rank()</w:t>
+      </w:r>
+    </w:p>
+    <w:p>
+      <w:pPr>
+        <w:pStyle w:val="Code"/>
+        <w:rPr>
+          <w:rFonts w:ascii="Cascadia Code" w:hAnsi="Cascadia Code"/>
+        </w:rPr>
+      </w:pPr>
+      <w:r>
+        <w:rPr>
+          <w:rFonts w:ascii="Cascadia Code" w:hAnsi="Cascadia Code"/>
+        </w:rPr>
+        <w:t xml:space="preserve">    </w:t>
+      </w:r>
+      <w:r>
+        <w:rPr>
+          <w:rFonts w:ascii="Cascadia Code" w:hAnsi="Cascadia Code"/>
+        </w:rPr>
+        <w:t>size = comm.Get_size()</w:t>
+      </w:r>
+    </w:p>
+    <w:p>
+      <w:pPr>
+        <w:pStyle w:val="Code"/>
+        <w:rPr>
+          <w:rFonts w:ascii="Cascadia Code" w:hAnsi="Cascadia Code"/>
+        </w:rPr>
+      </w:pPr>
+      <w:r>
+        <w:rPr>
+          <w:rFonts w:ascii="Cascadia Code" w:hAnsi="Cascadia Code"/>
+        </w:rPr>
+      </w:r>
+    </w:p>
+    <w:p>
+      <w:pPr>
+        <w:pStyle w:val="Code"/>
+        <w:rPr>
+          <w:rFonts w:ascii="Cascadia Code" w:hAnsi="Cascadia Code"/>
+        </w:rPr>
+      </w:pPr>
+      <w:r>
+        <w:rPr>
+          <w:rFonts w:ascii="Cascadia Code" w:hAnsi="Cascadia Code"/>
+        </w:rPr>
+        <w:t xml:space="preserve">    </w:t>
+      </w:r>
+      <w:r>
+        <w:rPr>
+          <w:rFonts w:ascii="Cascadia Code" w:hAnsi="Cascadia Code"/>
+        </w:rPr>
+        <w:t>if size == 2:</w:t>
+      </w:r>
+    </w:p>
+    <w:p>
+      <w:pPr>
+        <w:pStyle w:val="Code"/>
+        <w:rPr>
+          <w:rFonts w:ascii="Cascadia Code" w:hAnsi="Cascadia Code"/>
+        </w:rPr>
+      </w:pPr>
+      <w:r>
+        <w:rPr>
+          <w:rFonts w:ascii="Cascadia Code" w:hAnsi="Cascadia Code"/>
+        </w:rPr>
+        <w:t xml:space="preserve">        </w:t>
+      </w:r>
+      <w:r>
+        <w:rPr>
+          <w:rFonts w:ascii="Cascadia Code" w:hAnsi="Cascadia Code"/>
+        </w:rPr>
+        <w:t>n_iterations = 135</w:t>
+      </w:r>
+    </w:p>
+    <w:p>
+      <w:pPr>
+        <w:pStyle w:val="Code"/>
+        <w:rPr>
+          <w:rFonts w:ascii="Cascadia Code" w:hAnsi="Cascadia Code"/>
+        </w:rPr>
+      </w:pPr>
+      <w:r>
+        <w:rPr>
+          <w:rFonts w:ascii="Cascadia Code" w:hAnsi="Cascadia Code"/>
+        </w:rPr>
+        <w:t xml:space="preserve">    </w:t>
+      </w:r>
+      <w:r>
+        <w:rPr>
+          <w:rFonts w:ascii="Cascadia Code" w:hAnsi="Cascadia Code"/>
+        </w:rPr>
+        <w:t>elif size == 4:</w:t>
+      </w:r>
+    </w:p>
+    <w:p>
+      <w:pPr>
+        <w:pStyle w:val="Code"/>
+        <w:rPr>
+          <w:rFonts w:ascii="Cascadia Code" w:hAnsi="Cascadia Code"/>
+        </w:rPr>
+      </w:pPr>
+      <w:r>
+        <w:rPr>
+          <w:rFonts w:ascii="Cascadia Code" w:hAnsi="Cascadia Code"/>
+        </w:rPr>
+        <w:t xml:space="preserve">        </w:t>
+      </w:r>
+      <w:r>
+        <w:rPr>
+          <w:rFonts w:ascii="Cascadia Code" w:hAnsi="Cascadia Code"/>
+        </w:rPr>
+        <w:t>n_iterations = 67</w:t>
+      </w:r>
+    </w:p>
+    <w:p>
+      <w:pPr>
+        <w:pStyle w:val="Code"/>
+        <w:rPr>
+          <w:rFonts w:ascii="Cascadia Code" w:hAnsi="Cascadia Code"/>
+        </w:rPr>
+      </w:pPr>
+      <w:r>
+        <w:rPr>
+          <w:rFonts w:ascii="Cascadia Code" w:hAnsi="Cascadia Code"/>
+        </w:rPr>
+        <w:t xml:space="preserve">    </w:t>
+      </w:r>
+      <w:r>
+        <w:rPr>
+          <w:rFonts w:ascii="Cascadia Code" w:hAnsi="Cascadia Code"/>
+        </w:rPr>
+        <w:t>else:</w:t>
+      </w:r>
+    </w:p>
+    <w:p>
+      <w:pPr>
+        <w:pStyle w:val="Code"/>
+        <w:rPr>
+          <w:rFonts w:ascii="Cascadia Code" w:hAnsi="Cascadia Code"/>
+        </w:rPr>
+      </w:pPr>
+      <w:r>
+        <w:rPr>
+          <w:rFonts w:ascii="Cascadia Code" w:hAnsi="Cascadia Code"/>
+        </w:rPr>
+        <w:t xml:space="preserve">        </w:t>
+      </w:r>
+      <w:r>
+        <w:rPr>
+          <w:rFonts w:ascii="Cascadia Code" w:hAnsi="Cascadia Code"/>
+        </w:rPr>
+        <w:t>n_iterations = 100</w:t>
+      </w:r>
+    </w:p>
+    <w:p>
+      <w:pPr>
+        <w:pStyle w:val="Code"/>
+        <w:rPr>
+          <w:rFonts w:ascii="Cascadia Code" w:hAnsi="Cascadia Code"/>
+        </w:rPr>
+      </w:pPr>
+      <w:r>
+        <w:rPr>
+          <w:rFonts w:ascii="Cascadia Code" w:hAnsi="Cascadia Code"/>
+        </w:rPr>
+      </w:r>
+    </w:p>
+    <w:p>
+      <w:pPr>
+        <w:pStyle w:val="Code"/>
+        <w:rPr>
+          <w:rFonts w:ascii="Cascadia Code" w:hAnsi="Cascadia Code"/>
+        </w:rPr>
+      </w:pPr>
+      <w:r>
+        <w:rPr>
+          <w:rFonts w:ascii="Cascadia Code" w:hAnsi="Cascadia Code"/>
+        </w:rPr>
+        <w:t xml:space="preserve">    </w:t>
+      </w:r>
+      <w:r>
+        <w:rPr>
+          <w:rFonts w:ascii="Cascadia Code" w:hAnsi="Cascadia Code"/>
+        </w:rPr>
+        <w:t>n_in_proc = 1_000_000</w:t>
+      </w:r>
+    </w:p>
+    <w:p>
+      <w:pPr>
+        <w:pStyle w:val="Code"/>
+        <w:rPr>
+          <w:rFonts w:ascii="Cascadia Code" w:hAnsi="Cascadia Code"/>
+        </w:rPr>
+      </w:pPr>
+      <w:r>
+        <w:rPr>
+          <w:rFonts w:ascii="Cascadia Code" w:hAnsi="Cascadia Code"/>
+        </w:rPr>
+        <w:t xml:space="preserve">    </w:t>
+      </w:r>
+      <w:r>
+        <w:rPr>
+          <w:rFonts w:ascii="Cascadia Code" w:hAnsi="Cascadia Code"/>
+        </w:rPr>
+        <w:t>R = 0.5</w:t>
+      </w:r>
+    </w:p>
+    <w:p>
+      <w:pPr>
+        <w:pStyle w:val="Code"/>
+        <w:rPr>
+          <w:rFonts w:ascii="Cascadia Code" w:hAnsi="Cascadia Code"/>
+        </w:rPr>
+      </w:pPr>
+      <w:r>
+        <w:rPr>
+          <w:rFonts w:ascii="Cascadia Code" w:hAnsi="Cascadia Code"/>
+        </w:rPr>
+      </w:r>
+    </w:p>
+    <w:p>
+      <w:pPr>
+        <w:pStyle w:val="Code"/>
+        <w:rPr>
+          <w:rFonts w:ascii="Cascadia Code" w:hAnsi="Cascadia Code"/>
+        </w:rPr>
+      </w:pPr>
+      <w:r>
+        <w:rPr>
+          <w:rFonts w:ascii="Cascadia Code" w:hAnsi="Cascadia Code"/>
+        </w:rPr>
+        <w:t xml:space="preserve">    </w:t>
+      </w:r>
+      <w:r>
+        <w:rPr>
+          <w:rFonts w:ascii="Cascadia Code" w:hAnsi="Cascadia Code"/>
+        </w:rPr>
+        <w:t>pi_values = []</w:t>
+      </w:r>
+    </w:p>
+    <w:p>
+      <w:pPr>
+        <w:pStyle w:val="Code"/>
+        <w:rPr>
+          <w:rFonts w:ascii="Cascadia Code" w:hAnsi="Cascadia Code"/>
+        </w:rPr>
+      </w:pPr>
+      <w:r>
+        <w:rPr>
+          <w:rFonts w:ascii="Cascadia Code" w:hAnsi="Cascadia Code"/>
+        </w:rPr>
+        <w:t xml:space="preserve">    </w:t>
+      </w:r>
+      <w:r>
+        <w:rPr>
+          <w:rFonts w:ascii="Cascadia Code" w:hAnsi="Cascadia Code"/>
+        </w:rPr>
+        <w:t>start_time = MPI.Wtime()</w:t>
+      </w:r>
+    </w:p>
+    <w:p>
+      <w:pPr>
+        <w:pStyle w:val="Code"/>
+        <w:rPr>
+          <w:rFonts w:ascii="Cascadia Code" w:hAnsi="Cascadia Code"/>
+        </w:rPr>
+      </w:pPr>
+      <w:r>
+        <w:rPr>
+          <w:rFonts w:ascii="Cascadia Code" w:hAnsi="Cascadia Code"/>
+        </w:rPr>
+      </w:r>
+    </w:p>
+    <w:p>
+      <w:pPr>
+        <w:pStyle w:val="Code"/>
+        <w:rPr>
+          <w:rFonts w:ascii="Cascadia Code" w:hAnsi="Cascadia Code"/>
+        </w:rPr>
+      </w:pPr>
+      <w:r>
+        <w:rPr>
+          <w:rFonts w:ascii="Cascadia Code" w:hAnsi="Cascadia Code"/>
+        </w:rPr>
+        <w:t xml:space="preserve">    </w:t>
+      </w:r>
+      <w:r>
+        <w:rPr>
+          <w:rFonts w:ascii="Cascadia Code" w:hAnsi="Cascadia Code"/>
+        </w:rPr>
+        <w:t>for i in range(n_iterations):</w:t>
+      </w:r>
+    </w:p>
+    <w:p>
+      <w:pPr>
+        <w:pStyle w:val="Code"/>
+        <w:rPr>
+          <w:rFonts w:ascii="Cascadia Code" w:hAnsi="Cascadia Code"/>
+        </w:rPr>
+      </w:pPr>
+      <w:r>
+        <w:rPr>
+          <w:rFonts w:ascii="Cascadia Code" w:hAnsi="Cascadia Code"/>
+        </w:rPr>
+        <w:t xml:space="preserve">        </w:t>
+      </w:r>
+      <w:r>
+        <w:rPr>
+          <w:rFonts w:ascii="Cascadia Code" w:hAnsi="Cascadia Code"/>
+        </w:rPr>
+        <w:t>random.seed(time.time() + rank + i)</w:t>
+      </w:r>
+    </w:p>
+    <w:p>
+      <w:pPr>
+        <w:pStyle w:val="Code"/>
+        <w:rPr>
+          <w:rFonts w:ascii="Cascadia Code" w:hAnsi="Cascadia Code"/>
+        </w:rPr>
+      </w:pPr>
+      <w:r>
+        <w:rPr>
+          <w:rFonts w:ascii="Cascadia Code" w:hAnsi="Cascadia Code"/>
+        </w:rPr>
+        <w:t xml:space="preserve">        </w:t>
+      </w:r>
+      <w:r>
+        <w:rPr>
+          <w:rFonts w:ascii="Cascadia Code" w:hAnsi="Cascadia Code"/>
+        </w:rPr>
+        <w:t>in_circle_local = 0</w:t>
+      </w:r>
+    </w:p>
+    <w:p>
+      <w:pPr>
+        <w:pStyle w:val="Code"/>
+        <w:rPr>
+          <w:rFonts w:ascii="Cascadia Code" w:hAnsi="Cascadia Code"/>
+        </w:rPr>
+      </w:pPr>
+      <w:r>
+        <w:rPr>
+          <w:rFonts w:ascii="Cascadia Code" w:hAnsi="Cascadia Code"/>
+        </w:rPr>
+        <w:t xml:space="preserve">        </w:t>
+      </w:r>
+      <w:r>
+        <w:rPr>
+          <w:rFonts w:ascii="Cascadia Code" w:hAnsi="Cascadia Code"/>
+        </w:rPr>
+        <w:t>for _ in range(n_in_proc):</w:t>
+      </w:r>
+    </w:p>
+    <w:p>
+      <w:pPr>
+        <w:pStyle w:val="Code"/>
+        <w:rPr>
+          <w:rFonts w:ascii="Cascadia Code" w:hAnsi="Cascadia Code"/>
+        </w:rPr>
+      </w:pPr>
+      <w:r>
+        <w:rPr>
+          <w:rFonts w:ascii="Cascadia Code" w:hAnsi="Cascadia Code"/>
+        </w:rPr>
+        <w:t xml:space="preserve">            </w:t>
+      </w:r>
+      <w:r>
+        <w:rPr>
+          <w:rFonts w:ascii="Cascadia Code" w:hAnsi="Cascadia Code"/>
+        </w:rPr>
+        <w:t>x = random.uniform(-0.5, 0.5)</w:t>
+      </w:r>
+    </w:p>
+    <w:p>
+      <w:pPr>
+        <w:pStyle w:val="Code"/>
+        <w:rPr>
+          <w:rFonts w:ascii="Cascadia Code" w:hAnsi="Cascadia Code"/>
+        </w:rPr>
+      </w:pPr>
+      <w:r>
+        <w:rPr>
+          <w:rFonts w:ascii="Cascadia Code" w:hAnsi="Cascadia Code"/>
+        </w:rPr>
+        <w:t xml:space="preserve">            </w:t>
+      </w:r>
+      <w:r>
+        <w:rPr>
+          <w:rFonts w:ascii="Cascadia Code" w:hAnsi="Cascadia Code"/>
+        </w:rPr>
+        <w:t>y = random.uniform(-0.5, 0.5)</w:t>
+      </w:r>
+    </w:p>
+    <w:p>
+      <w:pPr>
+        <w:pStyle w:val="Code"/>
+        <w:rPr>
+          <w:rFonts w:ascii="Cascadia Code" w:hAnsi="Cascadia Code"/>
+        </w:rPr>
+      </w:pPr>
+      <w:r>
+        <w:rPr>
+          <w:rFonts w:ascii="Cascadia Code" w:hAnsi="Cascadia Code"/>
+        </w:rPr>
+        <w:t xml:space="preserve">            </w:t>
+      </w:r>
+      <w:r>
+        <w:rPr>
+          <w:rFonts w:ascii="Cascadia Code" w:hAnsi="Cascadia Code"/>
+        </w:rPr>
+        <w:t>if x * x + y * x &lt;= R * R:</w:t>
+      </w:r>
+    </w:p>
+    <w:p>
+      <w:pPr>
+        <w:pStyle w:val="Code"/>
+        <w:rPr>
+          <w:rFonts w:ascii="Cascadia Code" w:hAnsi="Cascadia Code"/>
+        </w:rPr>
+      </w:pPr>
+      <w:r>
+        <w:rPr>
+          <w:rFonts w:ascii="Cascadia Code" w:hAnsi="Cascadia Code"/>
+        </w:rPr>
+        <w:t xml:space="preserve">                </w:t>
+      </w:r>
+      <w:r>
+        <w:rPr>
+          <w:rFonts w:ascii="Cascadia Code" w:hAnsi="Cascadia Code"/>
+        </w:rPr>
+        <w:t>in_circle_local += 1</w:t>
+      </w:r>
+    </w:p>
+    <w:p>
+      <w:pPr>
+        <w:pStyle w:val="Code"/>
+        <w:rPr>
+          <w:rFonts w:ascii="Cascadia Code" w:hAnsi="Cascadia Code"/>
+        </w:rPr>
+      </w:pPr>
+      <w:r>
+        <w:rPr>
+          <w:rFonts w:ascii="Cascadia Code" w:hAnsi="Cascadia Code"/>
+        </w:rPr>
+      </w:r>
+    </w:p>
+    <w:p>
+      <w:pPr>
+        <w:pStyle w:val="Code"/>
+        <w:rPr>
+          <w:rFonts w:ascii="Cascadia Code" w:hAnsi="Cascadia Code"/>
+        </w:rPr>
+      </w:pPr>
+      <w:r>
+        <w:rPr>
+          <w:rFonts w:ascii="Cascadia Code" w:hAnsi="Cascadia Code"/>
+        </w:rPr>
+        <w:t xml:space="preserve">        </w:t>
+      </w:r>
+      <w:r>
+        <w:rPr>
+          <w:rFonts w:ascii="Cascadia Code" w:hAnsi="Cascadia Code"/>
+        </w:rPr>
+        <w:t>total_in_circle = comm.reduce(in_circle_local, op=MPI.SUM, root=0)</w:t>
+      </w:r>
+    </w:p>
+    <w:p>
+      <w:pPr>
+        <w:pStyle w:val="Code"/>
+        <w:rPr>
+          <w:rFonts w:ascii="Cascadia Code" w:hAnsi="Cascadia Code"/>
+        </w:rPr>
+      </w:pPr>
+      <w:r>
+        <w:rPr>
+          <w:rFonts w:ascii="Cascadia Code" w:hAnsi="Cascadia Code"/>
+        </w:rPr>
+      </w:r>
+    </w:p>
+    <w:p>
+      <w:pPr>
+        <w:pStyle w:val="Code"/>
+        <w:rPr>
+          <w:rFonts w:ascii="Cascadia Code" w:hAnsi="Cascadia Code"/>
+        </w:rPr>
+      </w:pPr>
+      <w:r>
+        <w:rPr>
+          <w:rFonts w:ascii="Cascadia Code" w:hAnsi="Cascadia Code"/>
+        </w:rPr>
+        <w:t xml:space="preserve">        </w:t>
+      </w:r>
+      <w:r>
+        <w:rPr>
+          <w:rFonts w:ascii="Cascadia Code" w:hAnsi="Cascadia Code"/>
+        </w:rPr>
+        <w:t>if rank == 0:</w:t>
+      </w:r>
+    </w:p>
+    <w:p>
+      <w:pPr>
+        <w:pStyle w:val="Code"/>
+        <w:rPr>
+          <w:rFonts w:ascii="Cascadia Code" w:hAnsi="Cascadia Code"/>
+        </w:rPr>
+      </w:pPr>
+      <w:r>
+        <w:rPr>
+          <w:rFonts w:ascii="Cascadia Code" w:hAnsi="Cascadia Code"/>
+        </w:rPr>
+        <w:t xml:space="preserve">            </w:t>
+      </w:r>
+      <w:r>
+        <w:rPr>
+          <w:rFonts w:ascii="Cascadia Code" w:hAnsi="Cascadia Code"/>
+        </w:rPr>
+        <w:t>points_this_iter = n_in_proc * size</w:t>
+      </w:r>
+    </w:p>
+    <w:p>
+      <w:pPr>
+        <w:pStyle w:val="Code"/>
+        <w:rPr>
+          <w:rFonts w:ascii="Cascadia Code" w:hAnsi="Cascadia Code"/>
+        </w:rPr>
+      </w:pPr>
+      <w:r>
+        <w:rPr>
+          <w:rFonts w:ascii="Cascadia Code" w:hAnsi="Cascadia Code"/>
+        </w:rPr>
+        <w:t xml:space="preserve">            </w:t>
+      </w:r>
+      <w:r>
+        <w:rPr>
+          <w:rFonts w:ascii="Cascadia Code" w:hAnsi="Cascadia Code"/>
+        </w:rPr>
+        <w:t>xi = 4.0 * (total_in_circle / points_this_iter)</w:t>
+      </w:r>
+    </w:p>
+    <w:p>
+      <w:pPr>
+        <w:pStyle w:val="Code"/>
+        <w:rPr>
+          <w:rFonts w:ascii="Cascadia Code" w:hAnsi="Cascadia Code"/>
+        </w:rPr>
+      </w:pPr>
+      <w:r>
+        <w:rPr>
+          <w:rFonts w:ascii="Cascadia Code" w:hAnsi="Cascadia Code"/>
+        </w:rPr>
+        <w:t xml:space="preserve">            </w:t>
+      </w:r>
+      <w:r>
+        <w:rPr>
+          <w:rFonts w:ascii="Cascadia Code" w:hAnsi="Cascadia Code"/>
+        </w:rPr>
+        <w:t>pi_values.append(xi)</w:t>
+      </w:r>
+    </w:p>
+    <w:p>
+      <w:pPr>
+        <w:pStyle w:val="Code"/>
+        <w:rPr>
+          <w:rFonts w:ascii="Cascadia Code" w:hAnsi="Cascadia Code"/>
+        </w:rPr>
+      </w:pPr>
+      <w:r>
+        <w:rPr>
+          <w:rFonts w:ascii="Cascadia Code" w:hAnsi="Cascadia Code"/>
+        </w:rPr>
+      </w:r>
+    </w:p>
+    <w:p>
+      <w:pPr>
+        <w:pStyle w:val="Code"/>
+        <w:rPr>
+          <w:rFonts w:ascii="Cascadia Code" w:hAnsi="Cascadia Code"/>
+        </w:rPr>
+      </w:pPr>
+      <w:r>
+        <w:rPr>
+          <w:rFonts w:ascii="Cascadia Code" w:hAnsi="Cascadia Code"/>
+        </w:rPr>
+        <w:t xml:space="preserve">    </w:t>
+      </w:r>
+      <w:r>
+        <w:rPr>
+          <w:rFonts w:ascii="Cascadia Code" w:hAnsi="Cascadia Code"/>
+        </w:rPr>
+        <w:t>end_time = MPI.Wtime()</w:t>
+      </w:r>
+    </w:p>
+    <w:p>
+      <w:pPr>
+        <w:pStyle w:val="Code"/>
+        <w:rPr>
+          <w:rFonts w:ascii="Cascadia Code" w:hAnsi="Cascadia Code"/>
+        </w:rPr>
+      </w:pPr>
+      <w:r>
+        <w:rPr>
+          <w:rFonts w:ascii="Cascadia Code" w:hAnsi="Cascadia Code"/>
+        </w:rPr>
+      </w:r>
+    </w:p>
+    <w:p>
+      <w:pPr>
+        <w:pStyle w:val="Code"/>
+        <w:rPr>
+          <w:rFonts w:ascii="Cascadia Code" w:hAnsi="Cascadia Code"/>
+        </w:rPr>
+      </w:pPr>
+      <w:r>
+        <w:rPr>
+          <w:rFonts w:ascii="Cascadia Code" w:hAnsi="Cascadia Code"/>
+        </w:rPr>
+        <w:t xml:space="preserve">    </w:t>
+      </w:r>
+      <w:r>
+        <w:rPr>
+          <w:rFonts w:ascii="Cascadia Code" w:hAnsi="Cascadia Code"/>
+        </w:rPr>
+        <w:t>if rank == 0:</w:t>
+      </w:r>
+    </w:p>
+    <w:p>
+      <w:pPr>
+        <w:pStyle w:val="Code"/>
+        <w:rPr>
+          <w:rFonts w:ascii="Cascadia Code" w:hAnsi="Cascadia Code"/>
+        </w:rPr>
+      </w:pPr>
+      <w:r>
+        <w:rPr>
+          <w:rFonts w:ascii="Cascadia Code" w:hAnsi="Cascadia Code"/>
+        </w:rPr>
+        <w:t xml:space="preserve">        </w:t>
+      </w:r>
+      <w:r>
+        <w:rPr>
+          <w:rFonts w:ascii="Cascadia Code" w:hAnsi="Cascadia Code"/>
+        </w:rPr>
+        <w:t>N_total = n_iterations * n_in_proc * size</w:t>
+      </w:r>
+    </w:p>
+    <w:p>
+      <w:pPr>
+        <w:pStyle w:val="Code"/>
+        <w:rPr>
+          <w:rFonts w:ascii="Cascadia Code" w:hAnsi="Cascadia Code"/>
+        </w:rPr>
+      </w:pPr>
+      <w:r>
+        <w:rPr>
+          <w:rFonts w:ascii="Cascadia Code" w:hAnsi="Cascadia Code"/>
+        </w:rPr>
+        <w:t xml:space="preserve">        </w:t>
+      </w:r>
+      <w:r>
+        <w:rPr>
+          <w:rFonts w:ascii="Cascadia Code" w:hAnsi="Cascadia Code"/>
+        </w:rPr>
+        <w:t>sum_xi = sum(pi_values)</w:t>
+      </w:r>
+    </w:p>
+    <w:p>
+      <w:pPr>
+        <w:pStyle w:val="Code"/>
+        <w:rPr>
+          <w:rFonts w:ascii="Cascadia Code" w:hAnsi="Cascadia Code"/>
+        </w:rPr>
+      </w:pPr>
+      <w:r>
+        <w:rPr>
+          <w:rFonts w:ascii="Cascadia Code" w:hAnsi="Cascadia Code"/>
+        </w:rPr>
+        <w:t xml:space="preserve">        </w:t>
+      </w:r>
+      <w:r>
+        <w:rPr>
+          <w:rFonts w:ascii="Cascadia Code" w:hAnsi="Cascadia Code"/>
+        </w:rPr>
+        <w:t>sum_xi_sq = sum(x**2 for x in pi_values)</w:t>
+      </w:r>
+    </w:p>
+    <w:p>
+      <w:pPr>
+        <w:pStyle w:val="Code"/>
+        <w:rPr>
+          <w:rFonts w:ascii="Cascadia Code" w:hAnsi="Cascadia Code"/>
+        </w:rPr>
+      </w:pPr>
+      <w:r>
+        <w:rPr>
+          <w:rFonts w:ascii="Cascadia Code" w:hAnsi="Cascadia Code"/>
+        </w:rPr>
+      </w:r>
+    </w:p>
+    <w:p>
+      <w:pPr>
+        <w:pStyle w:val="Code"/>
+        <w:rPr>
+          <w:rFonts w:ascii="Cascadia Code" w:hAnsi="Cascadia Code"/>
+        </w:rPr>
+      </w:pPr>
+      <w:r>
+        <w:rPr>
+          <w:rFonts w:ascii="Cascadia Code" w:hAnsi="Cascadia Code"/>
+        </w:rPr>
+        <w:t xml:space="preserve">        </w:t>
+      </w:r>
+      <w:r>
+        <w:rPr>
+          <w:rFonts w:ascii="Cascadia Code" w:hAnsi="Cascadia Code"/>
+        </w:rPr>
+        <w:t>pi_final = sum_xi / n_iterations</w:t>
+      </w:r>
+    </w:p>
+    <w:p>
+      <w:pPr>
+        <w:pStyle w:val="Code"/>
+        <w:rPr>
+          <w:rFonts w:ascii="Cascadia Code" w:hAnsi="Cascadia Code"/>
+        </w:rPr>
+      </w:pPr>
+      <w:r>
+        <w:rPr>
+          <w:rFonts w:ascii="Cascadia Code" w:hAnsi="Cascadia Code"/>
+        </w:rPr>
+        <w:t xml:space="preserve">        </w:t>
+      </w:r>
+      <w:r>
+        <w:rPr>
+          <w:rFonts w:ascii="Cascadia Code" w:hAnsi="Cascadia Code"/>
+        </w:rPr>
+        <w:t>variance = (1.0 / (n_iterations + 1)) * (</w:t>
+      </w:r>
+    </w:p>
+    <w:p>
+      <w:pPr>
+        <w:pStyle w:val="Code"/>
+        <w:rPr>
+          <w:rFonts w:ascii="Cascadia Code" w:hAnsi="Cascadia Code"/>
+        </w:rPr>
+      </w:pPr>
+      <w:r>
+        <w:rPr>
+          <w:rFonts w:ascii="Cascadia Code" w:hAnsi="Cascadia Code"/>
+        </w:rPr>
+        <w:t xml:space="preserve">            </w:t>
+      </w:r>
+      <w:r>
+        <w:rPr>
+          <w:rFonts w:ascii="Cascadia Code" w:hAnsi="Cascadia Code"/>
+        </w:rPr>
+        <w:t>sum_xi_sq - (1.0 / n_iterations) * (sum_xi**2)</w:t>
+      </w:r>
+    </w:p>
+    <w:p>
+      <w:pPr>
+        <w:pStyle w:val="Code"/>
+        <w:rPr>
+          <w:rFonts w:ascii="Cascadia Code" w:hAnsi="Cascadia Code"/>
+        </w:rPr>
+      </w:pPr>
+      <w:r>
+        <w:rPr>
+          <w:rFonts w:ascii="Cascadia Code" w:hAnsi="Cascadia Code"/>
+        </w:rPr>
+        <w:t xml:space="preserve">        </w:t>
+      </w:r>
+      <w:r>
+        <w:rPr>
+          <w:rFonts w:ascii="Cascadia Code" w:hAnsi="Cascadia Code"/>
+        </w:rPr>
+        <w:t>)</w:t>
+      </w:r>
+    </w:p>
+    <w:p>
+      <w:pPr>
+        <w:pStyle w:val="Code"/>
+        <w:rPr>
+          <w:rFonts w:ascii="Cascadia Code" w:hAnsi="Cascadia Code"/>
+        </w:rPr>
+      </w:pPr>
+      <w:r>
+        <w:rPr>
+          <w:rFonts w:ascii="Cascadia Code" w:hAnsi="Cascadia Code"/>
+        </w:rPr>
+        <w:t xml:space="preserve">        </w:t>
+      </w:r>
+      <w:r>
+        <w:rPr>
+          <w:rFonts w:ascii="Cascadia Code" w:hAnsi="Cascadia Code"/>
+        </w:rPr>
+        <w:t>sigma = math.sqrt(abs(variance))</w:t>
+      </w:r>
+    </w:p>
+    <w:p>
+      <w:pPr>
+        <w:pStyle w:val="Code"/>
+        <w:rPr>
+          <w:rFonts w:ascii="Cascadia Code" w:hAnsi="Cascadia Code"/>
+        </w:rPr>
+      </w:pPr>
+      <w:r>
+        <w:rPr>
+          <w:rFonts w:ascii="Cascadia Code" w:hAnsi="Cascadia Code"/>
+        </w:rPr>
+      </w:r>
+    </w:p>
+    <w:p>
+      <w:pPr>
+        <w:pStyle w:val="Code"/>
+        <w:rPr>
+          <w:rFonts w:ascii="Cascadia Code" w:hAnsi="Cascadia Code"/>
+        </w:rPr>
+      </w:pPr>
+      <w:r>
+        <w:rPr>
+          <w:rFonts w:ascii="Cascadia Code" w:hAnsi="Cascadia Code"/>
+        </w:rPr>
+        <w:t xml:space="preserve">        </w:t>
+      </w:r>
+      <w:r>
+        <w:rPr>
+          <w:rFonts w:ascii="Cascadia Code" w:hAnsi="Cascadia Code"/>
+        </w:rPr>
+        <w:t>actual_error = abs(math.pi - pi_final)</w:t>
+      </w:r>
+    </w:p>
+    <w:p>
+      <w:pPr>
+        <w:pStyle w:val="Code"/>
+        <w:rPr>
+          <w:rFonts w:ascii="Cascadia Code" w:hAnsi="Cascadia Code"/>
+        </w:rPr>
+      </w:pPr>
+      <w:r>
+        <w:rPr>
+          <w:rFonts w:ascii="Cascadia Code" w:hAnsi="Cascadia Code"/>
+        </w:rPr>
+        <w:t xml:space="preserve">        </w:t>
+      </w:r>
+      <w:r>
+        <w:rPr>
+          <w:rFonts w:ascii="Cascadia Code" w:hAnsi="Cascadia Code"/>
+        </w:rPr>
+        <w:t>theoretical_limit = 3 * (sigma / math.sqrt(n_iterations))</w:t>
+      </w:r>
+    </w:p>
+    <w:p>
+      <w:pPr>
+        <w:pStyle w:val="Code"/>
+        <w:rPr>
+          <w:rFonts w:ascii="Cascadia Code" w:hAnsi="Cascadia Code"/>
+        </w:rPr>
+      </w:pPr>
+      <w:r>
+        <w:rPr>
+          <w:rFonts w:ascii="Cascadia Code" w:hAnsi="Cascadia Code"/>
+        </w:rPr>
+      </w:r>
+    </w:p>
+    <w:p>
+      <w:pPr>
+        <w:pStyle w:val="Code"/>
+        <w:rPr>
+          <w:rFonts w:ascii="Cascadia Code" w:hAnsi="Cascadia Code"/>
+        </w:rPr>
+      </w:pPr>
+      <w:r>
+        <w:rPr>
+          <w:rFonts w:ascii="Cascadia Code" w:hAnsi="Cascadia Code"/>
+        </w:rPr>
+        <w:t xml:space="preserve">        </w:t>
+      </w:r>
+      <w:r>
+        <w:rPr>
+          <w:rFonts w:ascii="Cascadia Code" w:hAnsi="Cascadia Code"/>
+        </w:rPr>
+        <w:t>print(f"--- Results for {size} processors ---")</w:t>
+      </w:r>
+    </w:p>
+    <w:p>
+      <w:pPr>
+        <w:pStyle w:val="Code"/>
+        <w:rPr>
+          <w:rFonts w:ascii="Cascadia Code" w:hAnsi="Cascadia Code"/>
+        </w:rPr>
+      </w:pPr>
+      <w:r>
+        <w:rPr>
+          <w:rFonts w:ascii="Cascadia Code" w:hAnsi="Cascadia Code"/>
+        </w:rPr>
+        <w:t xml:space="preserve">        </w:t>
+      </w:r>
+      <w:r>
+        <w:rPr>
+          <w:rFonts w:ascii="Cascadia Code" w:hAnsi="Cascadia Code"/>
+        </w:rPr>
+        <w:t>print(f"General N: {N_total}")</w:t>
+      </w:r>
+    </w:p>
+    <w:p>
+      <w:pPr>
+        <w:pStyle w:val="Code"/>
+        <w:rPr>
+          <w:rFonts w:ascii="Cascadia Code" w:hAnsi="Cascadia Code"/>
+        </w:rPr>
+      </w:pPr>
+      <w:r>
+        <w:rPr>
+          <w:rFonts w:ascii="Cascadia Code" w:hAnsi="Cascadia Code"/>
+        </w:rPr>
+        <w:t xml:space="preserve">        </w:t>
+      </w:r>
+      <w:r>
+        <w:rPr>
+          <w:rFonts w:ascii="Cascadia Code" w:hAnsi="Cascadia Code"/>
+        </w:rPr>
+        <w:t>print(f"Calculated PI: {pi_final:.10f}")</w:t>
+      </w:r>
+    </w:p>
+    <w:p>
+      <w:pPr>
+        <w:pStyle w:val="Code"/>
+        <w:rPr>
+          <w:rFonts w:ascii="Cascadia Code" w:hAnsi="Cascadia Code"/>
+        </w:rPr>
+      </w:pPr>
+      <w:r>
+        <w:rPr>
+          <w:rFonts w:ascii="Cascadia Code" w:hAnsi="Cascadia Code"/>
+        </w:rPr>
+        <w:t xml:space="preserve">        </w:t>
+      </w:r>
+      <w:r>
+        <w:rPr>
+          <w:rFonts w:ascii="Cascadia Code" w:hAnsi="Cascadia Code"/>
+        </w:rPr>
+        <w:t>print(f"Actual error: {actual_error:.10e}")</w:t>
+      </w:r>
+    </w:p>
+    <w:p>
+      <w:pPr>
+        <w:pStyle w:val="Code"/>
+        <w:rPr>
+          <w:rFonts w:ascii="Cascadia Code" w:hAnsi="Cascadia Code"/>
+        </w:rPr>
+      </w:pPr>
+      <w:r>
+        <w:rPr>
+          <w:rFonts w:ascii="Cascadia Code" w:hAnsi="Cascadia Code"/>
+        </w:rPr>
+        <w:t xml:space="preserve">        </w:t>
+      </w:r>
+      <w:r>
+        <w:rPr>
+          <w:rFonts w:ascii="Cascadia Code" w:hAnsi="Cascadia Code"/>
+        </w:rPr>
+        <w:t>print(f"Theroretical limit (3*sigma/sqrt(N_iter)): {theoretical_limit:.10e}")</w:t>
+      </w:r>
+    </w:p>
+    <w:p>
+      <w:pPr>
+        <w:pStyle w:val="Code"/>
+        <w:rPr>
+          <w:rFonts w:ascii="Cascadia Code" w:hAnsi="Cascadia Code"/>
+        </w:rPr>
+      </w:pPr>
+      <w:r>
+        <w:rPr>
+          <w:rFonts w:ascii="Cascadia Code" w:hAnsi="Cascadia Code"/>
+        </w:rPr>
+        <w:t xml:space="preserve">        </w:t>
+      </w:r>
+      <w:r>
+        <w:rPr>
+          <w:rFonts w:ascii="Cascadia Code" w:hAnsi="Cascadia Code"/>
+        </w:rPr>
+        <w:t>print(f"Relationship (5.8) succeding: {actual_error &lt;= theoretical_limit}")</w:t>
+      </w:r>
+    </w:p>
+    <w:p>
+      <w:pPr>
+        <w:pStyle w:val="Code"/>
+        <w:rPr>
+          <w:rFonts w:ascii="Cascadia Code" w:hAnsi="Cascadia Code"/>
+        </w:rPr>
+      </w:pPr>
+      <w:r>
+        <w:rPr>
+          <w:rFonts w:ascii="Cascadia Code" w:hAnsi="Cascadia Code"/>
+        </w:rPr>
+        <w:t xml:space="preserve">        </w:t>
+      </w:r>
+      <w:r>
+        <w:rPr>
+          <w:rFonts w:ascii="Cascadia Code" w:hAnsi="Cascadia Code"/>
+        </w:rPr>
+        <w:t>print(f"Execution time: {end_time - start_time:.4f} сек")</w:t>
+      </w:r>
+    </w:p>
+    <w:p>
+      <w:pPr>
+        <w:pStyle w:val="Code"/>
+        <w:rPr>
+          <w:rFonts w:ascii="Cascadia Code" w:hAnsi="Cascadia Code"/>
+        </w:rPr>
+      </w:pPr>
+      <w:r>
+        <w:rPr>
+          <w:rFonts w:ascii="Cascadia Code" w:hAnsi="Cascadia Code"/>
+        </w:rPr>
+      </w:r>
+    </w:p>
+    <w:p>
+      <w:pPr>
+        <w:pStyle w:val="Code"/>
+        <w:rPr>
+          <w:rFonts w:ascii="Cascadia Code" w:hAnsi="Cascadia Code"/>
+        </w:rPr>
+      </w:pPr>
+      <w:r>
+        <w:rPr>
+          <w:rFonts w:ascii="Cascadia Code" w:hAnsi="Cascadia Code"/>
+        </w:rPr>
+        <w:t>if __name__ == "__main__":</w:t>
+      </w:r>
+    </w:p>
+    <w:p>
+      <w:pPr>
+        <w:pStyle w:val="Code"/>
+        <w:rPr>
+          <w:rFonts w:ascii="Cascadia Code" w:hAnsi="Cascadia Code"/>
+        </w:rPr>
+      </w:pPr>
+      <w:r>
+        <w:rPr>
+          <w:rFonts w:ascii="Cascadia Code" w:hAnsi="Cascadia Code"/>
+        </w:rPr>
+        <w:t xml:space="preserve">    </w:t>
+      </w:r>
+      <w:r>
+        <w:rPr>
+          <w:rFonts w:ascii="Cascadia Code" w:hAnsi="Cascadia Code"/>
+        </w:rPr>
+        <w:t>main()</w:t>
+      </w:r>
+    </w:p>
+    <w:p>
+      <w:pPr>
+        <w:pStyle w:val="p11"/>
+        <w:rPr/>
+      </w:pPr>
+      <w:r>
+        <w:rPr/>
+      </w:r>
+    </w:p>
+    <w:p>
+      <w:pPr>
+        <w:pStyle w:val="p11"/>
+        <w:rPr/>
+      </w:pPr>
+      <w:r>
+        <w:rPr/>
+        <w:t>Результати</w:t>
+      </w:r>
+    </w:p>
+    <w:p>
+      <w:pPr>
+        <w:pStyle w:val="p11"/>
+        <w:rPr/>
+      </w:pPr>
+      <w:r>
+        <w:rPr/>
+      </w:r>
+    </w:p>
+    <w:p>
+      <w:pPr>
+        <w:pStyle w:val="Code"/>
+        <w:rPr>
+          <w:rFonts w:ascii="Cascadia Code" w:hAnsi="Cascadia Code"/>
+        </w:rPr>
+      </w:pPr>
+      <w:r>
+        <w:rPr>
+          <w:rFonts w:ascii="Cascadia Code" w:hAnsi="Cascadia Code"/>
+        </w:rPr>
+        <w:t>--- Results for 1 processors ---</w:t>
+      </w:r>
+    </w:p>
+    <w:p>
+      <w:pPr>
+        <w:pStyle w:val="Code"/>
+        <w:rPr>
+          <w:rFonts w:ascii="Cascadia Code" w:hAnsi="Cascadia Code"/>
+        </w:rPr>
+      </w:pPr>
+      <w:r>
+        <w:rPr>
+          <w:rFonts w:ascii="Cascadia Code" w:hAnsi="Cascadia Code"/>
+        </w:rPr>
+        <w:t>General N: 100000000</w:t>
+      </w:r>
+    </w:p>
+    <w:p>
+      <w:pPr>
+        <w:pStyle w:val="Code"/>
+        <w:rPr>
+          <w:rFonts w:ascii="Cascadia Code" w:hAnsi="Cascadia Code"/>
+        </w:rPr>
+      </w:pPr>
+      <w:r>
+        <w:rPr>
+          <w:rFonts w:ascii="Cascadia Code" w:hAnsi="Cascadia Code"/>
+        </w:rPr>
+        <w:t>Calculated PI: 3.5804846800</w:t>
+      </w:r>
+    </w:p>
+    <w:p>
+      <w:pPr>
+        <w:pStyle w:val="Code"/>
+        <w:rPr>
+          <w:rFonts w:ascii="Cascadia Code" w:hAnsi="Cascadia Code"/>
+        </w:rPr>
+      </w:pPr>
+      <w:r>
+        <w:rPr>
+          <w:rFonts w:ascii="Cascadia Code" w:hAnsi="Cascadia Code"/>
+        </w:rPr>
+        <w:t>Actual error: 4.3889202641e-01</w:t>
+      </w:r>
+    </w:p>
+    <w:p>
+      <w:pPr>
+        <w:pStyle w:val="Code"/>
+        <w:rPr>
+          <w:rFonts w:ascii="Cascadia Code" w:hAnsi="Cascadia Code"/>
+        </w:rPr>
+      </w:pPr>
+      <w:r>
+        <w:rPr>
+          <w:rFonts w:ascii="Cascadia Code" w:hAnsi="Cascadia Code"/>
+        </w:rPr>
+        <w:t>Theroretical limit (3*sigma/sqrt(N_iter)): 3.6944752100e-04</w:t>
+      </w:r>
+    </w:p>
+    <w:p>
+      <w:pPr>
+        <w:pStyle w:val="Code"/>
+        <w:rPr>
+          <w:rFonts w:ascii="Cascadia Code" w:hAnsi="Cascadia Code"/>
+        </w:rPr>
+      </w:pPr>
+      <w:r>
+        <w:rPr>
+          <w:rFonts w:ascii="Cascadia Code" w:hAnsi="Cascadia Code"/>
+        </w:rPr>
+        <w:t>Relationship (5.8) succeding: False</w:t>
+      </w:r>
+    </w:p>
+    <w:p>
+      <w:pPr>
+        <w:pStyle w:val="Code"/>
+        <w:rPr>
+          <w:rFonts w:ascii="Cascadia Code" w:hAnsi="Cascadia Code"/>
+        </w:rPr>
+      </w:pPr>
+      <w:r>
+        <w:rPr>
+          <w:rFonts w:ascii="Cascadia Code" w:hAnsi="Cascadia Code"/>
+        </w:rPr>
+        <w:t>Execution time: 34.8550 сек</w:t>
+      </w:r>
+    </w:p>
+    <w:p>
+      <w:pPr>
+        <w:pStyle w:val="p11"/>
+        <w:rPr/>
+      </w:pPr>
+      <w:r>
+        <w:rPr/>
       </w:r>
     </w:p>
     <w:p>

</xml_diff>

<commit_message>
feat -- TR5: 5231 done Jesus thank you
</commit_message>
<xml_diff>
--- a/42TR Tehnologiji Rozpodilenyh System/5/TR_KNT-122_Onyshchenko_19_PR5.docx
+++ b/42TR Tehnologiji Rozpodilenyh System/5/TR_KNT-122_Onyshchenko_19_PR5.docx
@@ -654,7 +654,7 @@
       </w:r>
       <w:r>
         <w:drawing>
-          <wp:anchor behindDoc="0" distT="0" distB="0" distL="0" distR="0" simplePos="0" locked="0" layoutInCell="0" allowOverlap="1" relativeHeight="2">
+          <wp:anchor behindDoc="0" distT="0" distB="0" distL="0" distR="0" simplePos="0" locked="0" layoutInCell="0" allowOverlap="1" relativeHeight="10">
             <wp:simplePos x="0" y="0"/>
             <wp:positionH relativeFrom="column">
               <wp:posOffset>2188845</wp:posOffset>
@@ -795,7 +795,7 @@
       </w:r>
       <w:r>
         <w:drawing>
-          <wp:anchor behindDoc="0" distT="0" distB="0" distL="0" distR="0" simplePos="0" locked="0" layoutInCell="0" allowOverlap="1" relativeHeight="5">
+          <wp:anchor behindDoc="0" distT="0" distB="0" distL="0" distR="0" simplePos="0" locked="0" layoutInCell="0" allowOverlap="1" relativeHeight="12">
             <wp:simplePos x="0" y="0"/>
             <wp:positionH relativeFrom="column">
               <wp:posOffset>3315335</wp:posOffset>
@@ -860,9 +860,7 @@
         </w:rPr>
       </w:pPr>
       <w:r>
-        <w:rPr>
-          <w:lang w:val="en-US"/>
-        </w:rPr>
+        <w:rPr/>
         <w:drawing>
           <wp:inline distT="0" distB="0" distL="0" distR="0">
             <wp:extent cx="3886835" cy="1000125"/>
@@ -1038,6 +1036,30 @@
       </w:pPr>
       <w:r>
         <w:rPr/>
+        <w:t>5.2.2.4 Визначити прискорення паралельної програми для двох та чотирьох процесорів.</w:t>
+      </w:r>
+    </w:p>
+    <w:p>
+      <w:pPr>
+        <w:pStyle w:val="p11"/>
+        <w:rPr>
+          <w:lang w:val="en-US"/>
+        </w:rPr>
+      </w:pPr>
+      <w:r>
+        <w:rPr>
+          <w:lang w:val="en-US"/>
+        </w:rPr>
+        <w:t>5.2.3.1 Розробити паралельну програму інтегрування методом Монте-Карло, використовуючи програму 5.3.</w:t>
+      </w:r>
+    </w:p>
+    <w:p>
+      <w:pPr>
+        <w:pStyle w:val="p11"/>
+        <w:rPr/>
+      </w:pPr>
+      <w:r>
+        <w:rPr/>
       </w:r>
     </w:p>
     <w:p>
@@ -1850,7 +1872,7 @@
           </w:tcPr>
           <w:p>
             <w:pPr>
-              <w:pStyle w:val="user2"/>
+              <w:pStyle w:val="Style14"/>
               <w:spacing w:lineRule="auto" w:line="240"/>
               <w:ind w:hanging="0" w:left="0"/>
               <w:rPr>
@@ -1895,7 +1917,7 @@
           </w:tcPr>
           <w:p>
             <w:pPr>
-              <w:pStyle w:val="user2"/>
+              <w:pStyle w:val="Style14"/>
               <w:spacing w:lineRule="auto" w:line="240"/>
               <w:ind w:hanging="0" w:left="0"/>
               <w:rPr>
@@ -1928,7 +1950,7 @@
           </w:tcPr>
           <w:p>
             <w:pPr>
-              <w:pStyle w:val="user2"/>
+              <w:pStyle w:val="Style14"/>
               <w:spacing w:lineRule="auto" w:line="240"/>
               <w:ind w:hanging="0" w:left="0"/>
               <w:rPr>
@@ -1962,7 +1984,7 @@
           </w:tcPr>
           <w:p>
             <w:pPr>
-              <w:pStyle w:val="user2"/>
+              <w:pStyle w:val="Style14"/>
               <w:spacing w:lineRule="auto" w:line="240"/>
               <w:ind w:hanging="0" w:left="0"/>
               <w:rPr>
@@ -1997,7 +2019,7 @@
           </w:tcPr>
           <w:p>
             <w:pPr>
-              <w:pStyle w:val="user2"/>
+              <w:pStyle w:val="Style14"/>
               <w:spacing w:lineRule="auto" w:line="240"/>
               <w:ind w:hanging="0" w:left="0"/>
               <w:rPr>
@@ -2036,7 +2058,7 @@
           </w:tcPr>
           <w:p>
             <w:pPr>
-              <w:pStyle w:val="user2"/>
+              <w:pStyle w:val="Style14"/>
               <w:spacing w:lineRule="auto" w:line="240"/>
               <w:ind w:hanging="0" w:left="0"/>
               <w:rPr>
@@ -2064,7 +2086,7 @@
           </w:tcPr>
           <w:p>
             <w:pPr>
-              <w:pStyle w:val="user2"/>
+              <w:pStyle w:val="Style14"/>
               <w:spacing w:lineRule="auto" w:line="240"/>
               <w:ind w:hanging="0" w:left="0"/>
               <w:rPr>
@@ -2093,7 +2115,7 @@
           </w:tcPr>
           <w:p>
             <w:pPr>
-              <w:pStyle w:val="user2"/>
+              <w:pStyle w:val="Style14"/>
               <w:spacing w:lineRule="auto" w:line="240"/>
               <w:ind w:hanging="0" w:left="0"/>
               <w:rPr>
@@ -2160,7 +2182,7 @@
           </w:tcPr>
           <w:p>
             <w:pPr>
-              <w:pStyle w:val="user2"/>
+              <w:pStyle w:val="Style14"/>
               <w:spacing w:lineRule="auto" w:line="240"/>
               <w:ind w:hanging="0" w:left="0"/>
               <w:rPr>
@@ -2188,7 +2210,7 @@
           </w:tcPr>
           <w:p>
             <w:pPr>
-              <w:pStyle w:val="user2"/>
+              <w:pStyle w:val="Style14"/>
               <w:spacing w:lineRule="auto" w:line="240"/>
               <w:ind w:hanging="0" w:left="0"/>
               <w:rPr>
@@ -2217,7 +2239,7 @@
           </w:tcPr>
           <w:p>
             <w:pPr>
-              <w:pStyle w:val="user2"/>
+              <w:pStyle w:val="Style14"/>
               <w:spacing w:lineRule="auto" w:line="240"/>
               <w:ind w:hanging="0" w:left="0"/>
               <w:rPr>
@@ -2283,7 +2305,7 @@
           </w:tcPr>
           <w:p>
             <w:pPr>
-              <w:pStyle w:val="user2"/>
+              <w:pStyle w:val="Style14"/>
               <w:spacing w:lineRule="auto" w:line="240"/>
               <w:ind w:hanging="0" w:left="0"/>
               <w:rPr>
@@ -2311,7 +2333,7 @@
           </w:tcPr>
           <w:p>
             <w:pPr>
-              <w:pStyle w:val="user2"/>
+              <w:pStyle w:val="Style14"/>
               <w:spacing w:lineRule="auto" w:line="240"/>
               <w:ind w:hanging="0" w:left="0"/>
               <w:rPr>
@@ -2340,7 +2362,7 @@
           </w:tcPr>
           <w:p>
             <w:pPr>
-              <w:pStyle w:val="user2"/>
+              <w:pStyle w:val="Style14"/>
               <w:spacing w:lineRule="auto" w:line="240"/>
               <w:ind w:hanging="0" w:left="0"/>
               <w:rPr>
@@ -2406,7 +2428,7 @@
           </w:tcPr>
           <w:p>
             <w:pPr>
-              <w:pStyle w:val="user2"/>
+              <w:pStyle w:val="Style14"/>
               <w:spacing w:lineRule="auto" w:line="240"/>
               <w:ind w:hanging="0" w:left="0"/>
               <w:rPr>
@@ -2434,7 +2456,7 @@
           </w:tcPr>
           <w:p>
             <w:pPr>
-              <w:pStyle w:val="user2"/>
+              <w:pStyle w:val="Style14"/>
               <w:spacing w:lineRule="auto" w:line="240"/>
               <w:ind w:hanging="0" w:left="0"/>
               <w:rPr>
@@ -2463,7 +2485,7 @@
           </w:tcPr>
           <w:p>
             <w:pPr>
-              <w:pStyle w:val="user2"/>
+              <w:pStyle w:val="Style14"/>
               <w:spacing w:lineRule="auto" w:line="240"/>
               <w:ind w:hanging="0" w:left="0"/>
               <w:rPr>
@@ -2529,7 +2551,7 @@
           </w:tcPr>
           <w:p>
             <w:pPr>
-              <w:pStyle w:val="user2"/>
+              <w:pStyle w:val="Style14"/>
               <w:spacing w:lineRule="auto" w:line="240"/>
               <w:ind w:hanging="0" w:left="0"/>
               <w:rPr>
@@ -2557,7 +2579,7 @@
           </w:tcPr>
           <w:p>
             <w:pPr>
-              <w:pStyle w:val="user2"/>
+              <w:pStyle w:val="Style14"/>
               <w:spacing w:lineRule="auto" w:line="240"/>
               <w:ind w:hanging="0" w:left="0"/>
               <w:rPr>
@@ -2586,7 +2608,7 @@
           </w:tcPr>
           <w:p>
             <w:pPr>
-              <w:pStyle w:val="user2"/>
+              <w:pStyle w:val="Style14"/>
               <w:spacing w:lineRule="auto" w:line="240"/>
               <w:ind w:hanging="0" w:left="0"/>
               <w:rPr>
@@ -2653,7 +2675,7 @@
           </w:tcPr>
           <w:p>
             <w:pPr>
-              <w:pStyle w:val="user2"/>
+              <w:pStyle w:val="Style14"/>
               <w:spacing w:lineRule="auto" w:line="240"/>
               <w:ind w:hanging="0" w:left="0"/>
               <w:rPr>
@@ -2681,7 +2703,7 @@
           </w:tcPr>
           <w:p>
             <w:pPr>
-              <w:pStyle w:val="user2"/>
+              <w:pStyle w:val="Style14"/>
               <w:spacing w:lineRule="auto" w:line="240"/>
               <w:ind w:hanging="0" w:left="0"/>
               <w:rPr>
@@ -2710,7 +2732,7 @@
           </w:tcPr>
           <w:p>
             <w:pPr>
-              <w:pStyle w:val="user2"/>
+              <w:pStyle w:val="Style14"/>
               <w:spacing w:lineRule="auto" w:line="240"/>
               <w:ind w:hanging="0" w:left="0"/>
               <w:rPr>
@@ -4131,7 +4153,7 @@
       </w:r>
       <w:r>
         <w:drawing>
-          <wp:anchor behindDoc="0" distT="0" distB="0" distL="0" distR="0" simplePos="0" locked="0" layoutInCell="0" allowOverlap="1" relativeHeight="3">
+          <wp:anchor behindDoc="0" distT="0" distB="0" distL="0" distR="0" simplePos="0" locked="0" layoutInCell="0" allowOverlap="1" relativeHeight="11">
             <wp:simplePos x="0" y="0"/>
             <wp:positionH relativeFrom="column">
               <wp:posOffset>2188845</wp:posOffset>
@@ -5201,7 +5223,7 @@
       </w:r>
       <w:r>
         <w:drawing>
-          <wp:anchor behindDoc="0" distT="0" distB="0" distL="0" distR="0" simplePos="0" locked="0" layoutInCell="0" allowOverlap="1" relativeHeight="9">
+          <wp:anchor behindDoc="0" distT="0" distB="0" distL="0" distR="0" simplePos="0" locked="0" layoutInCell="0" allowOverlap="1" relativeHeight="13">
             <wp:simplePos x="0" y="0"/>
             <wp:positionH relativeFrom="column">
               <wp:posOffset>3315335</wp:posOffset>
@@ -9298,6 +9320,1471 @@
       </w:pPr>
       <w:r>
         <w:rPr/>
+      </w:r>
+    </w:p>
+    <w:p>
+      <w:pPr>
+        <w:pStyle w:val="H2"/>
+        <w:rPr/>
+      </w:pPr>
+      <w:r>
+        <w:rPr/>
+        <w:t>5.2.2.4</w:t>
+      </w:r>
+    </w:p>
+    <w:p>
+      <w:pPr>
+        <w:pStyle w:val="H3"/>
+        <w:rPr/>
+      </w:pPr>
+      <w:r>
+        <w:rPr/>
+        <w:t>Завдання</w:t>
+      </w:r>
+    </w:p>
+    <w:p>
+      <w:pPr>
+        <w:pStyle w:val="p11"/>
+        <w:rPr/>
+      </w:pPr>
+      <w:r>
+        <w:rPr/>
+      </w:r>
+    </w:p>
+    <w:p>
+      <w:pPr>
+        <w:pStyle w:val="p11"/>
+        <w:rPr/>
+      </w:pPr>
+      <w:r>
+        <w:rPr/>
+        <w:t>Визначити прискорення паралельної програми для двох та чотирьох процесорів.</w:t>
+      </w:r>
+    </w:p>
+    <w:p>
+      <w:pPr>
+        <w:pStyle w:val="p11"/>
+        <w:rPr/>
+      </w:pPr>
+      <w:r>
+        <w:rPr/>
+      </w:r>
+    </w:p>
+    <w:p>
+      <w:pPr>
+        <w:pStyle w:val="H3"/>
+        <w:rPr/>
+      </w:pPr>
+      <w:r>
+        <w:rPr/>
+        <w:t>Виконання</w:t>
+      </w:r>
+    </w:p>
+    <w:p>
+      <w:pPr>
+        <w:pStyle w:val="p11"/>
+        <w:rPr/>
+      </w:pPr>
+      <w:r>
+        <w:rPr/>
+      </w:r>
+    </w:p>
+    <w:p>
+      <w:pPr>
+        <w:pStyle w:val="p11"/>
+        <w:rPr/>
+      </w:pPr>
+      <w:r>
+        <w:rPr/>
+        <w:t>Для виконання обрано програму 5.</w:t>
+      </w:r>
+      <w:r>
+        <w:rPr/>
+        <w:t>1</w:t>
+      </w:r>
+      <w:r>
+        <w:rPr/>
+        <w:t>.2.</w:t>
+      </w:r>
+      <w:r>
+        <w:rPr/>
+        <w:t>3</w:t>
+      </w:r>
+      <w:r>
+        <w:rPr/>
+        <w:t>. Її запущено на двох та чотирьох процесорах.</w:t>
+      </w:r>
+    </w:p>
+    <w:p>
+      <w:pPr>
+        <w:pStyle w:val="p11"/>
+        <w:rPr/>
+      </w:pPr>
+      <w:r>
+        <w:rPr/>
+        <w:t xml:space="preserve">Для обчислення прискорення було використано формулу </w:t>
+      </w:r>
+      <w:r>
+        <w:rPr>
+          <w:lang w:val="en-US"/>
+        </w:rPr>
+        <w:t>S</w:t>
+      </w:r>
+      <w:r>
+        <w:rPr>
+          <w:vertAlign w:val="subscript"/>
+          <w:lang w:val="en-US"/>
+        </w:rPr>
+        <w:t>p</w:t>
+      </w:r>
+      <w:r>
+        <w:rPr>
+          <w:position w:val="0"/>
+          <w:sz w:val="28"/>
+          <w:vertAlign w:val="baseline"/>
+          <w:lang w:val="en-US"/>
+        </w:rPr>
+        <w:t>=T</w:t>
+      </w:r>
+      <w:r>
+        <w:rPr>
+          <w:vertAlign w:val="subscript"/>
+          <w:lang w:val="en-US"/>
+        </w:rPr>
+        <w:t>1</w:t>
+      </w:r>
+      <w:r>
+        <w:rPr>
+          <w:position w:val="0"/>
+          <w:sz w:val="28"/>
+          <w:vertAlign w:val="baseline"/>
+          <w:lang w:val="en-US"/>
+        </w:rPr>
+        <w:t>/T</w:t>
+      </w:r>
+      <w:r>
+        <w:rPr>
+          <w:vertAlign w:val="subscript"/>
+          <w:lang w:val="en-US"/>
+        </w:rPr>
+        <w:t>p</w:t>
+      </w:r>
+      <w:r>
+        <w:rPr>
+          <w:position w:val="0"/>
+          <w:sz w:val="28"/>
+          <w:vertAlign w:val="baseline"/>
+          <w:lang w:val="en-US"/>
+        </w:rPr>
+        <w:t>.</w:t>
+      </w:r>
+    </w:p>
+    <w:p>
+      <w:pPr>
+        <w:pStyle w:val="p11"/>
+        <w:rPr/>
+      </w:pPr>
+      <w:r>
+        <w:rPr/>
+      </w:r>
+    </w:p>
+    <w:p>
+      <w:pPr>
+        <w:pStyle w:val="H3"/>
+        <w:rPr/>
+      </w:pPr>
+      <w:r>
+        <w:rPr/>
+        <w:t>Таблиця</w:t>
+      </w:r>
+    </w:p>
+    <w:p>
+      <w:pPr>
+        <w:pStyle w:val="P1"/>
+        <w:rPr/>
+      </w:pPr>
+      <w:r>
+        <w:rPr/>
+      </w:r>
+    </w:p>
+    <w:tbl>
+      <w:tblPr>
+        <w:tblW w:w="7738" w:type="dxa"/>
+        <w:jc w:val="right"/>
+        <w:tblInd w:w="0" w:type="dxa"/>
+        <w:tblLayout w:type="fixed"/>
+        <w:tblCellMar>
+          <w:top w:w="55" w:type="dxa"/>
+          <w:left w:w="55" w:type="dxa"/>
+          <w:bottom w:w="55" w:type="dxa"/>
+          <w:right w:w="55" w:type="dxa"/>
+        </w:tblCellMar>
+      </w:tblPr>
+      <w:tblGrid>
+        <w:gridCol w:w="3122"/>
+        <w:gridCol w:w="2476"/>
+        <w:gridCol w:w="2140"/>
+      </w:tblGrid>
+      <w:tr>
+        <w:trPr/>
+        <w:tc>
+          <w:tcPr>
+            <w:tcW w:w="3122" w:type="dxa"/>
+            <w:tcBorders>
+              <w:top w:val="single" w:sz="4" w:space="0" w:color="000000"/>
+              <w:left w:val="single" w:sz="4" w:space="0" w:color="000000"/>
+              <w:bottom w:val="single" w:sz="4" w:space="0" w:color="000000"/>
+            </w:tcBorders>
+          </w:tcPr>
+          <w:p>
+            <w:pPr>
+              <w:pStyle w:val="Style14"/>
+              <w:ind w:hanging="0" w:left="0"/>
+              <w:rPr>
+                <w:b/>
+                <w:bCs/>
+              </w:rPr>
+            </w:pPr>
+            <w:r>
+              <w:rPr>
+                <w:b/>
+                <w:bCs/>
+              </w:rPr>
+              <w:t xml:space="preserve">Кількість процесорів, </w:t>
+            </w:r>
+            <w:r>
+              <w:rPr>
+                <w:b/>
+                <w:bCs/>
+                <w:lang w:val="en-US"/>
+              </w:rPr>
+              <w:t>p</w:t>
+            </w:r>
+          </w:p>
+        </w:tc>
+        <w:tc>
+          <w:tcPr>
+            <w:tcW w:w="2476" w:type="dxa"/>
+            <w:tcBorders>
+              <w:top w:val="single" w:sz="4" w:space="0" w:color="000000"/>
+              <w:left w:val="single" w:sz="4" w:space="0" w:color="000000"/>
+              <w:bottom w:val="single" w:sz="4" w:space="0" w:color="000000"/>
+            </w:tcBorders>
+          </w:tcPr>
+          <w:p>
+            <w:pPr>
+              <w:pStyle w:val="Style14"/>
+              <w:ind w:hanging="0" w:left="0"/>
+              <w:rPr>
+                <w:b/>
+                <w:bCs/>
+              </w:rPr>
+            </w:pPr>
+            <w:r>
+              <w:rPr>
+                <w:b/>
+                <w:bCs/>
+              </w:rPr>
+              <w:t xml:space="preserve">Час виконання, </w:t>
+            </w:r>
+            <w:r>
+              <w:rPr>
+                <w:b/>
+                <w:bCs/>
+                <w:lang w:val="en-US"/>
+              </w:rPr>
+              <w:t>T</w:t>
+            </w:r>
+            <w:r>
+              <w:rPr>
+                <w:b/>
+                <w:bCs/>
+                <w:vertAlign w:val="subscript"/>
+                <w:lang w:val="en-US"/>
+              </w:rPr>
+              <w:t>p</w:t>
+            </w:r>
+          </w:p>
+        </w:tc>
+        <w:tc>
+          <w:tcPr>
+            <w:tcW w:w="2140" w:type="dxa"/>
+            <w:tcBorders>
+              <w:top w:val="single" w:sz="4" w:space="0" w:color="000000"/>
+              <w:left w:val="single" w:sz="4" w:space="0" w:color="000000"/>
+              <w:bottom w:val="single" w:sz="4" w:space="0" w:color="000000"/>
+              <w:right w:val="single" w:sz="4" w:space="0" w:color="000000"/>
+            </w:tcBorders>
+          </w:tcPr>
+          <w:p>
+            <w:pPr>
+              <w:pStyle w:val="Style14"/>
+              <w:ind w:hanging="0" w:left="0"/>
+              <w:rPr>
+                <w:b/>
+                <w:bCs/>
+              </w:rPr>
+            </w:pPr>
+            <w:r>
+              <w:rPr>
+                <w:b/>
+                <w:bCs/>
+              </w:rPr>
+              <w:t xml:space="preserve">Прискорення, </w:t>
+            </w:r>
+            <w:r>
+              <w:rPr>
+                <w:b/>
+                <w:bCs/>
+                <w:lang w:val="en-US"/>
+              </w:rPr>
+              <w:t>S</w:t>
+            </w:r>
+          </w:p>
+        </w:tc>
+      </w:tr>
+      <w:tr>
+        <w:trPr/>
+        <w:tc>
+          <w:tcPr>
+            <w:tcW w:w="3122" w:type="dxa"/>
+            <w:tcBorders>
+              <w:left w:val="single" w:sz="4" w:space="0" w:color="000000"/>
+              <w:bottom w:val="single" w:sz="4" w:space="0" w:color="000000"/>
+            </w:tcBorders>
+          </w:tcPr>
+          <w:p>
+            <w:pPr>
+              <w:pStyle w:val="Style14"/>
+              <w:ind w:hanging="0" w:left="0"/>
+              <w:rPr>
+                <w:lang w:val="en-US"/>
+              </w:rPr>
+            </w:pPr>
+            <w:r>
+              <w:rPr>
+                <w:lang w:val="en-US"/>
+              </w:rPr>
+              <w:t>1</w:t>
+            </w:r>
+          </w:p>
+        </w:tc>
+        <w:tc>
+          <w:tcPr>
+            <w:tcW w:w="2476" w:type="dxa"/>
+            <w:tcBorders>
+              <w:left w:val="single" w:sz="4" w:space="0" w:color="000000"/>
+              <w:bottom w:val="single" w:sz="4" w:space="0" w:color="000000"/>
+            </w:tcBorders>
+          </w:tcPr>
+          <w:p>
+            <w:pPr>
+              <w:pStyle w:val="Style14"/>
+              <w:ind w:hanging="0" w:left="0"/>
+              <w:rPr/>
+            </w:pPr>
+            <w:r>
+              <w:rPr/>
+              <w:t>0.000225</w:t>
+            </w:r>
+          </w:p>
+        </w:tc>
+        <w:tc>
+          <w:tcPr>
+            <w:tcW w:w="2140" w:type="dxa"/>
+            <w:tcBorders>
+              <w:left w:val="single" w:sz="4" w:space="0" w:color="000000"/>
+              <w:bottom w:val="single" w:sz="4" w:space="0" w:color="000000"/>
+              <w:right w:val="single" w:sz="4" w:space="0" w:color="000000"/>
+            </w:tcBorders>
+          </w:tcPr>
+          <w:p>
+            <w:pPr>
+              <w:pStyle w:val="Style14"/>
+              <w:ind w:hanging="0" w:left="0"/>
+              <w:rPr>
+                <w:lang w:val="en-US"/>
+              </w:rPr>
+            </w:pPr>
+            <w:r>
+              <w:rPr>
+                <w:lang w:val="en-US"/>
+              </w:rPr>
+              <w:t>1</w:t>
+            </w:r>
+          </w:p>
+        </w:tc>
+      </w:tr>
+      <w:tr>
+        <w:trPr/>
+        <w:tc>
+          <w:tcPr>
+            <w:tcW w:w="3122" w:type="dxa"/>
+            <w:tcBorders>
+              <w:left w:val="single" w:sz="4" w:space="0" w:color="000000"/>
+              <w:bottom w:val="single" w:sz="4" w:space="0" w:color="000000"/>
+            </w:tcBorders>
+          </w:tcPr>
+          <w:p>
+            <w:pPr>
+              <w:pStyle w:val="Style14"/>
+              <w:ind w:hanging="0" w:left="0"/>
+              <w:rPr>
+                <w:lang w:val="en-US"/>
+              </w:rPr>
+            </w:pPr>
+            <w:r>
+              <w:rPr>
+                <w:lang w:val="en-US"/>
+              </w:rPr>
+              <w:t>2</w:t>
+            </w:r>
+          </w:p>
+        </w:tc>
+        <w:tc>
+          <w:tcPr>
+            <w:tcW w:w="2476" w:type="dxa"/>
+            <w:tcBorders>
+              <w:left w:val="single" w:sz="4" w:space="0" w:color="000000"/>
+              <w:bottom w:val="single" w:sz="4" w:space="0" w:color="000000"/>
+            </w:tcBorders>
+          </w:tcPr>
+          <w:p>
+            <w:pPr>
+              <w:pStyle w:val="Style14"/>
+              <w:ind w:hanging="0" w:left="0"/>
+              <w:rPr/>
+            </w:pPr>
+            <w:r>
+              <w:rPr/>
+              <w:t>0.000440</w:t>
+            </w:r>
+          </w:p>
+        </w:tc>
+        <w:tc>
+          <w:tcPr>
+            <w:tcW w:w="2140" w:type="dxa"/>
+            <w:tcBorders>
+              <w:left w:val="single" w:sz="4" w:space="0" w:color="000000"/>
+              <w:bottom w:val="single" w:sz="4" w:space="0" w:color="000000"/>
+              <w:right w:val="single" w:sz="4" w:space="0" w:color="000000"/>
+            </w:tcBorders>
+          </w:tcPr>
+          <w:p>
+            <w:pPr>
+              <w:pStyle w:val="Style14"/>
+              <w:ind w:hanging="0" w:left="0"/>
+              <w:rPr>
+                <w:lang w:val="en-US"/>
+              </w:rPr>
+            </w:pPr>
+            <w:r>
+              <w:rPr>
+                <w:lang w:val="en-US"/>
+              </w:rPr>
+              <w:t>0,511363636</w:t>
+            </w:r>
+          </w:p>
+        </w:tc>
+      </w:tr>
+      <w:tr>
+        <w:trPr/>
+        <w:tc>
+          <w:tcPr>
+            <w:tcW w:w="3122" w:type="dxa"/>
+            <w:tcBorders>
+              <w:left w:val="single" w:sz="4" w:space="0" w:color="000000"/>
+              <w:bottom w:val="single" w:sz="4" w:space="0" w:color="000000"/>
+            </w:tcBorders>
+          </w:tcPr>
+          <w:p>
+            <w:pPr>
+              <w:pStyle w:val="Style14"/>
+              <w:ind w:hanging="0" w:left="0"/>
+              <w:rPr>
+                <w:lang w:val="en-US"/>
+              </w:rPr>
+            </w:pPr>
+            <w:r>
+              <w:rPr>
+                <w:lang w:val="en-US"/>
+              </w:rPr>
+              <w:t>4</w:t>
+            </w:r>
+          </w:p>
+        </w:tc>
+        <w:tc>
+          <w:tcPr>
+            <w:tcW w:w="2476" w:type="dxa"/>
+            <w:tcBorders>
+              <w:left w:val="single" w:sz="4" w:space="0" w:color="000000"/>
+              <w:bottom w:val="single" w:sz="4" w:space="0" w:color="000000"/>
+            </w:tcBorders>
+          </w:tcPr>
+          <w:p>
+            <w:pPr>
+              <w:pStyle w:val="Style14"/>
+              <w:ind w:hanging="0" w:left="0"/>
+              <w:rPr/>
+            </w:pPr>
+            <w:r>
+              <w:rPr/>
+              <w:t>0.000832</w:t>
+            </w:r>
+          </w:p>
+        </w:tc>
+        <w:tc>
+          <w:tcPr>
+            <w:tcW w:w="2140" w:type="dxa"/>
+            <w:tcBorders>
+              <w:left w:val="single" w:sz="4" w:space="0" w:color="000000"/>
+              <w:bottom w:val="single" w:sz="4" w:space="0" w:color="000000"/>
+              <w:right w:val="single" w:sz="4" w:space="0" w:color="000000"/>
+            </w:tcBorders>
+          </w:tcPr>
+          <w:p>
+            <w:pPr>
+              <w:pStyle w:val="Style14"/>
+              <w:ind w:hanging="0" w:left="0"/>
+              <w:rPr>
+                <w:lang w:val="en-US"/>
+              </w:rPr>
+            </w:pPr>
+            <w:r>
+              <w:rPr>
+                <w:lang w:val="en-US"/>
+              </w:rPr>
+              <w:t>0,270432692</w:t>
+            </w:r>
+          </w:p>
+        </w:tc>
+      </w:tr>
+    </w:tbl>
+    <w:p>
+      <w:pPr>
+        <w:pStyle w:val="P1"/>
+        <w:rPr/>
+      </w:pPr>
+      <w:r>
+        <w:rPr/>
+      </w:r>
+    </w:p>
+    <w:p>
+      <w:pPr>
+        <w:pStyle w:val="H2"/>
+        <w:rPr/>
+      </w:pPr>
+      <w:r>
+        <w:rPr/>
+        <w:t>5.2.3.1</w:t>
+      </w:r>
+    </w:p>
+    <w:p>
+      <w:pPr>
+        <w:pStyle w:val="H3"/>
+        <w:rPr/>
+      </w:pPr>
+      <w:r>
+        <w:rPr/>
+        <w:t>Завдання</w:t>
+      </w:r>
+    </w:p>
+    <w:p>
+      <w:pPr>
+        <w:pStyle w:val="P1"/>
+        <w:rPr/>
+      </w:pPr>
+      <w:r>
+        <w:rPr/>
+      </w:r>
+    </w:p>
+    <w:p>
+      <w:pPr>
+        <w:pStyle w:val="P1"/>
+        <w:rPr/>
+      </w:pPr>
+      <w:r>
+        <w:rPr/>
+        <w:t>Розробити паралельну програму інтегрування методом Монте-Карло, використовуючи програму 5.3.</w:t>
+      </w:r>
+    </w:p>
+    <w:p>
+      <w:pPr>
+        <w:pStyle w:val="P1"/>
+        <w:rPr/>
+      </w:pPr>
+      <w:r>
+        <w:rPr/>
+      </w:r>
+    </w:p>
+    <w:p>
+      <w:pPr>
+        <w:pStyle w:val="P1"/>
+        <w:rPr/>
+      </w:pPr>
+      <w:r>
+        <w:rPr/>
+        <w:t>Код</w:t>
+      </w:r>
+    </w:p>
+    <w:p>
+      <w:pPr>
+        <w:pStyle w:val="P1"/>
+        <w:rPr/>
+      </w:pPr>
+      <w:r>
+        <w:rPr/>
+      </w:r>
+    </w:p>
+    <w:p>
+      <w:pPr>
+        <w:pStyle w:val="Code"/>
+        <w:rPr>
+          <w:rFonts w:ascii="Cascadia Code" w:hAnsi="Cascadia Code"/>
+        </w:rPr>
+      </w:pPr>
+      <w:r>
+        <w:rPr>
+          <w:rFonts w:ascii="Cascadia Code" w:hAnsi="Cascadia Code"/>
+        </w:rPr>
+        <w:t>import math</w:t>
+      </w:r>
+    </w:p>
+    <w:p>
+      <w:pPr>
+        <w:pStyle w:val="Code"/>
+        <w:rPr>
+          <w:rFonts w:ascii="Cascadia Code" w:hAnsi="Cascadia Code"/>
+        </w:rPr>
+      </w:pPr>
+      <w:r>
+        <w:rPr>
+          <w:rFonts w:ascii="Cascadia Code" w:hAnsi="Cascadia Code"/>
+        </w:rPr>
+        <w:t>import random</w:t>
+      </w:r>
+    </w:p>
+    <w:p>
+      <w:pPr>
+        <w:pStyle w:val="Code"/>
+        <w:rPr>
+          <w:rFonts w:ascii="Cascadia Code" w:hAnsi="Cascadia Code"/>
+        </w:rPr>
+      </w:pPr>
+      <w:r>
+        <w:rPr>
+          <w:rFonts w:ascii="Cascadia Code" w:hAnsi="Cascadia Code"/>
+        </w:rPr>
+        <w:t>import time</w:t>
+      </w:r>
+    </w:p>
+    <w:p>
+      <w:pPr>
+        <w:pStyle w:val="Code"/>
+        <w:rPr>
+          <w:rFonts w:ascii="Cascadia Code" w:hAnsi="Cascadia Code"/>
+        </w:rPr>
+      </w:pPr>
+      <w:r>
+        <w:rPr>
+          <w:rFonts w:ascii="Cascadia Code" w:hAnsi="Cascadia Code"/>
+        </w:rPr>
+        <w:t>from mpi4py import MPI</w:t>
+      </w:r>
+    </w:p>
+    <w:p>
+      <w:pPr>
+        <w:pStyle w:val="Code"/>
+        <w:rPr>
+          <w:rFonts w:ascii="Cascadia Code" w:hAnsi="Cascadia Code"/>
+        </w:rPr>
+      </w:pPr>
+      <w:r>
+        <w:rPr>
+          <w:rFonts w:ascii="Cascadia Code" w:hAnsi="Cascadia Code"/>
+        </w:rPr>
+      </w:r>
+    </w:p>
+    <w:p>
+      <w:pPr>
+        <w:pStyle w:val="Code"/>
+        <w:rPr>
+          <w:rFonts w:ascii="Cascadia Code" w:hAnsi="Cascadia Code"/>
+        </w:rPr>
+      </w:pPr>
+      <w:r>
+        <w:rPr>
+          <w:rFonts w:ascii="Cascadia Code" w:hAnsi="Cascadia Code"/>
+        </w:rPr>
+        <w:t>def f(x):</w:t>
+      </w:r>
+    </w:p>
+    <w:p>
+      <w:pPr>
+        <w:pStyle w:val="Code"/>
+        <w:rPr>
+          <w:rFonts w:ascii="Cascadia Code" w:hAnsi="Cascadia Code"/>
+        </w:rPr>
+      </w:pPr>
+      <w:r>
+        <w:rPr>
+          <w:rFonts w:ascii="Cascadia Code" w:hAnsi="Cascadia Code"/>
+        </w:rPr>
+        <w:t xml:space="preserve">    </w:t>
+      </w:r>
+      <w:r>
+        <w:rPr>
+          <w:rFonts w:ascii="Cascadia Code" w:hAnsi="Cascadia Code"/>
+        </w:rPr>
+        <w:t>return math.sin(x) ** 2</w:t>
+      </w:r>
+    </w:p>
+    <w:p>
+      <w:pPr>
+        <w:pStyle w:val="Code"/>
+        <w:rPr>
+          <w:rFonts w:ascii="Cascadia Code" w:hAnsi="Cascadia Code"/>
+        </w:rPr>
+      </w:pPr>
+      <w:r>
+        <w:rPr>
+          <w:rFonts w:ascii="Cascadia Code" w:hAnsi="Cascadia Code"/>
+        </w:rPr>
+      </w:r>
+    </w:p>
+    <w:p>
+      <w:pPr>
+        <w:pStyle w:val="Code"/>
+        <w:rPr>
+          <w:rFonts w:ascii="Cascadia Code" w:hAnsi="Cascadia Code"/>
+        </w:rPr>
+      </w:pPr>
+      <w:r>
+        <w:rPr>
+          <w:rFonts w:ascii="Cascadia Code" w:hAnsi="Cascadia Code"/>
+        </w:rPr>
+        <w:t>def main():</w:t>
+      </w:r>
+    </w:p>
+    <w:p>
+      <w:pPr>
+        <w:pStyle w:val="Code"/>
+        <w:rPr>
+          <w:rFonts w:ascii="Cascadia Code" w:hAnsi="Cascadia Code"/>
+        </w:rPr>
+      </w:pPr>
+      <w:r>
+        <w:rPr>
+          <w:rFonts w:ascii="Cascadia Code" w:hAnsi="Cascadia Code"/>
+        </w:rPr>
+        <w:t xml:space="preserve">    </w:t>
+      </w:r>
+      <w:r>
+        <w:rPr>
+          <w:rFonts w:ascii="Cascadia Code" w:hAnsi="Cascadia Code"/>
+        </w:rPr>
+        <w:t>comm = MPI.COMM_WORLD</w:t>
+      </w:r>
+    </w:p>
+    <w:p>
+      <w:pPr>
+        <w:pStyle w:val="Code"/>
+        <w:rPr>
+          <w:rFonts w:ascii="Cascadia Code" w:hAnsi="Cascadia Code"/>
+        </w:rPr>
+      </w:pPr>
+      <w:r>
+        <w:rPr>
+          <w:rFonts w:ascii="Cascadia Code" w:hAnsi="Cascadia Code"/>
+        </w:rPr>
+        <w:t xml:space="preserve">    </w:t>
+      </w:r>
+      <w:r>
+        <w:rPr>
+          <w:rFonts w:ascii="Cascadia Code" w:hAnsi="Cascadia Code"/>
+        </w:rPr>
+        <w:t>rank = comm.Get_rank()</w:t>
+      </w:r>
+    </w:p>
+    <w:p>
+      <w:pPr>
+        <w:pStyle w:val="Code"/>
+        <w:rPr>
+          <w:rFonts w:ascii="Cascadia Code" w:hAnsi="Cascadia Code"/>
+        </w:rPr>
+      </w:pPr>
+      <w:r>
+        <w:rPr>
+          <w:rFonts w:ascii="Cascadia Code" w:hAnsi="Cascadia Code"/>
+        </w:rPr>
+        <w:t xml:space="preserve">    </w:t>
+      </w:r>
+      <w:r>
+        <w:rPr>
+          <w:rFonts w:ascii="Cascadia Code" w:hAnsi="Cascadia Code"/>
+        </w:rPr>
+        <w:t>numprocs = comm.Get_size()</w:t>
+      </w:r>
+    </w:p>
+    <w:p>
+      <w:pPr>
+        <w:pStyle w:val="Code"/>
+        <w:rPr>
+          <w:rFonts w:ascii="Cascadia Code" w:hAnsi="Cascadia Code"/>
+        </w:rPr>
+      </w:pPr>
+      <w:r>
+        <w:rPr>
+          <w:rFonts w:ascii="Cascadia Code" w:hAnsi="Cascadia Code"/>
+        </w:rPr>
+      </w:r>
+    </w:p>
+    <w:p>
+      <w:pPr>
+        <w:pStyle w:val="Code"/>
+        <w:rPr>
+          <w:rFonts w:ascii="Cascadia Code" w:hAnsi="Cascadia Code"/>
+        </w:rPr>
+      </w:pPr>
+      <w:r>
+        <w:rPr>
+          <w:rFonts w:ascii="Cascadia Code" w:hAnsi="Cascadia Code"/>
+        </w:rPr>
+        <w:t xml:space="preserve">    </w:t>
+      </w:r>
+      <w:r>
+        <w:rPr>
+          <w:rFonts w:ascii="Cascadia Code" w:hAnsi="Cascadia Code"/>
+        </w:rPr>
+        <w:t>a = 0.0</w:t>
+      </w:r>
+    </w:p>
+    <w:p>
+      <w:pPr>
+        <w:pStyle w:val="Code"/>
+        <w:rPr>
+          <w:rFonts w:ascii="Cascadia Code" w:hAnsi="Cascadia Code"/>
+        </w:rPr>
+      </w:pPr>
+      <w:r>
+        <w:rPr>
+          <w:rFonts w:ascii="Cascadia Code" w:hAnsi="Cascadia Code"/>
+        </w:rPr>
+        <w:t xml:space="preserve">    </w:t>
+      </w:r>
+      <w:r>
+        <w:rPr>
+          <w:rFonts w:ascii="Cascadia Code" w:hAnsi="Cascadia Code"/>
+        </w:rPr>
+        <w:t>b = math.pi / 2</w:t>
+      </w:r>
+    </w:p>
+    <w:p>
+      <w:pPr>
+        <w:pStyle w:val="Code"/>
+        <w:rPr>
+          <w:rFonts w:ascii="Cascadia Code" w:hAnsi="Cascadia Code"/>
+        </w:rPr>
+      </w:pPr>
+      <w:r>
+        <w:rPr>
+          <w:rFonts w:ascii="Cascadia Code" w:hAnsi="Cascadia Code"/>
+        </w:rPr>
+        <w:t xml:space="preserve">    </w:t>
+      </w:r>
+      <w:r>
+        <w:rPr>
+          <w:rFonts w:ascii="Cascadia Code" w:hAnsi="Cascadia Code"/>
+        </w:rPr>
+        <w:t>N_total = 1_000_000_000</w:t>
+      </w:r>
+    </w:p>
+    <w:p>
+      <w:pPr>
+        <w:pStyle w:val="Code"/>
+        <w:rPr>
+          <w:rFonts w:ascii="Cascadia Code" w:hAnsi="Cascadia Code"/>
+        </w:rPr>
+      </w:pPr>
+      <w:r>
+        <w:rPr>
+          <w:rFonts w:ascii="Cascadia Code" w:hAnsi="Cascadia Code"/>
+        </w:rPr>
+        <w:t xml:space="preserve">    </w:t>
+      </w:r>
+      <w:r>
+        <w:rPr>
+          <w:rFonts w:ascii="Cascadia Code" w:hAnsi="Cascadia Code"/>
+        </w:rPr>
+        <w:t>n_per_procs = N_total // numprocs</w:t>
+      </w:r>
+    </w:p>
+    <w:p>
+      <w:pPr>
+        <w:pStyle w:val="Code"/>
+        <w:rPr>
+          <w:rFonts w:ascii="Cascadia Code" w:hAnsi="Cascadia Code"/>
+        </w:rPr>
+      </w:pPr>
+      <w:r>
+        <w:rPr>
+          <w:rFonts w:ascii="Cascadia Code" w:hAnsi="Cascadia Code"/>
+        </w:rPr>
+      </w:r>
+    </w:p>
+    <w:p>
+      <w:pPr>
+        <w:pStyle w:val="Code"/>
+        <w:rPr>
+          <w:rFonts w:ascii="Cascadia Code" w:hAnsi="Cascadia Code"/>
+        </w:rPr>
+      </w:pPr>
+      <w:r>
+        <w:rPr>
+          <w:rFonts w:ascii="Cascadia Code" w:hAnsi="Cascadia Code"/>
+        </w:rPr>
+        <w:t xml:space="preserve">    </w:t>
+      </w:r>
+      <w:r>
+        <w:rPr>
+          <w:rFonts w:ascii="Cascadia Code" w:hAnsi="Cascadia Code"/>
+        </w:rPr>
+        <w:t>reference = math.pi / 4</w:t>
+      </w:r>
+    </w:p>
+    <w:p>
+      <w:pPr>
+        <w:pStyle w:val="Code"/>
+        <w:rPr>
+          <w:rFonts w:ascii="Cascadia Code" w:hAnsi="Cascadia Code"/>
+        </w:rPr>
+      </w:pPr>
+      <w:r>
+        <w:rPr>
+          <w:rFonts w:ascii="Cascadia Code" w:hAnsi="Cascadia Code"/>
+        </w:rPr>
+        <w:t xml:space="preserve">    </w:t>
+      </w:r>
+      <w:r>
+        <w:rPr>
+          <w:rFonts w:ascii="Cascadia Code" w:hAnsi="Cascadia Code"/>
+        </w:rPr>
+        <w:t>local_sum = 0.0</w:t>
+      </w:r>
+    </w:p>
+    <w:p>
+      <w:pPr>
+        <w:pStyle w:val="Code"/>
+        <w:rPr>
+          <w:rFonts w:ascii="Cascadia Code" w:hAnsi="Cascadia Code"/>
+        </w:rPr>
+      </w:pPr>
+      <w:r>
+        <w:rPr>
+          <w:rFonts w:ascii="Cascadia Code" w:hAnsi="Cascadia Code"/>
+        </w:rPr>
+      </w:r>
+    </w:p>
+    <w:p>
+      <w:pPr>
+        <w:pStyle w:val="Code"/>
+        <w:rPr>
+          <w:rFonts w:ascii="Cascadia Code" w:hAnsi="Cascadia Code"/>
+        </w:rPr>
+      </w:pPr>
+      <w:r>
+        <w:rPr>
+          <w:rFonts w:ascii="Cascadia Code" w:hAnsi="Cascadia Code"/>
+        </w:rPr>
+        <w:t xml:space="preserve">    </w:t>
+      </w:r>
+      <w:r>
+        <w:rPr>
+          <w:rFonts w:ascii="Cascadia Code" w:hAnsi="Cascadia Code"/>
+        </w:rPr>
+        <w:t>start_time = MPI.Wtime()</w:t>
+      </w:r>
+    </w:p>
+    <w:p>
+      <w:pPr>
+        <w:pStyle w:val="Code"/>
+        <w:rPr>
+          <w:rFonts w:ascii="Cascadia Code" w:hAnsi="Cascadia Code"/>
+        </w:rPr>
+      </w:pPr>
+      <w:r>
+        <w:rPr>
+          <w:rFonts w:ascii="Cascadia Code" w:hAnsi="Cascadia Code"/>
+        </w:rPr>
+      </w:r>
+    </w:p>
+    <w:p>
+      <w:pPr>
+        <w:pStyle w:val="Code"/>
+        <w:rPr>
+          <w:rFonts w:ascii="Cascadia Code" w:hAnsi="Cascadia Code"/>
+        </w:rPr>
+      </w:pPr>
+      <w:r>
+        <w:rPr>
+          <w:rFonts w:ascii="Cascadia Code" w:hAnsi="Cascadia Code"/>
+        </w:rPr>
+        <w:t xml:space="preserve">    </w:t>
+      </w:r>
+      <w:r>
+        <w:rPr>
+          <w:rFonts w:ascii="Cascadia Code" w:hAnsi="Cascadia Code"/>
+        </w:rPr>
+        <w:t>random.seed(time.time() + rank)</w:t>
+      </w:r>
+    </w:p>
+    <w:p>
+      <w:pPr>
+        <w:pStyle w:val="Code"/>
+        <w:rPr>
+          <w:rFonts w:ascii="Cascadia Code" w:hAnsi="Cascadia Code"/>
+        </w:rPr>
+      </w:pPr>
+      <w:r>
+        <w:rPr>
+          <w:rFonts w:ascii="Cascadia Code" w:hAnsi="Cascadia Code"/>
+        </w:rPr>
+      </w:r>
+    </w:p>
+    <w:p>
+      <w:pPr>
+        <w:pStyle w:val="Code"/>
+        <w:rPr>
+          <w:rFonts w:ascii="Cascadia Code" w:hAnsi="Cascadia Code"/>
+        </w:rPr>
+      </w:pPr>
+      <w:r>
+        <w:rPr>
+          <w:rFonts w:ascii="Cascadia Code" w:hAnsi="Cascadia Code"/>
+        </w:rPr>
+        <w:t xml:space="preserve">    </w:t>
+      </w:r>
+      <w:r>
+        <w:rPr>
+          <w:rFonts w:ascii="Cascadia Code" w:hAnsi="Cascadia Code"/>
+        </w:rPr>
+        <w:t>for _ in range(n_per_procs):</w:t>
+      </w:r>
+    </w:p>
+    <w:p>
+      <w:pPr>
+        <w:pStyle w:val="Code"/>
+        <w:rPr>
+          <w:rFonts w:ascii="Cascadia Code" w:hAnsi="Cascadia Code"/>
+        </w:rPr>
+      </w:pPr>
+      <w:r>
+        <w:rPr>
+          <w:rFonts w:ascii="Cascadia Code" w:hAnsi="Cascadia Code"/>
+        </w:rPr>
+        <w:t xml:space="preserve">        </w:t>
+      </w:r>
+      <w:r>
+        <w:rPr>
+          <w:rFonts w:ascii="Cascadia Code" w:hAnsi="Cascadia Code"/>
+        </w:rPr>
+        <w:t>x = random.uniform(a, b)</w:t>
+      </w:r>
+    </w:p>
+    <w:p>
+      <w:pPr>
+        <w:pStyle w:val="Code"/>
+        <w:rPr>
+          <w:rFonts w:ascii="Cascadia Code" w:hAnsi="Cascadia Code"/>
+        </w:rPr>
+      </w:pPr>
+      <w:r>
+        <w:rPr>
+          <w:rFonts w:ascii="Cascadia Code" w:hAnsi="Cascadia Code"/>
+        </w:rPr>
+        <w:t xml:space="preserve">        </w:t>
+      </w:r>
+      <w:r>
+        <w:rPr>
+          <w:rFonts w:ascii="Cascadia Code" w:hAnsi="Cascadia Code"/>
+        </w:rPr>
+        <w:t>local_sum += f(x)</w:t>
+      </w:r>
+    </w:p>
+    <w:p>
+      <w:pPr>
+        <w:pStyle w:val="Code"/>
+        <w:rPr>
+          <w:rFonts w:ascii="Cascadia Code" w:hAnsi="Cascadia Code"/>
+        </w:rPr>
+      </w:pPr>
+      <w:r>
+        <w:rPr>
+          <w:rFonts w:ascii="Cascadia Code" w:hAnsi="Cascadia Code"/>
+        </w:rPr>
+      </w:r>
+    </w:p>
+    <w:p>
+      <w:pPr>
+        <w:pStyle w:val="Code"/>
+        <w:rPr>
+          <w:rFonts w:ascii="Cascadia Code" w:hAnsi="Cascadia Code"/>
+        </w:rPr>
+      </w:pPr>
+      <w:r>
+        <w:rPr>
+          <w:rFonts w:ascii="Cascadia Code" w:hAnsi="Cascadia Code"/>
+        </w:rPr>
+        <w:t xml:space="preserve">    </w:t>
+      </w:r>
+      <w:r>
+        <w:rPr>
+          <w:rFonts w:ascii="Cascadia Code" w:hAnsi="Cascadia Code"/>
+        </w:rPr>
+        <w:t>total_sum = comm.reduce(local_sum, op=MPI.SUM)</w:t>
+      </w:r>
+    </w:p>
+    <w:p>
+      <w:pPr>
+        <w:pStyle w:val="Code"/>
+        <w:rPr>
+          <w:rFonts w:ascii="Cascadia Code" w:hAnsi="Cascadia Code"/>
+        </w:rPr>
+      </w:pPr>
+      <w:r>
+        <w:rPr>
+          <w:rFonts w:ascii="Cascadia Code" w:hAnsi="Cascadia Code"/>
+        </w:rPr>
+        <w:t xml:space="preserve">    </w:t>
+      </w:r>
+      <w:r>
+        <w:rPr>
+          <w:rFonts w:ascii="Cascadia Code" w:hAnsi="Cascadia Code"/>
+        </w:rPr>
+        <w:t>end_time = MPI.Wtime()</w:t>
+      </w:r>
+    </w:p>
+    <w:p>
+      <w:pPr>
+        <w:pStyle w:val="Code"/>
+        <w:rPr>
+          <w:rFonts w:ascii="Cascadia Code" w:hAnsi="Cascadia Code"/>
+        </w:rPr>
+      </w:pPr>
+      <w:r>
+        <w:rPr>
+          <w:rFonts w:ascii="Cascadia Code" w:hAnsi="Cascadia Code"/>
+        </w:rPr>
+      </w:r>
+    </w:p>
+    <w:p>
+      <w:pPr>
+        <w:pStyle w:val="Code"/>
+        <w:rPr>
+          <w:rFonts w:ascii="Cascadia Code" w:hAnsi="Cascadia Code"/>
+        </w:rPr>
+      </w:pPr>
+      <w:r>
+        <w:rPr>
+          <w:rFonts w:ascii="Cascadia Code" w:hAnsi="Cascadia Code"/>
+        </w:rPr>
+        <w:t xml:space="preserve">    </w:t>
+      </w:r>
+      <w:r>
+        <w:rPr>
+          <w:rFonts w:ascii="Cascadia Code" w:hAnsi="Cascadia Code"/>
+        </w:rPr>
+        <w:t>if rank == 0:</w:t>
+      </w:r>
+    </w:p>
+    <w:p>
+      <w:pPr>
+        <w:pStyle w:val="Code"/>
+        <w:rPr>
+          <w:rFonts w:ascii="Cascadia Code" w:hAnsi="Cascadia Code"/>
+        </w:rPr>
+      </w:pPr>
+      <w:r>
+        <w:rPr>
+          <w:rFonts w:ascii="Cascadia Code" w:hAnsi="Cascadia Code"/>
+        </w:rPr>
+        <w:t xml:space="preserve">        </w:t>
+      </w:r>
+      <w:r>
+        <w:rPr>
+          <w:rFonts w:ascii="Cascadia Code" w:hAnsi="Cascadia Code"/>
+        </w:rPr>
+        <w:t>integral_mc = ((b - a) * total_sum) / N_total</w:t>
+      </w:r>
+    </w:p>
+    <w:p>
+      <w:pPr>
+        <w:pStyle w:val="Code"/>
+        <w:rPr>
+          <w:rFonts w:ascii="Cascadia Code" w:hAnsi="Cascadia Code"/>
+        </w:rPr>
+      </w:pPr>
+      <w:r>
+        <w:rPr>
+          <w:rFonts w:ascii="Cascadia Code" w:hAnsi="Cascadia Code"/>
+        </w:rPr>
+        <w:t xml:space="preserve">        </w:t>
+      </w:r>
+      <w:r>
+        <w:rPr>
+          <w:rFonts w:ascii="Cascadia Code" w:hAnsi="Cascadia Code"/>
+        </w:rPr>
+        <w:t>error = abs(reference - integral_mc)</w:t>
+      </w:r>
+    </w:p>
+    <w:p>
+      <w:pPr>
+        <w:pStyle w:val="Code"/>
+        <w:rPr>
+          <w:rFonts w:ascii="Cascadia Code" w:hAnsi="Cascadia Code"/>
+        </w:rPr>
+      </w:pPr>
+      <w:r>
+        <w:rPr>
+          <w:rFonts w:ascii="Cascadia Code" w:hAnsi="Cascadia Code"/>
+        </w:rPr>
+      </w:r>
+    </w:p>
+    <w:p>
+      <w:pPr>
+        <w:pStyle w:val="Code"/>
+        <w:rPr>
+          <w:rFonts w:ascii="Cascadia Code" w:hAnsi="Cascadia Code"/>
+        </w:rPr>
+      </w:pPr>
+      <w:r>
+        <w:rPr>
+          <w:rFonts w:ascii="Cascadia Code" w:hAnsi="Cascadia Code"/>
+        </w:rPr>
+        <w:t xml:space="preserve">        </w:t>
+      </w:r>
+      <w:r>
+        <w:rPr>
+          <w:rFonts w:ascii="Cascadia Code" w:hAnsi="Cascadia Code"/>
+        </w:rPr>
+        <w:t>print(f"Result: {integral_mc:.16f}")</w:t>
+      </w:r>
+    </w:p>
+    <w:p>
+      <w:pPr>
+        <w:pStyle w:val="Code"/>
+        <w:rPr>
+          <w:rFonts w:ascii="Cascadia Code" w:hAnsi="Cascadia Code"/>
+        </w:rPr>
+      </w:pPr>
+      <w:r>
+        <w:rPr>
+          <w:rFonts w:ascii="Cascadia Code" w:hAnsi="Cascadia Code"/>
+        </w:rPr>
+        <w:t xml:space="preserve">        </w:t>
+      </w:r>
+      <w:r>
+        <w:rPr>
+          <w:rFonts w:ascii="Cascadia Code" w:hAnsi="Cascadia Code"/>
+        </w:rPr>
+        <w:t>print(f"Accurate number: {reference:.16f}")</w:t>
+      </w:r>
+    </w:p>
+    <w:p>
+      <w:pPr>
+        <w:pStyle w:val="Code"/>
+        <w:rPr>
+          <w:rFonts w:ascii="Cascadia Code" w:hAnsi="Cascadia Code"/>
+        </w:rPr>
+      </w:pPr>
+      <w:r>
+        <w:rPr>
+          <w:rFonts w:ascii="Cascadia Code" w:hAnsi="Cascadia Code"/>
+        </w:rPr>
+        <w:t xml:space="preserve">        </w:t>
+      </w:r>
+      <w:r>
+        <w:rPr>
+          <w:rFonts w:ascii="Cascadia Code" w:hAnsi="Cascadia Code"/>
+        </w:rPr>
+        <w:t>print(f"Error: {error:.15f}")</w:t>
+      </w:r>
+    </w:p>
+    <w:p>
+      <w:pPr>
+        <w:pStyle w:val="Code"/>
+        <w:rPr>
+          <w:rFonts w:ascii="Cascadia Code" w:hAnsi="Cascadia Code"/>
+        </w:rPr>
+      </w:pPr>
+      <w:r>
+        <w:rPr>
+          <w:rFonts w:ascii="Cascadia Code" w:hAnsi="Cascadia Code"/>
+        </w:rPr>
+        <w:t xml:space="preserve">        </w:t>
+      </w:r>
+      <w:r>
+        <w:rPr>
+          <w:rFonts w:ascii="Cascadia Code" w:hAnsi="Cascadia Code"/>
+        </w:rPr>
+        <w:t>print(f"Execution time: {end_time - start_time:.4f} sec")</w:t>
+      </w:r>
+    </w:p>
+    <w:p>
+      <w:pPr>
+        <w:pStyle w:val="Code"/>
+        <w:rPr>
+          <w:rFonts w:ascii="Cascadia Code" w:hAnsi="Cascadia Code"/>
+        </w:rPr>
+      </w:pPr>
+      <w:r>
+        <w:rPr>
+          <w:rFonts w:ascii="Cascadia Code" w:hAnsi="Cascadia Code"/>
+        </w:rPr>
+      </w:r>
+    </w:p>
+    <w:p>
+      <w:pPr>
+        <w:pStyle w:val="Code"/>
+        <w:rPr>
+          <w:rFonts w:ascii="Cascadia Code" w:hAnsi="Cascadia Code"/>
+        </w:rPr>
+      </w:pPr>
+      <w:r>
+        <w:rPr>
+          <w:rFonts w:ascii="Cascadia Code" w:hAnsi="Cascadia Code"/>
+        </w:rPr>
+        <w:t>if __name__ == "__main__":</w:t>
+      </w:r>
+    </w:p>
+    <w:p>
+      <w:pPr>
+        <w:pStyle w:val="Code"/>
+        <w:rPr>
+          <w:rFonts w:ascii="Cascadia Code" w:hAnsi="Cascadia Code"/>
+        </w:rPr>
+      </w:pPr>
+      <w:r>
+        <w:rPr>
+          <w:rFonts w:ascii="Cascadia Code" w:hAnsi="Cascadia Code"/>
+        </w:rPr>
+        <w:t xml:space="preserve">    </w:t>
+      </w:r>
+      <w:r>
+        <w:rPr>
+          <w:rFonts w:ascii="Cascadia Code" w:hAnsi="Cascadia Code"/>
+        </w:rPr>
+        <w:t>main()</w:t>
+      </w:r>
+    </w:p>
+    <w:p>
+      <w:pPr>
+        <w:pStyle w:val="P1"/>
+        <w:rPr/>
+      </w:pPr>
+      <w:r>
+        <w:rPr/>
+      </w:r>
+    </w:p>
+    <w:p>
+      <w:pPr>
+        <w:pStyle w:val="H3"/>
+        <w:rPr/>
+      </w:pPr>
+      <w:r>
+        <w:rPr/>
+        <w:t>Результати</w:t>
+      </w:r>
+    </w:p>
+    <w:p>
+      <w:pPr>
+        <w:pStyle w:val="P1"/>
+        <w:rPr/>
+      </w:pPr>
+      <w:r>
+        <w:rPr/>
+      </w:r>
+    </w:p>
+    <w:p>
+      <w:pPr>
+        <w:pStyle w:val="Code"/>
+        <w:rPr>
+          <w:rFonts w:ascii="Cascadia Code" w:hAnsi="Cascadia Code"/>
+        </w:rPr>
+      </w:pPr>
+      <w:r>
+        <w:rPr>
+          <w:rFonts w:ascii="Cascadia Code" w:hAnsi="Cascadia Code"/>
+        </w:rPr>
+        <w:t>Result: 0.7854164765012532</w:t>
+      </w:r>
+    </w:p>
+    <w:p>
+      <w:pPr>
+        <w:pStyle w:val="Code"/>
+        <w:rPr>
+          <w:rFonts w:ascii="Cascadia Code" w:hAnsi="Cascadia Code"/>
+        </w:rPr>
+      </w:pPr>
+      <w:r>
+        <w:rPr>
+          <w:rFonts w:ascii="Cascadia Code" w:hAnsi="Cascadia Code"/>
+        </w:rPr>
+        <w:t>Accurate number: 0.7853981633974483</w:t>
+      </w:r>
+    </w:p>
+    <w:p>
+      <w:pPr>
+        <w:pStyle w:val="Code"/>
+        <w:rPr>
+          <w:rFonts w:ascii="Cascadia Code" w:hAnsi="Cascadia Code"/>
+        </w:rPr>
+      </w:pPr>
+      <w:r>
+        <w:rPr>
+          <w:rFonts w:ascii="Cascadia Code" w:hAnsi="Cascadia Code"/>
+        </w:rPr>
+        <w:t>Error: 0.000018313103805</w:t>
+      </w:r>
+    </w:p>
+    <w:p>
+      <w:pPr>
+        <w:pStyle w:val="Code"/>
+        <w:rPr>
+          <w:rFonts w:ascii="Cascadia Code" w:hAnsi="Cascadia Code"/>
+        </w:rPr>
+      </w:pPr>
+      <w:r>
+        <w:rPr>
+          <w:rFonts w:ascii="Cascadia Code" w:hAnsi="Cascadia Code"/>
+        </w:rPr>
+        <w:t>Execution time: 53.4747 sec</w:t>
+      </w:r>
+    </w:p>
+    <w:p>
+      <w:pPr>
+        <w:pStyle w:val="P1"/>
+        <w:rPr>
+          <w:rFonts w:ascii="Cascadia Code" w:hAnsi="Cascadia Code"/>
+        </w:rPr>
+      </w:pPr>
+      <w:r>
+        <w:rPr>
+          <w:rFonts w:ascii="Cascadia Code" w:hAnsi="Cascadia Code"/>
+        </w:rPr>
+      </w:r>
+    </w:p>
+    <w:p>
+      <w:pPr>
+        <w:pStyle w:val="P1"/>
+        <w:rPr>
+          <w:rFonts w:ascii="Cascadia Code" w:hAnsi="Cascadia Code"/>
+        </w:rPr>
+      </w:pPr>
+      <w:r>
+        <w:rPr>
+          <w:rFonts w:ascii="Cascadia Code" w:hAnsi="Cascadia Code"/>
+        </w:rPr>
       </w:r>
     </w:p>
     <w:p>
@@ -10188,12 +11675,12 @@
       <w:lang w:val="en-US" w:eastAsia="uk-UA"/>
     </w:rPr>
   </w:style>
-  <w:style w:type="character" w:styleId="Style12">
-    <w:name w:val="Символ нумерації"/>
+  <w:style w:type="character" w:styleId="user">
+    <w:name w:val="Символ нумерації (user)"/>
     <w:qFormat/>
     <w:rPr/>
   </w:style>
-  <w:style w:type="paragraph" w:styleId="Style13">
+  <w:style w:type="paragraph" w:styleId="Style12">
     <w:name w:val="Заголовок"/>
     <w:basedOn w:val="Normal"/>
     <w:next w:val="BodyText"/>
@@ -10203,7 +11690,7 @@
       <w:spacing w:before="240" w:after="120"/>
     </w:pPr>
     <w:rPr>
-      <w:rFonts w:ascii="Liberation Sans" w:hAnsi="Liberation Sans" w:eastAsia="Microsoft YaHei" w:cs="Lucida Sans"/>
+      <w:rFonts w:ascii="Liberation Sans" w:hAnsi="Liberation Sans" w:eastAsia="Microsoft YaHei" w:cs="Arial Unicode MS"/>
       <w:sz w:val="28"/>
       <w:szCs w:val="28"/>
     </w:rPr>
@@ -10240,8 +11727,34 @@
       <w:szCs w:val="24"/>
     </w:rPr>
   </w:style>
-  <w:style w:type="paragraph" w:styleId="Style14">
+  <w:style w:type="paragraph" w:styleId="Style13">
     <w:name w:val="Покажчик"/>
+    <w:basedOn w:val="Normal"/>
+    <w:qFormat/>
+    <w:pPr>
+      <w:suppressLineNumbers/>
+    </w:pPr>
+    <w:rPr>
+      <w:rFonts w:cs="Arial Unicode MS"/>
+    </w:rPr>
+  </w:style>
+  <w:style w:type="paragraph" w:styleId="user1">
+    <w:name w:val="Заголовок (user)"/>
+    <w:basedOn w:val="Normal"/>
+    <w:next w:val="BodyText"/>
+    <w:qFormat/>
+    <w:pPr>
+      <w:keepNext w:val="true"/>
+      <w:spacing w:before="240" w:after="120"/>
+    </w:pPr>
+    <w:rPr>
+      <w:rFonts w:ascii="Liberation Sans" w:hAnsi="Liberation Sans" w:eastAsia="Microsoft YaHei" w:cs="Lucida Sans"/>
+      <w:sz w:val="28"/>
+      <w:szCs w:val="28"/>
+    </w:rPr>
+  </w:style>
+  <w:style w:type="paragraph" w:styleId="user2">
+    <w:name w:val="Покажчик (user)"/>
     <w:basedOn w:val="Normal"/>
     <w:qFormat/>
     <w:pPr>
@@ -10251,35 +11764,9 @@
       <w:rFonts w:cs="Lucida Sans"/>
     </w:rPr>
   </w:style>
-  <w:style w:type="paragraph" w:styleId="user">
-    <w:name w:val="Заголовок (user)"/>
-    <w:basedOn w:val="Normal"/>
-    <w:next w:val="BodyText"/>
-    <w:qFormat/>
-    <w:pPr>
-      <w:keepNext w:val="true"/>
-      <w:spacing w:before="240" w:after="120"/>
-    </w:pPr>
-    <w:rPr>
-      <w:rFonts w:ascii="Liberation Sans" w:hAnsi="Liberation Sans" w:eastAsia="Microsoft YaHei" w:cs="Arial Unicode MS"/>
-      <w:sz w:val="28"/>
-      <w:szCs w:val="28"/>
-    </w:rPr>
-  </w:style>
-  <w:style w:type="paragraph" w:styleId="user1">
-    <w:name w:val="Покажчик (user)"/>
-    <w:basedOn w:val="Normal"/>
-    <w:qFormat/>
-    <w:pPr>
-      <w:suppressLineNumbers/>
-    </w:pPr>
-    <w:rPr>
-      <w:rFonts w:cs="Arial Unicode MS"/>
-    </w:rPr>
-  </w:style>
   <w:style w:type="paragraph" w:styleId="IndexHeading">
     <w:name w:val="index heading"/>
-    <w:basedOn w:val="user"/>
+    <w:basedOn w:val="Style12"/>
     <w:pPr/>
     <w:rPr/>
   </w:style>
@@ -10559,7 +12046,17 @@
     </w:pPr>
     <w:rPr/>
   </w:style>
-  <w:style w:type="paragraph" w:styleId="user2">
+  <w:style w:type="paragraph" w:styleId="Style14">
+    <w:name w:val="Вміст таблиці"/>
+    <w:basedOn w:val="Normal"/>
+    <w:qFormat/>
+    <w:pPr>
+      <w:widowControl w:val="false"/>
+      <w:suppressLineNumbers/>
+    </w:pPr>
+    <w:rPr/>
+  </w:style>
+  <w:style w:type="paragraph" w:styleId="user3">
     <w:name w:val="Вміст таблиці (user)"/>
     <w:basedOn w:val="Normal"/>
     <w:qFormat/>
@@ -10570,18 +12067,8 @@
     <w:rPr/>
   </w:style>
   <w:style w:type="paragraph" w:styleId="Style15">
-    <w:name w:val="Вміст таблиці"/>
-    <w:basedOn w:val="Normal"/>
-    <w:qFormat/>
-    <w:pPr>
-      <w:widowControl w:val="false"/>
-      <w:suppressLineNumbers/>
-    </w:pPr>
-    <w:rPr/>
-  </w:style>
-  <w:style w:type="paragraph" w:styleId="user3">
-    <w:name w:val="Заголовок таблиці (user)"/>
-    <w:basedOn w:val="user2"/>
+    <w:name w:val="Заголовок таблиці"/>
+    <w:basedOn w:val="Style14"/>
     <w:qFormat/>
     <w:pPr>
       <w:suppressLineNumbers/>
@@ -10592,8 +12079,8 @@
       <w:bCs/>
     </w:rPr>
   </w:style>
-  <w:style w:type="paragraph" w:styleId="user4">
-    <w:name w:val="Верхній і нижній колонтитули (user)"/>
+  <w:style w:type="paragraph" w:styleId="Style16">
+    <w:name w:val="Верхній і нижній колонтитули"/>
     <w:basedOn w:val="Normal"/>
     <w:qFormat/>
     <w:pPr>
@@ -10606,8 +12093,8 @@
     </w:pPr>
     <w:rPr/>
   </w:style>
-  <w:style w:type="paragraph" w:styleId="Style16">
-    <w:name w:val="Верхній і нижній колонтитули"/>
+  <w:style w:type="paragraph" w:styleId="user4">
+    <w:name w:val="Верхній і нижній колонтитули (user)"/>
     <w:basedOn w:val="Normal"/>
     <w:qFormat/>
     <w:pPr/>
@@ -10615,7 +12102,7 @@
   </w:style>
   <w:style w:type="paragraph" w:styleId="Footer">
     <w:name w:val="footer"/>
-    <w:basedOn w:val="user4"/>
+    <w:basedOn w:val="Style16"/>
     <w:pPr>
       <w:suppressLineNumbers/>
     </w:pPr>
@@ -10623,7 +12110,7 @@
   </w:style>
   <w:style w:type="paragraph" w:styleId="Header">
     <w:name w:val="header"/>
-    <w:basedOn w:val="Style16"/>
+    <w:basedOn w:val="user4"/>
     <w:pPr>
       <w:suppressLineNumbers/>
       <w:tabs>
@@ -10634,9 +12121,9 @@
     </w:pPr>
     <w:rPr/>
   </w:style>
-  <w:style w:type="paragraph" w:styleId="Style17">
-    <w:name w:val="Заголовок таблиці"/>
-    <w:basedOn w:val="Style15"/>
+  <w:style w:type="paragraph" w:styleId="user5">
+    <w:name w:val="Заголовок таблиці (user)"/>
+    <w:basedOn w:val="user3"/>
     <w:qFormat/>
     <w:pPr>
       <w:suppressLineNumbers/>
@@ -10647,8 +12134,8 @@
       <w:bCs/>
     </w:rPr>
   </w:style>
-  <w:style w:type="numbering" w:styleId="user5" w:default="1">
-    <w:name w:val="Без маркерів (user)"/>
+  <w:style w:type="numbering" w:styleId="Style17" w:default="1">
+    <w:name w:val="Без маркерів"/>
     <w:uiPriority w:val="99"/>
     <w:semiHidden/>
     <w:unhideWhenUsed/>

</xml_diff>

<commit_message>
feat -- TR5: doing the control questions, Jesus thank you!
</commit_message>
<xml_diff>
--- a/42TR Tehnologiji Rozpodilenyh System/5/TR_KNT-122_Onyshchenko_19_PR5.docx
+++ b/42TR Tehnologiji Rozpodilenyh System/5/TR_KNT-122_Onyshchenko_19_PR5.docx
@@ -1051,6 +1051,67 @@
           <w:lang w:val="en-US"/>
         </w:rPr>
         <w:t>5.2.3.1 Розробити паралельну програму інтегрування методом Монте-Карло, використовуючи програму 5.3.</w:t>
+      </w:r>
+    </w:p>
+    <w:p>
+      <w:pPr>
+        <w:pStyle w:val="p11"/>
+        <w:rPr>
+          <w:lang w:val="en-US"/>
+        </w:rPr>
+      </w:pPr>
+      <w:r>
+        <w:rPr>
+          <w:lang w:val="en-US"/>
+        </w:rPr>
+        <w:t>5.2.3.3 Виконати наступні варіанти завдання.</w:t>
+      </w:r>
+    </w:p>
+    <w:p>
+      <w:pPr>
+        <w:pStyle w:val="img1"/>
+        <w:rPr/>
+      </w:pPr>
+      <w:r>
+        <w:rPr/>
+        <w:drawing>
+          <wp:inline distT="0" distB="0" distL="0" distR="0">
+            <wp:extent cx="6645910" cy="397510"/>
+            <wp:effectExtent l="0" t="0" r="0" b="0"/>
+            <wp:docPr id="7" name="Зображення7"/>
+            <wp:cNvGraphicFramePr>
+              <a:graphicFrameLocks xmlns:a="http://schemas.openxmlformats.org/drawingml/2006/main" noChangeAspect="1"/>
+            </wp:cNvGraphicFramePr>
+            <a:graphic xmlns:a="http://schemas.openxmlformats.org/drawingml/2006/main">
+              <a:graphicData uri="http://schemas.openxmlformats.org/drawingml/2006/picture">
+                <pic:pic xmlns:pic="http://schemas.openxmlformats.org/drawingml/2006/picture">
+                  <pic:nvPicPr>
+                    <pic:cNvPr id="7" name="Зображення7"/>
+                    <pic:cNvPicPr>
+                      <a:picLocks noChangeAspect="1" noChangeArrowheads="1"/>
+                    </pic:cNvPicPr>
+                  </pic:nvPicPr>
+                  <pic:blipFill>
+                    <a:blip r:embed="rId8"/>
+                    <a:stretch>
+                      <a:fillRect/>
+                    </a:stretch>
+                  </pic:blipFill>
+                  <pic:spPr bwMode="auto">
+                    <a:xfrm>
+                      <a:off x="0" y="0"/>
+                      <a:ext cx="6645910" cy="397510"/>
+                    </a:xfrm>
+                    <a:prstGeom prst="rect">
+                      <a:avLst/>
+                    </a:prstGeom>
+                    <a:noFill/>
+                  </pic:spPr>
+                </pic:pic>
+              </a:graphicData>
+            </a:graphic>
+          </wp:inline>
+        </w:drawing>
       </w:r>
     </w:p>
     <w:p>
@@ -4164,7 +4225,7 @@
             <wp:extent cx="1438275" cy="466725"/>
             <wp:effectExtent l="0" t="0" r="0" b="0"/>
             <wp:wrapSquare wrapText="largest"/>
-            <wp:docPr id="7" name="Зображення1 копія 1"/>
+            <wp:docPr id="8" name="Зображення1 копія 1"/>
             <wp:cNvGraphicFramePr>
               <a:graphicFrameLocks xmlns:a="http://schemas.openxmlformats.org/drawingml/2006/main" noChangeAspect="1"/>
             </wp:cNvGraphicFramePr>
@@ -4172,13 +4233,13 @@
               <a:graphicData uri="http://schemas.openxmlformats.org/drawingml/2006/picture">
                 <pic:pic xmlns:pic="http://schemas.openxmlformats.org/drawingml/2006/picture">
                   <pic:nvPicPr>
-                    <pic:cNvPr id="7" name="Зображення1 копія 1"/>
+                    <pic:cNvPr id="8" name="Зображення1 копія 1"/>
                     <pic:cNvPicPr>
                       <a:picLocks noChangeAspect="1" noChangeArrowheads="1"/>
                     </pic:cNvPicPr>
                   </pic:nvPicPr>
                   <pic:blipFill>
-                    <a:blip r:embed="rId8"/>
+                    <a:blip r:embed="rId9"/>
                     <a:stretch>
                       <a:fillRect/>
                     </a:stretch>
@@ -5176,7 +5237,7 @@
           <wp:inline distT="0" distB="0" distL="0" distR="0">
             <wp:extent cx="3057525" cy="857250"/>
             <wp:effectExtent l="0" t="0" r="0" b="0"/>
-            <wp:docPr id="8" name="Зображення2 копія 1"/>
+            <wp:docPr id="9" name="Зображення2 копія 1"/>
             <wp:cNvGraphicFramePr>
               <a:graphicFrameLocks xmlns:a="http://schemas.openxmlformats.org/drawingml/2006/main" noChangeAspect="1"/>
             </wp:cNvGraphicFramePr>
@@ -5184,13 +5245,13 @@
               <a:graphicData uri="http://schemas.openxmlformats.org/drawingml/2006/picture">
                 <pic:pic xmlns:pic="http://schemas.openxmlformats.org/drawingml/2006/picture">
                   <pic:nvPicPr>
-                    <pic:cNvPr id="8" name="Зображення2 копія 1"/>
+                    <pic:cNvPr id="9" name="Зображення2 копія 1"/>
                     <pic:cNvPicPr>
                       <a:picLocks noChangeAspect="1" noChangeArrowheads="1"/>
                     </pic:cNvPicPr>
                   </pic:nvPicPr>
                   <pic:blipFill>
-                    <a:blip r:embed="rId9"/>
+                    <a:blip r:embed="rId10"/>
                     <a:stretch>
                       <a:fillRect/>
                     </a:stretch>
@@ -5234,7 +5295,7 @@
             <wp:extent cx="342900" cy="381000"/>
             <wp:effectExtent l="0" t="0" r="0" b="0"/>
             <wp:wrapSquare wrapText="largest"/>
-            <wp:docPr id="9" name="Зображення3 копія 1"/>
+            <wp:docPr id="10" name="Зображення3 копія 1"/>
             <wp:cNvGraphicFramePr>
               <a:graphicFrameLocks xmlns:a="http://schemas.openxmlformats.org/drawingml/2006/main" noChangeAspect="1"/>
             </wp:cNvGraphicFramePr>
@@ -5242,13 +5303,13 @@
               <a:graphicData uri="http://schemas.openxmlformats.org/drawingml/2006/picture">
                 <pic:pic xmlns:pic="http://schemas.openxmlformats.org/drawingml/2006/picture">
                   <pic:nvPicPr>
-                    <pic:cNvPr id="9" name="Зображення3 копія 1"/>
+                    <pic:cNvPr id="10" name="Зображення3 копія 1"/>
                     <pic:cNvPicPr>
                       <a:picLocks noChangeAspect="1" noChangeArrowheads="1"/>
                     </pic:cNvPicPr>
                   </pic:nvPicPr>
                   <pic:blipFill>
-                    <a:blip r:embed="rId10"/>
+                    <a:blip r:embed="rId11"/>
                     <a:stretch>
                       <a:fillRect/>
                     </a:stretch>
@@ -5291,7 +5352,7 @@
           <wp:inline distT="0" distB="0" distL="0" distR="0">
             <wp:extent cx="3886835" cy="1000125"/>
             <wp:effectExtent l="0" t="0" r="0" b="0"/>
-            <wp:docPr id="10" name="Зображення4 копія 1"/>
+            <wp:docPr id="11" name="Зображення4 копія 1"/>
             <wp:cNvGraphicFramePr>
               <a:graphicFrameLocks xmlns:a="http://schemas.openxmlformats.org/drawingml/2006/main" noChangeAspect="1"/>
             </wp:cNvGraphicFramePr>
@@ -5299,13 +5360,13 @@
               <a:graphicData uri="http://schemas.openxmlformats.org/drawingml/2006/picture">
                 <pic:pic xmlns:pic="http://schemas.openxmlformats.org/drawingml/2006/picture">
                   <pic:nvPicPr>
-                    <pic:cNvPr id="10" name="Зображення4 копія 1"/>
+                    <pic:cNvPr id="11" name="Зображення4 копія 1"/>
                     <pic:cNvPicPr>
                       <a:picLocks noChangeAspect="1" noChangeArrowheads="1"/>
                     </pic:cNvPicPr>
                   </pic:nvPicPr>
                   <pic:blipFill>
-                    <a:blip r:embed="rId11"/>
+                    <a:blip r:embed="rId12"/>
                     <a:stretch>
                       <a:fillRect/>
                     </a:stretch>
@@ -6921,7 +6982,7 @@
           <wp:inline distT="0" distB="0" distL="0" distR="0">
             <wp:extent cx="2105025" cy="409575"/>
             <wp:effectExtent l="0" t="0" r="0" b="0"/>
-            <wp:docPr id="11" name="Зображення5 копія 1"/>
+            <wp:docPr id="12" name="Зображення5 копія 1"/>
             <wp:cNvGraphicFramePr>
               <a:graphicFrameLocks xmlns:a="http://schemas.openxmlformats.org/drawingml/2006/main" noChangeAspect="1"/>
             </wp:cNvGraphicFramePr>
@@ -6929,13 +6990,13 @@
               <a:graphicData uri="http://schemas.openxmlformats.org/drawingml/2006/picture">
                 <pic:pic xmlns:pic="http://schemas.openxmlformats.org/drawingml/2006/picture">
                   <pic:nvPicPr>
-                    <pic:cNvPr id="11" name="Зображення5 копія 1"/>
+                    <pic:cNvPr id="12" name="Зображення5 копія 1"/>
                     <pic:cNvPicPr>
                       <a:picLocks noChangeAspect="1" noChangeArrowheads="1"/>
                     </pic:cNvPicPr>
                   </pic:nvPicPr>
                   <pic:blipFill>
-                    <a:blip r:embed="rId12"/>
+                    <a:blip r:embed="rId13"/>
                     <a:stretch>
                       <a:fillRect/>
                     </a:stretch>
@@ -7950,7 +8011,7 @@
           <wp:inline distT="0" distB="0" distL="0" distR="0">
             <wp:extent cx="1143000" cy="590550"/>
             <wp:effectExtent l="0" t="0" r="0" b="0"/>
-            <wp:docPr id="12" name="Зображення6 копія 1"/>
+            <wp:docPr id="13" name="Зображення6 копія 1"/>
             <wp:cNvGraphicFramePr>
               <a:graphicFrameLocks xmlns:a="http://schemas.openxmlformats.org/drawingml/2006/main" noChangeAspect="1"/>
             </wp:cNvGraphicFramePr>
@@ -7958,13 +8019,13 @@
               <a:graphicData uri="http://schemas.openxmlformats.org/drawingml/2006/picture">
                 <pic:pic xmlns:pic="http://schemas.openxmlformats.org/drawingml/2006/picture">
                   <pic:nvPicPr>
-                    <pic:cNvPr id="12" name="Зображення6 копія 1"/>
+                    <pic:cNvPr id="13" name="Зображення6 копія 1"/>
                     <pic:cNvPicPr>
                       <a:picLocks noChangeAspect="1" noChangeArrowheads="1"/>
                     </pic:cNvPicPr>
                   </pic:nvPicPr>
                   <pic:blipFill>
-                    <a:blip r:embed="rId13"/>
+                    <a:blip r:embed="rId14"/>
                     <a:stretch>
                       <a:fillRect/>
                     </a:stretch>
@@ -9198,7 +9259,7 @@
     </w:p>
     <w:p>
       <w:pPr>
-        <w:pStyle w:val="p11"/>
+        <w:pStyle w:val="H3"/>
         <w:rPr/>
       </w:pPr>
       <w:r>
@@ -9509,7 +9570,7 @@
     </w:p>
     <w:tbl>
       <w:tblPr>
-        <w:tblW w:w="7738" w:type="dxa"/>
+        <w:tblW w:w="6689" w:type="dxa"/>
         <w:jc w:val="right"/>
         <w:tblInd w:w="0" w:type="dxa"/>
         <w:tblLayout w:type="fixed"/>
@@ -9521,15 +9582,15 @@
         </w:tblCellMar>
       </w:tblPr>
       <w:tblGrid>
-        <w:gridCol w:w="3122"/>
-        <w:gridCol w:w="2476"/>
-        <w:gridCol w:w="2140"/>
+        <w:gridCol w:w="2695"/>
+        <w:gridCol w:w="2141"/>
+        <w:gridCol w:w="1853"/>
       </w:tblGrid>
       <w:tr>
         <w:trPr/>
         <w:tc>
           <w:tcPr>
-            <w:tcW w:w="3122" w:type="dxa"/>
+            <w:tcW w:w="2695" w:type="dxa"/>
             <w:tcBorders>
               <w:top w:val="single" w:sz="4" w:space="0" w:color="000000"/>
               <w:left w:val="single" w:sz="4" w:space="0" w:color="000000"/>
@@ -9540,15 +9601,20 @@
             <w:pPr>
               <w:pStyle w:val="Style14"/>
               <w:ind w:hanging="0" w:left="0"/>
+              <w:jc w:val="left"/>
               <w:rPr>
                 <w:b/>
                 <w:bCs/>
+                <w:sz w:val="24"/>
+                <w:szCs w:val="24"/>
               </w:rPr>
             </w:pPr>
             <w:r>
               <w:rPr>
                 <w:b/>
                 <w:bCs/>
+                <w:sz w:val="24"/>
+                <w:szCs w:val="24"/>
               </w:rPr>
               <w:t xml:space="preserve">Кількість процесорів, </w:t>
             </w:r>
@@ -9556,6 +9622,8 @@
               <w:rPr>
                 <w:b/>
                 <w:bCs/>
+                <w:sz w:val="24"/>
+                <w:szCs w:val="24"/>
                 <w:lang w:val="en-US"/>
               </w:rPr>
               <w:t>p</w:t>
@@ -9564,7 +9632,7 @@
         </w:tc>
         <w:tc>
           <w:tcPr>
-            <w:tcW w:w="2476" w:type="dxa"/>
+            <w:tcW w:w="2141" w:type="dxa"/>
             <w:tcBorders>
               <w:top w:val="single" w:sz="4" w:space="0" w:color="000000"/>
               <w:left w:val="single" w:sz="4" w:space="0" w:color="000000"/>
@@ -9575,15 +9643,20 @@
             <w:pPr>
               <w:pStyle w:val="Style14"/>
               <w:ind w:hanging="0" w:left="0"/>
+              <w:jc w:val="left"/>
               <w:rPr>
                 <w:b/>
                 <w:bCs/>
+                <w:sz w:val="24"/>
+                <w:szCs w:val="24"/>
               </w:rPr>
             </w:pPr>
             <w:r>
               <w:rPr>
                 <w:b/>
                 <w:bCs/>
+                <w:sz w:val="24"/>
+                <w:szCs w:val="24"/>
               </w:rPr>
               <w:t xml:space="preserve">Час виконання, </w:t>
             </w:r>
@@ -9591,6 +9664,8 @@
               <w:rPr>
                 <w:b/>
                 <w:bCs/>
+                <w:sz w:val="24"/>
+                <w:szCs w:val="24"/>
                 <w:lang w:val="en-US"/>
               </w:rPr>
               <w:t>T</w:t>
@@ -9599,6 +9674,8 @@
               <w:rPr>
                 <w:b/>
                 <w:bCs/>
+                <w:sz w:val="24"/>
+                <w:szCs w:val="24"/>
                 <w:vertAlign w:val="subscript"/>
                 <w:lang w:val="en-US"/>
               </w:rPr>
@@ -9608,7 +9685,7 @@
         </w:tc>
         <w:tc>
           <w:tcPr>
-            <w:tcW w:w="2140" w:type="dxa"/>
+            <w:tcW w:w="1853" w:type="dxa"/>
             <w:tcBorders>
               <w:top w:val="single" w:sz="4" w:space="0" w:color="000000"/>
               <w:left w:val="single" w:sz="4" w:space="0" w:color="000000"/>
@@ -9620,15 +9697,20 @@
             <w:pPr>
               <w:pStyle w:val="Style14"/>
               <w:ind w:hanging="0" w:left="0"/>
+              <w:jc w:val="left"/>
               <w:rPr>
                 <w:b/>
                 <w:bCs/>
+                <w:sz w:val="24"/>
+                <w:szCs w:val="24"/>
               </w:rPr>
             </w:pPr>
             <w:r>
               <w:rPr>
                 <w:b/>
                 <w:bCs/>
+                <w:sz w:val="24"/>
+                <w:szCs w:val="24"/>
               </w:rPr>
               <w:t xml:space="preserve">Прискорення, </w:t>
             </w:r>
@@ -9636,6 +9718,8 @@
               <w:rPr>
                 <w:b/>
                 <w:bCs/>
+                <w:sz w:val="24"/>
+                <w:szCs w:val="24"/>
                 <w:lang w:val="en-US"/>
               </w:rPr>
               <w:t>S</w:t>
@@ -9647,7 +9731,7 @@
         <w:trPr/>
         <w:tc>
           <w:tcPr>
-            <w:tcW w:w="3122" w:type="dxa"/>
+            <w:tcW w:w="2695" w:type="dxa"/>
             <w:tcBorders>
               <w:left w:val="single" w:sz="4" w:space="0" w:color="000000"/>
               <w:bottom w:val="single" w:sz="4" w:space="0" w:color="000000"/>
@@ -9657,12 +9741,17 @@
             <w:pPr>
               <w:pStyle w:val="Style14"/>
               <w:ind w:hanging="0" w:left="0"/>
+              <w:jc w:val="left"/>
               <w:rPr>
+                <w:sz w:val="24"/>
+                <w:szCs w:val="24"/>
                 <w:lang w:val="en-US"/>
               </w:rPr>
             </w:pPr>
             <w:r>
               <w:rPr>
+                <w:sz w:val="24"/>
+                <w:szCs w:val="24"/>
                 <w:lang w:val="en-US"/>
               </w:rPr>
               <w:t>1</w:t>
@@ -9671,7 +9760,7 @@
         </w:tc>
         <w:tc>
           <w:tcPr>
-            <w:tcW w:w="2476" w:type="dxa"/>
+            <w:tcW w:w="2141" w:type="dxa"/>
             <w:tcBorders>
               <w:left w:val="single" w:sz="4" w:space="0" w:color="000000"/>
               <w:bottom w:val="single" w:sz="4" w:space="0" w:color="000000"/>
@@ -9681,17 +9770,24 @@
             <w:pPr>
               <w:pStyle w:val="Style14"/>
               <w:ind w:hanging="0" w:left="0"/>
-              <w:rPr/>
+              <w:jc w:val="left"/>
+              <w:rPr>
+                <w:sz w:val="24"/>
+                <w:szCs w:val="24"/>
+              </w:rPr>
             </w:pPr>
             <w:r>
-              <w:rPr/>
+              <w:rPr>
+                <w:sz w:val="24"/>
+                <w:szCs w:val="24"/>
+              </w:rPr>
               <w:t>0.000225</w:t>
             </w:r>
           </w:p>
         </w:tc>
         <w:tc>
           <w:tcPr>
-            <w:tcW w:w="2140" w:type="dxa"/>
+            <w:tcW w:w="1853" w:type="dxa"/>
             <w:tcBorders>
               <w:left w:val="single" w:sz="4" w:space="0" w:color="000000"/>
               <w:bottom w:val="single" w:sz="4" w:space="0" w:color="000000"/>
@@ -9702,12 +9798,17 @@
             <w:pPr>
               <w:pStyle w:val="Style14"/>
               <w:ind w:hanging="0" w:left="0"/>
+              <w:jc w:val="left"/>
               <w:rPr>
+                <w:sz w:val="24"/>
+                <w:szCs w:val="24"/>
                 <w:lang w:val="en-US"/>
               </w:rPr>
             </w:pPr>
             <w:r>
               <w:rPr>
+                <w:sz w:val="24"/>
+                <w:szCs w:val="24"/>
                 <w:lang w:val="en-US"/>
               </w:rPr>
               <w:t>1</w:t>
@@ -9719,7 +9820,7 @@
         <w:trPr/>
         <w:tc>
           <w:tcPr>
-            <w:tcW w:w="3122" w:type="dxa"/>
+            <w:tcW w:w="2695" w:type="dxa"/>
             <w:tcBorders>
               <w:left w:val="single" w:sz="4" w:space="0" w:color="000000"/>
               <w:bottom w:val="single" w:sz="4" w:space="0" w:color="000000"/>
@@ -9729,12 +9830,17 @@
             <w:pPr>
               <w:pStyle w:val="Style14"/>
               <w:ind w:hanging="0" w:left="0"/>
+              <w:jc w:val="left"/>
               <w:rPr>
+                <w:sz w:val="24"/>
+                <w:szCs w:val="24"/>
                 <w:lang w:val="en-US"/>
               </w:rPr>
             </w:pPr>
             <w:r>
               <w:rPr>
+                <w:sz w:val="24"/>
+                <w:szCs w:val="24"/>
                 <w:lang w:val="en-US"/>
               </w:rPr>
               <w:t>2</w:t>
@@ -9743,7 +9849,7 @@
         </w:tc>
         <w:tc>
           <w:tcPr>
-            <w:tcW w:w="2476" w:type="dxa"/>
+            <w:tcW w:w="2141" w:type="dxa"/>
             <w:tcBorders>
               <w:left w:val="single" w:sz="4" w:space="0" w:color="000000"/>
               <w:bottom w:val="single" w:sz="4" w:space="0" w:color="000000"/>
@@ -9753,17 +9859,24 @@
             <w:pPr>
               <w:pStyle w:val="Style14"/>
               <w:ind w:hanging="0" w:left="0"/>
-              <w:rPr/>
+              <w:jc w:val="left"/>
+              <w:rPr>
+                <w:sz w:val="24"/>
+                <w:szCs w:val="24"/>
+              </w:rPr>
             </w:pPr>
             <w:r>
-              <w:rPr/>
+              <w:rPr>
+                <w:sz w:val="24"/>
+                <w:szCs w:val="24"/>
+              </w:rPr>
               <w:t>0.000440</w:t>
             </w:r>
           </w:p>
         </w:tc>
         <w:tc>
           <w:tcPr>
-            <w:tcW w:w="2140" w:type="dxa"/>
+            <w:tcW w:w="1853" w:type="dxa"/>
             <w:tcBorders>
               <w:left w:val="single" w:sz="4" w:space="0" w:color="000000"/>
               <w:bottom w:val="single" w:sz="4" w:space="0" w:color="000000"/>
@@ -9774,12 +9887,17 @@
             <w:pPr>
               <w:pStyle w:val="Style14"/>
               <w:ind w:hanging="0" w:left="0"/>
+              <w:jc w:val="left"/>
               <w:rPr>
+                <w:sz w:val="24"/>
+                <w:szCs w:val="24"/>
                 <w:lang w:val="en-US"/>
               </w:rPr>
             </w:pPr>
             <w:r>
               <w:rPr>
+                <w:sz w:val="24"/>
+                <w:szCs w:val="24"/>
                 <w:lang w:val="en-US"/>
               </w:rPr>
               <w:t>0,511363636</w:t>
@@ -9791,7 +9909,7 @@
         <w:trPr/>
         <w:tc>
           <w:tcPr>
-            <w:tcW w:w="3122" w:type="dxa"/>
+            <w:tcW w:w="2695" w:type="dxa"/>
             <w:tcBorders>
               <w:left w:val="single" w:sz="4" w:space="0" w:color="000000"/>
               <w:bottom w:val="single" w:sz="4" w:space="0" w:color="000000"/>
@@ -9801,12 +9919,17 @@
             <w:pPr>
               <w:pStyle w:val="Style14"/>
               <w:ind w:hanging="0" w:left="0"/>
+              <w:jc w:val="left"/>
               <w:rPr>
+                <w:sz w:val="24"/>
+                <w:szCs w:val="24"/>
                 <w:lang w:val="en-US"/>
               </w:rPr>
             </w:pPr>
             <w:r>
               <w:rPr>
+                <w:sz w:val="24"/>
+                <w:szCs w:val="24"/>
                 <w:lang w:val="en-US"/>
               </w:rPr>
               <w:t>4</w:t>
@@ -9815,7 +9938,7 @@
         </w:tc>
         <w:tc>
           <w:tcPr>
-            <w:tcW w:w="2476" w:type="dxa"/>
+            <w:tcW w:w="2141" w:type="dxa"/>
             <w:tcBorders>
               <w:left w:val="single" w:sz="4" w:space="0" w:color="000000"/>
               <w:bottom w:val="single" w:sz="4" w:space="0" w:color="000000"/>
@@ -9825,17 +9948,24 @@
             <w:pPr>
               <w:pStyle w:val="Style14"/>
               <w:ind w:hanging="0" w:left="0"/>
-              <w:rPr/>
+              <w:jc w:val="left"/>
+              <w:rPr>
+                <w:sz w:val="24"/>
+                <w:szCs w:val="24"/>
+              </w:rPr>
             </w:pPr>
             <w:r>
-              <w:rPr/>
+              <w:rPr>
+                <w:sz w:val="24"/>
+                <w:szCs w:val="24"/>
+              </w:rPr>
               <w:t>0.000832</w:t>
             </w:r>
           </w:p>
         </w:tc>
         <w:tc>
           <w:tcPr>
-            <w:tcW w:w="2140" w:type="dxa"/>
+            <w:tcW w:w="1853" w:type="dxa"/>
             <w:tcBorders>
               <w:left w:val="single" w:sz="4" w:space="0" w:color="000000"/>
               <w:bottom w:val="single" w:sz="4" w:space="0" w:color="000000"/>
@@ -9846,12 +9976,17 @@
             <w:pPr>
               <w:pStyle w:val="Style14"/>
               <w:ind w:hanging="0" w:left="0"/>
+              <w:jc w:val="left"/>
               <w:rPr>
+                <w:sz w:val="24"/>
+                <w:szCs w:val="24"/>
                 <w:lang w:val="en-US"/>
               </w:rPr>
             </w:pPr>
             <w:r>
               <w:rPr>
+                <w:sz w:val="24"/>
+                <w:szCs w:val="24"/>
                 <w:lang w:val="en-US"/>
               </w:rPr>
               <w:t>0,270432692</w:t>
@@ -9919,781 +10054,2178 @@
     </w:p>
     <w:p>
       <w:pPr>
+        <w:pStyle w:val="H3"/>
+        <w:rPr/>
+      </w:pPr>
+      <w:r>
+        <w:rPr/>
+        <w:t>Код</w:t>
+      </w:r>
+    </w:p>
+    <w:p>
+      <w:pPr>
         <w:pStyle w:val="P1"/>
         <w:rPr/>
       </w:pPr>
       <w:r>
         <w:rPr/>
+      </w:r>
+    </w:p>
+    <w:p>
+      <w:pPr>
+        <w:pStyle w:val="Code"/>
+        <w:rPr>
+          <w:rFonts w:ascii="Cascadia Code" w:hAnsi="Cascadia Code"/>
+        </w:rPr>
+      </w:pPr>
+      <w:r>
+        <w:rPr>
+          <w:rFonts w:ascii="Cascadia Code" w:hAnsi="Cascadia Code"/>
+        </w:rPr>
+        <w:t>import math</w:t>
+      </w:r>
+    </w:p>
+    <w:p>
+      <w:pPr>
+        <w:pStyle w:val="Code"/>
+        <w:rPr>
+          <w:rFonts w:ascii="Cascadia Code" w:hAnsi="Cascadia Code"/>
+        </w:rPr>
+      </w:pPr>
+      <w:r>
+        <w:rPr>
+          <w:rFonts w:ascii="Cascadia Code" w:hAnsi="Cascadia Code"/>
+        </w:rPr>
+        <w:t>import random</w:t>
+      </w:r>
+    </w:p>
+    <w:p>
+      <w:pPr>
+        <w:pStyle w:val="Code"/>
+        <w:rPr>
+          <w:rFonts w:ascii="Cascadia Code" w:hAnsi="Cascadia Code"/>
+        </w:rPr>
+      </w:pPr>
+      <w:r>
+        <w:rPr>
+          <w:rFonts w:ascii="Cascadia Code" w:hAnsi="Cascadia Code"/>
+        </w:rPr>
+        <w:t>import time</w:t>
+      </w:r>
+    </w:p>
+    <w:p>
+      <w:pPr>
+        <w:pStyle w:val="Code"/>
+        <w:rPr>
+          <w:rFonts w:ascii="Cascadia Code" w:hAnsi="Cascadia Code"/>
+        </w:rPr>
+      </w:pPr>
+      <w:r>
+        <w:rPr>
+          <w:rFonts w:ascii="Cascadia Code" w:hAnsi="Cascadia Code"/>
+        </w:rPr>
+        <w:t>from mpi4py import MPI</w:t>
+      </w:r>
+    </w:p>
+    <w:p>
+      <w:pPr>
+        <w:pStyle w:val="Code"/>
+        <w:rPr>
+          <w:rFonts w:ascii="Cascadia Code" w:hAnsi="Cascadia Code"/>
+        </w:rPr>
+      </w:pPr>
+      <w:r>
+        <w:rPr>
+          <w:rFonts w:ascii="Cascadia Code" w:hAnsi="Cascadia Code"/>
+        </w:rPr>
+      </w:r>
+    </w:p>
+    <w:p>
+      <w:pPr>
+        <w:pStyle w:val="Code"/>
+        <w:rPr>
+          <w:rFonts w:ascii="Cascadia Code" w:hAnsi="Cascadia Code"/>
+        </w:rPr>
+      </w:pPr>
+      <w:r>
+        <w:rPr>
+          <w:rFonts w:ascii="Cascadia Code" w:hAnsi="Cascadia Code"/>
+        </w:rPr>
+        <w:t>def f(x):</w:t>
+      </w:r>
+    </w:p>
+    <w:p>
+      <w:pPr>
+        <w:pStyle w:val="Code"/>
+        <w:rPr>
+          <w:rFonts w:ascii="Cascadia Code" w:hAnsi="Cascadia Code"/>
+        </w:rPr>
+      </w:pPr>
+      <w:r>
+        <w:rPr>
+          <w:rFonts w:ascii="Cascadia Code" w:hAnsi="Cascadia Code"/>
+        </w:rPr>
+        <w:t xml:space="preserve">    </w:t>
+      </w:r>
+      <w:r>
+        <w:rPr>
+          <w:rFonts w:ascii="Cascadia Code" w:hAnsi="Cascadia Code"/>
+        </w:rPr>
+        <w:t>return math.sin(x) ** 2</w:t>
+      </w:r>
+    </w:p>
+    <w:p>
+      <w:pPr>
+        <w:pStyle w:val="Code"/>
+        <w:rPr>
+          <w:rFonts w:ascii="Cascadia Code" w:hAnsi="Cascadia Code"/>
+        </w:rPr>
+      </w:pPr>
+      <w:r>
+        <w:rPr>
+          <w:rFonts w:ascii="Cascadia Code" w:hAnsi="Cascadia Code"/>
+        </w:rPr>
+      </w:r>
+    </w:p>
+    <w:p>
+      <w:pPr>
+        <w:pStyle w:val="Code"/>
+        <w:rPr>
+          <w:rFonts w:ascii="Cascadia Code" w:hAnsi="Cascadia Code"/>
+        </w:rPr>
+      </w:pPr>
+      <w:r>
+        <w:rPr>
+          <w:rFonts w:ascii="Cascadia Code" w:hAnsi="Cascadia Code"/>
+        </w:rPr>
+        <w:t>def main():</w:t>
+      </w:r>
+    </w:p>
+    <w:p>
+      <w:pPr>
+        <w:pStyle w:val="Code"/>
+        <w:rPr>
+          <w:rFonts w:ascii="Cascadia Code" w:hAnsi="Cascadia Code"/>
+        </w:rPr>
+      </w:pPr>
+      <w:r>
+        <w:rPr>
+          <w:rFonts w:ascii="Cascadia Code" w:hAnsi="Cascadia Code"/>
+        </w:rPr>
+        <w:t xml:space="preserve">    </w:t>
+      </w:r>
+      <w:r>
+        <w:rPr>
+          <w:rFonts w:ascii="Cascadia Code" w:hAnsi="Cascadia Code"/>
+        </w:rPr>
+        <w:t>comm = MPI.COMM_WORLD</w:t>
+      </w:r>
+    </w:p>
+    <w:p>
+      <w:pPr>
+        <w:pStyle w:val="Code"/>
+        <w:rPr>
+          <w:rFonts w:ascii="Cascadia Code" w:hAnsi="Cascadia Code"/>
+        </w:rPr>
+      </w:pPr>
+      <w:r>
+        <w:rPr>
+          <w:rFonts w:ascii="Cascadia Code" w:hAnsi="Cascadia Code"/>
+        </w:rPr>
+        <w:t xml:space="preserve">    </w:t>
+      </w:r>
+      <w:r>
+        <w:rPr>
+          <w:rFonts w:ascii="Cascadia Code" w:hAnsi="Cascadia Code"/>
+        </w:rPr>
+        <w:t>rank = comm.Get_rank()</w:t>
+      </w:r>
+    </w:p>
+    <w:p>
+      <w:pPr>
+        <w:pStyle w:val="Code"/>
+        <w:rPr>
+          <w:rFonts w:ascii="Cascadia Code" w:hAnsi="Cascadia Code"/>
+        </w:rPr>
+      </w:pPr>
+      <w:r>
+        <w:rPr>
+          <w:rFonts w:ascii="Cascadia Code" w:hAnsi="Cascadia Code"/>
+        </w:rPr>
+        <w:t xml:space="preserve">    </w:t>
+      </w:r>
+      <w:r>
+        <w:rPr>
+          <w:rFonts w:ascii="Cascadia Code" w:hAnsi="Cascadia Code"/>
+        </w:rPr>
+        <w:t>numprocs = comm.Get_size()</w:t>
+      </w:r>
+    </w:p>
+    <w:p>
+      <w:pPr>
+        <w:pStyle w:val="Code"/>
+        <w:rPr>
+          <w:rFonts w:ascii="Cascadia Code" w:hAnsi="Cascadia Code"/>
+        </w:rPr>
+      </w:pPr>
+      <w:r>
+        <w:rPr>
+          <w:rFonts w:ascii="Cascadia Code" w:hAnsi="Cascadia Code"/>
+        </w:rPr>
+      </w:r>
+    </w:p>
+    <w:p>
+      <w:pPr>
+        <w:pStyle w:val="Code"/>
+        <w:rPr>
+          <w:rFonts w:ascii="Cascadia Code" w:hAnsi="Cascadia Code"/>
+        </w:rPr>
+      </w:pPr>
+      <w:r>
+        <w:rPr>
+          <w:rFonts w:ascii="Cascadia Code" w:hAnsi="Cascadia Code"/>
+        </w:rPr>
+        <w:t xml:space="preserve">    </w:t>
+      </w:r>
+      <w:r>
+        <w:rPr>
+          <w:rFonts w:ascii="Cascadia Code" w:hAnsi="Cascadia Code"/>
+        </w:rPr>
+        <w:t>a = 0.0</w:t>
+      </w:r>
+    </w:p>
+    <w:p>
+      <w:pPr>
+        <w:pStyle w:val="Code"/>
+        <w:rPr>
+          <w:rFonts w:ascii="Cascadia Code" w:hAnsi="Cascadia Code"/>
+        </w:rPr>
+      </w:pPr>
+      <w:r>
+        <w:rPr>
+          <w:rFonts w:ascii="Cascadia Code" w:hAnsi="Cascadia Code"/>
+        </w:rPr>
+        <w:t xml:space="preserve">    </w:t>
+      </w:r>
+      <w:r>
+        <w:rPr>
+          <w:rFonts w:ascii="Cascadia Code" w:hAnsi="Cascadia Code"/>
+        </w:rPr>
+        <w:t>b = math.pi / 2</w:t>
+      </w:r>
+    </w:p>
+    <w:p>
+      <w:pPr>
+        <w:pStyle w:val="Code"/>
+        <w:rPr>
+          <w:rFonts w:ascii="Cascadia Code" w:hAnsi="Cascadia Code"/>
+        </w:rPr>
+      </w:pPr>
+      <w:r>
+        <w:rPr>
+          <w:rFonts w:ascii="Cascadia Code" w:hAnsi="Cascadia Code"/>
+        </w:rPr>
+        <w:t xml:space="preserve">    </w:t>
+      </w:r>
+      <w:r>
+        <w:rPr>
+          <w:rFonts w:ascii="Cascadia Code" w:hAnsi="Cascadia Code"/>
+        </w:rPr>
+        <w:t>N_total = 1_000_000_000</w:t>
+      </w:r>
+    </w:p>
+    <w:p>
+      <w:pPr>
+        <w:pStyle w:val="Code"/>
+        <w:rPr>
+          <w:rFonts w:ascii="Cascadia Code" w:hAnsi="Cascadia Code"/>
+        </w:rPr>
+      </w:pPr>
+      <w:r>
+        <w:rPr>
+          <w:rFonts w:ascii="Cascadia Code" w:hAnsi="Cascadia Code"/>
+        </w:rPr>
+        <w:t xml:space="preserve">    </w:t>
+      </w:r>
+      <w:r>
+        <w:rPr>
+          <w:rFonts w:ascii="Cascadia Code" w:hAnsi="Cascadia Code"/>
+        </w:rPr>
+        <w:t>n_per_procs = N_total // numprocs</w:t>
+      </w:r>
+    </w:p>
+    <w:p>
+      <w:pPr>
+        <w:pStyle w:val="Code"/>
+        <w:rPr>
+          <w:rFonts w:ascii="Cascadia Code" w:hAnsi="Cascadia Code"/>
+        </w:rPr>
+      </w:pPr>
+      <w:r>
+        <w:rPr>
+          <w:rFonts w:ascii="Cascadia Code" w:hAnsi="Cascadia Code"/>
+        </w:rPr>
+      </w:r>
+    </w:p>
+    <w:p>
+      <w:pPr>
+        <w:pStyle w:val="Code"/>
+        <w:rPr>
+          <w:rFonts w:ascii="Cascadia Code" w:hAnsi="Cascadia Code"/>
+        </w:rPr>
+      </w:pPr>
+      <w:r>
+        <w:rPr>
+          <w:rFonts w:ascii="Cascadia Code" w:hAnsi="Cascadia Code"/>
+        </w:rPr>
+        <w:t xml:space="preserve">    </w:t>
+      </w:r>
+      <w:r>
+        <w:rPr>
+          <w:rFonts w:ascii="Cascadia Code" w:hAnsi="Cascadia Code"/>
+        </w:rPr>
+        <w:t>reference = math.pi / 4</w:t>
+      </w:r>
+    </w:p>
+    <w:p>
+      <w:pPr>
+        <w:pStyle w:val="Code"/>
+        <w:rPr>
+          <w:rFonts w:ascii="Cascadia Code" w:hAnsi="Cascadia Code"/>
+        </w:rPr>
+      </w:pPr>
+      <w:r>
+        <w:rPr>
+          <w:rFonts w:ascii="Cascadia Code" w:hAnsi="Cascadia Code"/>
+        </w:rPr>
+        <w:t xml:space="preserve">    </w:t>
+      </w:r>
+      <w:r>
+        <w:rPr>
+          <w:rFonts w:ascii="Cascadia Code" w:hAnsi="Cascadia Code"/>
+        </w:rPr>
+        <w:t>local_sum = 0.0</w:t>
+      </w:r>
+    </w:p>
+    <w:p>
+      <w:pPr>
+        <w:pStyle w:val="Code"/>
+        <w:rPr>
+          <w:rFonts w:ascii="Cascadia Code" w:hAnsi="Cascadia Code"/>
+        </w:rPr>
+      </w:pPr>
+      <w:r>
+        <w:rPr>
+          <w:rFonts w:ascii="Cascadia Code" w:hAnsi="Cascadia Code"/>
+        </w:rPr>
+      </w:r>
+    </w:p>
+    <w:p>
+      <w:pPr>
+        <w:pStyle w:val="Code"/>
+        <w:rPr>
+          <w:rFonts w:ascii="Cascadia Code" w:hAnsi="Cascadia Code"/>
+        </w:rPr>
+      </w:pPr>
+      <w:r>
+        <w:rPr>
+          <w:rFonts w:ascii="Cascadia Code" w:hAnsi="Cascadia Code"/>
+        </w:rPr>
+        <w:t xml:space="preserve">    </w:t>
+      </w:r>
+      <w:r>
+        <w:rPr>
+          <w:rFonts w:ascii="Cascadia Code" w:hAnsi="Cascadia Code"/>
+        </w:rPr>
+        <w:t>start_time = MPI.Wtime()</w:t>
+      </w:r>
+    </w:p>
+    <w:p>
+      <w:pPr>
+        <w:pStyle w:val="Code"/>
+        <w:rPr>
+          <w:rFonts w:ascii="Cascadia Code" w:hAnsi="Cascadia Code"/>
+        </w:rPr>
+      </w:pPr>
+      <w:r>
+        <w:rPr>
+          <w:rFonts w:ascii="Cascadia Code" w:hAnsi="Cascadia Code"/>
+        </w:rPr>
+      </w:r>
+    </w:p>
+    <w:p>
+      <w:pPr>
+        <w:pStyle w:val="Code"/>
+        <w:rPr>
+          <w:rFonts w:ascii="Cascadia Code" w:hAnsi="Cascadia Code"/>
+        </w:rPr>
+      </w:pPr>
+      <w:r>
+        <w:rPr>
+          <w:rFonts w:ascii="Cascadia Code" w:hAnsi="Cascadia Code"/>
+        </w:rPr>
+        <w:t xml:space="preserve">    </w:t>
+      </w:r>
+      <w:r>
+        <w:rPr>
+          <w:rFonts w:ascii="Cascadia Code" w:hAnsi="Cascadia Code"/>
+        </w:rPr>
+        <w:t>random.seed(time.time() + rank)</w:t>
+      </w:r>
+    </w:p>
+    <w:p>
+      <w:pPr>
+        <w:pStyle w:val="Code"/>
+        <w:rPr>
+          <w:rFonts w:ascii="Cascadia Code" w:hAnsi="Cascadia Code"/>
+        </w:rPr>
+      </w:pPr>
+      <w:r>
+        <w:rPr>
+          <w:rFonts w:ascii="Cascadia Code" w:hAnsi="Cascadia Code"/>
+        </w:rPr>
+      </w:r>
+    </w:p>
+    <w:p>
+      <w:pPr>
+        <w:pStyle w:val="Code"/>
+        <w:rPr>
+          <w:rFonts w:ascii="Cascadia Code" w:hAnsi="Cascadia Code"/>
+        </w:rPr>
+      </w:pPr>
+      <w:r>
+        <w:rPr>
+          <w:rFonts w:ascii="Cascadia Code" w:hAnsi="Cascadia Code"/>
+        </w:rPr>
+        <w:t xml:space="preserve">    </w:t>
+      </w:r>
+      <w:r>
+        <w:rPr>
+          <w:rFonts w:ascii="Cascadia Code" w:hAnsi="Cascadia Code"/>
+        </w:rPr>
+        <w:t>for _ in range(n_per_procs):</w:t>
+      </w:r>
+    </w:p>
+    <w:p>
+      <w:pPr>
+        <w:pStyle w:val="Code"/>
+        <w:rPr>
+          <w:rFonts w:ascii="Cascadia Code" w:hAnsi="Cascadia Code"/>
+        </w:rPr>
+      </w:pPr>
+      <w:r>
+        <w:rPr>
+          <w:rFonts w:ascii="Cascadia Code" w:hAnsi="Cascadia Code"/>
+        </w:rPr>
+        <w:t xml:space="preserve">        </w:t>
+      </w:r>
+      <w:r>
+        <w:rPr>
+          <w:rFonts w:ascii="Cascadia Code" w:hAnsi="Cascadia Code"/>
+        </w:rPr>
+        <w:t>x = random.uniform(a, b)</w:t>
+      </w:r>
+    </w:p>
+    <w:p>
+      <w:pPr>
+        <w:pStyle w:val="Code"/>
+        <w:rPr>
+          <w:rFonts w:ascii="Cascadia Code" w:hAnsi="Cascadia Code"/>
+        </w:rPr>
+      </w:pPr>
+      <w:r>
+        <w:rPr>
+          <w:rFonts w:ascii="Cascadia Code" w:hAnsi="Cascadia Code"/>
+        </w:rPr>
+        <w:t xml:space="preserve">        </w:t>
+      </w:r>
+      <w:r>
+        <w:rPr>
+          <w:rFonts w:ascii="Cascadia Code" w:hAnsi="Cascadia Code"/>
+        </w:rPr>
+        <w:t>local_sum += f(x)</w:t>
+      </w:r>
+    </w:p>
+    <w:p>
+      <w:pPr>
+        <w:pStyle w:val="Code"/>
+        <w:rPr>
+          <w:rFonts w:ascii="Cascadia Code" w:hAnsi="Cascadia Code"/>
+        </w:rPr>
+      </w:pPr>
+      <w:r>
+        <w:rPr>
+          <w:rFonts w:ascii="Cascadia Code" w:hAnsi="Cascadia Code"/>
+        </w:rPr>
+      </w:r>
+    </w:p>
+    <w:p>
+      <w:pPr>
+        <w:pStyle w:val="Code"/>
+        <w:rPr>
+          <w:rFonts w:ascii="Cascadia Code" w:hAnsi="Cascadia Code"/>
+        </w:rPr>
+      </w:pPr>
+      <w:r>
+        <w:rPr>
+          <w:rFonts w:ascii="Cascadia Code" w:hAnsi="Cascadia Code"/>
+        </w:rPr>
+        <w:t xml:space="preserve">    </w:t>
+      </w:r>
+      <w:r>
+        <w:rPr>
+          <w:rFonts w:ascii="Cascadia Code" w:hAnsi="Cascadia Code"/>
+        </w:rPr>
+        <w:t>total_sum = comm.reduce(local_sum, op=MPI.SUM)</w:t>
+      </w:r>
+    </w:p>
+    <w:p>
+      <w:pPr>
+        <w:pStyle w:val="Code"/>
+        <w:rPr>
+          <w:rFonts w:ascii="Cascadia Code" w:hAnsi="Cascadia Code"/>
+        </w:rPr>
+      </w:pPr>
+      <w:r>
+        <w:rPr>
+          <w:rFonts w:ascii="Cascadia Code" w:hAnsi="Cascadia Code"/>
+        </w:rPr>
+        <w:t xml:space="preserve">    </w:t>
+      </w:r>
+      <w:r>
+        <w:rPr>
+          <w:rFonts w:ascii="Cascadia Code" w:hAnsi="Cascadia Code"/>
+        </w:rPr>
+        <w:t>end_time = MPI.Wtime()</w:t>
+      </w:r>
+    </w:p>
+    <w:p>
+      <w:pPr>
+        <w:pStyle w:val="Code"/>
+        <w:rPr>
+          <w:rFonts w:ascii="Cascadia Code" w:hAnsi="Cascadia Code"/>
+        </w:rPr>
+      </w:pPr>
+      <w:r>
+        <w:rPr>
+          <w:rFonts w:ascii="Cascadia Code" w:hAnsi="Cascadia Code"/>
+        </w:rPr>
+      </w:r>
+    </w:p>
+    <w:p>
+      <w:pPr>
+        <w:pStyle w:val="Code"/>
+        <w:rPr>
+          <w:rFonts w:ascii="Cascadia Code" w:hAnsi="Cascadia Code"/>
+        </w:rPr>
+      </w:pPr>
+      <w:r>
+        <w:rPr>
+          <w:rFonts w:ascii="Cascadia Code" w:hAnsi="Cascadia Code"/>
+        </w:rPr>
+        <w:t xml:space="preserve">    </w:t>
+      </w:r>
+      <w:r>
+        <w:rPr>
+          <w:rFonts w:ascii="Cascadia Code" w:hAnsi="Cascadia Code"/>
+        </w:rPr>
+        <w:t>if rank == 0:</w:t>
+      </w:r>
+    </w:p>
+    <w:p>
+      <w:pPr>
+        <w:pStyle w:val="Code"/>
+        <w:rPr>
+          <w:rFonts w:ascii="Cascadia Code" w:hAnsi="Cascadia Code"/>
+        </w:rPr>
+      </w:pPr>
+      <w:r>
+        <w:rPr>
+          <w:rFonts w:ascii="Cascadia Code" w:hAnsi="Cascadia Code"/>
+        </w:rPr>
+        <w:t xml:space="preserve">        </w:t>
+      </w:r>
+      <w:r>
+        <w:rPr>
+          <w:rFonts w:ascii="Cascadia Code" w:hAnsi="Cascadia Code"/>
+        </w:rPr>
+        <w:t>integral_mc = ((b - a) * total_sum) / N_total</w:t>
+      </w:r>
+    </w:p>
+    <w:p>
+      <w:pPr>
+        <w:pStyle w:val="Code"/>
+        <w:rPr>
+          <w:rFonts w:ascii="Cascadia Code" w:hAnsi="Cascadia Code"/>
+        </w:rPr>
+      </w:pPr>
+      <w:r>
+        <w:rPr>
+          <w:rFonts w:ascii="Cascadia Code" w:hAnsi="Cascadia Code"/>
+        </w:rPr>
+        <w:t xml:space="preserve">        </w:t>
+      </w:r>
+      <w:r>
+        <w:rPr>
+          <w:rFonts w:ascii="Cascadia Code" w:hAnsi="Cascadia Code"/>
+        </w:rPr>
+        <w:t>error = abs(reference - integral_mc)</w:t>
+      </w:r>
+    </w:p>
+    <w:p>
+      <w:pPr>
+        <w:pStyle w:val="Code"/>
+        <w:rPr>
+          <w:rFonts w:ascii="Cascadia Code" w:hAnsi="Cascadia Code"/>
+        </w:rPr>
+      </w:pPr>
+      <w:r>
+        <w:rPr>
+          <w:rFonts w:ascii="Cascadia Code" w:hAnsi="Cascadia Code"/>
+        </w:rPr>
+      </w:r>
+    </w:p>
+    <w:p>
+      <w:pPr>
+        <w:pStyle w:val="Code"/>
+        <w:rPr>
+          <w:rFonts w:ascii="Cascadia Code" w:hAnsi="Cascadia Code"/>
+        </w:rPr>
+      </w:pPr>
+      <w:r>
+        <w:rPr>
+          <w:rFonts w:ascii="Cascadia Code" w:hAnsi="Cascadia Code"/>
+        </w:rPr>
+        <w:t xml:space="preserve">        </w:t>
+      </w:r>
+      <w:r>
+        <w:rPr>
+          <w:rFonts w:ascii="Cascadia Code" w:hAnsi="Cascadia Code"/>
+        </w:rPr>
+        <w:t>print(f"Result: {integral_mc:.16f}")</w:t>
+      </w:r>
+    </w:p>
+    <w:p>
+      <w:pPr>
+        <w:pStyle w:val="Code"/>
+        <w:rPr>
+          <w:rFonts w:ascii="Cascadia Code" w:hAnsi="Cascadia Code"/>
+        </w:rPr>
+      </w:pPr>
+      <w:r>
+        <w:rPr>
+          <w:rFonts w:ascii="Cascadia Code" w:hAnsi="Cascadia Code"/>
+        </w:rPr>
+        <w:t xml:space="preserve">        </w:t>
+      </w:r>
+      <w:r>
+        <w:rPr>
+          <w:rFonts w:ascii="Cascadia Code" w:hAnsi="Cascadia Code"/>
+        </w:rPr>
+        <w:t>print(f"Accurate number: {reference:.16f}")</w:t>
+      </w:r>
+    </w:p>
+    <w:p>
+      <w:pPr>
+        <w:pStyle w:val="Code"/>
+        <w:rPr>
+          <w:rFonts w:ascii="Cascadia Code" w:hAnsi="Cascadia Code"/>
+        </w:rPr>
+      </w:pPr>
+      <w:r>
+        <w:rPr>
+          <w:rFonts w:ascii="Cascadia Code" w:hAnsi="Cascadia Code"/>
+        </w:rPr>
+        <w:t xml:space="preserve">        </w:t>
+      </w:r>
+      <w:r>
+        <w:rPr>
+          <w:rFonts w:ascii="Cascadia Code" w:hAnsi="Cascadia Code"/>
+        </w:rPr>
+        <w:t>print(f"Error: {error:.15f}")</w:t>
+      </w:r>
+    </w:p>
+    <w:p>
+      <w:pPr>
+        <w:pStyle w:val="Code"/>
+        <w:rPr>
+          <w:rFonts w:ascii="Cascadia Code" w:hAnsi="Cascadia Code"/>
+        </w:rPr>
+      </w:pPr>
+      <w:r>
+        <w:rPr>
+          <w:rFonts w:ascii="Cascadia Code" w:hAnsi="Cascadia Code"/>
+        </w:rPr>
+        <w:t xml:space="preserve">        </w:t>
+      </w:r>
+      <w:r>
+        <w:rPr>
+          <w:rFonts w:ascii="Cascadia Code" w:hAnsi="Cascadia Code"/>
+        </w:rPr>
+        <w:t>print(f"Execution time: {end_time - start_time:.4f} sec")</w:t>
+      </w:r>
+    </w:p>
+    <w:p>
+      <w:pPr>
+        <w:pStyle w:val="Code"/>
+        <w:rPr>
+          <w:rFonts w:ascii="Cascadia Code" w:hAnsi="Cascadia Code"/>
+        </w:rPr>
+      </w:pPr>
+      <w:r>
+        <w:rPr>
+          <w:rFonts w:ascii="Cascadia Code" w:hAnsi="Cascadia Code"/>
+        </w:rPr>
+      </w:r>
+    </w:p>
+    <w:p>
+      <w:pPr>
+        <w:pStyle w:val="Code"/>
+        <w:rPr>
+          <w:rFonts w:ascii="Cascadia Code" w:hAnsi="Cascadia Code"/>
+        </w:rPr>
+      </w:pPr>
+      <w:r>
+        <w:rPr>
+          <w:rFonts w:ascii="Cascadia Code" w:hAnsi="Cascadia Code"/>
+        </w:rPr>
+        <w:t>if __name__ == "__main__":</w:t>
+      </w:r>
+    </w:p>
+    <w:p>
+      <w:pPr>
+        <w:pStyle w:val="Code"/>
+        <w:rPr>
+          <w:rFonts w:ascii="Cascadia Code" w:hAnsi="Cascadia Code"/>
+        </w:rPr>
+      </w:pPr>
+      <w:r>
+        <w:rPr>
+          <w:rFonts w:ascii="Cascadia Code" w:hAnsi="Cascadia Code"/>
+        </w:rPr>
+        <w:t xml:space="preserve">    </w:t>
+      </w:r>
+      <w:r>
+        <w:rPr>
+          <w:rFonts w:ascii="Cascadia Code" w:hAnsi="Cascadia Code"/>
+        </w:rPr>
+        <w:t>main()</w:t>
+      </w:r>
+    </w:p>
+    <w:p>
+      <w:pPr>
+        <w:pStyle w:val="P1"/>
+        <w:rPr/>
+      </w:pPr>
+      <w:r>
+        <w:rPr/>
+      </w:r>
+    </w:p>
+    <w:p>
+      <w:pPr>
+        <w:pStyle w:val="H3"/>
+        <w:rPr/>
+      </w:pPr>
+      <w:r>
+        <w:rPr/>
+        <w:t>Результати</w:t>
+      </w:r>
+    </w:p>
+    <w:p>
+      <w:pPr>
+        <w:pStyle w:val="P1"/>
+        <w:rPr/>
+      </w:pPr>
+      <w:r>
+        <w:rPr/>
+      </w:r>
+    </w:p>
+    <w:p>
+      <w:pPr>
+        <w:pStyle w:val="Code"/>
+        <w:rPr>
+          <w:rFonts w:ascii="Cascadia Code" w:hAnsi="Cascadia Code"/>
+        </w:rPr>
+      </w:pPr>
+      <w:r>
+        <w:rPr>
+          <w:rFonts w:ascii="Cascadia Code" w:hAnsi="Cascadia Code"/>
+        </w:rPr>
+        <w:t>Result: 0.7854164765012532</w:t>
+      </w:r>
+    </w:p>
+    <w:p>
+      <w:pPr>
+        <w:pStyle w:val="Code"/>
+        <w:rPr>
+          <w:rFonts w:ascii="Cascadia Code" w:hAnsi="Cascadia Code"/>
+        </w:rPr>
+      </w:pPr>
+      <w:r>
+        <w:rPr>
+          <w:rFonts w:ascii="Cascadia Code" w:hAnsi="Cascadia Code"/>
+        </w:rPr>
+        <w:t>Accurate number: 0.7853981633974483</w:t>
+      </w:r>
+    </w:p>
+    <w:p>
+      <w:pPr>
+        <w:pStyle w:val="Code"/>
+        <w:rPr>
+          <w:rFonts w:ascii="Cascadia Code" w:hAnsi="Cascadia Code"/>
+        </w:rPr>
+      </w:pPr>
+      <w:r>
+        <w:rPr>
+          <w:rFonts w:ascii="Cascadia Code" w:hAnsi="Cascadia Code"/>
+        </w:rPr>
+        <w:t>Error: 0.000018313103805</w:t>
+      </w:r>
+    </w:p>
+    <w:p>
+      <w:pPr>
+        <w:pStyle w:val="Code"/>
+        <w:rPr>
+          <w:rFonts w:ascii="Cascadia Code" w:hAnsi="Cascadia Code"/>
+        </w:rPr>
+      </w:pPr>
+      <w:r>
+        <w:rPr>
+          <w:rFonts w:ascii="Cascadia Code" w:hAnsi="Cascadia Code"/>
+        </w:rPr>
+        <w:t>Execution time: 53.4747 sec</w:t>
+      </w:r>
+    </w:p>
+    <w:p>
+      <w:pPr>
+        <w:pStyle w:val="P1"/>
+        <w:rPr>
+          <w:rFonts w:ascii="Cascadia Code" w:hAnsi="Cascadia Code"/>
+        </w:rPr>
+      </w:pPr>
+      <w:r>
+        <w:rPr>
+          <w:rFonts w:ascii="Cascadia Code" w:hAnsi="Cascadia Code"/>
+        </w:rPr>
+      </w:r>
+    </w:p>
+    <w:p>
+      <w:pPr>
+        <w:pStyle w:val="H2"/>
+        <w:rPr/>
+      </w:pPr>
+      <w:r>
+        <w:rPr/>
+        <w:t>5.2.3.3</w:t>
+      </w:r>
+    </w:p>
+    <w:p>
+      <w:pPr>
+        <w:pStyle w:val="P1"/>
+        <w:rPr/>
+      </w:pPr>
+      <w:r>
+        <w:rPr/>
+        <w:t>Завдання</w:t>
+      </w:r>
+    </w:p>
+    <w:p>
+      <w:pPr>
+        <w:pStyle w:val="P1"/>
+        <w:rPr/>
+      </w:pPr>
+      <w:r>
+        <w:rPr/>
+      </w:r>
+    </w:p>
+    <w:p>
+      <w:pPr>
+        <w:pStyle w:val="Normal"/>
+        <w:rPr>
+          <w:lang w:val="en-US"/>
+        </w:rPr>
+      </w:pPr>
+      <w:r>
+        <w:rPr>
+          <w:lang w:val="en-US"/>
+        </w:rPr>
+        <w:t>Виконати наступні варіанти завдання.</w:t>
+      </w:r>
+    </w:p>
+    <w:p>
+      <w:pPr>
+        <w:pStyle w:val="img1"/>
+        <w:rPr/>
+      </w:pPr>
+      <w:r>
+        <w:rPr/>
+        <w:drawing>
+          <wp:inline distT="0" distB="0" distL="0" distR="0">
+            <wp:extent cx="6645910" cy="397510"/>
+            <wp:effectExtent l="0" t="0" r="0" b="0"/>
+            <wp:docPr id="14" name="Зображення7 копія 1"/>
+            <wp:cNvGraphicFramePr>
+              <a:graphicFrameLocks xmlns:a="http://schemas.openxmlformats.org/drawingml/2006/main" noChangeAspect="1"/>
+            </wp:cNvGraphicFramePr>
+            <a:graphic xmlns:a="http://schemas.openxmlformats.org/drawingml/2006/main">
+              <a:graphicData uri="http://schemas.openxmlformats.org/drawingml/2006/picture">
+                <pic:pic xmlns:pic="http://schemas.openxmlformats.org/drawingml/2006/picture">
+                  <pic:nvPicPr>
+                    <pic:cNvPr id="14" name="Зображення7 копія 1"/>
+                    <pic:cNvPicPr>
+                      <a:picLocks noChangeAspect="1" noChangeArrowheads="1"/>
+                    </pic:cNvPicPr>
+                  </pic:nvPicPr>
+                  <pic:blipFill>
+                    <a:blip r:embed="rId15"/>
+                    <a:stretch>
+                      <a:fillRect/>
+                    </a:stretch>
+                  </pic:blipFill>
+                  <pic:spPr bwMode="auto">
+                    <a:xfrm>
+                      <a:off x="0" y="0"/>
+                      <a:ext cx="6645910" cy="397510"/>
+                    </a:xfrm>
+                    <a:prstGeom prst="rect">
+                      <a:avLst/>
+                    </a:prstGeom>
+                    <a:noFill/>
+                  </pic:spPr>
+                </pic:pic>
+              </a:graphicData>
+            </a:graphic>
+          </wp:inline>
+        </w:drawing>
+      </w:r>
+    </w:p>
+    <w:p>
+      <w:pPr>
+        <w:pStyle w:val="p11"/>
+        <w:rPr/>
+      </w:pPr>
+      <w:r>
+        <w:rPr/>
+      </w:r>
+    </w:p>
+    <w:p>
+      <w:pPr>
+        <w:pStyle w:val="p11"/>
+        <w:rPr/>
+      </w:pPr>
+      <w:r>
+        <w:rPr/>
         <w:t>Код</w:t>
       </w:r>
     </w:p>
     <w:p>
       <w:pPr>
+        <w:pStyle w:val="p11"/>
+        <w:rPr/>
+      </w:pPr>
+      <w:r>
+        <w:rPr/>
+      </w:r>
+    </w:p>
+    <w:p>
+      <w:pPr>
+        <w:pStyle w:val="Code"/>
+        <w:rPr>
+          <w:rFonts w:ascii="Cascadia Code" w:hAnsi="Cascadia Code"/>
+        </w:rPr>
+      </w:pPr>
+      <w:r>
+        <w:rPr>
+          <w:rFonts w:ascii="Cascadia Code" w:hAnsi="Cascadia Code"/>
+        </w:rPr>
+        <w:t>import math</w:t>
+      </w:r>
+    </w:p>
+    <w:p>
+      <w:pPr>
+        <w:pStyle w:val="Code"/>
+        <w:rPr>
+          <w:rFonts w:ascii="Cascadia Code" w:hAnsi="Cascadia Code"/>
+        </w:rPr>
+      </w:pPr>
+      <w:r>
+        <w:rPr>
+          <w:rFonts w:ascii="Cascadia Code" w:hAnsi="Cascadia Code"/>
+        </w:rPr>
+        <w:t>import random</w:t>
+      </w:r>
+    </w:p>
+    <w:p>
+      <w:pPr>
+        <w:pStyle w:val="Code"/>
+        <w:rPr>
+          <w:rFonts w:ascii="Cascadia Code" w:hAnsi="Cascadia Code"/>
+        </w:rPr>
+      </w:pPr>
+      <w:r>
+        <w:rPr>
+          <w:rFonts w:ascii="Cascadia Code" w:hAnsi="Cascadia Code"/>
+        </w:rPr>
+        <w:t>import time</w:t>
+      </w:r>
+    </w:p>
+    <w:p>
+      <w:pPr>
+        <w:pStyle w:val="Code"/>
+        <w:rPr>
+          <w:rFonts w:ascii="Cascadia Code" w:hAnsi="Cascadia Code"/>
+        </w:rPr>
+      </w:pPr>
+      <w:r>
+        <w:rPr>
+          <w:rFonts w:ascii="Cascadia Code" w:hAnsi="Cascadia Code"/>
+        </w:rPr>
+        <w:t>from mpi4py import MPI</w:t>
+      </w:r>
+    </w:p>
+    <w:p>
+      <w:pPr>
+        <w:pStyle w:val="Code"/>
+        <w:rPr>
+          <w:rFonts w:ascii="Cascadia Code" w:hAnsi="Cascadia Code"/>
+        </w:rPr>
+      </w:pPr>
+      <w:r>
+        <w:rPr>
+          <w:rFonts w:ascii="Cascadia Code" w:hAnsi="Cascadia Code"/>
+        </w:rPr>
+      </w:r>
+    </w:p>
+    <w:p>
+      <w:pPr>
+        <w:pStyle w:val="Code"/>
+        <w:rPr>
+          <w:rFonts w:ascii="Cascadia Code" w:hAnsi="Cascadia Code"/>
+        </w:rPr>
+      </w:pPr>
+      <w:r>
+        <w:rPr>
+          <w:rFonts w:ascii="Cascadia Code" w:hAnsi="Cascadia Code"/>
+        </w:rPr>
+        <w:t>def f(x, y):</w:t>
+      </w:r>
+    </w:p>
+    <w:p>
+      <w:pPr>
+        <w:pStyle w:val="Code"/>
+        <w:rPr>
+          <w:rFonts w:ascii="Cascadia Code" w:hAnsi="Cascadia Code"/>
+        </w:rPr>
+      </w:pPr>
+      <w:r>
+        <w:rPr>
+          <w:rFonts w:ascii="Cascadia Code" w:hAnsi="Cascadia Code"/>
+        </w:rPr>
+        <w:t xml:space="preserve">    </w:t>
+      </w:r>
+      <w:r>
+        <w:rPr>
+          <w:rFonts w:ascii="Cascadia Code" w:hAnsi="Cascadia Code"/>
+        </w:rPr>
+        <w:t>return x * y</w:t>
+      </w:r>
+    </w:p>
+    <w:p>
+      <w:pPr>
+        <w:pStyle w:val="Code"/>
+        <w:rPr>
+          <w:rFonts w:ascii="Cascadia Code" w:hAnsi="Cascadia Code"/>
+        </w:rPr>
+      </w:pPr>
+      <w:r>
+        <w:rPr>
+          <w:rFonts w:ascii="Cascadia Code" w:hAnsi="Cascadia Code"/>
+        </w:rPr>
+      </w:r>
+    </w:p>
+    <w:p>
+      <w:pPr>
+        <w:pStyle w:val="Code"/>
+        <w:rPr>
+          <w:rFonts w:ascii="Cascadia Code" w:hAnsi="Cascadia Code"/>
+        </w:rPr>
+      </w:pPr>
+      <w:r>
+        <w:rPr>
+          <w:rFonts w:ascii="Cascadia Code" w:hAnsi="Cascadia Code"/>
+        </w:rPr>
+        <w:t>def main():</w:t>
+      </w:r>
+    </w:p>
+    <w:p>
+      <w:pPr>
+        <w:pStyle w:val="Code"/>
+        <w:rPr>
+          <w:rFonts w:ascii="Cascadia Code" w:hAnsi="Cascadia Code"/>
+        </w:rPr>
+      </w:pPr>
+      <w:r>
+        <w:rPr>
+          <w:rFonts w:ascii="Cascadia Code" w:hAnsi="Cascadia Code"/>
+        </w:rPr>
+        <w:t xml:space="preserve">    </w:t>
+      </w:r>
+      <w:r>
+        <w:rPr>
+          <w:rFonts w:ascii="Cascadia Code" w:hAnsi="Cascadia Code"/>
+        </w:rPr>
+        <w:t>comm = MPI.COMM_WORLD</w:t>
+      </w:r>
+    </w:p>
+    <w:p>
+      <w:pPr>
+        <w:pStyle w:val="Code"/>
+        <w:rPr>
+          <w:rFonts w:ascii="Cascadia Code" w:hAnsi="Cascadia Code"/>
+        </w:rPr>
+      </w:pPr>
+      <w:r>
+        <w:rPr>
+          <w:rFonts w:ascii="Cascadia Code" w:hAnsi="Cascadia Code"/>
+        </w:rPr>
+        <w:t xml:space="preserve">    </w:t>
+      </w:r>
+      <w:r>
+        <w:rPr>
+          <w:rFonts w:ascii="Cascadia Code" w:hAnsi="Cascadia Code"/>
+        </w:rPr>
+        <w:t>rank = comm.Get_rank()</w:t>
+      </w:r>
+    </w:p>
+    <w:p>
+      <w:pPr>
+        <w:pStyle w:val="Code"/>
+        <w:rPr>
+          <w:rFonts w:ascii="Cascadia Code" w:hAnsi="Cascadia Code"/>
+        </w:rPr>
+      </w:pPr>
+      <w:r>
+        <w:rPr>
+          <w:rFonts w:ascii="Cascadia Code" w:hAnsi="Cascadia Code"/>
+        </w:rPr>
+        <w:t xml:space="preserve">    </w:t>
+      </w:r>
+      <w:r>
+        <w:rPr>
+          <w:rFonts w:ascii="Cascadia Code" w:hAnsi="Cascadia Code"/>
+        </w:rPr>
+        <w:t>numprocs = comm.Get_size()</w:t>
+      </w:r>
+    </w:p>
+    <w:p>
+      <w:pPr>
+        <w:pStyle w:val="Code"/>
+        <w:rPr>
+          <w:rFonts w:ascii="Cascadia Code" w:hAnsi="Cascadia Code"/>
+        </w:rPr>
+      </w:pPr>
+      <w:r>
+        <w:rPr>
+          <w:rFonts w:ascii="Cascadia Code" w:hAnsi="Cascadia Code"/>
+        </w:rPr>
+      </w:r>
+    </w:p>
+    <w:p>
+      <w:pPr>
+        <w:pStyle w:val="Code"/>
+        <w:rPr>
+          <w:rFonts w:ascii="Cascadia Code" w:hAnsi="Cascadia Code"/>
+        </w:rPr>
+      </w:pPr>
+      <w:r>
+        <w:rPr>
+          <w:rFonts w:ascii="Cascadia Code" w:hAnsi="Cascadia Code"/>
+        </w:rPr>
+        <w:t xml:space="preserve">    </w:t>
+      </w:r>
+      <w:r>
+        <w:rPr>
+          <w:rFonts w:ascii="Cascadia Code" w:hAnsi="Cascadia Code"/>
+        </w:rPr>
+        <w:t>N_total = 100_000_000</w:t>
+      </w:r>
+    </w:p>
+    <w:p>
+      <w:pPr>
+        <w:pStyle w:val="Code"/>
+        <w:rPr>
+          <w:rFonts w:ascii="Cascadia Code" w:hAnsi="Cascadia Code"/>
+        </w:rPr>
+      </w:pPr>
+      <w:r>
+        <w:rPr>
+          <w:rFonts w:ascii="Cascadia Code" w:hAnsi="Cascadia Code"/>
+        </w:rPr>
+        <w:t xml:space="preserve">    </w:t>
+      </w:r>
+      <w:r>
+        <w:rPr>
+          <w:rFonts w:ascii="Cascadia Code" w:hAnsi="Cascadia Code"/>
+        </w:rPr>
+        <w:t>n_per_procs = N_total // numprocs</w:t>
+      </w:r>
+    </w:p>
+    <w:p>
+      <w:pPr>
+        <w:pStyle w:val="Code"/>
+        <w:rPr>
+          <w:rFonts w:ascii="Cascadia Code" w:hAnsi="Cascadia Code"/>
+        </w:rPr>
+      </w:pPr>
+      <w:r>
+        <w:rPr>
+          <w:rFonts w:ascii="Cascadia Code" w:hAnsi="Cascadia Code"/>
+        </w:rPr>
+      </w:r>
+    </w:p>
+    <w:p>
+      <w:pPr>
+        <w:pStyle w:val="Code"/>
+        <w:rPr>
+          <w:rFonts w:ascii="Cascadia Code" w:hAnsi="Cascadia Code"/>
+        </w:rPr>
+      </w:pPr>
+      <w:r>
+        <w:rPr>
+          <w:rFonts w:ascii="Cascadia Code" w:hAnsi="Cascadia Code"/>
+        </w:rPr>
+        <w:t xml:space="preserve">    </w:t>
+      </w:r>
+      <w:r>
+        <w:rPr>
+          <w:rFonts w:ascii="Cascadia Code" w:hAnsi="Cascadia Code"/>
+        </w:rPr>
+        <w:t>x_min, x_max = 0.0, 1.0</w:t>
+      </w:r>
+    </w:p>
+    <w:p>
+      <w:pPr>
+        <w:pStyle w:val="Code"/>
+        <w:rPr>
+          <w:rFonts w:ascii="Cascadia Code" w:hAnsi="Cascadia Code"/>
+        </w:rPr>
+      </w:pPr>
+      <w:r>
+        <w:rPr>
+          <w:rFonts w:ascii="Cascadia Code" w:hAnsi="Cascadia Code"/>
+        </w:rPr>
+        <w:t xml:space="preserve">    </w:t>
+      </w:r>
+      <w:r>
+        <w:rPr>
+          <w:rFonts w:ascii="Cascadia Code" w:hAnsi="Cascadia Code"/>
+        </w:rPr>
+        <w:t>y_min, y_max = 0.0, 1.0</w:t>
+      </w:r>
+    </w:p>
+    <w:p>
+      <w:pPr>
+        <w:pStyle w:val="Code"/>
+        <w:rPr>
+          <w:rFonts w:ascii="Cascadia Code" w:hAnsi="Cascadia Code"/>
+        </w:rPr>
+      </w:pPr>
+      <w:r>
+        <w:rPr>
+          <w:rFonts w:ascii="Cascadia Code" w:hAnsi="Cascadia Code"/>
+        </w:rPr>
+        <w:t xml:space="preserve">    </w:t>
+      </w:r>
+      <w:r>
+        <w:rPr>
+          <w:rFonts w:ascii="Cascadia Code" w:hAnsi="Cascadia Code"/>
+        </w:rPr>
+        <w:t>area_rect = (x_max - x_min) * (y_max - y_min)</w:t>
+      </w:r>
+    </w:p>
+    <w:p>
+      <w:pPr>
+        <w:pStyle w:val="Code"/>
+        <w:rPr>
+          <w:rFonts w:ascii="Cascadia Code" w:hAnsi="Cascadia Code"/>
+        </w:rPr>
+      </w:pPr>
+      <w:r>
+        <w:rPr>
+          <w:rFonts w:ascii="Cascadia Code" w:hAnsi="Cascadia Code"/>
+        </w:rPr>
+      </w:r>
+    </w:p>
+    <w:p>
+      <w:pPr>
+        <w:pStyle w:val="Code"/>
+        <w:rPr>
+          <w:rFonts w:ascii="Cascadia Code" w:hAnsi="Cascadia Code"/>
+        </w:rPr>
+      </w:pPr>
+      <w:r>
+        <w:rPr>
+          <w:rFonts w:ascii="Cascadia Code" w:hAnsi="Cascadia Code"/>
+        </w:rPr>
+        <w:t xml:space="preserve">    </w:t>
+      </w:r>
+      <w:r>
+        <w:rPr>
+          <w:rFonts w:ascii="Cascadia Code" w:hAnsi="Cascadia Code"/>
+        </w:rPr>
+        <w:t>local_sum = 0.0</w:t>
+      </w:r>
+    </w:p>
+    <w:p>
+      <w:pPr>
+        <w:pStyle w:val="Code"/>
+        <w:rPr>
+          <w:rFonts w:ascii="Cascadia Code" w:hAnsi="Cascadia Code"/>
+        </w:rPr>
+      </w:pPr>
+      <w:r>
+        <w:rPr>
+          <w:rFonts w:ascii="Cascadia Code" w:hAnsi="Cascadia Code"/>
+        </w:rPr>
+        <w:t xml:space="preserve">    </w:t>
+      </w:r>
+      <w:r>
+        <w:rPr>
+          <w:rFonts w:ascii="Cascadia Code" w:hAnsi="Cascadia Code"/>
+        </w:rPr>
+        <w:t>points_in_S = 0</w:t>
+      </w:r>
+    </w:p>
+    <w:p>
+      <w:pPr>
+        <w:pStyle w:val="Code"/>
+        <w:rPr>
+          <w:rFonts w:ascii="Cascadia Code" w:hAnsi="Cascadia Code"/>
+        </w:rPr>
+      </w:pPr>
+      <w:r>
+        <w:rPr>
+          <w:rFonts w:ascii="Cascadia Code" w:hAnsi="Cascadia Code"/>
+        </w:rPr>
+      </w:r>
+    </w:p>
+    <w:p>
+      <w:pPr>
+        <w:pStyle w:val="Code"/>
+        <w:rPr>
+          <w:rFonts w:ascii="Cascadia Code" w:hAnsi="Cascadia Code"/>
+        </w:rPr>
+      </w:pPr>
+      <w:r>
+        <w:rPr>
+          <w:rFonts w:ascii="Cascadia Code" w:hAnsi="Cascadia Code"/>
+        </w:rPr>
+        <w:t xml:space="preserve">    </w:t>
+      </w:r>
+      <w:r>
+        <w:rPr>
+          <w:rFonts w:ascii="Cascadia Code" w:hAnsi="Cascadia Code"/>
+        </w:rPr>
+        <w:t>random.seed(time.time() + rank)</w:t>
+      </w:r>
+    </w:p>
+    <w:p>
+      <w:pPr>
+        <w:pStyle w:val="Code"/>
+        <w:rPr>
+          <w:rFonts w:ascii="Cascadia Code" w:hAnsi="Cascadia Code"/>
+        </w:rPr>
+      </w:pPr>
+      <w:r>
+        <w:rPr>
+          <w:rFonts w:ascii="Cascadia Code" w:hAnsi="Cascadia Code"/>
+        </w:rPr>
+      </w:r>
+    </w:p>
+    <w:p>
+      <w:pPr>
+        <w:pStyle w:val="Code"/>
+        <w:rPr>
+          <w:rFonts w:ascii="Cascadia Code" w:hAnsi="Cascadia Code"/>
+        </w:rPr>
+      </w:pPr>
+      <w:r>
+        <w:rPr>
+          <w:rFonts w:ascii="Cascadia Code" w:hAnsi="Cascadia Code"/>
+        </w:rPr>
+        <w:t xml:space="preserve">    </w:t>
+      </w:r>
+      <w:r>
+        <w:rPr>
+          <w:rFonts w:ascii="Cascadia Code" w:hAnsi="Cascadia Code"/>
+        </w:rPr>
+        <w:t>start_time = MPI.Wtime()</w:t>
+      </w:r>
+    </w:p>
+    <w:p>
+      <w:pPr>
+        <w:pStyle w:val="Code"/>
+        <w:rPr>
+          <w:rFonts w:ascii="Cascadia Code" w:hAnsi="Cascadia Code"/>
+        </w:rPr>
+      </w:pPr>
+      <w:r>
+        <w:rPr>
+          <w:rFonts w:ascii="Cascadia Code" w:hAnsi="Cascadia Code"/>
+        </w:rPr>
+      </w:r>
+    </w:p>
+    <w:p>
+      <w:pPr>
+        <w:pStyle w:val="Code"/>
+        <w:rPr>
+          <w:rFonts w:ascii="Cascadia Code" w:hAnsi="Cascadia Code"/>
+        </w:rPr>
+      </w:pPr>
+      <w:r>
+        <w:rPr>
+          <w:rFonts w:ascii="Cascadia Code" w:hAnsi="Cascadia Code"/>
+        </w:rPr>
+        <w:t xml:space="preserve">    </w:t>
+      </w:r>
+      <w:r>
+        <w:rPr>
+          <w:rFonts w:ascii="Cascadia Code" w:hAnsi="Cascadia Code"/>
+        </w:rPr>
+        <w:t>for _ in range(n_per_procs):</w:t>
+      </w:r>
+    </w:p>
+    <w:p>
+      <w:pPr>
+        <w:pStyle w:val="Code"/>
+        <w:rPr>
+          <w:rFonts w:ascii="Cascadia Code" w:hAnsi="Cascadia Code"/>
+        </w:rPr>
+      </w:pPr>
+      <w:r>
+        <w:rPr>
+          <w:rFonts w:ascii="Cascadia Code" w:hAnsi="Cascadia Code"/>
+        </w:rPr>
+        <w:t xml:space="preserve">        </w:t>
+      </w:r>
+      <w:r>
+        <w:rPr>
+          <w:rFonts w:ascii="Cascadia Code" w:hAnsi="Cascadia Code"/>
+        </w:rPr>
+        <w:t>x = random.uniform(x_min, x_max)</w:t>
+      </w:r>
+    </w:p>
+    <w:p>
+      <w:pPr>
+        <w:pStyle w:val="Code"/>
+        <w:rPr>
+          <w:rFonts w:ascii="Cascadia Code" w:hAnsi="Cascadia Code"/>
+        </w:rPr>
+      </w:pPr>
+      <w:r>
+        <w:rPr>
+          <w:rFonts w:ascii="Cascadia Code" w:hAnsi="Cascadia Code"/>
+        </w:rPr>
+        <w:t xml:space="preserve">        </w:t>
+      </w:r>
+      <w:r>
+        <w:rPr>
+          <w:rFonts w:ascii="Cascadia Code" w:hAnsi="Cascadia Code"/>
+        </w:rPr>
+        <w:t>y = random.uniform(y_min, y_max)</w:t>
+      </w:r>
+    </w:p>
+    <w:p>
+      <w:pPr>
+        <w:pStyle w:val="Code"/>
+        <w:rPr>
+          <w:rFonts w:ascii="Cascadia Code" w:hAnsi="Cascadia Code"/>
+        </w:rPr>
+      </w:pPr>
+      <w:r>
+        <w:rPr>
+          <w:rFonts w:ascii="Cascadia Code" w:hAnsi="Cascadia Code"/>
+        </w:rPr>
+      </w:r>
+    </w:p>
+    <w:p>
+      <w:pPr>
+        <w:pStyle w:val="Code"/>
+        <w:rPr>
+          <w:rFonts w:ascii="Cascadia Code" w:hAnsi="Cascadia Code"/>
+        </w:rPr>
+      </w:pPr>
+      <w:r>
+        <w:rPr>
+          <w:rFonts w:ascii="Cascadia Code" w:hAnsi="Cascadia Code"/>
+        </w:rPr>
+        <w:t xml:space="preserve">        </w:t>
+      </w:r>
+      <w:r>
+        <w:rPr>
+          <w:rFonts w:ascii="Cascadia Code" w:hAnsi="Cascadia Code"/>
+        </w:rPr>
+        <w:t>if x**2 &lt;= y &lt;= math.sqrt(x):</w:t>
+      </w:r>
+    </w:p>
+    <w:p>
+      <w:pPr>
+        <w:pStyle w:val="Code"/>
+        <w:rPr>
+          <w:rFonts w:ascii="Cascadia Code" w:hAnsi="Cascadia Code"/>
+        </w:rPr>
+      </w:pPr>
+      <w:r>
+        <w:rPr>
+          <w:rFonts w:ascii="Cascadia Code" w:hAnsi="Cascadia Code"/>
+        </w:rPr>
+        <w:t xml:space="preserve">            </w:t>
+      </w:r>
+      <w:r>
+        <w:rPr>
+          <w:rFonts w:ascii="Cascadia Code" w:hAnsi="Cascadia Code"/>
+        </w:rPr>
+        <w:t>local_sum += f(x, y)</w:t>
+      </w:r>
+    </w:p>
+    <w:p>
+      <w:pPr>
+        <w:pStyle w:val="Code"/>
+        <w:rPr>
+          <w:rFonts w:ascii="Cascadia Code" w:hAnsi="Cascadia Code"/>
+        </w:rPr>
+      </w:pPr>
+      <w:r>
+        <w:rPr>
+          <w:rFonts w:ascii="Cascadia Code" w:hAnsi="Cascadia Code"/>
+        </w:rPr>
+        <w:t xml:space="preserve">            </w:t>
+      </w:r>
+      <w:r>
+        <w:rPr>
+          <w:rFonts w:ascii="Cascadia Code" w:hAnsi="Cascadia Code"/>
+        </w:rPr>
+        <w:t>points_in_S += 1</w:t>
+      </w:r>
+    </w:p>
+    <w:p>
+      <w:pPr>
+        <w:pStyle w:val="Code"/>
+        <w:rPr>
+          <w:rFonts w:ascii="Cascadia Code" w:hAnsi="Cascadia Code"/>
+        </w:rPr>
+      </w:pPr>
+      <w:r>
+        <w:rPr>
+          <w:rFonts w:ascii="Cascadia Code" w:hAnsi="Cascadia Code"/>
+        </w:rPr>
+      </w:r>
+    </w:p>
+    <w:p>
+      <w:pPr>
+        <w:pStyle w:val="Code"/>
+        <w:rPr>
+          <w:rFonts w:ascii="Cascadia Code" w:hAnsi="Cascadia Code"/>
+        </w:rPr>
+      </w:pPr>
+      <w:r>
+        <w:rPr>
+          <w:rFonts w:ascii="Cascadia Code" w:hAnsi="Cascadia Code"/>
+        </w:rPr>
+        <w:t xml:space="preserve">    </w:t>
+      </w:r>
+      <w:r>
+        <w:rPr>
+          <w:rFonts w:ascii="Cascadia Code" w:hAnsi="Cascadia Code"/>
+        </w:rPr>
+        <w:t>total_f_sum = comm.reduce(local_sum, op=MPI.SUM, root=0)</w:t>
+      </w:r>
+    </w:p>
+    <w:p>
+      <w:pPr>
+        <w:pStyle w:val="Code"/>
+        <w:rPr>
+          <w:rFonts w:ascii="Cascadia Code" w:hAnsi="Cascadia Code"/>
+        </w:rPr>
+      </w:pPr>
+      <w:r>
+        <w:rPr>
+          <w:rFonts w:ascii="Cascadia Code" w:hAnsi="Cascadia Code"/>
+        </w:rPr>
+        <w:t xml:space="preserve">    </w:t>
+      </w:r>
+      <w:r>
+        <w:rPr>
+          <w:rFonts w:ascii="Cascadia Code" w:hAnsi="Cascadia Code"/>
+        </w:rPr>
+        <w:t>total_points_in_S = comm.reduce(points_in_S, op=MPI.SUM, root=0)</w:t>
+      </w:r>
+    </w:p>
+    <w:p>
+      <w:pPr>
+        <w:pStyle w:val="Code"/>
+        <w:rPr>
+          <w:rFonts w:ascii="Cascadia Code" w:hAnsi="Cascadia Code"/>
+        </w:rPr>
+      </w:pPr>
+      <w:r>
+        <w:rPr>
+          <w:rFonts w:ascii="Cascadia Code" w:hAnsi="Cascadia Code"/>
+        </w:rPr>
+        <w:t xml:space="preserve">    </w:t>
+      </w:r>
+      <w:r>
+        <w:rPr>
+          <w:rFonts w:ascii="Cascadia Code" w:hAnsi="Cascadia Code"/>
+        </w:rPr>
+        <w:t>end_time = MPI.Wtime()</w:t>
+      </w:r>
+    </w:p>
+    <w:p>
+      <w:pPr>
+        <w:pStyle w:val="Code"/>
+        <w:rPr>
+          <w:rFonts w:ascii="Cascadia Code" w:hAnsi="Cascadia Code"/>
+        </w:rPr>
+      </w:pPr>
+      <w:r>
+        <w:rPr>
+          <w:rFonts w:ascii="Cascadia Code" w:hAnsi="Cascadia Code"/>
+        </w:rPr>
+      </w:r>
+    </w:p>
+    <w:p>
+      <w:pPr>
+        <w:pStyle w:val="Code"/>
+        <w:rPr>
+          <w:rFonts w:ascii="Cascadia Code" w:hAnsi="Cascadia Code"/>
+        </w:rPr>
+      </w:pPr>
+      <w:r>
+        <w:rPr>
+          <w:rFonts w:ascii="Cascadia Code" w:hAnsi="Cascadia Code"/>
+        </w:rPr>
+        <w:t xml:space="preserve">    </w:t>
+      </w:r>
+      <w:r>
+        <w:rPr>
+          <w:rFonts w:ascii="Cascadia Code" w:hAnsi="Cascadia Code"/>
+        </w:rPr>
+        <w:t>if rank == 0:</w:t>
+      </w:r>
+    </w:p>
+    <w:p>
+      <w:pPr>
+        <w:pStyle w:val="Code"/>
+        <w:rPr>
+          <w:rFonts w:ascii="Cascadia Code" w:hAnsi="Cascadia Code"/>
+        </w:rPr>
+      </w:pPr>
+      <w:r>
+        <w:rPr>
+          <w:rFonts w:ascii="Cascadia Code" w:hAnsi="Cascadia Code"/>
+        </w:rPr>
+        <w:t xml:space="preserve">        </w:t>
+      </w:r>
+      <w:r>
+        <w:rPr>
+          <w:rFonts w:ascii="Cascadia Code" w:hAnsi="Cascadia Code"/>
+        </w:rPr>
+        <w:t># I = Area_react * (Sum_f_in_S / N_total)</w:t>
+      </w:r>
+    </w:p>
+    <w:p>
+      <w:pPr>
+        <w:pStyle w:val="Code"/>
+        <w:rPr>
+          <w:rFonts w:ascii="Cascadia Code" w:hAnsi="Cascadia Code"/>
+        </w:rPr>
+      </w:pPr>
+      <w:r>
+        <w:rPr>
+          <w:rFonts w:ascii="Cascadia Code" w:hAnsi="Cascadia Code"/>
+        </w:rPr>
+        <w:t xml:space="preserve">        </w:t>
+      </w:r>
+      <w:r>
+        <w:rPr>
+          <w:rFonts w:ascii="Cascadia Code" w:hAnsi="Cascadia Code"/>
+        </w:rPr>
+        <w:t>integral_mc = (area_rect * total_f_sum) / N_total</w:t>
+      </w:r>
+    </w:p>
+    <w:p>
+      <w:pPr>
+        <w:pStyle w:val="Code"/>
+        <w:rPr>
+          <w:rFonts w:ascii="Cascadia Code" w:hAnsi="Cascadia Code"/>
+        </w:rPr>
+      </w:pPr>
+      <w:r>
+        <w:rPr>
+          <w:rFonts w:ascii="Cascadia Code" w:hAnsi="Cascadia Code"/>
+        </w:rPr>
+      </w:r>
+    </w:p>
+    <w:p>
+      <w:pPr>
+        <w:pStyle w:val="Code"/>
+        <w:rPr>
+          <w:rFonts w:ascii="Cascadia Code" w:hAnsi="Cascadia Code"/>
+        </w:rPr>
+      </w:pPr>
+      <w:r>
+        <w:rPr>
+          <w:rFonts w:ascii="Cascadia Code" w:hAnsi="Cascadia Code"/>
+        </w:rPr>
+        <w:t xml:space="preserve">        </w:t>
+      </w:r>
+      <w:r>
+        <w:rPr>
+          <w:rFonts w:ascii="Cascadia Code" w:hAnsi="Cascadia Code"/>
+        </w:rPr>
+        <w:t>reference = 1.0 / 12.0</w:t>
+      </w:r>
+    </w:p>
+    <w:p>
+      <w:pPr>
+        <w:pStyle w:val="Code"/>
+        <w:rPr>
+          <w:rFonts w:ascii="Cascadia Code" w:hAnsi="Cascadia Code"/>
+        </w:rPr>
+      </w:pPr>
+      <w:r>
+        <w:rPr>
+          <w:rFonts w:ascii="Cascadia Code" w:hAnsi="Cascadia Code"/>
+        </w:rPr>
+        <w:t xml:space="preserve">        </w:t>
+      </w:r>
+      <w:r>
+        <w:rPr>
+          <w:rFonts w:ascii="Cascadia Code" w:hAnsi="Cascadia Code"/>
+        </w:rPr>
+        <w:t>error = abs(reference - integral_mc)</w:t>
+      </w:r>
+    </w:p>
+    <w:p>
+      <w:pPr>
+        <w:pStyle w:val="Code"/>
+        <w:rPr>
+          <w:rFonts w:ascii="Cascadia Code" w:hAnsi="Cascadia Code"/>
+        </w:rPr>
+      </w:pPr>
+      <w:r>
+        <w:rPr>
+          <w:rFonts w:ascii="Cascadia Code" w:hAnsi="Cascadia Code"/>
+        </w:rPr>
+      </w:r>
+    </w:p>
+    <w:p>
+      <w:pPr>
+        <w:pStyle w:val="Code"/>
+        <w:rPr>
+          <w:rFonts w:ascii="Cascadia Code" w:hAnsi="Cascadia Code"/>
+        </w:rPr>
+      </w:pPr>
+      <w:r>
+        <w:rPr>
+          <w:rFonts w:ascii="Cascadia Code" w:hAnsi="Cascadia Code"/>
+        </w:rPr>
+        <w:t xml:space="preserve">        </w:t>
+      </w:r>
+      <w:r>
+        <w:rPr>
+          <w:rFonts w:ascii="Cascadia Code" w:hAnsi="Cascadia Code"/>
+        </w:rPr>
+        <w:t>area_S_approx = (area_rect * total_points_in_S) / N_total</w:t>
+      </w:r>
+    </w:p>
+    <w:p>
+      <w:pPr>
+        <w:pStyle w:val="Code"/>
+        <w:rPr>
+          <w:rFonts w:ascii="Cascadia Code" w:hAnsi="Cascadia Code"/>
+        </w:rPr>
+      </w:pPr>
+      <w:r>
+        <w:rPr>
+          <w:rFonts w:ascii="Cascadia Code" w:hAnsi="Cascadia Code"/>
+        </w:rPr>
+      </w:r>
+    </w:p>
+    <w:p>
+      <w:pPr>
+        <w:pStyle w:val="Code"/>
+        <w:rPr>
+          <w:rFonts w:ascii="Cascadia Code" w:hAnsi="Cascadia Code"/>
+        </w:rPr>
+      </w:pPr>
+      <w:r>
+        <w:rPr>
+          <w:rFonts w:ascii="Cascadia Code" w:hAnsi="Cascadia Code"/>
+        </w:rPr>
+        <w:t xml:space="preserve">        </w:t>
+      </w:r>
+      <w:r>
+        <w:rPr>
+          <w:rFonts w:ascii="Cascadia Code" w:hAnsi="Cascadia Code"/>
+        </w:rPr>
+        <w:t>print("--- Calculated double integral ---")</w:t>
+      </w:r>
+    </w:p>
+    <w:p>
+      <w:pPr>
+        <w:pStyle w:val="Code"/>
+        <w:rPr>
+          <w:rFonts w:ascii="Cascadia Code" w:hAnsi="Cascadia Code"/>
+        </w:rPr>
+      </w:pPr>
+      <w:r>
+        <w:rPr>
+          <w:rFonts w:ascii="Cascadia Code" w:hAnsi="Cascadia Code"/>
+        </w:rPr>
+        <w:t xml:space="preserve">        </w:t>
+      </w:r>
+      <w:r>
+        <w:rPr>
+          <w:rFonts w:ascii="Cascadia Code" w:hAnsi="Cascadia Code"/>
+        </w:rPr>
+        <w:t>print(f"Number of processes: {numprocs}")</w:t>
+      </w:r>
+    </w:p>
+    <w:p>
+      <w:pPr>
+        <w:pStyle w:val="Code"/>
+        <w:rPr>
+          <w:rFonts w:ascii="Cascadia Code" w:hAnsi="Cascadia Code"/>
+        </w:rPr>
+      </w:pPr>
+      <w:r>
+        <w:rPr>
+          <w:rFonts w:ascii="Cascadia Code" w:hAnsi="Cascadia Code"/>
+        </w:rPr>
+        <w:t xml:space="preserve">        </w:t>
+      </w:r>
+      <w:r>
+        <w:rPr>
+          <w:rFonts w:ascii="Cascadia Code" w:hAnsi="Cascadia Code"/>
+        </w:rPr>
+        <w:t>print(f"Total number of points N: {N_total}")</w:t>
+      </w:r>
+    </w:p>
+    <w:p>
+      <w:pPr>
+        <w:pStyle w:val="Code"/>
+        <w:rPr>
+          <w:rFonts w:ascii="Cascadia Code" w:hAnsi="Cascadia Code"/>
+        </w:rPr>
+      </w:pPr>
+      <w:r>
+        <w:rPr>
+          <w:rFonts w:ascii="Cascadia Code" w:hAnsi="Cascadia Code"/>
+        </w:rPr>
+        <w:t xml:space="preserve">        </w:t>
+      </w:r>
+      <w:r>
+        <w:rPr>
+          <w:rFonts w:ascii="Cascadia Code" w:hAnsi="Cascadia Code"/>
+        </w:rPr>
+        <w:t>print(f"Approcimated area of area S: {area_S_approx:.6f} (accurate: 1/3)")</w:t>
+      </w:r>
+    </w:p>
+    <w:p>
+      <w:pPr>
+        <w:pStyle w:val="Code"/>
+        <w:rPr>
+          <w:rFonts w:ascii="Cascadia Code" w:hAnsi="Cascadia Code"/>
+        </w:rPr>
+      </w:pPr>
+      <w:r>
+        <w:rPr>
+          <w:rFonts w:ascii="Cascadia Code" w:hAnsi="Cascadia Code"/>
+        </w:rPr>
+        <w:t xml:space="preserve">        </w:t>
+      </w:r>
+      <w:r>
+        <w:rPr>
+          <w:rFonts w:ascii="Cascadia Code" w:hAnsi="Cascadia Code"/>
+        </w:rPr>
+        <w:t>print(f"Integration results: {integral_mc:.10f}")</w:t>
+      </w:r>
+    </w:p>
+    <w:p>
+      <w:pPr>
+        <w:pStyle w:val="Code"/>
+        <w:rPr>
+          <w:rFonts w:ascii="Cascadia Code" w:hAnsi="Cascadia Code"/>
+        </w:rPr>
+      </w:pPr>
+      <w:r>
+        <w:rPr>
+          <w:rFonts w:ascii="Cascadia Code" w:hAnsi="Cascadia Code"/>
+        </w:rPr>
+        <w:t xml:space="preserve">        </w:t>
+      </w:r>
+      <w:r>
+        <w:rPr>
+          <w:rFonts w:ascii="Cascadia Code" w:hAnsi="Cascadia Code"/>
+        </w:rPr>
+        <w:t>print(f"Accurate value (1/12): {reference:.10f}")</w:t>
+      </w:r>
+    </w:p>
+    <w:p>
+      <w:pPr>
+        <w:pStyle w:val="Code"/>
+        <w:rPr>
+          <w:rFonts w:ascii="Cascadia Code" w:hAnsi="Cascadia Code"/>
+        </w:rPr>
+      </w:pPr>
+      <w:r>
+        <w:rPr>
+          <w:rFonts w:ascii="Cascadia Code" w:hAnsi="Cascadia Code"/>
+        </w:rPr>
+        <w:t xml:space="preserve">        </w:t>
+      </w:r>
+      <w:r>
+        <w:rPr>
+          <w:rFonts w:ascii="Cascadia Code" w:hAnsi="Cascadia Code"/>
+        </w:rPr>
+        <w:t>print(f"Absolute error: {error:.10e}")</w:t>
+      </w:r>
+    </w:p>
+    <w:p>
+      <w:pPr>
+        <w:pStyle w:val="Code"/>
+        <w:rPr>
+          <w:rFonts w:ascii="Cascadia Code" w:hAnsi="Cascadia Code"/>
+        </w:rPr>
+      </w:pPr>
+      <w:r>
+        <w:rPr>
+          <w:rFonts w:ascii="Cascadia Code" w:hAnsi="Cascadia Code"/>
+        </w:rPr>
+        <w:t xml:space="preserve">        </w:t>
+      </w:r>
+      <w:r>
+        <w:rPr>
+          <w:rFonts w:ascii="Cascadia Code" w:hAnsi="Cascadia Code"/>
+        </w:rPr>
+        <w:t>print(f"Execution time: {end_time - start_time:.4f} sec")</w:t>
+      </w:r>
+    </w:p>
+    <w:p>
+      <w:pPr>
+        <w:pStyle w:val="Code"/>
+        <w:rPr>
+          <w:rFonts w:ascii="Cascadia Code" w:hAnsi="Cascadia Code"/>
+        </w:rPr>
+      </w:pPr>
+      <w:r>
+        <w:rPr>
+          <w:rFonts w:ascii="Cascadia Code" w:hAnsi="Cascadia Code"/>
+        </w:rPr>
+      </w:r>
+    </w:p>
+    <w:p>
+      <w:pPr>
+        <w:pStyle w:val="Code"/>
+        <w:rPr>
+          <w:rFonts w:ascii="Cascadia Code" w:hAnsi="Cascadia Code"/>
+        </w:rPr>
+      </w:pPr>
+      <w:r>
+        <w:rPr>
+          <w:rFonts w:ascii="Cascadia Code" w:hAnsi="Cascadia Code"/>
+        </w:rPr>
+        <w:t>if __name__ == "__main__":</w:t>
+      </w:r>
+    </w:p>
+    <w:p>
+      <w:pPr>
+        <w:pStyle w:val="Code"/>
+        <w:rPr>
+          <w:rFonts w:ascii="Cascadia Code" w:hAnsi="Cascadia Code"/>
+        </w:rPr>
+      </w:pPr>
+      <w:r>
+        <w:rPr>
+          <w:rFonts w:ascii="Cascadia Code" w:hAnsi="Cascadia Code"/>
+        </w:rPr>
+        <w:t xml:space="preserve">    </w:t>
+      </w:r>
+      <w:r>
+        <w:rPr>
+          <w:rFonts w:ascii="Cascadia Code" w:hAnsi="Cascadia Code"/>
+        </w:rPr>
+        <w:t>main()</w:t>
+      </w:r>
+    </w:p>
+    <w:p>
+      <w:pPr>
         <w:pStyle w:val="P1"/>
-        <w:rPr/>
-      </w:pPr>
-      <w:r>
-        <w:rPr/>
-      </w:r>
-    </w:p>
-    <w:p>
-      <w:pPr>
-        <w:pStyle w:val="Code"/>
-        <w:rPr>
-          <w:rFonts w:ascii="Cascadia Code" w:hAnsi="Cascadia Code"/>
-        </w:rPr>
-      </w:pPr>
-      <w:r>
-        <w:rPr>
-          <w:rFonts w:ascii="Cascadia Code" w:hAnsi="Cascadia Code"/>
-        </w:rPr>
-        <w:t>import math</w:t>
-      </w:r>
-    </w:p>
-    <w:p>
-      <w:pPr>
-        <w:pStyle w:val="Code"/>
-        <w:rPr>
-          <w:rFonts w:ascii="Cascadia Code" w:hAnsi="Cascadia Code"/>
-        </w:rPr>
-      </w:pPr>
-      <w:r>
-        <w:rPr>
-          <w:rFonts w:ascii="Cascadia Code" w:hAnsi="Cascadia Code"/>
-        </w:rPr>
-        <w:t>import random</w:t>
-      </w:r>
-    </w:p>
-    <w:p>
-      <w:pPr>
-        <w:pStyle w:val="Code"/>
-        <w:rPr>
-          <w:rFonts w:ascii="Cascadia Code" w:hAnsi="Cascadia Code"/>
-        </w:rPr>
-      </w:pPr>
-      <w:r>
-        <w:rPr>
-          <w:rFonts w:ascii="Cascadia Code" w:hAnsi="Cascadia Code"/>
-        </w:rPr>
-        <w:t>import time</w:t>
-      </w:r>
-    </w:p>
-    <w:p>
-      <w:pPr>
-        <w:pStyle w:val="Code"/>
-        <w:rPr>
-          <w:rFonts w:ascii="Cascadia Code" w:hAnsi="Cascadia Code"/>
-        </w:rPr>
-      </w:pPr>
-      <w:r>
-        <w:rPr>
-          <w:rFonts w:ascii="Cascadia Code" w:hAnsi="Cascadia Code"/>
-        </w:rPr>
-        <w:t>from mpi4py import MPI</w:t>
-      </w:r>
-    </w:p>
-    <w:p>
-      <w:pPr>
-        <w:pStyle w:val="Code"/>
-        <w:rPr>
-          <w:rFonts w:ascii="Cascadia Code" w:hAnsi="Cascadia Code"/>
-        </w:rPr>
-      </w:pPr>
-      <w:r>
-        <w:rPr>
-          <w:rFonts w:ascii="Cascadia Code" w:hAnsi="Cascadia Code"/>
-        </w:rPr>
-      </w:r>
-    </w:p>
-    <w:p>
-      <w:pPr>
-        <w:pStyle w:val="Code"/>
-        <w:rPr>
-          <w:rFonts w:ascii="Cascadia Code" w:hAnsi="Cascadia Code"/>
-        </w:rPr>
-      </w:pPr>
-      <w:r>
-        <w:rPr>
-          <w:rFonts w:ascii="Cascadia Code" w:hAnsi="Cascadia Code"/>
-        </w:rPr>
-        <w:t>def f(x):</w:t>
-      </w:r>
-    </w:p>
-    <w:p>
-      <w:pPr>
-        <w:pStyle w:val="Code"/>
-        <w:rPr>
-          <w:rFonts w:ascii="Cascadia Code" w:hAnsi="Cascadia Code"/>
-        </w:rPr>
-      </w:pPr>
-      <w:r>
-        <w:rPr>
-          <w:rFonts w:ascii="Cascadia Code" w:hAnsi="Cascadia Code"/>
-        </w:rPr>
-        <w:t xml:space="preserve">    </w:t>
-      </w:r>
-      <w:r>
-        <w:rPr>
-          <w:rFonts w:ascii="Cascadia Code" w:hAnsi="Cascadia Code"/>
-        </w:rPr>
-        <w:t>return math.sin(x) ** 2</w:t>
-      </w:r>
-    </w:p>
-    <w:p>
-      <w:pPr>
-        <w:pStyle w:val="Code"/>
-        <w:rPr>
-          <w:rFonts w:ascii="Cascadia Code" w:hAnsi="Cascadia Code"/>
-        </w:rPr>
-      </w:pPr>
-      <w:r>
-        <w:rPr>
-          <w:rFonts w:ascii="Cascadia Code" w:hAnsi="Cascadia Code"/>
-        </w:rPr>
-      </w:r>
-    </w:p>
-    <w:p>
-      <w:pPr>
-        <w:pStyle w:val="Code"/>
-        <w:rPr>
-          <w:rFonts w:ascii="Cascadia Code" w:hAnsi="Cascadia Code"/>
-        </w:rPr>
-      </w:pPr>
-      <w:r>
-        <w:rPr>
-          <w:rFonts w:ascii="Cascadia Code" w:hAnsi="Cascadia Code"/>
-        </w:rPr>
-        <w:t>def main():</w:t>
-      </w:r>
-    </w:p>
-    <w:p>
-      <w:pPr>
-        <w:pStyle w:val="Code"/>
-        <w:rPr>
-          <w:rFonts w:ascii="Cascadia Code" w:hAnsi="Cascadia Code"/>
-        </w:rPr>
-      </w:pPr>
-      <w:r>
-        <w:rPr>
-          <w:rFonts w:ascii="Cascadia Code" w:hAnsi="Cascadia Code"/>
-        </w:rPr>
-        <w:t xml:space="preserve">    </w:t>
-      </w:r>
-      <w:r>
-        <w:rPr>
-          <w:rFonts w:ascii="Cascadia Code" w:hAnsi="Cascadia Code"/>
-        </w:rPr>
-        <w:t>comm = MPI.COMM_WORLD</w:t>
-      </w:r>
-    </w:p>
-    <w:p>
-      <w:pPr>
-        <w:pStyle w:val="Code"/>
-        <w:rPr>
-          <w:rFonts w:ascii="Cascadia Code" w:hAnsi="Cascadia Code"/>
-        </w:rPr>
-      </w:pPr>
-      <w:r>
-        <w:rPr>
-          <w:rFonts w:ascii="Cascadia Code" w:hAnsi="Cascadia Code"/>
-        </w:rPr>
-        <w:t xml:space="preserve">    </w:t>
-      </w:r>
-      <w:r>
-        <w:rPr>
-          <w:rFonts w:ascii="Cascadia Code" w:hAnsi="Cascadia Code"/>
-        </w:rPr>
-        <w:t>rank = comm.Get_rank()</w:t>
-      </w:r>
-    </w:p>
-    <w:p>
-      <w:pPr>
-        <w:pStyle w:val="Code"/>
-        <w:rPr>
-          <w:rFonts w:ascii="Cascadia Code" w:hAnsi="Cascadia Code"/>
-        </w:rPr>
-      </w:pPr>
-      <w:r>
-        <w:rPr>
-          <w:rFonts w:ascii="Cascadia Code" w:hAnsi="Cascadia Code"/>
-        </w:rPr>
-        <w:t xml:space="preserve">    </w:t>
-      </w:r>
-      <w:r>
-        <w:rPr>
-          <w:rFonts w:ascii="Cascadia Code" w:hAnsi="Cascadia Code"/>
-        </w:rPr>
-        <w:t>numprocs = comm.Get_size()</w:t>
-      </w:r>
-    </w:p>
-    <w:p>
-      <w:pPr>
-        <w:pStyle w:val="Code"/>
-        <w:rPr>
-          <w:rFonts w:ascii="Cascadia Code" w:hAnsi="Cascadia Code"/>
-        </w:rPr>
-      </w:pPr>
-      <w:r>
-        <w:rPr>
-          <w:rFonts w:ascii="Cascadia Code" w:hAnsi="Cascadia Code"/>
-        </w:rPr>
-      </w:r>
-    </w:p>
-    <w:p>
-      <w:pPr>
-        <w:pStyle w:val="Code"/>
-        <w:rPr>
-          <w:rFonts w:ascii="Cascadia Code" w:hAnsi="Cascadia Code"/>
-        </w:rPr>
-      </w:pPr>
-      <w:r>
-        <w:rPr>
-          <w:rFonts w:ascii="Cascadia Code" w:hAnsi="Cascadia Code"/>
-        </w:rPr>
-        <w:t xml:space="preserve">    </w:t>
-      </w:r>
-      <w:r>
-        <w:rPr>
-          <w:rFonts w:ascii="Cascadia Code" w:hAnsi="Cascadia Code"/>
-        </w:rPr>
-        <w:t>a = 0.0</w:t>
-      </w:r>
-    </w:p>
-    <w:p>
-      <w:pPr>
-        <w:pStyle w:val="Code"/>
-        <w:rPr>
-          <w:rFonts w:ascii="Cascadia Code" w:hAnsi="Cascadia Code"/>
-        </w:rPr>
-      </w:pPr>
-      <w:r>
-        <w:rPr>
-          <w:rFonts w:ascii="Cascadia Code" w:hAnsi="Cascadia Code"/>
-        </w:rPr>
-        <w:t xml:space="preserve">    </w:t>
-      </w:r>
-      <w:r>
-        <w:rPr>
-          <w:rFonts w:ascii="Cascadia Code" w:hAnsi="Cascadia Code"/>
-        </w:rPr>
-        <w:t>b = math.pi / 2</w:t>
-      </w:r>
-    </w:p>
-    <w:p>
-      <w:pPr>
-        <w:pStyle w:val="Code"/>
-        <w:rPr>
-          <w:rFonts w:ascii="Cascadia Code" w:hAnsi="Cascadia Code"/>
-        </w:rPr>
-      </w:pPr>
-      <w:r>
-        <w:rPr>
-          <w:rFonts w:ascii="Cascadia Code" w:hAnsi="Cascadia Code"/>
-        </w:rPr>
-        <w:t xml:space="preserve">    </w:t>
-      </w:r>
-      <w:r>
-        <w:rPr>
-          <w:rFonts w:ascii="Cascadia Code" w:hAnsi="Cascadia Code"/>
-        </w:rPr>
-        <w:t>N_total = 1_000_000_000</w:t>
-      </w:r>
-    </w:p>
-    <w:p>
-      <w:pPr>
-        <w:pStyle w:val="Code"/>
-        <w:rPr>
-          <w:rFonts w:ascii="Cascadia Code" w:hAnsi="Cascadia Code"/>
-        </w:rPr>
-      </w:pPr>
-      <w:r>
-        <w:rPr>
-          <w:rFonts w:ascii="Cascadia Code" w:hAnsi="Cascadia Code"/>
-        </w:rPr>
-        <w:t xml:space="preserve">    </w:t>
-      </w:r>
-      <w:r>
-        <w:rPr>
-          <w:rFonts w:ascii="Cascadia Code" w:hAnsi="Cascadia Code"/>
-        </w:rPr>
-        <w:t>n_per_procs = N_total // numprocs</w:t>
-      </w:r>
-    </w:p>
-    <w:p>
-      <w:pPr>
-        <w:pStyle w:val="Code"/>
-        <w:rPr>
-          <w:rFonts w:ascii="Cascadia Code" w:hAnsi="Cascadia Code"/>
-        </w:rPr>
-      </w:pPr>
-      <w:r>
-        <w:rPr>
-          <w:rFonts w:ascii="Cascadia Code" w:hAnsi="Cascadia Code"/>
-        </w:rPr>
-      </w:r>
-    </w:p>
-    <w:p>
-      <w:pPr>
-        <w:pStyle w:val="Code"/>
-        <w:rPr>
-          <w:rFonts w:ascii="Cascadia Code" w:hAnsi="Cascadia Code"/>
-        </w:rPr>
-      </w:pPr>
-      <w:r>
-        <w:rPr>
-          <w:rFonts w:ascii="Cascadia Code" w:hAnsi="Cascadia Code"/>
-        </w:rPr>
-        <w:t xml:space="preserve">    </w:t>
-      </w:r>
-      <w:r>
-        <w:rPr>
-          <w:rFonts w:ascii="Cascadia Code" w:hAnsi="Cascadia Code"/>
-        </w:rPr>
-        <w:t>reference = math.pi / 4</w:t>
-      </w:r>
-    </w:p>
-    <w:p>
-      <w:pPr>
-        <w:pStyle w:val="Code"/>
-        <w:rPr>
-          <w:rFonts w:ascii="Cascadia Code" w:hAnsi="Cascadia Code"/>
-        </w:rPr>
-      </w:pPr>
-      <w:r>
-        <w:rPr>
-          <w:rFonts w:ascii="Cascadia Code" w:hAnsi="Cascadia Code"/>
-        </w:rPr>
-        <w:t xml:space="preserve">    </w:t>
-      </w:r>
-      <w:r>
-        <w:rPr>
-          <w:rFonts w:ascii="Cascadia Code" w:hAnsi="Cascadia Code"/>
-        </w:rPr>
-        <w:t>local_sum = 0.0</w:t>
-      </w:r>
-    </w:p>
-    <w:p>
-      <w:pPr>
-        <w:pStyle w:val="Code"/>
-        <w:rPr>
-          <w:rFonts w:ascii="Cascadia Code" w:hAnsi="Cascadia Code"/>
-        </w:rPr>
-      </w:pPr>
-      <w:r>
-        <w:rPr>
-          <w:rFonts w:ascii="Cascadia Code" w:hAnsi="Cascadia Code"/>
-        </w:rPr>
-      </w:r>
-    </w:p>
-    <w:p>
-      <w:pPr>
-        <w:pStyle w:val="Code"/>
-        <w:rPr>
-          <w:rFonts w:ascii="Cascadia Code" w:hAnsi="Cascadia Code"/>
-        </w:rPr>
-      </w:pPr>
-      <w:r>
-        <w:rPr>
-          <w:rFonts w:ascii="Cascadia Code" w:hAnsi="Cascadia Code"/>
-        </w:rPr>
-        <w:t xml:space="preserve">    </w:t>
-      </w:r>
-      <w:r>
-        <w:rPr>
-          <w:rFonts w:ascii="Cascadia Code" w:hAnsi="Cascadia Code"/>
-        </w:rPr>
-        <w:t>start_time = MPI.Wtime()</w:t>
-      </w:r>
-    </w:p>
-    <w:p>
-      <w:pPr>
-        <w:pStyle w:val="Code"/>
-        <w:rPr>
-          <w:rFonts w:ascii="Cascadia Code" w:hAnsi="Cascadia Code"/>
-        </w:rPr>
-      </w:pPr>
-      <w:r>
-        <w:rPr>
-          <w:rFonts w:ascii="Cascadia Code" w:hAnsi="Cascadia Code"/>
-        </w:rPr>
-      </w:r>
-    </w:p>
-    <w:p>
-      <w:pPr>
-        <w:pStyle w:val="Code"/>
-        <w:rPr>
-          <w:rFonts w:ascii="Cascadia Code" w:hAnsi="Cascadia Code"/>
-        </w:rPr>
-      </w:pPr>
-      <w:r>
-        <w:rPr>
-          <w:rFonts w:ascii="Cascadia Code" w:hAnsi="Cascadia Code"/>
-        </w:rPr>
-        <w:t xml:space="preserve">    </w:t>
-      </w:r>
-      <w:r>
-        <w:rPr>
-          <w:rFonts w:ascii="Cascadia Code" w:hAnsi="Cascadia Code"/>
-        </w:rPr>
-        <w:t>random.seed(time.time() + rank)</w:t>
-      </w:r>
-    </w:p>
-    <w:p>
-      <w:pPr>
-        <w:pStyle w:val="Code"/>
-        <w:rPr>
-          <w:rFonts w:ascii="Cascadia Code" w:hAnsi="Cascadia Code"/>
-        </w:rPr>
-      </w:pPr>
-      <w:r>
-        <w:rPr>
-          <w:rFonts w:ascii="Cascadia Code" w:hAnsi="Cascadia Code"/>
-        </w:rPr>
-      </w:r>
-    </w:p>
-    <w:p>
-      <w:pPr>
-        <w:pStyle w:val="Code"/>
-        <w:rPr>
-          <w:rFonts w:ascii="Cascadia Code" w:hAnsi="Cascadia Code"/>
-        </w:rPr>
-      </w:pPr>
-      <w:r>
-        <w:rPr>
-          <w:rFonts w:ascii="Cascadia Code" w:hAnsi="Cascadia Code"/>
-        </w:rPr>
-        <w:t xml:space="preserve">    </w:t>
-      </w:r>
-      <w:r>
-        <w:rPr>
-          <w:rFonts w:ascii="Cascadia Code" w:hAnsi="Cascadia Code"/>
-        </w:rPr>
-        <w:t>for _ in range(n_per_procs):</w:t>
-      </w:r>
-    </w:p>
-    <w:p>
-      <w:pPr>
-        <w:pStyle w:val="Code"/>
-        <w:rPr>
-          <w:rFonts w:ascii="Cascadia Code" w:hAnsi="Cascadia Code"/>
-        </w:rPr>
-      </w:pPr>
-      <w:r>
-        <w:rPr>
-          <w:rFonts w:ascii="Cascadia Code" w:hAnsi="Cascadia Code"/>
-        </w:rPr>
-        <w:t xml:space="preserve">        </w:t>
-      </w:r>
-      <w:r>
-        <w:rPr>
-          <w:rFonts w:ascii="Cascadia Code" w:hAnsi="Cascadia Code"/>
-        </w:rPr>
-        <w:t>x = random.uniform(a, b)</w:t>
-      </w:r>
-    </w:p>
-    <w:p>
-      <w:pPr>
-        <w:pStyle w:val="Code"/>
-        <w:rPr>
-          <w:rFonts w:ascii="Cascadia Code" w:hAnsi="Cascadia Code"/>
-        </w:rPr>
-      </w:pPr>
-      <w:r>
-        <w:rPr>
-          <w:rFonts w:ascii="Cascadia Code" w:hAnsi="Cascadia Code"/>
-        </w:rPr>
-        <w:t xml:space="preserve">        </w:t>
-      </w:r>
-      <w:r>
-        <w:rPr>
-          <w:rFonts w:ascii="Cascadia Code" w:hAnsi="Cascadia Code"/>
-        </w:rPr>
-        <w:t>local_sum += f(x)</w:t>
-      </w:r>
-    </w:p>
-    <w:p>
-      <w:pPr>
-        <w:pStyle w:val="Code"/>
-        <w:rPr>
-          <w:rFonts w:ascii="Cascadia Code" w:hAnsi="Cascadia Code"/>
-        </w:rPr>
-      </w:pPr>
-      <w:r>
-        <w:rPr>
-          <w:rFonts w:ascii="Cascadia Code" w:hAnsi="Cascadia Code"/>
-        </w:rPr>
-      </w:r>
-    </w:p>
-    <w:p>
-      <w:pPr>
-        <w:pStyle w:val="Code"/>
-        <w:rPr>
-          <w:rFonts w:ascii="Cascadia Code" w:hAnsi="Cascadia Code"/>
-        </w:rPr>
-      </w:pPr>
-      <w:r>
-        <w:rPr>
-          <w:rFonts w:ascii="Cascadia Code" w:hAnsi="Cascadia Code"/>
-        </w:rPr>
-        <w:t xml:space="preserve">    </w:t>
-      </w:r>
-      <w:r>
-        <w:rPr>
-          <w:rFonts w:ascii="Cascadia Code" w:hAnsi="Cascadia Code"/>
-        </w:rPr>
-        <w:t>total_sum = comm.reduce(local_sum, op=MPI.SUM)</w:t>
-      </w:r>
-    </w:p>
-    <w:p>
-      <w:pPr>
-        <w:pStyle w:val="Code"/>
-        <w:rPr>
-          <w:rFonts w:ascii="Cascadia Code" w:hAnsi="Cascadia Code"/>
-        </w:rPr>
-      </w:pPr>
-      <w:r>
-        <w:rPr>
-          <w:rFonts w:ascii="Cascadia Code" w:hAnsi="Cascadia Code"/>
-        </w:rPr>
-        <w:t xml:space="preserve">    </w:t>
-      </w:r>
-      <w:r>
-        <w:rPr>
-          <w:rFonts w:ascii="Cascadia Code" w:hAnsi="Cascadia Code"/>
-        </w:rPr>
-        <w:t>end_time = MPI.Wtime()</w:t>
-      </w:r>
-    </w:p>
-    <w:p>
-      <w:pPr>
-        <w:pStyle w:val="Code"/>
-        <w:rPr>
-          <w:rFonts w:ascii="Cascadia Code" w:hAnsi="Cascadia Code"/>
-        </w:rPr>
-      </w:pPr>
-      <w:r>
-        <w:rPr>
-          <w:rFonts w:ascii="Cascadia Code" w:hAnsi="Cascadia Code"/>
-        </w:rPr>
-      </w:r>
-    </w:p>
-    <w:p>
-      <w:pPr>
-        <w:pStyle w:val="Code"/>
-        <w:rPr>
-          <w:rFonts w:ascii="Cascadia Code" w:hAnsi="Cascadia Code"/>
-        </w:rPr>
-      </w:pPr>
-      <w:r>
-        <w:rPr>
-          <w:rFonts w:ascii="Cascadia Code" w:hAnsi="Cascadia Code"/>
-        </w:rPr>
-        <w:t xml:space="preserve">    </w:t>
-      </w:r>
-      <w:r>
-        <w:rPr>
-          <w:rFonts w:ascii="Cascadia Code" w:hAnsi="Cascadia Code"/>
-        </w:rPr>
-        <w:t>if rank == 0:</w:t>
-      </w:r>
-    </w:p>
-    <w:p>
-      <w:pPr>
-        <w:pStyle w:val="Code"/>
-        <w:rPr>
-          <w:rFonts w:ascii="Cascadia Code" w:hAnsi="Cascadia Code"/>
-        </w:rPr>
-      </w:pPr>
-      <w:r>
-        <w:rPr>
-          <w:rFonts w:ascii="Cascadia Code" w:hAnsi="Cascadia Code"/>
-        </w:rPr>
-        <w:t xml:space="preserve">        </w:t>
-      </w:r>
-      <w:r>
-        <w:rPr>
-          <w:rFonts w:ascii="Cascadia Code" w:hAnsi="Cascadia Code"/>
-        </w:rPr>
-        <w:t>integral_mc = ((b - a) * total_sum) / N_total</w:t>
-      </w:r>
-    </w:p>
-    <w:p>
-      <w:pPr>
-        <w:pStyle w:val="Code"/>
-        <w:rPr>
-          <w:rFonts w:ascii="Cascadia Code" w:hAnsi="Cascadia Code"/>
-        </w:rPr>
-      </w:pPr>
-      <w:r>
-        <w:rPr>
-          <w:rFonts w:ascii="Cascadia Code" w:hAnsi="Cascadia Code"/>
-        </w:rPr>
-        <w:t xml:space="preserve">        </w:t>
-      </w:r>
-      <w:r>
-        <w:rPr>
-          <w:rFonts w:ascii="Cascadia Code" w:hAnsi="Cascadia Code"/>
-        </w:rPr>
-        <w:t>error = abs(reference - integral_mc)</w:t>
-      </w:r>
-    </w:p>
-    <w:p>
-      <w:pPr>
-        <w:pStyle w:val="Code"/>
-        <w:rPr>
-          <w:rFonts w:ascii="Cascadia Code" w:hAnsi="Cascadia Code"/>
-        </w:rPr>
-      </w:pPr>
-      <w:r>
-        <w:rPr>
-          <w:rFonts w:ascii="Cascadia Code" w:hAnsi="Cascadia Code"/>
-        </w:rPr>
-      </w:r>
-    </w:p>
-    <w:p>
-      <w:pPr>
-        <w:pStyle w:val="Code"/>
-        <w:rPr>
-          <w:rFonts w:ascii="Cascadia Code" w:hAnsi="Cascadia Code"/>
-        </w:rPr>
-      </w:pPr>
-      <w:r>
-        <w:rPr>
-          <w:rFonts w:ascii="Cascadia Code" w:hAnsi="Cascadia Code"/>
-        </w:rPr>
-        <w:t xml:space="preserve">        </w:t>
-      </w:r>
-      <w:r>
-        <w:rPr>
-          <w:rFonts w:ascii="Cascadia Code" w:hAnsi="Cascadia Code"/>
-        </w:rPr>
-        <w:t>print(f"Result: {integral_mc:.16f}")</w:t>
-      </w:r>
-    </w:p>
-    <w:p>
-      <w:pPr>
-        <w:pStyle w:val="Code"/>
-        <w:rPr>
-          <w:rFonts w:ascii="Cascadia Code" w:hAnsi="Cascadia Code"/>
-        </w:rPr>
-      </w:pPr>
-      <w:r>
-        <w:rPr>
-          <w:rFonts w:ascii="Cascadia Code" w:hAnsi="Cascadia Code"/>
-        </w:rPr>
-        <w:t xml:space="preserve">        </w:t>
-      </w:r>
-      <w:r>
-        <w:rPr>
-          <w:rFonts w:ascii="Cascadia Code" w:hAnsi="Cascadia Code"/>
-        </w:rPr>
-        <w:t>print(f"Accurate number: {reference:.16f}")</w:t>
-      </w:r>
-    </w:p>
-    <w:p>
-      <w:pPr>
-        <w:pStyle w:val="Code"/>
-        <w:rPr>
-          <w:rFonts w:ascii="Cascadia Code" w:hAnsi="Cascadia Code"/>
-        </w:rPr>
-      </w:pPr>
-      <w:r>
-        <w:rPr>
-          <w:rFonts w:ascii="Cascadia Code" w:hAnsi="Cascadia Code"/>
-        </w:rPr>
-        <w:t xml:space="preserve">        </w:t>
-      </w:r>
-      <w:r>
-        <w:rPr>
-          <w:rFonts w:ascii="Cascadia Code" w:hAnsi="Cascadia Code"/>
-        </w:rPr>
-        <w:t>print(f"Error: {error:.15f}")</w:t>
-      </w:r>
-    </w:p>
-    <w:p>
-      <w:pPr>
-        <w:pStyle w:val="Code"/>
-        <w:rPr>
-          <w:rFonts w:ascii="Cascadia Code" w:hAnsi="Cascadia Code"/>
-        </w:rPr>
-      </w:pPr>
-      <w:r>
-        <w:rPr>
-          <w:rFonts w:ascii="Cascadia Code" w:hAnsi="Cascadia Code"/>
-        </w:rPr>
-        <w:t xml:space="preserve">        </w:t>
-      </w:r>
-      <w:r>
-        <w:rPr>
-          <w:rFonts w:ascii="Cascadia Code" w:hAnsi="Cascadia Code"/>
-        </w:rPr>
-        <w:t>print(f"Execution time: {end_time - start_time:.4f} sec")</w:t>
-      </w:r>
-    </w:p>
-    <w:p>
-      <w:pPr>
-        <w:pStyle w:val="Code"/>
-        <w:rPr>
-          <w:rFonts w:ascii="Cascadia Code" w:hAnsi="Cascadia Code"/>
-        </w:rPr>
-      </w:pPr>
-      <w:r>
-        <w:rPr>
-          <w:rFonts w:ascii="Cascadia Code" w:hAnsi="Cascadia Code"/>
-        </w:rPr>
-      </w:r>
-    </w:p>
-    <w:p>
-      <w:pPr>
-        <w:pStyle w:val="Code"/>
-        <w:rPr>
-          <w:rFonts w:ascii="Cascadia Code" w:hAnsi="Cascadia Code"/>
-        </w:rPr>
-      </w:pPr>
-      <w:r>
-        <w:rPr>
-          <w:rFonts w:ascii="Cascadia Code" w:hAnsi="Cascadia Code"/>
-        </w:rPr>
-        <w:t>if __name__ == "__main__":</w:t>
-      </w:r>
-    </w:p>
-    <w:p>
-      <w:pPr>
-        <w:pStyle w:val="Code"/>
-        <w:rPr>
-          <w:rFonts w:ascii="Cascadia Code" w:hAnsi="Cascadia Code"/>
-        </w:rPr>
-      </w:pPr>
-      <w:r>
-        <w:rPr>
-          <w:rFonts w:ascii="Cascadia Code" w:hAnsi="Cascadia Code"/>
-        </w:rPr>
-        <w:t xml:space="preserve">    </w:t>
-      </w:r>
-      <w:r>
-        <w:rPr>
-          <w:rFonts w:ascii="Cascadia Code" w:hAnsi="Cascadia Code"/>
-        </w:rPr>
-        <w:t>main()</w:t>
+        <w:rPr>
+          <w:rFonts w:ascii="Cascadia Code" w:hAnsi="Cascadia Code"/>
+        </w:rPr>
+      </w:pPr>
+      <w:r>
+        <w:rPr>
+          <w:rFonts w:ascii="Cascadia Code" w:hAnsi="Cascadia Code"/>
+        </w:rPr>
+      </w:r>
+    </w:p>
+    <w:p>
+      <w:pPr>
+        <w:pStyle w:val="H3"/>
+        <w:rPr/>
+      </w:pPr>
+      <w:r>
+        <w:rPr/>
+        <w:t>Результати</w:t>
       </w:r>
     </w:p>
     <w:p>
       <w:pPr>
         <w:pStyle w:val="P1"/>
-        <w:rPr/>
-      </w:pPr>
-      <w:r>
-        <w:rPr/>
-      </w:r>
-    </w:p>
-    <w:p>
-      <w:pPr>
-        <w:pStyle w:val="H3"/>
-        <w:rPr/>
-      </w:pPr>
-      <w:r>
-        <w:rPr/>
-        <w:t>Результати</w:t>
+        <w:rPr>
+          <w:rFonts w:ascii="Cascadia Code" w:hAnsi="Cascadia Code"/>
+        </w:rPr>
+      </w:pPr>
+      <w:r>
+        <w:rPr>
+          <w:rFonts w:ascii="Cascadia Code" w:hAnsi="Cascadia Code"/>
+        </w:rPr>
+      </w:r>
+    </w:p>
+    <w:p>
+      <w:pPr>
+        <w:pStyle w:val="Code"/>
+        <w:rPr>
+          <w:rFonts w:ascii="Cascadia Code" w:hAnsi="Cascadia Code"/>
+        </w:rPr>
+      </w:pPr>
+      <w:r>
+        <w:rPr>
+          <w:rFonts w:ascii="Cascadia Code" w:hAnsi="Cascadia Code"/>
+        </w:rPr>
+        <w:t>--- Calculated double integral ---</w:t>
+      </w:r>
+    </w:p>
+    <w:p>
+      <w:pPr>
+        <w:pStyle w:val="Code"/>
+        <w:rPr>
+          <w:rFonts w:ascii="Cascadia Code" w:hAnsi="Cascadia Code"/>
+        </w:rPr>
+      </w:pPr>
+      <w:r>
+        <w:rPr>
+          <w:rFonts w:ascii="Cascadia Code" w:hAnsi="Cascadia Code"/>
+        </w:rPr>
+        <w:t>Number of processes: 12</w:t>
+      </w:r>
+    </w:p>
+    <w:p>
+      <w:pPr>
+        <w:pStyle w:val="Code"/>
+        <w:rPr>
+          <w:rFonts w:ascii="Cascadia Code" w:hAnsi="Cascadia Code"/>
+        </w:rPr>
+      </w:pPr>
+      <w:r>
+        <w:rPr>
+          <w:rFonts w:ascii="Cascadia Code" w:hAnsi="Cascadia Code"/>
+        </w:rPr>
+        <w:t>Total number of points N: 100000000</w:t>
+      </w:r>
+    </w:p>
+    <w:p>
+      <w:pPr>
+        <w:pStyle w:val="Code"/>
+        <w:rPr>
+          <w:rFonts w:ascii="Cascadia Code" w:hAnsi="Cascadia Code"/>
+        </w:rPr>
+      </w:pPr>
+      <w:r>
+        <w:rPr>
+          <w:rFonts w:ascii="Cascadia Code" w:hAnsi="Cascadia Code"/>
+        </w:rPr>
+        <w:t>Approcimated area of area S: 0.333378 (accurate: 1/3)</w:t>
+      </w:r>
+    </w:p>
+    <w:p>
+      <w:pPr>
+        <w:pStyle w:val="Code"/>
+        <w:rPr>
+          <w:rFonts w:ascii="Cascadia Code" w:hAnsi="Cascadia Code"/>
+        </w:rPr>
+      </w:pPr>
+      <w:r>
+        <w:rPr>
+          <w:rFonts w:ascii="Cascadia Code" w:hAnsi="Cascadia Code"/>
+        </w:rPr>
+        <w:t>Integration results: 0.0833352054</w:t>
+      </w:r>
+    </w:p>
+    <w:p>
+      <w:pPr>
+        <w:pStyle w:val="Code"/>
+        <w:rPr>
+          <w:rFonts w:ascii="Cascadia Code" w:hAnsi="Cascadia Code"/>
+        </w:rPr>
+      </w:pPr>
+      <w:r>
+        <w:rPr>
+          <w:rFonts w:ascii="Cascadia Code" w:hAnsi="Cascadia Code"/>
+        </w:rPr>
+        <w:t>Accurate value (1/12): 0.0833333333</w:t>
+      </w:r>
+    </w:p>
+    <w:p>
+      <w:pPr>
+        <w:pStyle w:val="Code"/>
+        <w:rPr>
+          <w:rFonts w:ascii="Cascadia Code" w:hAnsi="Cascadia Code"/>
+        </w:rPr>
+      </w:pPr>
+      <w:r>
+        <w:rPr>
+          <w:rFonts w:ascii="Cascadia Code" w:hAnsi="Cascadia Code"/>
+        </w:rPr>
+        <w:t>Absolute error: 1.8720723393e-06</w:t>
+      </w:r>
+    </w:p>
+    <w:p>
+      <w:pPr>
+        <w:pStyle w:val="Code"/>
+        <w:rPr>
+          <w:rFonts w:ascii="Cascadia Code" w:hAnsi="Cascadia Code"/>
+        </w:rPr>
+      </w:pPr>
+      <w:r>
+        <w:rPr>
+          <w:rFonts w:ascii="Cascadia Code" w:hAnsi="Cascadia Code"/>
+        </w:rPr>
+        <w:t>Execution time: 6.9551 sec</w:t>
+      </w:r>
+    </w:p>
+    <w:p>
+      <w:pPr>
+        <w:pStyle w:val="h11"/>
+        <w:rPr/>
+      </w:pPr>
+      <w:r>
+        <w:rPr/>
+        <w:t>Питання</w:t>
+      </w:r>
+    </w:p>
+    <w:p>
+      <w:pPr>
+        <w:pStyle w:val="H2"/>
+        <w:rPr/>
+      </w:pPr>
+      <w:r>
+        <w:rPr/>
+        <w:t>Проаналізуйте програму 5.1. Нехай інтервал інтегрування складається з 10 підінтервалів (0, 1, 2 і т.д.), а кількість процесорів дорівнює чотирьом. Назвіть номери підінтервалів, в яких обчислює підінтегральну функцію кожний з процесорів.</w:t>
       </w:r>
     </w:p>
     <w:p>
@@ -10707,94 +12239,101 @@
     </w:p>
     <w:p>
       <w:pPr>
-        <w:pStyle w:val="Code"/>
-        <w:rPr>
-          <w:rFonts w:ascii="Cascadia Code" w:hAnsi="Cascadia Code"/>
-        </w:rPr>
-      </w:pPr>
-      <w:r>
-        <w:rPr>
-          <w:rFonts w:ascii="Cascadia Code" w:hAnsi="Cascadia Code"/>
-        </w:rPr>
-        <w:t>Result: 0.7854164765012532</w:t>
-      </w:r>
-    </w:p>
-    <w:p>
-      <w:pPr>
-        <w:pStyle w:val="Code"/>
-        <w:rPr>
-          <w:rFonts w:ascii="Cascadia Code" w:hAnsi="Cascadia Code"/>
-        </w:rPr>
-      </w:pPr>
-      <w:r>
-        <w:rPr>
-          <w:rFonts w:ascii="Cascadia Code" w:hAnsi="Cascadia Code"/>
-        </w:rPr>
-        <w:t>Accurate number: 0.7853981633974483</w:t>
-      </w:r>
-    </w:p>
-    <w:p>
-      <w:pPr>
-        <w:pStyle w:val="Code"/>
-        <w:rPr>
-          <w:rFonts w:ascii="Cascadia Code" w:hAnsi="Cascadia Code"/>
-        </w:rPr>
-      </w:pPr>
-      <w:r>
-        <w:rPr>
-          <w:rFonts w:ascii="Cascadia Code" w:hAnsi="Cascadia Code"/>
-        </w:rPr>
-        <w:t>Error: 0.000018313103805</w:t>
-      </w:r>
-    </w:p>
-    <w:p>
-      <w:pPr>
-        <w:pStyle w:val="Code"/>
-        <w:rPr>
-          <w:rFonts w:ascii="Cascadia Code" w:hAnsi="Cascadia Code"/>
-        </w:rPr>
-      </w:pPr>
-      <w:r>
-        <w:rPr>
-          <w:rFonts w:ascii="Cascadia Code" w:hAnsi="Cascadia Code"/>
-        </w:rPr>
-        <w:t>Execution time: 53.4747 sec</w:t>
-      </w:r>
-    </w:p>
-    <w:p>
-      <w:pPr>
         <w:pStyle w:val="P1"/>
-        <w:rPr>
-          <w:rFonts w:ascii="Cascadia Code" w:hAnsi="Cascadia Code"/>
-        </w:rPr>
-      </w:pPr>
-      <w:r>
-        <w:rPr>
-          <w:rFonts w:ascii="Cascadia Code" w:hAnsi="Cascadia Code"/>
-        </w:rPr>
+        <w:rPr/>
+      </w:pPr>
+      <w:r>
+        <w:rPr/>
+        <w:t xml:space="preserve">Якщо маємо за </w:t>
+      </w:r>
+      <w:r>
+        <w:rPr>
+          <w:lang w:val="en-US"/>
+        </w:rPr>
+        <w:t xml:space="preserve">n = 10 </w:t>
+      </w:r>
+      <w:r>
+        <w:rPr>
+          <w:lang w:val="uk-UA"/>
+        </w:rPr>
+        <w:t xml:space="preserve">інтервалів та </w:t>
+      </w:r>
+      <w:r>
+        <w:rPr>
+          <w:lang w:val="en-US"/>
+        </w:rPr>
+        <w:t xml:space="preserve">size = 4 </w:t>
+      </w:r>
+      <w:r>
+        <w:rPr>
+          <w:lang w:val="uk-UA"/>
+        </w:rPr>
+        <w:t>процесори, тоді інтервали розподіляються так:</w:t>
       </w:r>
     </w:p>
     <w:p>
       <w:pPr>
         <w:pStyle w:val="P1"/>
         <w:rPr>
-          <w:rFonts w:ascii="Cascadia Code" w:hAnsi="Cascadia Code"/>
-        </w:rPr>
-      </w:pPr>
-      <w:r>
-        <w:rPr>
-          <w:rFonts w:ascii="Cascadia Code" w:hAnsi="Cascadia Code"/>
-        </w:rPr>
-      </w:r>
-    </w:p>
-    <w:p>
-      <w:pPr>
-        <w:pStyle w:val="h11"/>
-        <w:rPr/>
-      </w:pPr>
-      <w:r>
-        <w:rPr/>
-        <w:t>Питання</w:t>
+          <w:lang w:val="uk-UA"/>
+        </w:rPr>
+      </w:pPr>
+      <w:r>
+        <w:rPr>
+          <w:lang w:val="uk-UA"/>
+        </w:rPr>
+        <w:t>- процесор 0: інтервали 1, 5, 9;</w:t>
+      </w:r>
+    </w:p>
+    <w:p>
+      <w:pPr>
+        <w:pStyle w:val="P1"/>
+        <w:rPr>
+          <w:lang w:val="uk-UA"/>
+        </w:rPr>
+      </w:pPr>
+      <w:r>
+        <w:rPr>
+          <w:lang w:val="uk-UA"/>
+        </w:rPr>
+        <w:t>- процесор 1: інтервали 2, 6, 10;</w:t>
+      </w:r>
+    </w:p>
+    <w:p>
+      <w:pPr>
+        <w:pStyle w:val="P1"/>
+        <w:rPr>
+          <w:lang w:val="uk-UA"/>
+        </w:rPr>
+      </w:pPr>
+      <w:r>
+        <w:rPr>
+          <w:lang w:val="uk-UA"/>
+        </w:rPr>
+        <w:t>- процесор 2: інтервали 3, 7;</w:t>
+      </w:r>
+    </w:p>
+    <w:p>
+      <w:pPr>
+        <w:pStyle w:val="P1"/>
+        <w:rPr>
+          <w:lang w:val="uk-UA"/>
+        </w:rPr>
+      </w:pPr>
+      <w:r>
+        <w:rPr>
+          <w:lang w:val="uk-UA"/>
+        </w:rPr>
+        <w:t>- процесор 3: інтервали 4, 8.</w:t>
+      </w:r>
+    </w:p>
+    <w:p>
+      <w:pPr>
+        <w:pStyle w:val="P1"/>
+        <w:rPr/>
+      </w:pPr>
+      <w:r>
+        <w:rPr/>
       </w:r>
     </w:p>
     <w:p>
@@ -10804,7 +12343,35 @@
       </w:pPr>
       <w:r>
         <w:rPr/>
-        <w:t>Проаналізуйте програму 5.1. Нехай інтервал інтегрування складається з 10 підінтервалів (0, 1, 2 і т.д.), а кількість процесорів дорівнює чотирьом. Назвіть номери підінтервалів, в яких обчислює підінтегральну функцію кожний з процесорів.</w:t>
+        <w:t>Чи залежить прискорення обчислення числа ПІ за допомогою програми 1 від кількості підінтервалів?</w:t>
+      </w:r>
+    </w:p>
+    <w:p>
+      <w:pPr>
+        <w:pStyle w:val="P1"/>
+        <w:rPr/>
+      </w:pPr>
+      <w:r>
+        <w:rPr/>
+      </w:r>
+    </w:p>
+    <w:p>
+      <w:pPr>
+        <w:pStyle w:val="P1"/>
+        <w:rPr/>
+      </w:pPr>
+      <w:r>
+        <w:rPr/>
+        <w:t>Так, залежить.</w:t>
+      </w:r>
+    </w:p>
+    <w:p>
+      <w:pPr>
+        <w:pStyle w:val="P1"/>
+        <w:rPr/>
+      </w:pPr>
+      <w:r>
+        <w:rPr/>
       </w:r>
     </w:p>
     <w:p>
@@ -10814,7 +12381,117 @@
       </w:pPr>
       <w:r>
         <w:rPr/>
-        <w:t>Чи залежить прискорення обчислення числа ПІ за допомогою програми 1 від кількості підінтервалів?</w:t>
+        <w:t>Порівняйте точності обчислень числа ПІ за допомогою програм 5.1 та 5.3. Які ваші висновки щодо точності реалізованих в програмах 5.1 та 5.3 методів?</w:t>
+      </w:r>
+    </w:p>
+    <w:p>
+      <w:pPr>
+        <w:pStyle w:val="P1"/>
+        <w:rPr>
+          <w:lang w:val="en-US"/>
+        </w:rPr>
+      </w:pPr>
+      <w:r>
+        <w:rPr>
+          <w:lang w:val="en-US"/>
+        </w:rPr>
+      </w:r>
+    </w:p>
+    <w:p>
+      <w:pPr>
+        <w:pStyle w:val="P1"/>
+        <w:rPr>
+          <w:lang w:val="uk-UA"/>
+        </w:rPr>
+      </w:pPr>
+      <w:r>
+        <w:rPr>
+          <w:lang w:val="uk-UA"/>
+        </w:rPr>
+        <w:t>Було проведено обчислення на двох програмах.</w:t>
+      </w:r>
+    </w:p>
+    <w:p>
+      <w:pPr>
+        <w:pStyle w:val="P1"/>
+        <w:rPr>
+          <w:lang w:val="uk-UA"/>
+        </w:rPr>
+      </w:pPr>
+      <w:r>
+        <w:rPr>
+          <w:lang w:val="uk-UA"/>
+        </w:rPr>
+        <w:t>Результати першої: 3.1508492098656036.</w:t>
+      </w:r>
+    </w:p>
+    <w:p>
+      <w:pPr>
+        <w:pStyle w:val="P1"/>
+        <w:rPr>
+          <w:lang w:val="uk-UA"/>
+        </w:rPr>
+      </w:pPr>
+      <w:r>
+        <w:rPr>
+          <w:lang w:val="uk-UA"/>
+        </w:rPr>
+        <w:t>Результати другої:  3.1416110770196730.</w:t>
+      </w:r>
+    </w:p>
+    <w:p>
+      <w:pPr>
+        <w:pStyle w:val="P1"/>
+        <w:rPr>
+          <w:lang w:val="uk-UA"/>
+        </w:rPr>
+      </w:pPr>
+      <w:r>
+        <w:rPr>
+          <w:lang w:val="uk-UA"/>
+        </w:rPr>
+        <w:t>Похибка першої: 0.0092565562758105.</w:t>
+      </w:r>
+    </w:p>
+    <w:p>
+      <w:pPr>
+        <w:pStyle w:val="P1"/>
+        <w:rPr>
+          <w:lang w:val="uk-UA"/>
+        </w:rPr>
+      </w:pPr>
+      <w:r>
+        <w:rPr>
+          <w:lang w:val="uk-UA"/>
+        </w:rPr>
+        <w:t>Похибка другої:  0.000018423429880.</w:t>
+      </w:r>
+    </w:p>
+    <w:p>
+      <w:pPr>
+        <w:pStyle w:val="P1"/>
+        <w:rPr>
+          <w:lang w:val="uk-UA"/>
+        </w:rPr>
+      </w:pPr>
+      <w:r>
+        <w:rPr>
+          <w:lang w:val="uk-UA"/>
+        </w:rPr>
+        <w:t>З цього видно, що друга програма обчислює число ПІ більш точно. Але вона і вимагає більше часу для виконання.</w:t>
+      </w:r>
+    </w:p>
+    <w:p>
+      <w:pPr>
+        <w:pStyle w:val="P1"/>
+        <w:rPr>
+          <w:lang w:val="uk-UA"/>
+        </w:rPr>
+      </w:pPr>
+      <w:r>
+        <w:rPr>
+          <w:lang w:val="uk-UA"/>
+        </w:rPr>
       </w:r>
     </w:p>
     <w:p>
@@ -10824,7 +12501,69 @@
       </w:pPr>
       <w:r>
         <w:rPr/>
-        <w:t>Порівняйте точності обчислень числа ПІ за допомогою програм 5.1 та 5.3. Які ваші висновки щодо точності реалізованих в програмах 5.1 та 5.3 методів?</w:t>
+        <w:t>Як в MPI визначити розмір буфера, необхідного для прийому повідомлень?</w:t>
+      </w:r>
+    </w:p>
+    <w:p>
+      <w:pPr>
+        <w:pStyle w:val="P1"/>
+        <w:rPr/>
+      </w:pPr>
+      <w:r>
+        <w:rPr/>
+      </w:r>
+    </w:p>
+    <w:p>
+      <w:pPr>
+        <w:pStyle w:val="P1"/>
+        <w:rPr/>
+      </w:pPr>
+      <w:r>
+        <w:rPr/>
+        <w:t xml:space="preserve">У бібліотеці </w:t>
+      </w:r>
+      <w:r>
+        <w:rPr>
+          <w:lang w:val="en-US"/>
+        </w:rPr>
+        <w:t xml:space="preserve">mpi4py </w:t>
+      </w:r>
+      <w:r>
+        <w:rPr>
+          <w:lang w:val="uk-UA"/>
+        </w:rPr>
+        <w:t xml:space="preserve">для малих об’єктів розмір визначається автоматично через серіалізацію, а для великих використовується </w:t>
+      </w:r>
+      <w:r>
+        <w:rPr>
+          <w:lang w:val="en-US"/>
+        </w:rPr>
+        <w:t xml:space="preserve">nbytes </w:t>
+      </w:r>
+      <w:r>
+        <w:rPr>
+          <w:lang w:val="uk-UA"/>
+        </w:rPr>
+        <w:t xml:space="preserve">об’єкти </w:t>
+      </w:r>
+      <w:r>
+        <w:rPr>
+          <w:lang w:val="en-US"/>
+        </w:rPr>
+        <w:t>NumPy.</w:t>
+      </w:r>
+    </w:p>
+    <w:p>
+      <w:pPr>
+        <w:pStyle w:val="P1"/>
+        <w:rPr>
+          <w:lang w:val="en-US"/>
+        </w:rPr>
+      </w:pPr>
+      <w:r>
+        <w:rPr>
+          <w:lang w:val="en-US"/>
+        </w:rPr>
       </w:r>
     </w:p>
     <w:p>
@@ -10834,7 +12573,159 @@
       </w:pPr>
       <w:r>
         <w:rPr/>
-        <w:t>Як в MPI визначити розмір буфера, необхідного для прийому повідомлень?</w:t>
+        <w:t>Що таке групи процесів в MPI? За допомогою яких функцій бібліотеки MPI їх можна створити?</w:t>
+      </w:r>
+    </w:p>
+    <w:p>
+      <w:pPr>
+        <w:pStyle w:val="P1"/>
+        <w:rPr/>
+      </w:pPr>
+      <w:r>
+        <w:rPr/>
+      </w:r>
+    </w:p>
+    <w:p>
+      <w:pPr>
+        <w:pStyle w:val="P1"/>
+        <w:rPr/>
+      </w:pPr>
+      <w:r>
+        <w:rPr/>
+        <w:t xml:space="preserve">Група процесів в </w:t>
+      </w:r>
+      <w:r>
+        <w:rPr>
+          <w:lang w:val="en-US"/>
+        </w:rPr>
+        <w:t xml:space="preserve">MPI </w:t>
+      </w:r>
+      <w:r>
+        <w:rPr>
+          <w:lang w:val="uk-UA"/>
+        </w:rPr>
+        <w:t>є впорядкованою множиною процесів.</w:t>
+      </w:r>
+    </w:p>
+    <w:p>
+      <w:pPr>
+        <w:pStyle w:val="P1"/>
+        <w:rPr>
+          <w:lang w:val="uk-UA"/>
+        </w:rPr>
+      </w:pPr>
+      <w:r>
+        <w:rPr>
+          <w:lang w:val="uk-UA"/>
+        </w:rPr>
+        <w:t>Основні функції для роботи з групами:</w:t>
+      </w:r>
+    </w:p>
+    <w:p>
+      <w:pPr>
+        <w:pStyle w:val="P1"/>
+        <w:rPr>
+          <w:lang w:val="uk-UA"/>
+        </w:rPr>
+      </w:pPr>
+      <w:r>
+        <w:rPr>
+          <w:lang w:val="uk-UA"/>
+        </w:rPr>
+        <w:t xml:space="preserve">- </w:t>
+      </w:r>
+      <w:r>
+        <w:rPr>
+          <w:lang w:val="en-US"/>
+        </w:rPr>
+        <w:t xml:space="preserve">MPI_Comm_group – </w:t>
+      </w:r>
+      <w:r>
+        <w:rPr>
+          <w:lang w:val="uk-UA"/>
+        </w:rPr>
+        <w:t>отримати групу з комунікатора;</w:t>
+      </w:r>
+    </w:p>
+    <w:p>
+      <w:pPr>
+        <w:pStyle w:val="P1"/>
+        <w:rPr>
+          <w:lang w:val="en-US"/>
+        </w:rPr>
+      </w:pPr>
+      <w:r>
+        <w:rPr>
+          <w:lang w:val="en-US"/>
+        </w:rPr>
+        <w:t xml:space="preserve">- MPI_Group_incl – </w:t>
+      </w:r>
+      <w:r>
+        <w:rPr>
+          <w:lang w:val="uk-UA"/>
+        </w:rPr>
+        <w:t>створити групу з вибраних рангів;</w:t>
+      </w:r>
+    </w:p>
+    <w:p>
+      <w:pPr>
+        <w:pStyle w:val="P1"/>
+        <w:rPr>
+          <w:lang w:val="uk-UA"/>
+        </w:rPr>
+      </w:pPr>
+      <w:r>
+        <w:rPr>
+          <w:lang w:val="uk-UA"/>
+        </w:rPr>
+        <w:t xml:space="preserve">- </w:t>
+      </w:r>
+      <w:r>
+        <w:rPr>
+          <w:lang w:val="en-US"/>
+        </w:rPr>
+        <w:t xml:space="preserve">MPI_Group_excl – </w:t>
+      </w:r>
+      <w:r>
+        <w:rPr>
+          <w:lang w:val="uk-UA"/>
+        </w:rPr>
+        <w:t>створити групу, виключивши певні ранги;</w:t>
+      </w:r>
+    </w:p>
+    <w:p>
+      <w:pPr>
+        <w:pStyle w:val="P1"/>
+        <w:rPr>
+          <w:lang w:val="uk-UA"/>
+        </w:rPr>
+      </w:pPr>
+      <w:r>
+        <w:rPr>
+          <w:lang w:val="uk-UA"/>
+        </w:rPr>
+        <w:t xml:space="preserve">- </w:t>
+      </w:r>
+      <w:r>
+        <w:rPr>
+          <w:lang w:val="en-US"/>
+        </w:rPr>
+        <w:t xml:space="preserve">MPI_Group_union / MPI_Group_intersection – </w:t>
+      </w:r>
+      <w:r>
+        <w:rPr>
+          <w:lang w:val="uk-UA"/>
+        </w:rPr>
+        <w:t>операції над множинами.</w:t>
+      </w:r>
+    </w:p>
+    <w:p>
+      <w:pPr>
+        <w:pStyle w:val="P1"/>
+        <w:rPr/>
+      </w:pPr>
+      <w:r>
+        <w:rPr/>
       </w:r>
     </w:p>
     <w:p>
@@ -10844,17 +12735,103 @@
       </w:pPr>
       <w:r>
         <w:rPr/>
-        <w:t>Що таке групи процесів в MPI? За допомогою яких функцій бібліотеки MPI їх можна створити?</w:t>
-      </w:r>
-    </w:p>
-    <w:p>
-      <w:pPr>
-        <w:pStyle w:val="H2"/>
-        <w:rPr/>
-      </w:pPr>
-      <w:r>
-        <w:rPr/>
         <w:t>Як здійснити обмін даними між процесами групи?</w:t>
+      </w:r>
+    </w:p>
+    <w:p>
+      <w:pPr>
+        <w:pStyle w:val="P1"/>
+        <w:rPr/>
+      </w:pPr>
+      <w:r>
+        <w:rPr/>
+      </w:r>
+    </w:p>
+    <w:p>
+      <w:pPr>
+        <w:pStyle w:val="P1"/>
+        <w:rPr/>
+      </w:pPr>
+      <w:r>
+        <w:rPr/>
+        <w:t>Обмін даних здійснюється через комунікатори.</w:t>
+      </w:r>
+    </w:p>
+    <w:p>
+      <w:pPr>
+        <w:pStyle w:val="P1"/>
+        <w:rPr/>
+      </w:pPr>
+      <w:r>
+        <w:rPr/>
+        <w:t>Кроки виконання:</w:t>
+      </w:r>
+    </w:p>
+    <w:p>
+      <w:pPr>
+        <w:pStyle w:val="P1"/>
+        <w:rPr/>
+      </w:pPr>
+      <w:r>
+        <w:rPr/>
+        <w:t>1. створюється нова група;</w:t>
+      </w:r>
+    </w:p>
+    <w:p>
+      <w:pPr>
+        <w:pStyle w:val="P1"/>
+        <w:rPr/>
+      </w:pPr>
+      <w:r>
+        <w:rPr/>
+        <w:t xml:space="preserve">2. на основі групи створюється новий комунікатор: </w:t>
+      </w:r>
+      <w:r>
+        <w:rPr>
+          <w:lang w:val="en-US"/>
+        </w:rPr>
+        <w:t>MPI_Comm_create(old_comm, group, &amp;new_comm).</w:t>
+      </w:r>
+    </w:p>
+    <w:p>
+      <w:pPr>
+        <w:pStyle w:val="P1"/>
+        <w:rPr>
+          <w:lang w:val="en-US"/>
+        </w:rPr>
+      </w:pPr>
+      <w:r>
+        <w:rPr>
+          <w:lang w:val="en-US"/>
+        </w:rPr>
+        <w:t xml:space="preserve">3. </w:t>
+      </w:r>
+      <w:r>
+        <w:rPr>
+          <w:lang w:val="uk-UA"/>
+        </w:rPr>
+        <w:t xml:space="preserve">обмін </w:t>
+      </w:r>
+      <w:r>
+        <w:rPr>
+          <w:lang w:val="en-US"/>
+        </w:rPr>
+        <w:t xml:space="preserve">(send/recv, bcast) </w:t>
+      </w:r>
+      <w:r>
+        <w:rPr>
+          <w:lang w:val="uk-UA"/>
+        </w:rPr>
+        <w:t>відбувається через новий комунікатор.</w:t>
+      </w:r>
+    </w:p>
+    <w:p>
+      <w:pPr>
+        <w:pStyle w:val="P1"/>
+        <w:rPr/>
+      </w:pPr>
+      <w:r>
+        <w:rPr/>
       </w:r>
     </w:p>
     <w:p>

</xml_diff>

<commit_message>
feat -- TR5: hopefully this is it
</commit_message>
<xml_diff>
--- a/42TR Tehnologiji Rozpodilenyh System/5/TR_KNT-122_Onyshchenko_19_PR5.docx
+++ b/42TR Tehnologiji Rozpodilenyh System/5/TR_KNT-122_Onyshchenko_19_PR5.docx
@@ -2820,6 +2820,9 @@
       <w:r>
         <w:rPr/>
       </w:r>
+      <w:r>
+        <w:br w:type="page"/>
+      </w:r>
     </w:p>
     <w:p>
       <w:pPr>
@@ -4089,9 +4092,10 @@
         </w:rPr>
       </w:pPr>
       <w:r>
-        <w:rPr>
-          <w:lang w:val="uk-UA"/>
-        </w:rPr>
+        <w:rPr/>
+      </w:r>
+      <w:r>
+        <w:br w:type="page"/>
       </w:r>
     </w:p>
     <w:p>
@@ -5168,9 +5172,10 @@
         </w:rPr>
       </w:pPr>
       <w:r>
-        <w:rPr>
-          <w:rFonts w:ascii="Cascadia Code" w:hAnsi="Cascadia Code"/>
-        </w:rPr>
+        <w:rPr/>
+      </w:r>
+      <w:r>
+        <w:br w:type="page"/>
       </w:r>
     </w:p>
     <w:p>
@@ -6913,9 +6918,10 @@
         </w:rPr>
       </w:pPr>
       <w:r>
-        <w:rPr>
-          <w:rFonts w:ascii="Cascadia Code" w:hAnsi="Cascadia Code"/>
-        </w:rPr>
+        <w:rPr/>
+      </w:r>
+      <w:r>
+        <w:br w:type="page"/>
       </w:r>
     </w:p>
     <w:p>
@@ -7952,9 +7958,10 @@
         </w:rPr>
       </w:pPr>
       <w:r>
-        <w:rPr>
-          <w:rFonts w:ascii="Cascadia Code" w:hAnsi="Cascadia Code"/>
-        </w:rPr>
+        <w:rPr/>
+      </w:r>
+      <w:r>
+        <w:br w:type="page"/>
       </w:r>
     </w:p>
     <w:p>
@@ -9381,6 +9388,9 @@
       </w:pPr>
       <w:r>
         <w:rPr/>
+      </w:r>
+      <w:r>
+        <w:br w:type="page"/>
       </w:r>
     </w:p>
     <w:p>
@@ -10003,6 +10013,9 @@
       <w:r>
         <w:rPr/>
       </w:r>
+      <w:r>
+        <w:br w:type="page"/>
+      </w:r>
     </w:p>
     <w:p>
       <w:pPr>
@@ -10899,14 +10912,13 @@
     <w:p>
       <w:pPr>
         <w:pStyle w:val="P1"/>
-        <w:rPr>
-          <w:rFonts w:ascii="Cascadia Code" w:hAnsi="Cascadia Code"/>
-        </w:rPr>
-      </w:pPr>
-      <w:r>
-        <w:rPr>
-          <w:rFonts w:ascii="Cascadia Code" w:hAnsi="Cascadia Code"/>
-        </w:rPr>
+        <w:rPr/>
+      </w:pPr>
+      <w:r>
+        <w:rPr/>
+      </w:r>
+      <w:r>
+        <w:br w:type="page"/>
       </w:r>
     </w:p>
     <w:p>
@@ -10921,7 +10933,7 @@
     </w:p>
     <w:p>
       <w:pPr>
-        <w:pStyle w:val="P1"/>
+        <w:pStyle w:val="H3"/>
         <w:rPr/>
       </w:pPr>
       <w:r>
@@ -11010,21 +11022,21 @@
     </w:p>
     <w:p>
       <w:pPr>
+        <w:pStyle w:val="H3"/>
+        <w:rPr/>
+      </w:pPr>
+      <w:r>
+        <w:rPr/>
+        <w:t>Код</w:t>
+      </w:r>
+    </w:p>
+    <w:p>
+      <w:pPr>
         <w:pStyle w:val="p11"/>
         <w:rPr/>
       </w:pPr>
       <w:r>
         <w:rPr/>
-        <w:t>Код</w:t>
-      </w:r>
-    </w:p>
-    <w:p>
-      <w:pPr>
-        <w:pStyle w:val="p11"/>
-        <w:rPr/>
-      </w:pPr>
-      <w:r>
-        <w:rPr/>
       </w:r>
     </w:p>
     <w:p>
@@ -12210,6 +12222,18 @@
     </w:p>
     <w:p>
       <w:pPr>
+        <w:pStyle w:val="P1"/>
+        <w:rPr/>
+      </w:pPr>
+      <w:r>
+        <w:rPr/>
+      </w:r>
+      <w:r>
+        <w:br w:type="page"/>
+      </w:r>
+    </w:p>
+    <w:p>
+      <w:pPr>
         <w:pStyle w:val="h11"/>
         <w:rPr/>
       </w:pPr>
@@ -12846,12 +12870,114 @@
     </w:p>
     <w:p>
       <w:pPr>
+        <w:pStyle w:val="P1"/>
+        <w:rPr/>
+      </w:pPr>
+      <w:r>
+        <w:rPr/>
+      </w:r>
+    </w:p>
+    <w:p>
+      <w:pPr>
+        <w:pStyle w:val="P1"/>
+        <w:rPr/>
+      </w:pPr>
+      <w:r>
+        <w:rPr/>
+        <w:t xml:space="preserve">Функція розділяє групу процесів існуючого комунікатора </w:t>
+      </w:r>
+      <w:r>
+        <w:rPr>
+          <w:i/>
+          <w:iCs/>
+          <w:lang w:val="en-US"/>
+        </w:rPr>
+        <w:t xml:space="preserve">comm </w:t>
+      </w:r>
+      <w:r>
+        <w:rPr>
+          <w:lang w:val="uk-UA"/>
+        </w:rPr>
+        <w:t xml:space="preserve">на кілька нових незалежних підгруп </w:t>
+      </w:r>
+      <w:r>
+        <w:rPr>
+          <w:i/>
+          <w:iCs/>
+          <w:lang w:val="en-US"/>
+        </w:rPr>
+        <w:t xml:space="preserve">newcomm </w:t>
+      </w:r>
+      <w:r>
+        <w:rPr>
+          <w:i w:val="false"/>
+          <w:iCs w:val="false"/>
+          <w:lang w:val="uk-UA"/>
+        </w:rPr>
+        <w:t xml:space="preserve">на основі значення </w:t>
+      </w:r>
+      <w:r>
+        <w:rPr>
+          <w:i/>
+          <w:iCs/>
+          <w:lang w:val="en-US"/>
+        </w:rPr>
+        <w:t>split</w:t>
+      </w:r>
+      <w:r>
+        <w:rPr>
+          <w:i w:val="false"/>
+          <w:iCs w:val="false"/>
+          <w:lang w:val="en-US"/>
+        </w:rPr>
+        <w:t>.</w:t>
+      </w:r>
+    </w:p>
+    <w:p>
+      <w:pPr>
+        <w:pStyle w:val="P1"/>
+        <w:rPr>
+          <w:i w:val="false"/>
+          <w:i w:val="false"/>
+          <w:iCs w:val="false"/>
+          <w:lang w:val="en-US"/>
+        </w:rPr>
+      </w:pPr>
+      <w:r>
+        <w:rPr>
+          <w:i w:val="false"/>
+          <w:iCs w:val="false"/>
+          <w:lang w:val="en-US"/>
+        </w:rPr>
+      </w:r>
+    </w:p>
+    <w:p>
+      <w:pPr>
         <w:pStyle w:val="H2"/>
         <w:rPr/>
       </w:pPr>
       <w:r>
         <w:rPr/>
         <w:t>Чи можуть декілька комунікаторів в одній паралельній програмі мати однакові ідентифікатори?</w:t>
+      </w:r>
+    </w:p>
+    <w:p>
+      <w:pPr>
+        <w:pStyle w:val="P1"/>
+        <w:rPr/>
+      </w:pPr>
+      <w:r>
+        <w:rPr/>
+      </w:r>
+    </w:p>
+    <w:p>
+      <w:pPr>
+        <w:pStyle w:val="P1"/>
+        <w:rPr/>
+      </w:pPr>
+      <w:r>
+        <w:rPr/>
+        <w:t>Не можуть. Повідомлення, надіслане в одному комунікаторі, не буде отримане в іншому.</w:t>
       </w:r>
     </w:p>
     <w:sectPr>

</xml_diff>